<commit_message>
docs(sia): catch up the documentation with Phases 1–3
- 3.4: React 19 + React Router 7; 8.3 CI: oxlint (jsx-a11y) + Vitest
- 4.1 / Appendix A: résumé upload + signed link, logo route, admin lists
  (employers, job postings, feedback, accommodations); OpenAPI file named
- 5.1 matching tie-break and "must offer all" filter; 5.3 SERVER_ERROR,
  rows in HTTP order; 6.4 uploaded files and gateway-only links
- Appendix F data model matches the migrations; references for React,
  React Router, Vitest, Testing Library, oxlint, axe-core, Jest
- opendoor-dev references: résumé/logo routes and M5 sort/match rules

Co-Authored-By: Claude Opus 5.5 <noreply@anthropic.com>
</commit_message>
<xml_diff>
--- a/docs/OpenDoor_SIA1_Final_Project_Documentation.docx
+++ b/docs/OpenDoor_SIA1_Final_Project_Documentation.docx
@@ -4887,7 +4887,7 @@
                 <w:sz w:val="16"/>
                 <w:szCs w:val="16"/>
               </w:rPr>
-              <w:t xml:space="preserve">React 18, Vite, React Router, Axios, AuthContext</w:t>
+              <w:t xml:space="preserve">React 19, Vite, React Router 7, Axios, AuthContext</w:t>
             </w:r>
           </w:p>
         </w:tc>
@@ -7521,6 +7521,168 @@
                 <w:sz w:val="16"/>
                 <w:szCs w:val="16"/>
               </w:rPr>
+              <w:t xml:space="preserve">POST, GET</w:t>
+            </w:r>
+          </w:p>
+        </w:tc>
+        <w:tc>
+          <w:tcPr>
+            <w:tcW w:type="dxa" w:w="2700"/>
+            <w:tcBorders>
+              <w:top w:val="single" w:color="7F7F7F" w:sz="4"/>
+              <w:left w:val="single" w:color="7F7F7F" w:sz="4"/>
+              <w:bottom w:val="single" w:color="7F7F7F" w:sz="4"/>
+              <w:right w:val="single" w:color="7F7F7F" w:sz="4"/>
+            </w:tcBorders>
+            <w:tcMar>
+              <w:top w:type="dxa" w:w="60"/>
+              <w:left w:type="dxa" w:w="100"/>
+              <w:bottom w:type="dxa" w:w="60"/>
+              <w:right w:type="dxa" w:w="100"/>
+            </w:tcMar>
+          </w:tcPr>
+          <w:p>
+            <w:pPr>
+              <w:spacing w:after="20"/>
+            </w:pPr>
+            <w:r>
+              <w:rPr>
+                <w:sz w:val="16"/>
+                <w:szCs w:val="16"/>
+              </w:rPr>
+              <w:t xml:space="preserve">/api/candidate/resume, /api/resumes/{id}</w:t>
+            </w:r>
+          </w:p>
+        </w:tc>
+        <w:tc>
+          <w:tcPr>
+            <w:tcW w:type="dxa" w:w="2280"/>
+            <w:tcBorders>
+              <w:top w:val="single" w:color="7F7F7F" w:sz="4"/>
+              <w:left w:val="single" w:color="7F7F7F" w:sz="4"/>
+              <w:bottom w:val="single" w:color="7F7F7F" w:sz="4"/>
+              <w:right w:val="single" w:color="7F7F7F" w:sz="4"/>
+            </w:tcBorders>
+            <w:tcMar>
+              <w:top w:type="dxa" w:w="60"/>
+              <w:left w:type="dxa" w:w="100"/>
+              <w:bottom w:type="dxa" w:w="60"/>
+              <w:right w:type="dxa" w:w="100"/>
+            </w:tcMar>
+          </w:tcPr>
+          <w:p>
+            <w:pPr>
+              <w:spacing w:after="20"/>
+            </w:pPr>
+            <w:r>
+              <w:rPr>
+                <w:sz w:val="16"/>
+                <w:szCs w:val="16"/>
+              </w:rPr>
+              <w:t xml:space="preserve">Upload PDF résumé (max 5 MB); open it from a 30-minute signed link</w:t>
+            </w:r>
+          </w:p>
+        </w:tc>
+        <w:tc>
+          <w:tcPr>
+            <w:tcW w:type="dxa" w:w="2900"/>
+            <w:tcBorders>
+              <w:top w:val="single" w:color="7F7F7F" w:sz="4"/>
+              <w:left w:val="single" w:color="7F7F7F" w:sz="4"/>
+              <w:bottom w:val="single" w:color="7F7F7F" w:sz="4"/>
+              <w:right w:val="single" w:color="7F7F7F" w:sz="4"/>
+            </w:tcBorders>
+            <w:tcMar>
+              <w:top w:type="dxa" w:w="60"/>
+              <w:left w:type="dxa" w:w="100"/>
+              <w:bottom w:type="dxa" w:w="60"/>
+              <w:right w:type="dxa" w:w="100"/>
+            </w:tcMar>
+          </w:tcPr>
+          <w:p>
+            <w:pPr>
+              <w:spacing w:after="20"/>
+            </w:pPr>
+            <w:r>
+              <w:rPr>
+                <w:sz w:val="16"/>
+                <w:szCs w:val="16"/>
+              </w:rPr>
+              <w:t xml:space="preserve">multipart </w:t>
+            </w:r>
+            <w:r>
+              <w:rPr>
+                <w:rFonts w:ascii="Consolas" w:cs="Consolas" w:eastAsia="Consolas" w:hAnsi="Consolas"/>
+                <w:sz w:val="16"/>
+                <w:szCs w:val="16"/>
+              </w:rPr>
+              <w:t xml:space="preserve">resume</w:t>
+            </w:r>
+            <w:r>
+              <w:rPr>
+                <w:sz w:val="16"/>
+                <w:szCs w:val="16"/>
+              </w:rPr>
+              <w:t xml:space="preserve"> → 200 {resume_url}; signed link → PDF</w:t>
+            </w:r>
+          </w:p>
+        </w:tc>
+      </w:tr>
+      <w:tr>
+        <w:tc>
+          <w:tcPr>
+            <w:tcW w:type="dxa" w:w="1250"/>
+            <w:tcBorders>
+              <w:top w:val="single" w:color="7F7F7F" w:sz="4"/>
+              <w:left w:val="single" w:color="7F7F7F" w:sz="4"/>
+              <w:bottom w:val="single" w:color="7F7F7F" w:sz="4"/>
+              <w:right w:val="single" w:color="7F7F7F" w:sz="4"/>
+            </w:tcBorders>
+            <w:tcMar>
+              <w:top w:type="dxa" w:w="60"/>
+              <w:left w:type="dxa" w:w="100"/>
+              <w:bottom w:type="dxa" w:w="60"/>
+              <w:right w:type="dxa" w:w="100"/>
+            </w:tcMar>
+          </w:tcPr>
+          <w:p>
+            <w:pPr>
+              <w:spacing w:after="20"/>
+            </w:pPr>
+            <w:r>
+              <w:rPr>
+                <w:sz w:val="16"/>
+                <w:szCs w:val="16"/>
+              </w:rPr>
+              <w:t xml:space="preserve">Core</w:t>
+            </w:r>
+          </w:p>
+        </w:tc>
+        <w:tc>
+          <w:tcPr>
+            <w:tcW w:type="dxa" w:w="950"/>
+            <w:tcBorders>
+              <w:top w:val="single" w:color="7F7F7F" w:sz="4"/>
+              <w:left w:val="single" w:color="7F7F7F" w:sz="4"/>
+              <w:bottom w:val="single" w:color="7F7F7F" w:sz="4"/>
+              <w:right w:val="single" w:color="7F7F7F" w:sz="4"/>
+            </w:tcBorders>
+            <w:tcMar>
+              <w:top w:type="dxa" w:w="60"/>
+              <w:left w:type="dxa" w:w="100"/>
+              <w:bottom w:type="dxa" w:w="60"/>
+              <w:right w:type="dxa" w:w="100"/>
+            </w:tcMar>
+          </w:tcPr>
+          <w:p>
+            <w:pPr>
+              <w:spacing w:after="20"/>
+            </w:pPr>
+            <w:r>
+              <w:rPr>
+                <w:sz w:val="16"/>
+                <w:szCs w:val="16"/>
+              </w:rPr>
               <w:t xml:space="preserve">GET</w:t>
             </w:r>
           </w:p>
@@ -9862,7 +10024,7 @@
         <w:t xml:space="preserve">match</w:t>
       </w:r>
       <w:r>
-        <w:t xml:space="preserve"> object is computed by the Core Service from the candidate's needs; it appears only for logged-in candidates.</w:t>
+        <w:t xml:space="preserve"> object is computed by the Core Service from the candidate's needs; it appears only for logged-in candidates who have saved accommodation needs.</w:t>
       </w:r>
     </w:p>
     <w:tbl>
@@ -14736,7 +14898,7 @@
         <w:t xml:space="preserve">match.met</w:t>
       </w:r>
       <w:r>
-        <w:t xml:space="preserve">, orders full matches first and then partial matches by count, and applies keyword, category and extra accommodation filters on top. The </w:t>
+        <w:t xml:space="preserve">, orders full matches first and then partial matches by count (ties follow the chosen sort: newest or closing soon), and applies keyword, category and extra accommodation filters on top (a posting must offer every selected accommodation). The </w:t>
       </w:r>
       <w:r>
         <w:rPr>
@@ -17823,7 +17985,7 @@
                 <w:sz w:val="16"/>
                 <w:szCs w:val="16"/>
               </w:rPr>
-              <w:t xml:space="preserve">429</w:t>
+              <w:t xml:space="preserve">422</w:t>
             </w:r>
           </w:p>
         </w:tc>
@@ -17852,7 +18014,7 @@
                 <w:sz w:val="16"/>
                 <w:szCs w:val="16"/>
               </w:rPr>
-              <w:t xml:space="preserve">RATE_LIMITED</w:t>
+              <w:t xml:space="preserve">REGISTRY_INVALID_REQUEST</w:t>
             </w:r>
           </w:p>
         </w:tc>
@@ -17881,7 +18043,7 @@
                 <w:sz w:val="16"/>
                 <w:szCs w:val="16"/>
               </w:rPr>
-              <w:t xml:space="preserve">Gateway, Core</w:t>
+              <w:t xml:space="preserve">Core</w:t>
             </w:r>
           </w:p>
         </w:tc>
@@ -17910,7 +18072,7 @@
                 <w:sz w:val="16"/>
                 <w:szCs w:val="16"/>
               </w:rPr>
-              <w:t xml:space="preserve">Over 120 requests/min per IP at the gateway, or over 5 login attempts/min; </w:t>
+              <w:t xml:space="preserve">Registry returned </w:t>
             </w:r>
             <w:r>
               <w:rPr>
@@ -17918,14 +18080,14 @@
                 <w:sz w:val="16"/>
                 <w:szCs w:val="16"/>
               </w:rPr>
-              <w:t xml:space="preserve">Retry-After</w:t>
-            </w:r>
-            <w:r>
-              <w:rPr>
-                <w:sz w:val="16"/>
-                <w:szCs w:val="16"/>
-              </w:rPr>
-              <w:t xml:space="preserve"> header sent</w:t>
+              <w:t xml:space="preserve">Client.Validation</w:t>
+            </w:r>
+            <w:r>
+              <w:rPr>
+                <w:sz w:val="16"/>
+                <w:szCs w:val="16"/>
+              </w:rPr>
+              <w:t xml:space="preserve"> (e.g., malformed registration number); the employer is asked to correct it</w:t>
             </w:r>
           </w:p>
         </w:tc>
@@ -17956,7 +18118,7 @@
                 <w:sz w:val="16"/>
                 <w:szCs w:val="16"/>
               </w:rPr>
-              <w:t xml:space="preserve">422</w:t>
+              <w:t xml:space="preserve">429</w:t>
             </w:r>
           </w:p>
         </w:tc>
@@ -17985,7 +18147,7 @@
                 <w:sz w:val="16"/>
                 <w:szCs w:val="16"/>
               </w:rPr>
-              <w:t xml:space="preserve">REGISTRY_INVALID_REQUEST</w:t>
+              <w:t xml:space="preserve">RATE_LIMITED</w:t>
             </w:r>
           </w:p>
         </w:tc>
@@ -18014,6 +18176,139 @@
                 <w:sz w:val="16"/>
                 <w:szCs w:val="16"/>
               </w:rPr>
+              <w:t xml:space="preserve">Gateway, Core</w:t>
+            </w:r>
+          </w:p>
+        </w:tc>
+        <w:tc>
+          <w:tcPr>
+            <w:tcW w:type="dxa" w:w="4780"/>
+            <w:tcBorders>
+              <w:top w:val="single" w:color="7F7F7F" w:sz="4"/>
+              <w:left w:val="single" w:color="7F7F7F" w:sz="4"/>
+              <w:bottom w:val="single" w:color="7F7F7F" w:sz="4"/>
+              <w:right w:val="single" w:color="7F7F7F" w:sz="4"/>
+            </w:tcBorders>
+            <w:tcMar>
+              <w:top w:type="dxa" w:w="60"/>
+              <w:left w:type="dxa" w:w="100"/>
+              <w:bottom w:type="dxa" w:w="60"/>
+              <w:right w:type="dxa" w:w="100"/>
+            </w:tcMar>
+          </w:tcPr>
+          <w:p>
+            <w:pPr>
+              <w:spacing w:after="20"/>
+            </w:pPr>
+            <w:r>
+              <w:rPr>
+                <w:sz w:val="16"/>
+                <w:szCs w:val="16"/>
+              </w:rPr>
+              <w:t xml:space="preserve">Over 120 requests/min per IP at the gateway, or over 5 login attempts/min; </w:t>
+            </w:r>
+            <w:r>
+              <w:rPr>
+                <w:rFonts w:ascii="Consolas" w:cs="Consolas" w:eastAsia="Consolas" w:hAnsi="Consolas"/>
+                <w:sz w:val="16"/>
+                <w:szCs w:val="16"/>
+              </w:rPr>
+              <w:t xml:space="preserve">Retry-After</w:t>
+            </w:r>
+            <w:r>
+              <w:rPr>
+                <w:sz w:val="16"/>
+                <w:szCs w:val="16"/>
+              </w:rPr>
+              <w:t xml:space="preserve"> header sent</w:t>
+            </w:r>
+          </w:p>
+        </w:tc>
+      </w:tr>
+      <w:tr>
+        <w:tc>
+          <w:tcPr>
+            <w:tcW w:type="dxa" w:w="800"/>
+            <w:tcBorders>
+              <w:top w:val="single" w:color="7F7F7F" w:sz="4"/>
+              <w:left w:val="single" w:color="7F7F7F" w:sz="4"/>
+              <w:bottom w:val="single" w:color="7F7F7F" w:sz="4"/>
+              <w:right w:val="single" w:color="7F7F7F" w:sz="4"/>
+            </w:tcBorders>
+            <w:tcMar>
+              <w:top w:type="dxa" w:w="60"/>
+              <w:left w:type="dxa" w:w="100"/>
+              <w:bottom w:type="dxa" w:w="60"/>
+              <w:right w:type="dxa" w:w="100"/>
+            </w:tcMar>
+          </w:tcPr>
+          <w:p>
+            <w:pPr>
+              <w:spacing w:after="20"/>
+            </w:pPr>
+            <w:r>
+              <w:rPr>
+                <w:sz w:val="16"/>
+                <w:szCs w:val="16"/>
+              </w:rPr>
+              <w:t xml:space="preserve">500</w:t>
+            </w:r>
+          </w:p>
+        </w:tc>
+        <w:tc>
+          <w:tcPr>
+            <w:tcW w:type="dxa" w:w="3000"/>
+            <w:tcBorders>
+              <w:top w:val="single" w:color="7F7F7F" w:sz="4"/>
+              <w:left w:val="single" w:color="7F7F7F" w:sz="4"/>
+              <w:bottom w:val="single" w:color="7F7F7F" w:sz="4"/>
+              <w:right w:val="single" w:color="7F7F7F" w:sz="4"/>
+            </w:tcBorders>
+            <w:tcMar>
+              <w:top w:type="dxa" w:w="60"/>
+              <w:left w:type="dxa" w:w="100"/>
+              <w:bottom w:type="dxa" w:w="60"/>
+              <w:right w:type="dxa" w:w="100"/>
+            </w:tcMar>
+          </w:tcPr>
+          <w:p>
+            <w:pPr>
+              <w:spacing w:after="20"/>
+            </w:pPr>
+            <w:r>
+              <w:rPr>
+                <w:sz w:val="16"/>
+                <w:szCs w:val="16"/>
+              </w:rPr>
+              <w:t xml:space="preserve">SERVER_ERROR</w:t>
+            </w:r>
+          </w:p>
+        </w:tc>
+        <w:tc>
+          <w:tcPr>
+            <w:tcW w:type="dxa" w:w="1500"/>
+            <w:tcBorders>
+              <w:top w:val="single" w:color="7F7F7F" w:sz="4"/>
+              <w:left w:val="single" w:color="7F7F7F" w:sz="4"/>
+              <w:bottom w:val="single" w:color="7F7F7F" w:sz="4"/>
+              <w:right w:val="single" w:color="7F7F7F" w:sz="4"/>
+            </w:tcBorders>
+            <w:tcMar>
+              <w:top w:type="dxa" w:w="60"/>
+              <w:left w:type="dxa" w:w="100"/>
+              <w:bottom w:type="dxa" w:w="60"/>
+              <w:right w:type="dxa" w:w="100"/>
+            </w:tcMar>
+          </w:tcPr>
+          <w:p>
+            <w:pPr>
+              <w:spacing w:after="20"/>
+            </w:pPr>
+            <w:r>
+              <w:rPr>
+                <w:sz w:val="16"/>
+                <w:szCs w:val="16"/>
+              </w:rPr>
               <w:t xml:space="preserve">Core</w:t>
             </w:r>
           </w:p>
@@ -18043,7 +18338,7 @@
                 <w:sz w:val="16"/>
                 <w:szCs w:val="16"/>
               </w:rPr>
-              <w:t xml:space="preserve">Registry returned </w:t>
+              <w:t xml:space="preserve">Unexpected server error; generic message only (no stack trace), details logged with the </w:t>
             </w:r>
             <w:r>
               <w:rPr>
@@ -18051,14 +18346,7 @@
                 <w:sz w:val="16"/>
                 <w:szCs w:val="16"/>
               </w:rPr>
-              <w:t xml:space="preserve">Client.Validation</w:t>
-            </w:r>
-            <w:r>
-              <w:rPr>
-                <w:sz w:val="16"/>
-                <w:szCs w:val="16"/>
-              </w:rPr>
-              <w:t xml:space="preserve"> (e.g., malformed registration number); the employer is asked to correct it</w:t>
+              <w:t xml:space="preserve">request_id</w:t>
             </w:r>
           </w:p>
         </w:tc>
@@ -19196,6 +19484,35 @@
       </w:r>
       <w:r>
         <w:t xml:space="preserve"> for statuses, max lengths, PDF-only size-limited résumé uploads); Eloquent parameter binding prevents SQL injection; the SOAP request is validated against the WSDL schema; React escapes output by default.</w:t>
+      </w:r>
+    </w:p>
+    <w:p>
+      <w:pPr>
+        <w:pStyle w:val="ListParagraph"/>
+        <w:numPr>
+          <w:ilvl w:val="0"/>
+          <w:numId w:val="2"/>
+        </w:numPr>
+        <w:spacing w:after="60"/>
+      </w:pPr>
+      <w:r>
+        <w:rPr>
+          <w:b/>
+          <w:bCs/>
+        </w:rPr>
+        <w:t xml:space="preserve">Uploaded files:</w:t>
+      </w:r>
+      <w:r>
+        <w:t xml:space="preserve"> company logos are public images served through the gateway; résumés are stored on Core's private disk and opened only through a temporary signed link (30 minutes, </w:t>
+      </w:r>
+      <w:r>
+        <w:rPr>
+          <w:rFonts w:ascii="Consolas" w:cs="Consolas" w:eastAsia="Consolas" w:hAnsi="Consolas"/>
+        </w:rPr>
+        <w:t xml:space="preserve">Cache-Control: no-store</w:t>
+      </w:r>
+      <w:r>
+        <w:t xml:space="preserve">) returned to the candidate, so the PDF can be opened in a new tab without exposing the token. Links in API responses (logos, résumés, page links) always point at the gateway, never at an internal service host.</w:t>
       </w:r>
     </w:p>
     <w:p>
@@ -26408,7 +26725,22 @@
                 <w:sz w:val="16"/>
                 <w:szCs w:val="16"/>
               </w:rPr>
-              <w:t xml:space="preserve">, ESLint, </w:t>
+              <w:t xml:space="preserve">, oxlint (with </w:t>
+            </w:r>
+            <w:r>
+              <w:rPr>
+                <w:rFonts w:ascii="Consolas" w:cs="Consolas" w:eastAsia="Consolas" w:hAnsi="Consolas"/>
+                <w:sz w:val="16"/>
+                <w:szCs w:val="16"/>
+              </w:rPr>
+              <w:t xml:space="preserve">jsx-a11y</w:t>
+            </w:r>
+            <w:r>
+              <w:rPr>
+                <w:sz w:val="16"/>
+                <w:szCs w:val="16"/>
+              </w:rPr>
+              <w:t xml:space="preserve"> accessibility rules), Vitest unit tests (React Testing Library), </w:t>
             </w:r>
             <w:r>
               <w:rPr>
@@ -30101,7 +30433,7 @@
         <w:ind w:left="720" w:hanging="720"/>
       </w:pPr>
       <w:r>
-        <w:t xml:space="preserve">Express.js. (n.d.). Express 4.x API reference. https://expressjs.com/</w:t>
+        <w:t xml:space="preserve">Deque Systems. (n.d.). axe-core: Accessibility engine for automated web UI testing. https://github.com/dequelabs/axe-core</w:t>
       </w:r>
     </w:p>
     <w:p>
@@ -30110,7 +30442,7 @@
         <w:ind w:left="720" w:hanging="720"/>
       </w:pPr>
       <w:r>
-        <w:t xml:space="preserve">GitHub. (n.d.). GitHub Actions documentation. https://docs.github.com/actions</w:t>
+        <w:t xml:space="preserve">Express.js. (n.d.). Express 4.x API reference. https://expressjs.com/</w:t>
       </w:r>
     </w:p>
     <w:p>
@@ -30119,7 +30451,7 @@
         <w:ind w:left="720" w:hanging="720"/>
       </w:pPr>
       <w:r>
-        <w:t xml:space="preserve">Laravel. (n.d.). Laravel 13.x documentation: Sanctum, Authorization, Validation. https://laravel.com/docs/13.x</w:t>
+        <w:t xml:space="preserve">GitHub. (n.d.). GitHub Actions documentation. https://docs.github.com/actions</w:t>
       </w:r>
     </w:p>
     <w:p>
@@ -30128,7 +30460,7 @@
         <w:ind w:left="720" w:hanging="720"/>
       </w:pPr>
       <w:r>
-        <w:t xml:space="preserve">National Privacy Commission. (2016). Implementing rules and regulations of Republic Act No. 10173, known as the Data Privacy Act of 2012. https://privacy.gov.ph/implementing-rules-regulations-data-privacy-act-2012/</w:t>
+        <w:t xml:space="preserve">Laravel. (n.d.). Laravel 13.x documentation: Sanctum, Authorization, Validation. https://laravel.com/docs/13.x</w:t>
       </w:r>
     </w:p>
     <w:p>
@@ -30137,7 +30469,7 @@
         <w:ind w:left="720" w:hanging="720"/>
       </w:pPr>
       <w:r>
-        <w:t xml:space="preserve">OASIS. (2006). Web Services Security UsernameToken Profile 1.1. https://docs.oasis-open.org/wss/v1.1/</w:t>
+        <w:t xml:space="preserve">Meta Open Source. (n.d.). React documentation (version 19). https://react.dev/</w:t>
       </w:r>
     </w:p>
     <w:p>
@@ -30146,7 +30478,7 @@
         <w:ind w:left="720" w:hanging="720"/>
       </w:pPr>
       <w:r>
-        <w:t xml:space="preserve">OpenStreetMap Foundation. (n.d.). Nominatim usage policy. https://operations.osmfoundation.org/policies/nominatim/</w:t>
+        <w:t xml:space="preserve">National Privacy Commission. (2016). Implementing rules and regulations of Republic Act No. 10173, known as the Data Privacy Act of 2012. https://privacy.gov.ph/implementing-rules-regulations-data-privacy-act-2012/</w:t>
       </w:r>
     </w:p>
     <w:p>
@@ -30155,7 +30487,7 @@
         <w:ind w:left="720" w:hanging="720"/>
       </w:pPr>
       <w:r>
-        <w:t xml:space="preserve">OpenStreetMap Wiki. (n.d.). Overpass API; Key:wheelchair. https://wiki.openstreetmap.org/wiki/Overpass_API</w:t>
+        <w:t xml:space="preserve">OASIS. (2006). Web Services Security UsernameToken Profile 1.1. https://docs.oasis-open.org/wss/v1.1/</w:t>
       </w:r>
     </w:p>
     <w:p>
@@ -30164,7 +30496,7 @@
         <w:ind w:left="720" w:hanging="720"/>
       </w:pPr>
       <w:r>
-        <w:t xml:space="preserve">PHP Group. (n.d.). SOAP extension (SoapServer, SoapClient). https://www.php.net/manual/en/book.soap.php</w:t>
+        <w:t xml:space="preserve">OpenJS Foundation. (n.d.). Jest documentation. https://jestjs.io/</w:t>
       </w:r>
     </w:p>
     <w:p>
@@ -30173,7 +30505,7 @@
         <w:ind w:left="720" w:hanging="720"/>
       </w:pPr>
       <w:r>
-        <w:t xml:space="preserve">Postman. (n.d.). Writing tests and running collections with Newman. https://learning.postman.com/docs/</w:t>
+        <w:t xml:space="preserve">OpenStreetMap Foundation. (n.d.). Nominatim usage policy. https://operations.osmfoundation.org/policies/nominatim/</w:t>
       </w:r>
     </w:p>
     <w:p>
@@ -30182,7 +30514,7 @@
         <w:ind w:left="720" w:hanging="720"/>
       </w:pPr>
       <w:r>
-        <w:t xml:space="preserve">PSGC API. (n.d.). Philippine Standard Geographic Code API. https://psgc.gitlab.io/api/</w:t>
+        <w:t xml:space="preserve">OpenStreetMap Wiki. (n.d.). Overpass API; Key:wheelchair. https://wiki.openstreetmap.org/wiki/Overpass_API</w:t>
       </w:r>
     </w:p>
     <w:p>
@@ -30191,7 +30523,7 @@
         <w:ind w:left="720" w:hanging="720"/>
       </w:pPr>
       <w:r>
-        <w:t xml:space="preserve">PWD-E. (n.d.). PWD-E: Future begins today. Retrieved September 28, 2026, from https://pwd-e.com/home/</w:t>
+        <w:t xml:space="preserve">Oxc Project. (n.d.). Oxlint linter. https://oxc.rs/docs/guide/usage/linter</w:t>
       </w:r>
     </w:p>
     <w:p>
@@ -30200,7 +30532,7 @@
         <w:ind w:left="720" w:hanging="720"/>
       </w:pPr>
       <w:r>
-        <w:t xml:space="preserve">Railway. (n.d.). Private networking. https://docs.railway.com/</w:t>
+        <w:t xml:space="preserve">PHP Group. (n.d.). SOAP extension (SoapServer, SoapClient). https://www.php.net/manual/en/book.soap.php</w:t>
       </w:r>
     </w:p>
     <w:p>
@@ -30209,7 +30541,7 @@
         <w:ind w:left="720" w:hanging="720"/>
       </w:pPr>
       <w:r>
-        <w:t xml:space="preserve">Rappler. (2023). Still a long road ahead: PWDs struggle to join Philippine workforce. https://www.rappler.com/newsbreak/in-depth/persons-with-disability-struggle-philippine-workforce/</w:t>
+        <w:t xml:space="preserve">Postman. (n.d.). Writing tests and running collections with Newman. https://learning.postman.com/docs/</w:t>
       </w:r>
     </w:p>
     <w:p>
@@ -30218,7 +30550,7 @@
         <w:ind w:left="720" w:hanging="720"/>
       </w:pPr>
       <w:r>
-        <w:t xml:space="preserve">Republic Act No. 7277. (1992). Magna Carta for Disabled Persons. Official Gazette of the Republic of the Philippines.</w:t>
+        <w:t xml:space="preserve">PSGC API. (n.d.). Philippine Standard Geographic Code API. https://psgc.gitlab.io/api/</w:t>
       </w:r>
     </w:p>
     <w:p>
@@ -30227,7 +30559,7 @@
         <w:ind w:left="720" w:hanging="720"/>
       </w:pPr>
       <w:r>
-        <w:t xml:space="preserve">Republic Act No. 10173. (2012). Data Privacy Act of 2012. Official Gazette of the Republic of the Philippines.</w:t>
+        <w:t xml:space="preserve">PWD-E. (n.d.). PWD-E: Future begins today. Retrieved September 28, 2026, from https://pwd-e.com/home/</w:t>
       </w:r>
     </w:p>
     <w:p>
@@ -30236,7 +30568,7 @@
         <w:ind w:left="720" w:hanging="720"/>
       </w:pPr>
       <w:r>
-        <w:t xml:space="preserve">Republic Act No. 10524. (2013). An Act expanding the positions reserved for persons with disability, amending Republic Act No. 7277. Official Gazette of the Republic of the Philippines.</w:t>
+        <w:t xml:space="preserve">Railway. (n.d.). Private networking. https://docs.railway.com/</w:t>
       </w:r>
     </w:p>
     <w:p>
@@ -30245,7 +30577,7 @@
         <w:ind w:left="720" w:hanging="720"/>
       </w:pPr>
       <w:r>
-        <w:t xml:space="preserve">Respicio &amp; Co. (n.d.). PWD right to reasonable accommodation in the workplace (Philippines). https://www.lawyer-philippines.com/</w:t>
+        <w:t xml:space="preserve">Rappler. (2023). Still a long road ahead: PWDs struggle to join Philippine workforce. https://www.rappler.com/newsbreak/in-depth/persons-with-disability-struggle-philippine-workforce/</w:t>
       </w:r>
     </w:p>
     <w:p>
@@ -30254,7 +30586,7 @@
         <w:ind w:left="720" w:hanging="720"/>
       </w:pPr>
       <w:r>
-        <w:t xml:space="preserve">SDDirect. (2023). Disability inclusion in the Philippines (Disability Inclusion Helpdesk Report No. 61). https://sddirect.org.uk/</w:t>
+        <w:t xml:space="preserve">Remix Software. (n.d.). React Router documentation (version 7). https://reactrouter.com/</w:t>
       </w:r>
     </w:p>
     <w:p>
@@ -30263,7 +30595,7 @@
         <w:ind w:left="720" w:hanging="720"/>
       </w:pPr>
       <w:r>
-        <w:t xml:space="preserve">United Nations. (n.d.). Goal 8: Promote sustained, inclusive and sustainable economic growth, full and productive employment and decent work for all. https://sdgs.un.org/goals/goal8</w:t>
+        <w:t xml:space="preserve">Republic Act No. 7277. (1992). Magna Carta for Disabled Persons. Official Gazette of the Republic of the Philippines.</w:t>
       </w:r>
     </w:p>
     <w:p>
@@ -30272,7 +30604,7 @@
         <w:ind w:left="720" w:hanging="720"/>
       </w:pPr>
       <w:r>
-        <w:t xml:space="preserve">Vercel. (n.d.). Vite on Vercel. https://vercel.com/docs</w:t>
+        <w:t xml:space="preserve">Republic Act No. 10173. (2012). Data Privacy Act of 2012. Official Gazette of the Republic of the Philippines.</w:t>
       </w:r>
     </w:p>
     <w:p>
@@ -30281,7 +30613,7 @@
         <w:ind w:left="720" w:hanging="720"/>
       </w:pPr>
       <w:r>
-        <w:t xml:space="preserve">W3C. (2007). SOAP Version 1.2 and Web Services Description Language (WSDL) 1.1 notes. https://www.w3.org/TR/wsdl</w:t>
+        <w:t xml:space="preserve">Republic Act No. 10524. (2013). An Act expanding the positions reserved for persons with disability, amending Republic Act No. 7277. Official Gazette of the Republic of the Philippines.</w:t>
       </w:r>
     </w:p>
     <w:p>
@@ -30290,6 +30622,69 @@
         <w:ind w:left="720" w:hanging="720"/>
       </w:pPr>
       <w:r>
+        <w:t xml:space="preserve">Respicio &amp; Co. (n.d.). PWD right to reasonable accommodation in the workplace (Philippines). https://www.lawyer-philippines.com/</w:t>
+      </w:r>
+    </w:p>
+    <w:p>
+      <w:pPr>
+        <w:spacing w:after="100"/>
+        <w:ind w:left="720" w:hanging="720"/>
+      </w:pPr>
+      <w:r>
+        <w:t xml:space="preserve">SDDirect. (2023). Disability inclusion in the Philippines (Disability Inclusion Helpdesk Report No. 61). https://sddirect.org.uk/</w:t>
+      </w:r>
+    </w:p>
+    <w:p>
+      <w:pPr>
+        <w:spacing w:after="100"/>
+        <w:ind w:left="720" w:hanging="720"/>
+      </w:pPr>
+      <w:r>
+        <w:t xml:space="preserve">Testing Library. (n.d.). React Testing Library. https://testing-library.com/docs/react-testing-library/intro/</w:t>
+      </w:r>
+    </w:p>
+    <w:p>
+      <w:pPr>
+        <w:spacing w:after="100"/>
+        <w:ind w:left="720" w:hanging="720"/>
+      </w:pPr>
+      <w:r>
+        <w:t xml:space="preserve">United Nations. (n.d.). Goal 8: Promote sustained, inclusive and sustainable economic growth, full and productive employment and decent work for all. https://sdgs.un.org/goals/goal8</w:t>
+      </w:r>
+    </w:p>
+    <w:p>
+      <w:pPr>
+        <w:spacing w:after="100"/>
+        <w:ind w:left="720" w:hanging="720"/>
+      </w:pPr>
+      <w:r>
+        <w:t xml:space="preserve">Vercel. (n.d.). Vite on Vercel. https://vercel.com/docs</w:t>
+      </w:r>
+    </w:p>
+    <w:p>
+      <w:pPr>
+        <w:spacing w:after="100"/>
+        <w:ind w:left="720" w:hanging="720"/>
+      </w:pPr>
+      <w:r>
+        <w:t xml:space="preserve">Vitest. (n.d.). Vitest documentation. https://vitest.dev/</w:t>
+      </w:r>
+    </w:p>
+    <w:p>
+      <w:pPr>
+        <w:spacing w:after="100"/>
+        <w:ind w:left="720" w:hanging="720"/>
+      </w:pPr>
+      <w:r>
+        <w:t xml:space="preserve">W3C. (2007). SOAP Version 1.2 and Web Services Description Language (WSDL) 1.1 notes. https://www.w3.org/TR/wsdl</w:t>
+      </w:r>
+    </w:p>
+    <w:p>
+      <w:pPr>
+        <w:spacing w:after="100"/>
+        <w:ind w:left="720" w:hanging="720"/>
+      </w:pPr>
+      <w:r>
         <w:t xml:space="preserve">W3C. (2018). Web Content Accessibility Guidelines (WCAG) 2.1. https://www.w3.org/TR/WCAG21/</w:t>
       </w:r>
     </w:p>
@@ -30328,13 +30723,16 @@
         <w:t xml:space="preserve">{GATEWAY}/api</w:t>
       </w:r>
       <w:r>
-        <w:t xml:space="preserve">. Access: P = public, C = candidate, E = employer, A = administrator, S = internal service key. </w:t>
+        <w:t xml:space="preserve">. Access: P = public, C = candidate, E = employer, A = administrator, S = internal service key. The complete machine-readable contract (request and response schemas, error codes, enums) is </w:t>
       </w:r>
       <w:r>
         <w:rPr>
-          <w:highlight w:val="yellow"/>
+          <w:rFonts w:ascii="Consolas" w:cs="Consolas" w:eastAsia="Consolas" w:hAnsi="Consolas"/>
         </w:rPr>
-        <w:t xml:space="preserve">[Attach or link the generated OpenAPI file, e.g., docs/openapi.yaml.]</w:t>
+        <w:t xml:space="preserve">docs/openapi.yaml</w:t>
+      </w:r>
+      <w:r>
+        <w:t xml:space="preserve"> (OpenAPI 3.1) in the repository.</w:t>
       </w:r>
     </w:p>
     <w:tbl>
@@ -31256,7 +31654,7 @@
                 <w:sz w:val="15"/>
                 <w:szCs w:val="15"/>
               </w:rPr>
-              <w:t xml:space="preserve">Upload PDF résumé</w:t>
+              <w:t xml:space="preserve">Upload PDF résumé (max 5 MB)</w:t>
             </w:r>
           </w:p>
         </w:tc>
@@ -31287,7 +31685,7 @@
                 <w:sz w:val="15"/>
                 <w:szCs w:val="15"/>
               </w:rPr>
-              <w:t xml:space="preserve">M3 Company</w:t>
+              <w:t xml:space="preserve">M2 Profile</w:t>
             </w:r>
           </w:p>
         </w:tc>
@@ -31316,7 +31714,7 @@
                 <w:sz w:val="15"/>
                 <w:szCs w:val="15"/>
               </w:rPr>
-              <w:t xml:space="preserve">GET, PUT</w:t>
+              <w:t xml:space="preserve">GET</w:t>
             </w:r>
           </w:p>
         </w:tc>
@@ -31345,7 +31743,7 @@
                 <w:sz w:val="15"/>
                 <w:szCs w:val="15"/>
               </w:rPr>
-              <w:t xml:space="preserve">/employer/company</w:t>
+              <w:t xml:space="preserve">/resumes/{id}?expires=&amp;signature=</w:t>
             </w:r>
           </w:p>
         </w:tc>
@@ -31374,7 +31772,7 @@
                 <w:sz w:val="15"/>
                 <w:szCs w:val="15"/>
               </w:rPr>
-              <w:t xml:space="preserve">E</w:t>
+              <w:t xml:space="preserve">P (signed link)</w:t>
             </w:r>
           </w:p>
         </w:tc>
@@ -31403,7 +31801,7 @@
                 <w:sz w:val="15"/>
                 <w:szCs w:val="15"/>
               </w:rPr>
-              <w:t xml:space="preserve">Own company profile</w:t>
+              <w:t xml:space="preserve">Open résumé PDF (link valid 30 min)</w:t>
             </w:r>
           </w:p>
         </w:tc>
@@ -31463,7 +31861,7 @@
                 <w:sz w:val="15"/>
                 <w:szCs w:val="15"/>
               </w:rPr>
-              <w:t xml:space="preserve">GET</w:t>
+              <w:t xml:space="preserve">GET, PUT</w:t>
             </w:r>
           </w:p>
         </w:tc>
@@ -31492,7 +31890,7 @@
                 <w:sz w:val="15"/>
                 <w:szCs w:val="15"/>
               </w:rPr>
-              <w:t xml:space="preserve">/employers/{id}</w:t>
+              <w:t xml:space="preserve">/employer/company</w:t>
             </w:r>
           </w:p>
         </w:tc>
@@ -31521,7 +31919,7 @@
                 <w:sz w:val="15"/>
                 <w:szCs w:val="15"/>
               </w:rPr>
-              <w:t xml:space="preserve">P</w:t>
+              <w:t xml:space="preserve">E</w:t>
             </w:r>
           </w:p>
         </w:tc>
@@ -31550,7 +31948,7 @@
                 <w:sz w:val="15"/>
                 <w:szCs w:val="15"/>
               </w:rPr>
-              <w:t xml:space="preserve">Public employer page</w:t>
+              <w:t xml:space="preserve">Own company profile</w:t>
             </w:r>
           </w:p>
         </w:tc>
@@ -31610,7 +32008,7 @@
                 <w:sz w:val="15"/>
                 <w:szCs w:val="15"/>
               </w:rPr>
-              <w:t xml:space="preserve">PATCH</w:t>
+              <w:t xml:space="preserve">GET</w:t>
             </w:r>
           </w:p>
         </w:tc>
@@ -31639,7 +32037,7 @@
                 <w:sz w:val="15"/>
                 <w:szCs w:val="15"/>
               </w:rPr>
-              <w:t xml:space="preserve">/admin/employers/{id}/verify</w:t>
+              <w:t xml:space="preserve">/employers/{id}</w:t>
             </w:r>
           </w:p>
         </w:tc>
@@ -31668,7 +32066,7 @@
                 <w:sz w:val="15"/>
                 <w:szCs w:val="15"/>
               </w:rPr>
-              <w:t xml:space="preserve">A</w:t>
+              <w:t xml:space="preserve">P</w:t>
             </w:r>
           </w:p>
         </w:tc>
@@ -31697,7 +32095,7 @@
                 <w:sz w:val="15"/>
                 <w:szCs w:val="15"/>
               </w:rPr>
-              <w:t xml:space="preserve">check (SOAP) / approve / reject</w:t>
+              <w:t xml:space="preserve">Public employer page</w:t>
             </w:r>
           </w:p>
         </w:tc>
@@ -31728,7 +32126,7 @@
                 <w:sz w:val="15"/>
                 <w:szCs w:val="15"/>
               </w:rPr>
-              <w:t xml:space="preserve">M4 Postings</w:t>
+              <w:t xml:space="preserve">M3 Company</w:t>
             </w:r>
           </w:p>
         </w:tc>
@@ -31786,7 +32184,7 @@
                 <w:sz w:val="15"/>
                 <w:szCs w:val="15"/>
               </w:rPr>
-              <w:t xml:space="preserve">/employer/job-postings</w:t>
+              <w:t xml:space="preserve">/employers/{id}/logo</w:t>
             </w:r>
           </w:p>
         </w:tc>
@@ -31815,7 +32213,7 @@
                 <w:sz w:val="15"/>
                 <w:szCs w:val="15"/>
               </w:rPr>
-              <w:t xml:space="preserve">E</w:t>
+              <w:t xml:space="preserve">P</w:t>
             </w:r>
           </w:p>
         </w:tc>
@@ -31844,7 +32242,7 @@
                 <w:sz w:val="15"/>
                 <w:szCs w:val="15"/>
               </w:rPr>
-              <w:t xml:space="preserve">Own postings</w:t>
+              <w:t xml:space="preserve">Company logo (PNG/JPG/WebP, max 2 MB)</w:t>
             </w:r>
           </w:p>
         </w:tc>
@@ -31875,7 +32273,7 @@
                 <w:sz w:val="15"/>
                 <w:szCs w:val="15"/>
               </w:rPr>
-              <w:t xml:space="preserve">M4 Postings</w:t>
+              <w:t xml:space="preserve">M3 Company</w:t>
             </w:r>
           </w:p>
         </w:tc>
@@ -31904,7 +32302,7 @@
                 <w:sz w:val="15"/>
                 <w:szCs w:val="15"/>
               </w:rPr>
-              <w:t xml:space="preserve">POST</w:t>
+              <w:t xml:space="preserve">GET</w:t>
             </w:r>
           </w:p>
         </w:tc>
@@ -31933,7 +32331,7 @@
                 <w:sz w:val="15"/>
                 <w:szCs w:val="15"/>
               </w:rPr>
-              <w:t xml:space="preserve">/job-postings</w:t>
+              <w:t xml:space="preserve">/admin/employers, /admin/employers/{id}</w:t>
             </w:r>
           </w:p>
         </w:tc>
@@ -31962,7 +32360,7 @@
                 <w:sz w:val="15"/>
                 <w:szCs w:val="15"/>
               </w:rPr>
-              <w:t xml:space="preserve">E</w:t>
+              <w:t xml:space="preserve">A</w:t>
             </w:r>
           </w:p>
         </w:tc>
@@ -31991,7 +32389,7 @@
                 <w:sz w:val="15"/>
                 <w:szCs w:val="15"/>
               </w:rPr>
-              <w:t xml:space="preserve">Create</w:t>
+              <w:t xml:space="preserve">Verification queue / details with latest registry check</w:t>
             </w:r>
           </w:p>
         </w:tc>
@@ -32022,7 +32420,7 @@
                 <w:sz w:val="15"/>
                 <w:szCs w:val="15"/>
               </w:rPr>
-              <w:t xml:space="preserve">M4 Postings</w:t>
+              <w:t xml:space="preserve">M3 Company</w:t>
             </w:r>
           </w:p>
         </w:tc>
@@ -32051,7 +32449,7 @@
                 <w:sz w:val="15"/>
                 <w:szCs w:val="15"/>
               </w:rPr>
-              <w:t xml:space="preserve">PUT, DELETE</w:t>
+              <w:t xml:space="preserve">PATCH</w:t>
             </w:r>
           </w:p>
         </w:tc>
@@ -32080,7 +32478,7 @@
                 <w:sz w:val="15"/>
                 <w:szCs w:val="15"/>
               </w:rPr>
-              <w:t xml:space="preserve">/job-postings/{id}</w:t>
+              <w:t xml:space="preserve">/admin/employers/{id}/verify</w:t>
             </w:r>
           </w:p>
         </w:tc>
@@ -32109,7 +32507,7 @@
                 <w:sz w:val="15"/>
                 <w:szCs w:val="15"/>
               </w:rPr>
-              <w:t xml:space="preserve">E (owner)</w:t>
+              <w:t xml:space="preserve">A</w:t>
             </w:r>
           </w:p>
         </w:tc>
@@ -32138,7 +32536,7 @@
                 <w:sz w:val="15"/>
                 <w:szCs w:val="15"/>
               </w:rPr>
-              <w:t xml:space="preserve">Update / soft-delete</w:t>
+              <w:t xml:space="preserve">check (SOAP) / approve / reject</w:t>
             </w:r>
           </w:p>
         </w:tc>
@@ -32198,7 +32596,7 @@
                 <w:sz w:val="15"/>
                 <w:szCs w:val="15"/>
               </w:rPr>
-              <w:t xml:space="preserve">PATCH</w:t>
+              <w:t xml:space="preserve">GET</w:t>
             </w:r>
           </w:p>
         </w:tc>
@@ -32227,7 +32625,7 @@
                 <w:sz w:val="15"/>
                 <w:szCs w:val="15"/>
               </w:rPr>
-              <w:t xml:space="preserve">/job-postings/{id}/status</w:t>
+              <w:t xml:space="preserve">/employer/job-postings</w:t>
             </w:r>
           </w:p>
         </w:tc>
@@ -32256,7 +32654,7 @@
                 <w:sz w:val="15"/>
                 <w:szCs w:val="15"/>
               </w:rPr>
-              <w:t xml:space="preserve">E (owner)</w:t>
+              <w:t xml:space="preserve">E</w:t>
             </w:r>
           </w:p>
         </w:tc>
@@ -32285,7 +32683,7 @@
                 <w:sz w:val="15"/>
                 <w:szCs w:val="15"/>
               </w:rPr>
-              <w:t xml:space="preserve">Close / reopen</w:t>
+              <w:t xml:space="preserve">Own postings</w:t>
             </w:r>
           </w:p>
         </w:tc>
@@ -32345,7 +32743,7 @@
                 <w:sz w:val="15"/>
                 <w:szCs w:val="15"/>
               </w:rPr>
-              <w:t xml:space="preserve">PATCH</w:t>
+              <w:t xml:space="preserve">POST</w:t>
             </w:r>
           </w:p>
         </w:tc>
@@ -32374,7 +32772,7 @@
                 <w:sz w:val="15"/>
                 <w:szCs w:val="15"/>
               </w:rPr>
-              <w:t xml:space="preserve">/admin/job-postings/{id}/approve</w:t>
+              <w:t xml:space="preserve">/job-postings</w:t>
             </w:r>
           </w:p>
         </w:tc>
@@ -32403,7 +32801,7 @@
                 <w:sz w:val="15"/>
                 <w:szCs w:val="15"/>
               </w:rPr>
-              <w:t xml:space="preserve">A</w:t>
+              <w:t xml:space="preserve">E</w:t>
             </w:r>
           </w:p>
         </w:tc>
@@ -32432,7 +32830,7 @@
                 <w:sz w:val="15"/>
                 <w:szCs w:val="15"/>
               </w:rPr>
-              <w:t xml:space="preserve">Approve / reject</w:t>
+              <w:t xml:space="preserve">Create</w:t>
             </w:r>
           </w:p>
         </w:tc>
@@ -32463,7 +32861,7 @@
                 <w:sz w:val="15"/>
                 <w:szCs w:val="15"/>
               </w:rPr>
-              <w:t xml:space="preserve">M5 Search</w:t>
+              <w:t xml:space="preserve">M4 Postings</w:t>
             </w:r>
           </w:p>
         </w:tc>
@@ -32492,7 +32890,7 @@
                 <w:sz w:val="15"/>
                 <w:szCs w:val="15"/>
               </w:rPr>
-              <w:t xml:space="preserve">GET</w:t>
+              <w:t xml:space="preserve">PUT, DELETE</w:t>
             </w:r>
           </w:p>
         </w:tc>
@@ -32521,7 +32919,7 @@
                 <w:sz w:val="15"/>
                 <w:szCs w:val="15"/>
               </w:rPr>
-              <w:t xml:space="preserve">/job-postings?q=&amp;category=&amp;accommodations[]=&amp;match=1&amp;sort=&amp;page=</w:t>
+              <w:t xml:space="preserve">/job-postings/{id}</w:t>
             </w:r>
           </w:p>
         </w:tc>
@@ -32550,7 +32948,7 @@
                 <w:sz w:val="15"/>
                 <w:szCs w:val="15"/>
               </w:rPr>
-              <w:t xml:space="preserve">P (match: C)</w:t>
+              <w:t xml:space="preserve">E (owner)</w:t>
             </w:r>
           </w:p>
         </w:tc>
@@ -32579,7 +32977,7 @@
                 <w:sz w:val="15"/>
                 <w:szCs w:val="15"/>
               </w:rPr>
-              <w:t xml:space="preserve">Search, filter, match</w:t>
+              <w:t xml:space="preserve">Update / soft-delete</w:t>
             </w:r>
           </w:p>
         </w:tc>
@@ -32610,7 +33008,7 @@
                 <w:sz w:val="15"/>
                 <w:szCs w:val="15"/>
               </w:rPr>
-              <w:t xml:space="preserve">M5 Search</w:t>
+              <w:t xml:space="preserve">M4 Postings</w:t>
             </w:r>
           </w:p>
         </w:tc>
@@ -32639,7 +33037,7 @@
                 <w:sz w:val="15"/>
                 <w:szCs w:val="15"/>
               </w:rPr>
-              <w:t xml:space="preserve">GET</w:t>
+              <w:t xml:space="preserve">PATCH</w:t>
             </w:r>
           </w:p>
         </w:tc>
@@ -32668,7 +33066,7 @@
                 <w:sz w:val="15"/>
                 <w:szCs w:val="15"/>
               </w:rPr>
-              <w:t xml:space="preserve">/job-postings/{id}</w:t>
+              <w:t xml:space="preserve">/job-postings/{id}/status</w:t>
             </w:r>
           </w:p>
         </w:tc>
@@ -32697,7 +33095,7 @@
                 <w:sz w:val="15"/>
                 <w:szCs w:val="15"/>
               </w:rPr>
-              <w:t xml:space="preserve">P</w:t>
+              <w:t xml:space="preserve">E (owner)</w:t>
             </w:r>
           </w:p>
         </w:tc>
@@ -32726,7 +33124,7 @@
                 <w:sz w:val="15"/>
                 <w:szCs w:val="15"/>
               </w:rPr>
-              <w:t xml:space="preserve">Details (+ match for C)</w:t>
+              <w:t xml:space="preserve">Close / reopen</w:t>
             </w:r>
           </w:p>
         </w:tc>
@@ -32757,7 +33155,7 @@
                 <w:sz w:val="15"/>
                 <w:szCs w:val="15"/>
               </w:rPr>
-              <w:t xml:space="preserve">M5/M11</w:t>
+              <w:t xml:space="preserve">M4 Postings</w:t>
             </w:r>
           </w:p>
         </w:tc>
@@ -32815,7 +33213,7 @@
                 <w:sz w:val="15"/>
                 <w:szCs w:val="15"/>
               </w:rPr>
-              <w:t xml:space="preserve">/categories, /accommodations</w:t>
+              <w:t xml:space="preserve">/admin/job-postings</w:t>
             </w:r>
           </w:p>
         </w:tc>
@@ -32844,7 +33242,7 @@
                 <w:sz w:val="15"/>
                 <w:szCs w:val="15"/>
               </w:rPr>
-              <w:t xml:space="preserve">P</w:t>
+              <w:t xml:space="preserve">A</w:t>
             </w:r>
           </w:p>
         </w:tc>
@@ -32873,7 +33271,7 @@
                 <w:sz w:val="15"/>
                 <w:szCs w:val="15"/>
               </w:rPr>
-              <w:t xml:space="preserve">Filter options</w:t>
+              <w:t xml:space="preserve">Approval queue</w:t>
             </w:r>
           </w:p>
         </w:tc>
@@ -32904,7 +33302,7 @@
                 <w:sz w:val="15"/>
                 <w:szCs w:val="15"/>
               </w:rPr>
-              <w:t xml:space="preserve">M6 Applications</w:t>
+              <w:t xml:space="preserve">M4 Postings</w:t>
             </w:r>
           </w:p>
         </w:tc>
@@ -32933,7 +33331,7 @@
                 <w:sz w:val="15"/>
                 <w:szCs w:val="15"/>
               </w:rPr>
-              <w:t xml:space="preserve">POST</w:t>
+              <w:t xml:space="preserve">PATCH</w:t>
             </w:r>
           </w:p>
         </w:tc>
@@ -32962,7 +33360,7 @@
                 <w:sz w:val="15"/>
                 <w:szCs w:val="15"/>
               </w:rPr>
-              <w:t xml:space="preserve">/job-postings/{id}/applications</w:t>
+              <w:t xml:space="preserve">/admin/job-postings/{id}/approve</w:t>
             </w:r>
           </w:p>
         </w:tc>
@@ -32991,7 +33389,7 @@
                 <w:sz w:val="15"/>
                 <w:szCs w:val="15"/>
               </w:rPr>
-              <w:t xml:space="preserve">C</w:t>
+              <w:t xml:space="preserve">A</w:t>
             </w:r>
           </w:p>
         </w:tc>
@@ -33020,7 +33418,7 @@
                 <w:sz w:val="15"/>
                 <w:szCs w:val="15"/>
               </w:rPr>
-              <w:t xml:space="preserve">Apply</w:t>
+              <w:t xml:space="preserve">Approve / reject (with reason)</w:t>
             </w:r>
           </w:p>
         </w:tc>
@@ -33051,7 +33449,7 @@
                 <w:sz w:val="15"/>
                 <w:szCs w:val="15"/>
               </w:rPr>
-              <w:t xml:space="preserve">M6 Applications</w:t>
+              <w:t xml:space="preserve">M5 Search</w:t>
             </w:r>
           </w:p>
         </w:tc>
@@ -33109,7 +33507,7 @@
                 <w:sz w:val="15"/>
                 <w:szCs w:val="15"/>
               </w:rPr>
-              <w:t xml:space="preserve">/applications, /applications/{id}</w:t>
+              <w:t xml:space="preserve">/job-postings?q=&amp;category=&amp;accommodations[]=&amp;match=1&amp;sort=&amp;page=</w:t>
             </w:r>
           </w:p>
         </w:tc>
@@ -33138,7 +33536,7 @@
                 <w:sz w:val="15"/>
                 <w:szCs w:val="15"/>
               </w:rPr>
-              <w:t xml:space="preserve">C (own) / E (own postings)</w:t>
+              <w:t xml:space="preserve">P (match: C)</w:t>
             </w:r>
           </w:p>
         </w:tc>
@@ -33167,7 +33565,7 @@
                 <w:sz w:val="15"/>
                 <w:szCs w:val="15"/>
               </w:rPr>
-              <w:t xml:space="preserve">List / details</w:t>
+              <w:t xml:space="preserve">Search, filter, match</w:t>
             </w:r>
           </w:p>
         </w:tc>
@@ -33198,7 +33596,7 @@
                 <w:sz w:val="15"/>
                 <w:szCs w:val="15"/>
               </w:rPr>
-              <w:t xml:space="preserve">M6 Applications</w:t>
+              <w:t xml:space="preserve">M5 Search</w:t>
             </w:r>
           </w:p>
         </w:tc>
@@ -33227,7 +33625,7 @@
                 <w:sz w:val="15"/>
                 <w:szCs w:val="15"/>
               </w:rPr>
-              <w:t xml:space="preserve">PATCH</w:t>
+              <w:t xml:space="preserve">GET</w:t>
             </w:r>
           </w:p>
         </w:tc>
@@ -33256,7 +33654,7 @@
                 <w:sz w:val="15"/>
                 <w:szCs w:val="15"/>
               </w:rPr>
-              <w:t xml:space="preserve">/applications/{id}/status</w:t>
+              <w:t xml:space="preserve">/job-postings/{id}</w:t>
             </w:r>
           </w:p>
         </w:tc>
@@ -33285,7 +33683,7 @@
                 <w:sz w:val="15"/>
                 <w:szCs w:val="15"/>
               </w:rPr>
-              <w:t xml:space="preserve">C / E</w:t>
+              <w:t xml:space="preserve">P</w:t>
             </w:r>
           </w:p>
         </w:tc>
@@ -33314,7 +33712,7 @@
                 <w:sz w:val="15"/>
                 <w:szCs w:val="15"/>
               </w:rPr>
-              <w:t xml:space="preserve">Status transition</w:t>
+              <w:t xml:space="preserve">Details (+ match for C)</w:t>
             </w:r>
           </w:p>
         </w:tc>
@@ -33345,7 +33743,7 @@
                 <w:sz w:val="15"/>
                 <w:szCs w:val="15"/>
               </w:rPr>
-              <w:t xml:space="preserve">M7 Feedback</w:t>
+              <w:t xml:space="preserve">M5/M11</w:t>
             </w:r>
           </w:p>
         </w:tc>
@@ -33403,7 +33801,7 @@
                 <w:sz w:val="15"/>
                 <w:szCs w:val="15"/>
               </w:rPr>
-              <w:t xml:space="preserve">/applications/{id}/feedback-form</w:t>
+              <w:t xml:space="preserve">/categories, /accommodations</w:t>
             </w:r>
           </w:p>
         </w:tc>
@@ -33432,7 +33830,7 @@
                 <w:sz w:val="15"/>
                 <w:szCs w:val="15"/>
               </w:rPr>
-              <w:t xml:space="preserve">C (hired)</w:t>
+              <w:t xml:space="preserve">P</w:t>
             </w:r>
           </w:p>
         </w:tc>
@@ -33461,7 +33859,7 @@
                 <w:sz w:val="15"/>
                 <w:szCs w:val="15"/>
               </w:rPr>
-              <w:t xml:space="preserve">Items to rate</w:t>
+              <w:t xml:space="preserve">Filter options</w:t>
             </w:r>
           </w:p>
         </w:tc>
@@ -33492,7 +33890,7 @@
                 <w:sz w:val="15"/>
                 <w:szCs w:val="15"/>
               </w:rPr>
-              <w:t xml:space="preserve">M7 Feedback</w:t>
+              <w:t xml:space="preserve">M6 Applications</w:t>
             </w:r>
           </w:p>
         </w:tc>
@@ -33550,7 +33948,7 @@
                 <w:sz w:val="15"/>
                 <w:szCs w:val="15"/>
               </w:rPr>
-              <w:t xml:space="preserve">/applications/{id}/feedback</w:t>
+              <w:t xml:space="preserve">/job-postings/{id}/applications</w:t>
             </w:r>
           </w:p>
         </w:tc>
@@ -33579,7 +33977,7 @@
                 <w:sz w:val="15"/>
                 <w:szCs w:val="15"/>
               </w:rPr>
-              <w:t xml:space="preserve">C (hired, 30 days)</w:t>
+              <w:t xml:space="preserve">C</w:t>
             </w:r>
           </w:p>
         </w:tc>
@@ -33608,7 +34006,7 @@
                 <w:sz w:val="15"/>
                 <w:szCs w:val="15"/>
               </w:rPr>
-              <w:t xml:space="preserve">Submit</w:t>
+              <w:t xml:space="preserve">Apply</w:t>
             </w:r>
           </w:p>
         </w:tc>
@@ -33639,7 +34037,7 @@
                 <w:sz w:val="15"/>
                 <w:szCs w:val="15"/>
               </w:rPr>
-              <w:t xml:space="preserve">M7 Feedback</w:t>
+              <w:t xml:space="preserve">M6 Applications</w:t>
             </w:r>
           </w:p>
         </w:tc>
@@ -33697,7 +34095,7 @@
                 <w:sz w:val="15"/>
                 <w:szCs w:val="15"/>
               </w:rPr>
-              <w:t xml:space="preserve">/employers/{id}/trust-score</w:t>
+              <w:t xml:space="preserve">/applications, /applications/{id}</w:t>
             </w:r>
           </w:p>
         </w:tc>
@@ -33726,7 +34124,7 @@
                 <w:sz w:val="15"/>
                 <w:szCs w:val="15"/>
               </w:rPr>
-              <w:t xml:space="preserve">P</w:t>
+              <w:t xml:space="preserve">C (own) / E (own postings)</w:t>
             </w:r>
           </w:p>
         </w:tc>
@@ -33755,7 +34153,7 @@
                 <w:sz w:val="15"/>
                 <w:szCs w:val="15"/>
               </w:rPr>
-              <w:t xml:space="preserve">Score and breakdown</w:t>
+              <w:t xml:space="preserve">List / details</w:t>
             </w:r>
           </w:p>
         </w:tc>
@@ -33786,7 +34184,7 @@
                 <w:sz w:val="15"/>
                 <w:szCs w:val="15"/>
               </w:rPr>
-              <w:t xml:space="preserve">M8 Dashboards</w:t>
+              <w:t xml:space="preserve">M6 Applications</w:t>
             </w:r>
           </w:p>
         </w:tc>
@@ -33815,7 +34213,7 @@
                 <w:sz w:val="15"/>
                 <w:szCs w:val="15"/>
               </w:rPr>
-              <w:t xml:space="preserve">GET</w:t>
+              <w:t xml:space="preserve">PATCH</w:t>
             </w:r>
           </w:p>
         </w:tc>
@@ -33844,7 +34242,7 @@
                 <w:sz w:val="15"/>
                 <w:szCs w:val="15"/>
               </w:rPr>
-              <w:t xml:space="preserve">/candidate/dashboard, /employer/dashboard, /admin/dashboard</w:t>
+              <w:t xml:space="preserve">/applications/{id}/status</w:t>
             </w:r>
           </w:p>
         </w:tc>
@@ -33873,7 +34271,7 @@
                 <w:sz w:val="15"/>
                 <w:szCs w:val="15"/>
               </w:rPr>
-              <w:t xml:space="preserve">C / E / A</w:t>
+              <w:t xml:space="preserve">C / E</w:t>
             </w:r>
           </w:p>
         </w:tc>
@@ -33902,7 +34300,7 @@
                 <w:sz w:val="15"/>
                 <w:szCs w:val="15"/>
               </w:rPr>
-              <w:t xml:space="preserve">Summaries</w:t>
+              <w:t xml:space="preserve">Status transition</w:t>
             </w:r>
           </w:p>
         </w:tc>
@@ -33933,7 +34331,7 @@
                 <w:sz w:val="15"/>
                 <w:szCs w:val="15"/>
               </w:rPr>
-              <w:t xml:space="preserve">M9 Notifications</w:t>
+              <w:t xml:space="preserve">M7 Feedback</w:t>
             </w:r>
           </w:p>
         </w:tc>
@@ -33962,7 +34360,7 @@
                 <w:sz w:val="15"/>
                 <w:szCs w:val="15"/>
               </w:rPr>
-              <w:t xml:space="preserve">GET, PATCH</w:t>
+              <w:t xml:space="preserve">GET</w:t>
             </w:r>
           </w:p>
         </w:tc>
@@ -33991,7 +34389,7 @@
                 <w:sz w:val="15"/>
                 <w:szCs w:val="15"/>
               </w:rPr>
-              <w:t xml:space="preserve">/notifications, /notifications/{id}/read, /notifications/read-all</w:t>
+              <w:t xml:space="preserve">/applications/{id}/feedback-form</w:t>
             </w:r>
           </w:p>
         </w:tc>
@@ -34020,7 +34418,7 @@
                 <w:sz w:val="15"/>
                 <w:szCs w:val="15"/>
               </w:rPr>
-              <w:t xml:space="preserve">C / E</w:t>
+              <w:t xml:space="preserve">C (hired)</w:t>
             </w:r>
           </w:p>
         </w:tc>
@@ -34049,7 +34447,7 @@
                 <w:sz w:val="15"/>
                 <w:szCs w:val="15"/>
               </w:rPr>
-              <w:t xml:space="preserve">List, mark read</w:t>
+              <w:t xml:space="preserve">Items to rate</w:t>
             </w:r>
           </w:p>
         </w:tc>
@@ -34080,7 +34478,7 @@
                 <w:sz w:val="15"/>
                 <w:szCs w:val="15"/>
               </w:rPr>
-              <w:t xml:space="preserve">M10 Moderation</w:t>
+              <w:t xml:space="preserve">M7 Feedback</w:t>
             </w:r>
           </w:p>
         </w:tc>
@@ -34109,7 +34507,7 @@
                 <w:sz w:val="15"/>
                 <w:szCs w:val="15"/>
               </w:rPr>
-              <w:t xml:space="preserve">GET, PATCH</w:t>
+              <w:t xml:space="preserve">POST</w:t>
             </w:r>
           </w:p>
         </w:tc>
@@ -34138,7 +34536,7 @@
                 <w:sz w:val="15"/>
                 <w:szCs w:val="15"/>
               </w:rPr>
-              <w:t xml:space="preserve">/admin/users, /admin/users/{id}/suspend</w:t>
+              <w:t xml:space="preserve">/applications/{id}/feedback</w:t>
             </w:r>
           </w:p>
         </w:tc>
@@ -34167,7 +34565,7 @@
                 <w:sz w:val="15"/>
                 <w:szCs w:val="15"/>
               </w:rPr>
-              <w:t xml:space="preserve">A</w:t>
+              <w:t xml:space="preserve">C (hired, 30 days)</w:t>
             </w:r>
           </w:p>
         </w:tc>
@@ -34196,7 +34594,7 @@
                 <w:sz w:val="15"/>
                 <w:szCs w:val="15"/>
               </w:rPr>
-              <w:t xml:space="preserve">Users</w:t>
+              <w:t xml:space="preserve">Submit</w:t>
             </w:r>
           </w:p>
         </w:tc>
@@ -34227,7 +34625,7 @@
                 <w:sz w:val="15"/>
                 <w:szCs w:val="15"/>
               </w:rPr>
-              <w:t xml:space="preserve">M10 Moderation</w:t>
+              <w:t xml:space="preserve">M7 Feedback</w:t>
             </w:r>
           </w:p>
         </w:tc>
@@ -34256,7 +34654,7 @@
                 <w:sz w:val="15"/>
                 <w:szCs w:val="15"/>
               </w:rPr>
-              <w:t xml:space="preserve">POST</w:t>
+              <w:t xml:space="preserve">GET</w:t>
             </w:r>
           </w:p>
         </w:tc>
@@ -34285,7 +34683,7 @@
                 <w:sz w:val="15"/>
                 <w:szCs w:val="15"/>
               </w:rPr>
-              <w:t xml:space="preserve">/job-postings/{id}/reports</w:t>
+              <w:t xml:space="preserve">/employers/{id}/trust-score</w:t>
             </w:r>
           </w:p>
         </w:tc>
@@ -34314,7 +34712,7 @@
                 <w:sz w:val="15"/>
                 <w:szCs w:val="15"/>
               </w:rPr>
-              <w:t xml:space="preserve">C</w:t>
+              <w:t xml:space="preserve">P</w:t>
             </w:r>
           </w:p>
         </w:tc>
@@ -34343,7 +34741,7 @@
                 <w:sz w:val="15"/>
                 <w:szCs w:val="15"/>
               </w:rPr>
-              <w:t xml:space="preserve">Report posting</w:t>
+              <w:t xml:space="preserve">Score and breakdown</w:t>
             </w:r>
           </w:p>
         </w:tc>
@@ -34374,7 +34772,7 @@
                 <w:sz w:val="15"/>
                 <w:szCs w:val="15"/>
               </w:rPr>
-              <w:t xml:space="preserve">M10 Moderation</w:t>
+              <w:t xml:space="preserve">M8 Dashboards</w:t>
             </w:r>
           </w:p>
         </w:tc>
@@ -34403,7 +34801,7 @@
                 <w:sz w:val="15"/>
                 <w:szCs w:val="15"/>
               </w:rPr>
-              <w:t xml:space="preserve">GET, PATCH</w:t>
+              <w:t xml:space="preserve">GET</w:t>
             </w:r>
           </w:p>
         </w:tc>
@@ -34432,7 +34830,7 @@
                 <w:sz w:val="15"/>
                 <w:szCs w:val="15"/>
               </w:rPr>
-              <w:t xml:space="preserve">/admin/reports, /admin/reports/{id}</w:t>
+              <w:t xml:space="preserve">/candidate/dashboard, /employer/dashboard, /admin/dashboard</w:t>
             </w:r>
           </w:p>
         </w:tc>
@@ -34461,7 +34859,7 @@
                 <w:sz w:val="15"/>
                 <w:szCs w:val="15"/>
               </w:rPr>
-              <w:t xml:space="preserve">A</w:t>
+              <w:t xml:space="preserve">C / E / A</w:t>
             </w:r>
           </w:p>
         </w:tc>
@@ -34490,7 +34888,7 @@
                 <w:sz w:val="15"/>
                 <w:szCs w:val="15"/>
               </w:rPr>
-              <w:t xml:space="preserve">Review reports</w:t>
+              <w:t xml:space="preserve">Summaries</w:t>
             </w:r>
           </w:p>
         </w:tc>
@@ -34521,7 +34919,7 @@
                 <w:sz w:val="15"/>
                 <w:szCs w:val="15"/>
               </w:rPr>
-              <w:t xml:space="preserve">M10 Moderation</w:t>
+              <w:t xml:space="preserve">M9 Notifications</w:t>
             </w:r>
           </w:p>
         </w:tc>
@@ -34550,7 +34948,7 @@
                 <w:sz w:val="15"/>
                 <w:szCs w:val="15"/>
               </w:rPr>
-              <w:t xml:space="preserve">PATCH</w:t>
+              <w:t xml:space="preserve">GET, PATCH</w:t>
             </w:r>
           </w:p>
         </w:tc>
@@ -34579,7 +34977,7 @@
                 <w:sz w:val="15"/>
                 <w:szCs w:val="15"/>
               </w:rPr>
-              <w:t xml:space="preserve">/admin/feedback/{id}/hide</w:t>
+              <w:t xml:space="preserve">/notifications, /notifications/{id}/read, /notifications/read-all</w:t>
             </w:r>
           </w:p>
         </w:tc>
@@ -34608,7 +35006,7 @@
                 <w:sz w:val="15"/>
                 <w:szCs w:val="15"/>
               </w:rPr>
-              <w:t xml:space="preserve">A</w:t>
+              <w:t xml:space="preserve">C / E</w:t>
             </w:r>
           </w:p>
         </w:tc>
@@ -34637,7 +35035,7 @@
                 <w:sz w:val="15"/>
                 <w:szCs w:val="15"/>
               </w:rPr>
-              <w:t xml:space="preserve">Hide feedback</w:t>
+              <w:t xml:space="preserve">List, mark read</w:t>
             </w:r>
           </w:p>
         </w:tc>
@@ -34668,7 +35066,7 @@
                 <w:sz w:val="15"/>
                 <w:szCs w:val="15"/>
               </w:rPr>
-              <w:t xml:space="preserve">M11 Master data</w:t>
+              <w:t xml:space="preserve">M10 Moderation</w:t>
             </w:r>
           </w:p>
         </w:tc>
@@ -34697,7 +35095,7 @@
                 <w:sz w:val="15"/>
                 <w:szCs w:val="15"/>
               </w:rPr>
-              <w:t xml:space="preserve">POST, PUT, DELETE</w:t>
+              <w:t xml:space="preserve">GET, PATCH</w:t>
             </w:r>
           </w:p>
         </w:tc>
@@ -34726,7 +35124,7 @@
                 <w:sz w:val="15"/>
                 <w:szCs w:val="15"/>
               </w:rPr>
-              <w:t xml:space="preserve">/admin/categories/{id}, /admin/accommodations/{id}</w:t>
+              <w:t xml:space="preserve">/admin/users, /admin/users/{id}/suspend</w:t>
             </w:r>
           </w:p>
         </w:tc>
@@ -34784,7 +35182,889 @@
                 <w:sz w:val="15"/>
                 <w:szCs w:val="15"/>
               </w:rPr>
-              <w:t xml:space="preserve">Manage lists</w:t>
+              <w:t xml:space="preserve">Users</w:t>
+            </w:r>
+          </w:p>
+        </w:tc>
+      </w:tr>
+      <w:tr>
+        <w:tc>
+          <w:tcPr>
+            <w:tcW w:type="dxa" w:w="1600"/>
+            <w:tcBorders>
+              <w:top w:val="single" w:color="7F7F7F" w:sz="4"/>
+              <w:left w:val="single" w:color="7F7F7F" w:sz="4"/>
+              <w:bottom w:val="single" w:color="7F7F7F" w:sz="4"/>
+              <w:right w:val="single" w:color="7F7F7F" w:sz="4"/>
+            </w:tcBorders>
+            <w:tcMar>
+              <w:top w:type="dxa" w:w="60"/>
+              <w:left w:type="dxa" w:w="100"/>
+              <w:bottom w:type="dxa" w:w="60"/>
+              <w:right w:type="dxa" w:w="100"/>
+            </w:tcMar>
+          </w:tcPr>
+          <w:p>
+            <w:pPr>
+              <w:spacing w:after="20"/>
+            </w:pPr>
+            <w:r>
+              <w:rPr>
+                <w:sz w:val="15"/>
+                <w:szCs w:val="15"/>
+              </w:rPr>
+              <w:t xml:space="preserve">M10 Moderation</w:t>
+            </w:r>
+          </w:p>
+        </w:tc>
+        <w:tc>
+          <w:tcPr>
+            <w:tcW w:type="dxa" w:w="1300"/>
+            <w:tcBorders>
+              <w:top w:val="single" w:color="7F7F7F" w:sz="4"/>
+              <w:left w:val="single" w:color="7F7F7F" w:sz="4"/>
+              <w:bottom w:val="single" w:color="7F7F7F" w:sz="4"/>
+              <w:right w:val="single" w:color="7F7F7F" w:sz="4"/>
+            </w:tcBorders>
+            <w:tcMar>
+              <w:top w:type="dxa" w:w="60"/>
+              <w:left w:type="dxa" w:w="100"/>
+              <w:bottom w:type="dxa" w:w="60"/>
+              <w:right w:type="dxa" w:w="100"/>
+            </w:tcMar>
+          </w:tcPr>
+          <w:p>
+            <w:pPr>
+              <w:spacing w:after="20"/>
+            </w:pPr>
+            <w:r>
+              <w:rPr>
+                <w:sz w:val="15"/>
+                <w:szCs w:val="15"/>
+              </w:rPr>
+              <w:t xml:space="preserve">POST</w:t>
+            </w:r>
+          </w:p>
+        </w:tc>
+        <w:tc>
+          <w:tcPr>
+            <w:tcW w:type="dxa" w:w="3800"/>
+            <w:tcBorders>
+              <w:top w:val="single" w:color="7F7F7F" w:sz="4"/>
+              <w:left w:val="single" w:color="7F7F7F" w:sz="4"/>
+              <w:bottom w:val="single" w:color="7F7F7F" w:sz="4"/>
+              <w:right w:val="single" w:color="7F7F7F" w:sz="4"/>
+            </w:tcBorders>
+            <w:tcMar>
+              <w:top w:type="dxa" w:w="60"/>
+              <w:left w:type="dxa" w:w="100"/>
+              <w:bottom w:type="dxa" w:w="60"/>
+              <w:right w:type="dxa" w:w="100"/>
+            </w:tcMar>
+          </w:tcPr>
+          <w:p>
+            <w:pPr>
+              <w:spacing w:after="20"/>
+            </w:pPr>
+            <w:r>
+              <w:rPr>
+                <w:sz w:val="15"/>
+                <w:szCs w:val="15"/>
+              </w:rPr>
+              <w:t xml:space="preserve">/job-postings/{id}/reports</w:t>
+            </w:r>
+          </w:p>
+        </w:tc>
+        <w:tc>
+          <w:tcPr>
+            <w:tcW w:type="dxa" w:w="1600"/>
+            <w:tcBorders>
+              <w:top w:val="single" w:color="7F7F7F" w:sz="4"/>
+              <w:left w:val="single" w:color="7F7F7F" w:sz="4"/>
+              <w:bottom w:val="single" w:color="7F7F7F" w:sz="4"/>
+              <w:right w:val="single" w:color="7F7F7F" w:sz="4"/>
+            </w:tcBorders>
+            <w:tcMar>
+              <w:top w:type="dxa" w:w="60"/>
+              <w:left w:type="dxa" w:w="100"/>
+              <w:bottom w:type="dxa" w:w="60"/>
+              <w:right w:type="dxa" w:w="100"/>
+            </w:tcMar>
+          </w:tcPr>
+          <w:p>
+            <w:pPr>
+              <w:spacing w:after="20"/>
+            </w:pPr>
+            <w:r>
+              <w:rPr>
+                <w:sz w:val="15"/>
+                <w:szCs w:val="15"/>
+              </w:rPr>
+              <w:t xml:space="preserve">C</w:t>
+            </w:r>
+          </w:p>
+        </w:tc>
+        <w:tc>
+          <w:tcPr>
+            <w:tcW w:type="dxa" w:w="1780"/>
+            <w:tcBorders>
+              <w:top w:val="single" w:color="7F7F7F" w:sz="4"/>
+              <w:left w:val="single" w:color="7F7F7F" w:sz="4"/>
+              <w:bottom w:val="single" w:color="7F7F7F" w:sz="4"/>
+              <w:right w:val="single" w:color="7F7F7F" w:sz="4"/>
+            </w:tcBorders>
+            <w:tcMar>
+              <w:top w:type="dxa" w:w="60"/>
+              <w:left w:type="dxa" w:w="100"/>
+              <w:bottom w:type="dxa" w:w="60"/>
+              <w:right w:type="dxa" w:w="100"/>
+            </w:tcMar>
+          </w:tcPr>
+          <w:p>
+            <w:pPr>
+              <w:spacing w:after="20"/>
+            </w:pPr>
+            <w:r>
+              <w:rPr>
+                <w:sz w:val="15"/>
+                <w:szCs w:val="15"/>
+              </w:rPr>
+              <w:t xml:space="preserve">Report posting</w:t>
+            </w:r>
+          </w:p>
+        </w:tc>
+      </w:tr>
+      <w:tr>
+        <w:tc>
+          <w:tcPr>
+            <w:tcW w:type="dxa" w:w="1600"/>
+            <w:tcBorders>
+              <w:top w:val="single" w:color="7F7F7F" w:sz="4"/>
+              <w:left w:val="single" w:color="7F7F7F" w:sz="4"/>
+              <w:bottom w:val="single" w:color="7F7F7F" w:sz="4"/>
+              <w:right w:val="single" w:color="7F7F7F" w:sz="4"/>
+            </w:tcBorders>
+            <w:tcMar>
+              <w:top w:type="dxa" w:w="60"/>
+              <w:left w:type="dxa" w:w="100"/>
+              <w:bottom w:type="dxa" w:w="60"/>
+              <w:right w:type="dxa" w:w="100"/>
+            </w:tcMar>
+          </w:tcPr>
+          <w:p>
+            <w:pPr>
+              <w:spacing w:after="20"/>
+            </w:pPr>
+            <w:r>
+              <w:rPr>
+                <w:sz w:val="15"/>
+                <w:szCs w:val="15"/>
+              </w:rPr>
+              <w:t xml:space="preserve">M10 Moderation</w:t>
+            </w:r>
+          </w:p>
+        </w:tc>
+        <w:tc>
+          <w:tcPr>
+            <w:tcW w:type="dxa" w:w="1300"/>
+            <w:tcBorders>
+              <w:top w:val="single" w:color="7F7F7F" w:sz="4"/>
+              <w:left w:val="single" w:color="7F7F7F" w:sz="4"/>
+              <w:bottom w:val="single" w:color="7F7F7F" w:sz="4"/>
+              <w:right w:val="single" w:color="7F7F7F" w:sz="4"/>
+            </w:tcBorders>
+            <w:tcMar>
+              <w:top w:type="dxa" w:w="60"/>
+              <w:left w:type="dxa" w:w="100"/>
+              <w:bottom w:type="dxa" w:w="60"/>
+              <w:right w:type="dxa" w:w="100"/>
+            </w:tcMar>
+          </w:tcPr>
+          <w:p>
+            <w:pPr>
+              <w:spacing w:after="20"/>
+            </w:pPr>
+            <w:r>
+              <w:rPr>
+                <w:sz w:val="15"/>
+                <w:szCs w:val="15"/>
+              </w:rPr>
+              <w:t xml:space="preserve">GET, PATCH</w:t>
+            </w:r>
+          </w:p>
+        </w:tc>
+        <w:tc>
+          <w:tcPr>
+            <w:tcW w:type="dxa" w:w="3800"/>
+            <w:tcBorders>
+              <w:top w:val="single" w:color="7F7F7F" w:sz="4"/>
+              <w:left w:val="single" w:color="7F7F7F" w:sz="4"/>
+              <w:bottom w:val="single" w:color="7F7F7F" w:sz="4"/>
+              <w:right w:val="single" w:color="7F7F7F" w:sz="4"/>
+            </w:tcBorders>
+            <w:tcMar>
+              <w:top w:type="dxa" w:w="60"/>
+              <w:left w:type="dxa" w:w="100"/>
+              <w:bottom w:type="dxa" w:w="60"/>
+              <w:right w:type="dxa" w:w="100"/>
+            </w:tcMar>
+          </w:tcPr>
+          <w:p>
+            <w:pPr>
+              <w:spacing w:after="20"/>
+            </w:pPr>
+            <w:r>
+              <w:rPr>
+                <w:sz w:val="15"/>
+                <w:szCs w:val="15"/>
+              </w:rPr>
+              <w:t xml:space="preserve">/admin/reports, /admin/reports/{id}</w:t>
+            </w:r>
+          </w:p>
+        </w:tc>
+        <w:tc>
+          <w:tcPr>
+            <w:tcW w:type="dxa" w:w="1600"/>
+            <w:tcBorders>
+              <w:top w:val="single" w:color="7F7F7F" w:sz="4"/>
+              <w:left w:val="single" w:color="7F7F7F" w:sz="4"/>
+              <w:bottom w:val="single" w:color="7F7F7F" w:sz="4"/>
+              <w:right w:val="single" w:color="7F7F7F" w:sz="4"/>
+            </w:tcBorders>
+            <w:tcMar>
+              <w:top w:type="dxa" w:w="60"/>
+              <w:left w:type="dxa" w:w="100"/>
+              <w:bottom w:type="dxa" w:w="60"/>
+              <w:right w:type="dxa" w:w="100"/>
+            </w:tcMar>
+          </w:tcPr>
+          <w:p>
+            <w:pPr>
+              <w:spacing w:after="20"/>
+            </w:pPr>
+            <w:r>
+              <w:rPr>
+                <w:sz w:val="15"/>
+                <w:szCs w:val="15"/>
+              </w:rPr>
+              <w:t xml:space="preserve">A</w:t>
+            </w:r>
+          </w:p>
+        </w:tc>
+        <w:tc>
+          <w:tcPr>
+            <w:tcW w:type="dxa" w:w="1780"/>
+            <w:tcBorders>
+              <w:top w:val="single" w:color="7F7F7F" w:sz="4"/>
+              <w:left w:val="single" w:color="7F7F7F" w:sz="4"/>
+              <w:bottom w:val="single" w:color="7F7F7F" w:sz="4"/>
+              <w:right w:val="single" w:color="7F7F7F" w:sz="4"/>
+            </w:tcBorders>
+            <w:tcMar>
+              <w:top w:type="dxa" w:w="60"/>
+              <w:left w:type="dxa" w:w="100"/>
+              <w:bottom w:type="dxa" w:w="60"/>
+              <w:right w:type="dxa" w:w="100"/>
+            </w:tcMar>
+          </w:tcPr>
+          <w:p>
+            <w:pPr>
+              <w:spacing w:after="20"/>
+            </w:pPr>
+            <w:r>
+              <w:rPr>
+                <w:sz w:val="15"/>
+                <w:szCs w:val="15"/>
+              </w:rPr>
+              <w:t xml:space="preserve">Review reports</w:t>
+            </w:r>
+          </w:p>
+        </w:tc>
+      </w:tr>
+      <w:tr>
+        <w:tc>
+          <w:tcPr>
+            <w:tcW w:type="dxa" w:w="1600"/>
+            <w:tcBorders>
+              <w:top w:val="single" w:color="7F7F7F" w:sz="4"/>
+              <w:left w:val="single" w:color="7F7F7F" w:sz="4"/>
+              <w:bottom w:val="single" w:color="7F7F7F" w:sz="4"/>
+              <w:right w:val="single" w:color="7F7F7F" w:sz="4"/>
+            </w:tcBorders>
+            <w:tcMar>
+              <w:top w:type="dxa" w:w="60"/>
+              <w:left w:type="dxa" w:w="100"/>
+              <w:bottom w:type="dxa" w:w="60"/>
+              <w:right w:type="dxa" w:w="100"/>
+            </w:tcMar>
+          </w:tcPr>
+          <w:p>
+            <w:pPr>
+              <w:spacing w:after="20"/>
+            </w:pPr>
+            <w:r>
+              <w:rPr>
+                <w:sz w:val="15"/>
+                <w:szCs w:val="15"/>
+              </w:rPr>
+              <w:t xml:space="preserve">M10 Moderation</w:t>
+            </w:r>
+          </w:p>
+        </w:tc>
+        <w:tc>
+          <w:tcPr>
+            <w:tcW w:type="dxa" w:w="1300"/>
+            <w:tcBorders>
+              <w:top w:val="single" w:color="7F7F7F" w:sz="4"/>
+              <w:left w:val="single" w:color="7F7F7F" w:sz="4"/>
+              <w:bottom w:val="single" w:color="7F7F7F" w:sz="4"/>
+              <w:right w:val="single" w:color="7F7F7F" w:sz="4"/>
+            </w:tcBorders>
+            <w:tcMar>
+              <w:top w:type="dxa" w:w="60"/>
+              <w:left w:type="dxa" w:w="100"/>
+              <w:bottom w:type="dxa" w:w="60"/>
+              <w:right w:type="dxa" w:w="100"/>
+            </w:tcMar>
+          </w:tcPr>
+          <w:p>
+            <w:pPr>
+              <w:spacing w:after="20"/>
+            </w:pPr>
+            <w:r>
+              <w:rPr>
+                <w:sz w:val="15"/>
+                <w:szCs w:val="15"/>
+              </w:rPr>
+              <w:t xml:space="preserve">GET</w:t>
+            </w:r>
+          </w:p>
+        </w:tc>
+        <w:tc>
+          <w:tcPr>
+            <w:tcW w:type="dxa" w:w="3800"/>
+            <w:tcBorders>
+              <w:top w:val="single" w:color="7F7F7F" w:sz="4"/>
+              <w:left w:val="single" w:color="7F7F7F" w:sz="4"/>
+              <w:bottom w:val="single" w:color="7F7F7F" w:sz="4"/>
+              <w:right w:val="single" w:color="7F7F7F" w:sz="4"/>
+            </w:tcBorders>
+            <w:tcMar>
+              <w:top w:type="dxa" w:w="60"/>
+              <w:left w:type="dxa" w:w="100"/>
+              <w:bottom w:type="dxa" w:w="60"/>
+              <w:right w:type="dxa" w:w="100"/>
+            </w:tcMar>
+          </w:tcPr>
+          <w:p>
+            <w:pPr>
+              <w:spacing w:after="20"/>
+            </w:pPr>
+            <w:r>
+              <w:rPr>
+                <w:sz w:val="15"/>
+                <w:szCs w:val="15"/>
+              </w:rPr>
+              <w:t xml:space="preserve">/admin/feedback</w:t>
+            </w:r>
+          </w:p>
+        </w:tc>
+        <w:tc>
+          <w:tcPr>
+            <w:tcW w:type="dxa" w:w="1600"/>
+            <w:tcBorders>
+              <w:top w:val="single" w:color="7F7F7F" w:sz="4"/>
+              <w:left w:val="single" w:color="7F7F7F" w:sz="4"/>
+              <w:bottom w:val="single" w:color="7F7F7F" w:sz="4"/>
+              <w:right w:val="single" w:color="7F7F7F" w:sz="4"/>
+            </w:tcBorders>
+            <w:tcMar>
+              <w:top w:type="dxa" w:w="60"/>
+              <w:left w:type="dxa" w:w="100"/>
+              <w:bottom w:type="dxa" w:w="60"/>
+              <w:right w:type="dxa" w:w="100"/>
+            </w:tcMar>
+          </w:tcPr>
+          <w:p>
+            <w:pPr>
+              <w:spacing w:after="20"/>
+            </w:pPr>
+            <w:r>
+              <w:rPr>
+                <w:sz w:val="15"/>
+                <w:szCs w:val="15"/>
+              </w:rPr>
+              <w:t xml:space="preserve">A</w:t>
+            </w:r>
+          </w:p>
+        </w:tc>
+        <w:tc>
+          <w:tcPr>
+            <w:tcW w:type="dxa" w:w="1780"/>
+            <w:tcBorders>
+              <w:top w:val="single" w:color="7F7F7F" w:sz="4"/>
+              <w:left w:val="single" w:color="7F7F7F" w:sz="4"/>
+              <w:bottom w:val="single" w:color="7F7F7F" w:sz="4"/>
+              <w:right w:val="single" w:color="7F7F7F" w:sz="4"/>
+            </w:tcBorders>
+            <w:tcMar>
+              <w:top w:type="dxa" w:w="60"/>
+              <w:left w:type="dxa" w:w="100"/>
+              <w:bottom w:type="dxa" w:w="60"/>
+              <w:right w:type="dxa" w:w="100"/>
+            </w:tcMar>
+          </w:tcPr>
+          <w:p>
+            <w:pPr>
+              <w:spacing w:after="20"/>
+            </w:pPr>
+            <w:r>
+              <w:rPr>
+                <w:sz w:val="15"/>
+                <w:szCs w:val="15"/>
+              </w:rPr>
+              <w:t xml:space="preserve">Feedback for moderation (anonymous)</w:t>
+            </w:r>
+          </w:p>
+        </w:tc>
+      </w:tr>
+      <w:tr>
+        <w:tc>
+          <w:tcPr>
+            <w:tcW w:type="dxa" w:w="1600"/>
+            <w:tcBorders>
+              <w:top w:val="single" w:color="7F7F7F" w:sz="4"/>
+              <w:left w:val="single" w:color="7F7F7F" w:sz="4"/>
+              <w:bottom w:val="single" w:color="7F7F7F" w:sz="4"/>
+              <w:right w:val="single" w:color="7F7F7F" w:sz="4"/>
+            </w:tcBorders>
+            <w:tcMar>
+              <w:top w:type="dxa" w:w="60"/>
+              <w:left w:type="dxa" w:w="100"/>
+              <w:bottom w:type="dxa" w:w="60"/>
+              <w:right w:type="dxa" w:w="100"/>
+            </w:tcMar>
+          </w:tcPr>
+          <w:p>
+            <w:pPr>
+              <w:spacing w:after="20"/>
+            </w:pPr>
+            <w:r>
+              <w:rPr>
+                <w:sz w:val="15"/>
+                <w:szCs w:val="15"/>
+              </w:rPr>
+              <w:t xml:space="preserve">M10 Moderation</w:t>
+            </w:r>
+          </w:p>
+        </w:tc>
+        <w:tc>
+          <w:tcPr>
+            <w:tcW w:type="dxa" w:w="1300"/>
+            <w:tcBorders>
+              <w:top w:val="single" w:color="7F7F7F" w:sz="4"/>
+              <w:left w:val="single" w:color="7F7F7F" w:sz="4"/>
+              <w:bottom w:val="single" w:color="7F7F7F" w:sz="4"/>
+              <w:right w:val="single" w:color="7F7F7F" w:sz="4"/>
+            </w:tcBorders>
+            <w:tcMar>
+              <w:top w:type="dxa" w:w="60"/>
+              <w:left w:type="dxa" w:w="100"/>
+              <w:bottom w:type="dxa" w:w="60"/>
+              <w:right w:type="dxa" w:w="100"/>
+            </w:tcMar>
+          </w:tcPr>
+          <w:p>
+            <w:pPr>
+              <w:spacing w:after="20"/>
+            </w:pPr>
+            <w:r>
+              <w:rPr>
+                <w:sz w:val="15"/>
+                <w:szCs w:val="15"/>
+              </w:rPr>
+              <w:t xml:space="preserve">PATCH</w:t>
+            </w:r>
+          </w:p>
+        </w:tc>
+        <w:tc>
+          <w:tcPr>
+            <w:tcW w:type="dxa" w:w="3800"/>
+            <w:tcBorders>
+              <w:top w:val="single" w:color="7F7F7F" w:sz="4"/>
+              <w:left w:val="single" w:color="7F7F7F" w:sz="4"/>
+              <w:bottom w:val="single" w:color="7F7F7F" w:sz="4"/>
+              <w:right w:val="single" w:color="7F7F7F" w:sz="4"/>
+            </w:tcBorders>
+            <w:tcMar>
+              <w:top w:type="dxa" w:w="60"/>
+              <w:left w:type="dxa" w:w="100"/>
+              <w:bottom w:type="dxa" w:w="60"/>
+              <w:right w:type="dxa" w:w="100"/>
+            </w:tcMar>
+          </w:tcPr>
+          <w:p>
+            <w:pPr>
+              <w:spacing w:after="20"/>
+            </w:pPr>
+            <w:r>
+              <w:rPr>
+                <w:sz w:val="15"/>
+                <w:szCs w:val="15"/>
+              </w:rPr>
+              <w:t xml:space="preserve">/admin/feedback/{id}/hide</w:t>
+            </w:r>
+          </w:p>
+        </w:tc>
+        <w:tc>
+          <w:tcPr>
+            <w:tcW w:type="dxa" w:w="1600"/>
+            <w:tcBorders>
+              <w:top w:val="single" w:color="7F7F7F" w:sz="4"/>
+              <w:left w:val="single" w:color="7F7F7F" w:sz="4"/>
+              <w:bottom w:val="single" w:color="7F7F7F" w:sz="4"/>
+              <w:right w:val="single" w:color="7F7F7F" w:sz="4"/>
+            </w:tcBorders>
+            <w:tcMar>
+              <w:top w:type="dxa" w:w="60"/>
+              <w:left w:type="dxa" w:w="100"/>
+              <w:bottom w:type="dxa" w:w="60"/>
+              <w:right w:type="dxa" w:w="100"/>
+            </w:tcMar>
+          </w:tcPr>
+          <w:p>
+            <w:pPr>
+              <w:spacing w:after="20"/>
+            </w:pPr>
+            <w:r>
+              <w:rPr>
+                <w:sz w:val="15"/>
+                <w:szCs w:val="15"/>
+              </w:rPr>
+              <w:t xml:space="preserve">A</w:t>
+            </w:r>
+          </w:p>
+        </w:tc>
+        <w:tc>
+          <w:tcPr>
+            <w:tcW w:type="dxa" w:w="1780"/>
+            <w:tcBorders>
+              <w:top w:val="single" w:color="7F7F7F" w:sz="4"/>
+              <w:left w:val="single" w:color="7F7F7F" w:sz="4"/>
+              <w:bottom w:val="single" w:color="7F7F7F" w:sz="4"/>
+              <w:right w:val="single" w:color="7F7F7F" w:sz="4"/>
+            </w:tcBorders>
+            <w:tcMar>
+              <w:top w:type="dxa" w:w="60"/>
+              <w:left w:type="dxa" w:w="100"/>
+              <w:bottom w:type="dxa" w:w="60"/>
+              <w:right w:type="dxa" w:w="100"/>
+            </w:tcMar>
+          </w:tcPr>
+          <w:p>
+            <w:pPr>
+              <w:spacing w:after="20"/>
+            </w:pPr>
+            <w:r>
+              <w:rPr>
+                <w:sz w:val="15"/>
+                <w:szCs w:val="15"/>
+              </w:rPr>
+              <w:t xml:space="preserve">Hide feedback</w:t>
+            </w:r>
+          </w:p>
+        </w:tc>
+      </w:tr>
+      <w:tr>
+        <w:tc>
+          <w:tcPr>
+            <w:tcW w:type="dxa" w:w="1600"/>
+            <w:tcBorders>
+              <w:top w:val="single" w:color="7F7F7F" w:sz="4"/>
+              <w:left w:val="single" w:color="7F7F7F" w:sz="4"/>
+              <w:bottom w:val="single" w:color="7F7F7F" w:sz="4"/>
+              <w:right w:val="single" w:color="7F7F7F" w:sz="4"/>
+            </w:tcBorders>
+            <w:tcMar>
+              <w:top w:type="dxa" w:w="60"/>
+              <w:left w:type="dxa" w:w="100"/>
+              <w:bottom w:type="dxa" w:w="60"/>
+              <w:right w:type="dxa" w:w="100"/>
+            </w:tcMar>
+          </w:tcPr>
+          <w:p>
+            <w:pPr>
+              <w:spacing w:after="20"/>
+            </w:pPr>
+            <w:r>
+              <w:rPr>
+                <w:sz w:val="15"/>
+                <w:szCs w:val="15"/>
+              </w:rPr>
+              <w:t xml:space="preserve">M11 Master data</w:t>
+            </w:r>
+          </w:p>
+        </w:tc>
+        <w:tc>
+          <w:tcPr>
+            <w:tcW w:type="dxa" w:w="1300"/>
+            <w:tcBorders>
+              <w:top w:val="single" w:color="7F7F7F" w:sz="4"/>
+              <w:left w:val="single" w:color="7F7F7F" w:sz="4"/>
+              <w:bottom w:val="single" w:color="7F7F7F" w:sz="4"/>
+              <w:right w:val="single" w:color="7F7F7F" w:sz="4"/>
+            </w:tcBorders>
+            <w:tcMar>
+              <w:top w:type="dxa" w:w="60"/>
+              <w:left w:type="dxa" w:w="100"/>
+              <w:bottom w:type="dxa" w:w="60"/>
+              <w:right w:type="dxa" w:w="100"/>
+            </w:tcMar>
+          </w:tcPr>
+          <w:p>
+            <w:pPr>
+              <w:spacing w:after="20"/>
+            </w:pPr>
+            <w:r>
+              <w:rPr>
+                <w:sz w:val="15"/>
+                <w:szCs w:val="15"/>
+              </w:rPr>
+              <w:t xml:space="preserve">GET</w:t>
+            </w:r>
+          </w:p>
+        </w:tc>
+        <w:tc>
+          <w:tcPr>
+            <w:tcW w:type="dxa" w:w="3800"/>
+            <w:tcBorders>
+              <w:top w:val="single" w:color="7F7F7F" w:sz="4"/>
+              <w:left w:val="single" w:color="7F7F7F" w:sz="4"/>
+              <w:bottom w:val="single" w:color="7F7F7F" w:sz="4"/>
+              <w:right w:val="single" w:color="7F7F7F" w:sz="4"/>
+            </w:tcBorders>
+            <w:tcMar>
+              <w:top w:type="dxa" w:w="60"/>
+              <w:left w:type="dxa" w:w="100"/>
+              <w:bottom w:type="dxa" w:w="60"/>
+              <w:right w:type="dxa" w:w="100"/>
+            </w:tcMar>
+          </w:tcPr>
+          <w:p>
+            <w:pPr>
+              <w:spacing w:after="20"/>
+            </w:pPr>
+            <w:r>
+              <w:rPr>
+                <w:sz w:val="15"/>
+                <w:szCs w:val="15"/>
+              </w:rPr>
+              <w:t xml:space="preserve">/admin/accommodations</w:t>
+            </w:r>
+          </w:p>
+        </w:tc>
+        <w:tc>
+          <w:tcPr>
+            <w:tcW w:type="dxa" w:w="1600"/>
+            <w:tcBorders>
+              <w:top w:val="single" w:color="7F7F7F" w:sz="4"/>
+              <w:left w:val="single" w:color="7F7F7F" w:sz="4"/>
+              <w:bottom w:val="single" w:color="7F7F7F" w:sz="4"/>
+              <w:right w:val="single" w:color="7F7F7F" w:sz="4"/>
+            </w:tcBorders>
+            <w:tcMar>
+              <w:top w:type="dxa" w:w="60"/>
+              <w:left w:type="dxa" w:w="100"/>
+              <w:bottom w:type="dxa" w:w="60"/>
+              <w:right w:type="dxa" w:w="100"/>
+            </w:tcMar>
+          </w:tcPr>
+          <w:p>
+            <w:pPr>
+              <w:spacing w:after="20"/>
+            </w:pPr>
+            <w:r>
+              <w:rPr>
+                <w:sz w:val="15"/>
+                <w:szCs w:val="15"/>
+              </w:rPr>
+              <w:t xml:space="preserve">A</w:t>
+            </w:r>
+          </w:p>
+        </w:tc>
+        <w:tc>
+          <w:tcPr>
+            <w:tcW w:type="dxa" w:w="1780"/>
+            <w:tcBorders>
+              <w:top w:val="single" w:color="7F7F7F" w:sz="4"/>
+              <w:left w:val="single" w:color="7F7F7F" w:sz="4"/>
+              <w:bottom w:val="single" w:color="7F7F7F" w:sz="4"/>
+              <w:right w:val="single" w:color="7F7F7F" w:sz="4"/>
+            </w:tcBorders>
+            <w:tcMar>
+              <w:top w:type="dxa" w:w="60"/>
+              <w:left w:type="dxa" w:w="100"/>
+              <w:bottom w:type="dxa" w:w="60"/>
+              <w:right w:type="dxa" w:w="100"/>
+            </w:tcMar>
+          </w:tcPr>
+          <w:p>
+            <w:pPr>
+              <w:spacing w:after="20"/>
+            </w:pPr>
+            <w:r>
+              <w:rPr>
+                <w:sz w:val="15"/>
+                <w:szCs w:val="15"/>
+              </w:rPr>
+              <w:t xml:space="preserve">All types incl. retired</w:t>
+            </w:r>
+          </w:p>
+        </w:tc>
+      </w:tr>
+      <w:tr>
+        <w:tc>
+          <w:tcPr>
+            <w:tcW w:type="dxa" w:w="1600"/>
+            <w:tcBorders>
+              <w:top w:val="single" w:color="7F7F7F" w:sz="4"/>
+              <w:left w:val="single" w:color="7F7F7F" w:sz="4"/>
+              <w:bottom w:val="single" w:color="7F7F7F" w:sz="4"/>
+              <w:right w:val="single" w:color="7F7F7F" w:sz="4"/>
+            </w:tcBorders>
+            <w:tcMar>
+              <w:top w:type="dxa" w:w="60"/>
+              <w:left w:type="dxa" w:w="100"/>
+              <w:bottom w:type="dxa" w:w="60"/>
+              <w:right w:type="dxa" w:w="100"/>
+            </w:tcMar>
+          </w:tcPr>
+          <w:p>
+            <w:pPr>
+              <w:spacing w:after="20"/>
+            </w:pPr>
+            <w:r>
+              <w:rPr>
+                <w:sz w:val="15"/>
+                <w:szCs w:val="15"/>
+              </w:rPr>
+              <w:t xml:space="preserve">M11 Master data</w:t>
+            </w:r>
+          </w:p>
+        </w:tc>
+        <w:tc>
+          <w:tcPr>
+            <w:tcW w:type="dxa" w:w="1300"/>
+            <w:tcBorders>
+              <w:top w:val="single" w:color="7F7F7F" w:sz="4"/>
+              <w:left w:val="single" w:color="7F7F7F" w:sz="4"/>
+              <w:bottom w:val="single" w:color="7F7F7F" w:sz="4"/>
+              <w:right w:val="single" w:color="7F7F7F" w:sz="4"/>
+            </w:tcBorders>
+            <w:tcMar>
+              <w:top w:type="dxa" w:w="60"/>
+              <w:left w:type="dxa" w:w="100"/>
+              <w:bottom w:type="dxa" w:w="60"/>
+              <w:right w:type="dxa" w:w="100"/>
+            </w:tcMar>
+          </w:tcPr>
+          <w:p>
+            <w:pPr>
+              <w:spacing w:after="20"/>
+            </w:pPr>
+            <w:r>
+              <w:rPr>
+                <w:sz w:val="15"/>
+                <w:szCs w:val="15"/>
+              </w:rPr>
+              <w:t xml:space="preserve">POST, PUT, DELETE</w:t>
+            </w:r>
+          </w:p>
+        </w:tc>
+        <w:tc>
+          <w:tcPr>
+            <w:tcW w:type="dxa" w:w="3800"/>
+            <w:tcBorders>
+              <w:top w:val="single" w:color="7F7F7F" w:sz="4"/>
+              <w:left w:val="single" w:color="7F7F7F" w:sz="4"/>
+              <w:bottom w:val="single" w:color="7F7F7F" w:sz="4"/>
+              <w:right w:val="single" w:color="7F7F7F" w:sz="4"/>
+            </w:tcBorders>
+            <w:tcMar>
+              <w:top w:type="dxa" w:w="60"/>
+              <w:left w:type="dxa" w:w="100"/>
+              <w:bottom w:type="dxa" w:w="60"/>
+              <w:right w:type="dxa" w:w="100"/>
+            </w:tcMar>
+          </w:tcPr>
+          <w:p>
+            <w:pPr>
+              <w:spacing w:after="20"/>
+            </w:pPr>
+            <w:r>
+              <w:rPr>
+                <w:sz w:val="15"/>
+                <w:szCs w:val="15"/>
+              </w:rPr>
+              <w:t xml:space="preserve">/admin/categories/{id}, /admin/accommodations/{id}</w:t>
+            </w:r>
+          </w:p>
+        </w:tc>
+        <w:tc>
+          <w:tcPr>
+            <w:tcW w:type="dxa" w:w="1600"/>
+            <w:tcBorders>
+              <w:top w:val="single" w:color="7F7F7F" w:sz="4"/>
+              <w:left w:val="single" w:color="7F7F7F" w:sz="4"/>
+              <w:bottom w:val="single" w:color="7F7F7F" w:sz="4"/>
+              <w:right w:val="single" w:color="7F7F7F" w:sz="4"/>
+            </w:tcBorders>
+            <w:tcMar>
+              <w:top w:type="dxa" w:w="60"/>
+              <w:left w:type="dxa" w:w="100"/>
+              <w:bottom w:type="dxa" w:w="60"/>
+              <w:right w:type="dxa" w:w="100"/>
+            </w:tcMar>
+          </w:tcPr>
+          <w:p>
+            <w:pPr>
+              <w:spacing w:after="20"/>
+            </w:pPr>
+            <w:r>
+              <w:rPr>
+                <w:sz w:val="15"/>
+                <w:szCs w:val="15"/>
+              </w:rPr>
+              <w:t xml:space="preserve">A</w:t>
+            </w:r>
+          </w:p>
+        </w:tc>
+        <w:tc>
+          <w:tcPr>
+            <w:tcW w:type="dxa" w:w="1780"/>
+            <w:tcBorders>
+              <w:top w:val="single" w:color="7F7F7F" w:sz="4"/>
+              <w:left w:val="single" w:color="7F7F7F" w:sz="4"/>
+              <w:bottom w:val="single" w:color="7F7F7F" w:sz="4"/>
+              <w:right w:val="single" w:color="7F7F7F" w:sz="4"/>
+            </w:tcBorders>
+            <w:tcMar>
+              <w:top w:type="dxa" w:w="60"/>
+              <w:left w:type="dxa" w:w="100"/>
+              <w:bottom w:type="dxa" w:w="60"/>
+              <w:right w:type="dxa" w:w="100"/>
+            </w:tcMar>
+          </w:tcPr>
+          <w:p>
+            <w:pPr>
+              <w:spacing w:after="20"/>
+            </w:pPr>
+            <w:r>
+              <w:rPr>
+                <w:sz w:val="15"/>
+                <w:szCs w:val="15"/>
+              </w:rPr>
+              <w:t xml:space="preserve">Manage lists (in use: category 422, accommodation retired)</w:t>
             </w:r>
           </w:p>
         </w:tc>
@@ -39324,7 +40604,7 @@
                 <w:sz w:val="16"/>
                 <w:szCs w:val="16"/>
               </w:rPr>
-              <w:t xml:space="preserve">id, name, email, password, role, is_active, consented_at, timestamps</w:t>
+              <w:t xml:space="preserve">id, name, email, password, role, is_active, consented_at, display_prefs, timestamps</w:t>
             </w:r>
           </w:p>
         </w:tc>
@@ -39413,7 +40693,7 @@
                 <w:sz w:val="16"/>
                 <w:szCs w:val="16"/>
               </w:rPr>
-              <w:t xml:space="preserve">id, user_id, headline, skills, experience, location_psgc, disability_type (nullable), show_disability, resume_path</w:t>
+              <w:t xml:space="preserve">id, user_id, headline, skills, experience, location_psgc, location_label, disability_type (nullable), show_disability, resume_path</w:t>
             </w:r>
           </w:p>
         </w:tc>
@@ -39502,7 +40782,7 @@
                 <w:sz w:val="16"/>
                 <w:szCs w:val="16"/>
               </w:rPr>
-              <w:t xml:space="preserve">id, user_id, company_name, business_reg_no, registry_type, industry, address, location_psgc, verified_at, trust_score, feedback_count</w:t>
+              <w:t xml:space="preserve">id, user_id, company_name, business_reg_no, registry_type, industry, address, location_psgc, location_label, description, logo_path, verified_at, verification_rejected_reason, trust_score, feedback_count</w:t>
             </w:r>
           </w:p>
         </w:tc>
@@ -39777,7 +41057,7 @@
                 <w:sz w:val="16"/>
                 <w:szCs w:val="16"/>
               </w:rPr>
-              <w:t xml:space="preserve">id, employer_id, category_id, title, description, address, location_psgc, employment_type, work_setup, interview_format, status, closes_at, is_approved, deleted_at</w:t>
+              <w:t xml:space="preserve">id, employer_id, category_id, title, description, address, location_psgc, location_label, employment_type, work_setup, interview_format, status, closes_at, is_approved, rejection_reason, deleted_at</w:t>
             </w:r>
           </w:p>
         </w:tc>
@@ -39806,7 +41086,7 @@
                 <w:sz w:val="16"/>
                 <w:szCs w:val="16"/>
               </w:rPr>
-              <w:t xml:space="preserve">Soft deletes; full-text index on title and description</w:t>
+              <w:t xml:space="preserve">Soft deletes; indexes (status, category_id) and (employer_id, status); MySQL full-text index on title and description (keyword search currently uses a case-insensitive LIKE)</w:t>
             </w:r>
           </w:p>
         </w:tc>

</xml_diff>

<commit_message>
docs(sia): document M7 feedback details and remove a blank page
Adds the application_accommodation table, the form's `submitted` flag,
`feedback_submitted`, the breakdown hidden below three responses and the
T10 demo seed. Top-level headings now start pages with pageBreakBefore, so
an exactly full page no longer leaves a blank page after it.

Co-Authored-By: Claude Opus 5.5 <noreply@anthropic.com>
</commit_message>
<xml_diff>
--- a/docs/OpenDoor_SIA1_Final_Project_Documentation.docx
+++ b/docs/OpenDoor_SIA1_Final_Project_Documentation.docx
@@ -50,13 +50,9 @@
       </w:r>
     </w:p>
     <w:p>
-      <w:r>
-        <w:br w:type="page"/>
-      </w:r>
-    </w:p>
-    <w:p>
       <w:pPr>
         <w:pStyle w:val="Heading1"/>
+        <w:pageBreakBefore/>
       </w:pPr>
       <w:r>
         <w:t xml:space="preserve">Project Information</w:t>
@@ -1647,13 +1643,9 @@
       </w:pPr>
     </w:p>
     <w:p>
-      <w:r>
-        <w:br w:type="page"/>
-      </w:r>
-    </w:p>
-    <w:p>
       <w:pPr>
         <w:pStyle w:val="Heading1"/>
+        <w:pageBreakBefore/>
       </w:pPr>
       <w:r>
         <w:t xml:space="preserve">Executive Summary</w:t>
@@ -1825,13 +1817,9 @@
       </w:r>
     </w:p>
     <w:p>
-      <w:r>
-        <w:br w:type="page"/>
-      </w:r>
-    </w:p>
-    <w:p>
       <w:pPr>
         <w:pStyle w:val="Heading1"/>
+        <w:pageBreakBefore/>
       </w:pPr>
       <w:r>
         <w:t xml:space="preserve">1. Project Overview</w:t>
@@ -3143,13 +3131,9 @@
       </w:pPr>
     </w:p>
     <w:p>
-      <w:r>
-        <w:br w:type="page"/>
-      </w:r>
-    </w:p>
-    <w:p>
       <w:pPr>
         <w:pStyle w:val="Heading1"/>
+        <w:pageBreakBefore/>
       </w:pPr>
       <w:r>
         <w:t xml:space="preserve">2. AS-IS Analysis</w:t>
@@ -3394,13 +3378,9 @@
       </w:r>
     </w:p>
     <w:p>
-      <w:r>
-        <w:br w:type="page"/>
-      </w:r>
-    </w:p>
-    <w:p>
       <w:pPr>
         <w:pStyle w:val="Heading1"/>
+        <w:pageBreakBefore/>
       </w:pPr>
       <w:r>
         <w:t xml:space="preserve">3. TO-BE Solution and Architecture</w:t>
@@ -6340,13 +6320,9 @@
       </w:pPr>
     </w:p>
     <w:p>
-      <w:r>
-        <w:br w:type="page"/>
-      </w:r>
-    </w:p>
-    <w:p>
       <w:pPr>
         <w:pStyle w:val="Heading1"/>
+        <w:pageBreakBefore/>
       </w:pPr>
       <w:r>
         <w:t xml:space="preserve">4. API and Data Exchange Design</w:t>
@@ -8770,7 +8746,7 @@
                 <w:sz w:val="16"/>
                 <w:szCs w:val="16"/>
               </w:rPr>
-              <w:t xml:space="preserve">Accommodations to rate</w:t>
+              <w:t xml:space="preserve">Accommodations to rate (those advertised at the time of hire)</w:t>
             </w:r>
           </w:p>
         </w:tc>
@@ -8799,7 +8775,7 @@
                 <w:sz w:val="16"/>
                 <w:szCs w:val="16"/>
               </w:rPr>
-              <w:t xml:space="preserve">→ {items:[{accommodation_id,name}]}</w:t>
+              <w:t xml:space="preserve">→ {opens_on, is_open, submitted, items:[{accommodation_id,name}]}</w:t>
             </w:r>
           </w:p>
         </w:tc>
@@ -9064,7 +9040,7 @@
                 <w:sz w:val="16"/>
                 <w:szCs w:val="16"/>
               </w:rPr>
-              <w:t xml:space="preserve">Score, count and breakdown</w:t>
+              <w:t xml:space="preserve">Score, count and breakdown (breakdown empty until published)</w:t>
             </w:r>
           </w:p>
         </w:tc>
@@ -10599,7 +10575,25 @@
         <w:t xml:space="preserve">hired</w:t>
       </w:r>
       <w:r>
-        <w:t xml:space="preserve">, from calendar day 30 after the hire date in Asia/Manila time – e.g. hired on 1 October, feedback opens on 31 October; one per application). Ratings map to Delivered = 1, Partially = 0.5, Not delivered = 0.</w:t>
+        <w:t xml:space="preserve">, from calendar day 30 after the hire date in Asia/Manila time – e.g. hired on 1 October, feedback opens on 31 October; one per application). The items are the accommodations the posting advertised when the application became hired – the Core Service records them at hire in </w:t>
+      </w:r>
+      <w:r>
+        <w:rPr>
+          <w:rFonts w:ascii="Consolas" w:cs="Consolas" w:eastAsia="Consolas" w:hAnsi="Consolas"/>
+        </w:rPr>
+        <w:t xml:space="preserve">application_accommodation</w:t>
+      </w:r>
+      <w:r>
+        <w:t xml:space="preserve">, so later edits to the posting do not change what is rated – and every item must be rated once. Ratings map to Delivered = 1, Partially = 0.5, Not delivered = 0. The candidate's own application view adds </w:t>
+      </w:r>
+      <w:r>
+        <w:rPr>
+          <w:rFonts w:ascii="Consolas" w:cs="Consolas" w:eastAsia="Consolas" w:hAnsi="Consolas"/>
+        </w:rPr>
+        <w:t xml:space="preserve">feedback_submitted</w:t>
+      </w:r>
+      <w:r>
+        <w:t xml:space="preserve">; employers never see whether or how a candidate rated.</w:t>
       </w:r>
     </w:p>
     <w:tbl>
@@ -14912,13 +14906,9 @@
       </w:r>
     </w:p>
     <w:p>
-      <w:r>
-        <w:br w:type="page"/>
-      </w:r>
-    </w:p>
-    <w:p>
       <w:pPr>
         <w:pStyle w:val="Heading1"/>
+        <w:pageBreakBefore/>
       </w:pPr>
       <w:r>
         <w:t xml:space="preserve">5. Integration Flow</w:t>
@@ -18904,13 +18894,9 @@
       </w:r>
     </w:p>
     <w:p>
-      <w:r>
-        <w:br w:type="page"/>
-      </w:r>
-    </w:p>
-    <w:p>
       <w:pPr>
         <w:pStyle w:val="Heading1"/>
+        <w:pageBreakBefore/>
       </w:pPr>
       <w:r>
         <w:t xml:space="preserve">6. Security Design</w:t>
@@ -19157,7 +19143,7 @@
         <w:t xml:space="preserve">JobPostingPolicy</w:t>
       </w:r>
       <w:r>
-        <w:t xml:space="preserve">, </w:t>
+        <w:t xml:space="preserve">; </w:t>
       </w:r>
       <w:r>
         <w:rPr>
@@ -19166,25 +19152,7 @@
         <w:t xml:space="preserve">ApplicationPolicy</w:t>
       </w:r>
       <w:r>
-        <w:t xml:space="preserve">, </w:t>
-      </w:r>
-      <w:r>
-        <w:rPr>
-          <w:rFonts w:ascii="Consolas" w:cs="Consolas" w:eastAsia="Consolas" w:hAnsi="Consolas"/>
-        </w:rPr>
-        <w:t xml:space="preserve">CandidateProfilePolicy</w:t>
-      </w:r>
-      <w:r>
-        <w:t xml:space="preserve">, </w:t>
-      </w:r>
-      <w:r>
-        <w:rPr>
-          <w:rFonts w:ascii="Consolas" w:cs="Consolas" w:eastAsia="Consolas" w:hAnsi="Consolas"/>
-        </w:rPr>
-        <w:t xml:space="preserve">FeedbackPolicy</w:t>
-      </w:r>
-      <w:r>
-        <w:t xml:space="preserve">) check ownership of the specific record – for example, an employer can update only its own postings and can see a candidate's accommodation needs only through an application to its own posting, and only the hired candidate can submit feedback. API Resources control which fields each role receives (feedback authors are never exposed to employers). The React </w:t>
+        <w:t xml:space="preserve"> for viewing, status changes and feedback) check ownership of the specific record – for example, an employer can update only its own postings and can see a candidate's accommodation needs only through an application to its own posting, and only the hired candidate can submit feedback. API Resources control which fields each role receives (feedback authors are never exposed to employers). The React </w:t>
       </w:r>
       <w:r>
         <w:rPr>
@@ -19601,7 +19569,7 @@
         <w:t xml:space="preserve">consented_at</w:t>
       </w:r>
       <w:r>
-        <w:t xml:space="preserve">) before accommodation data is stored; disability type is optional, hidden by default and never used for matching; candidates' needs are shown to an employer only after the candidate applies; trust scores are aggregated and shown only after three responses so individual employees cannot be identified.</w:t>
+        <w:t xml:space="preserve">) before accommodation data is stored; disability type is optional, hidden by default and never used for matching; candidates' needs are shown to an employer only after the candidate applies; trust scores and their per-accommodation breakdown are aggregated and shown only after three responses so individual employees cannot be identified.</w:t>
       </w:r>
     </w:p>
     <w:p>
@@ -19625,13 +19593,9 @@
       </w:r>
     </w:p>
     <w:p>
-      <w:r>
-        <w:br w:type="page"/>
-      </w:r>
-    </w:p>
-    <w:p>
       <w:pPr>
         <w:pStyle w:val="Heading1"/>
+        <w:pageBreakBefore/>
       </w:pPr>
       <w:r>
         <w:t xml:space="preserve">7. Testing and Quality Assurance</w:t>
@@ -24721,13 +24685,9 @@
       </w:r>
     </w:p>
     <w:p>
-      <w:r>
-        <w:br w:type="page"/>
-      </w:r>
-    </w:p>
-    <w:p>
       <w:pPr>
         <w:pStyle w:val="Heading1"/>
+        <w:pageBreakBefore/>
       </w:pPr>
       <w:r>
         <w:t xml:space="preserve">8. Deployment and DevOps</w:t>
@@ -25981,7 +25941,7 @@
         <w:t xml:space="preserve">Limitations.</w:t>
       </w:r>
       <w:r>
-        <w:t xml:space="preserve"> The Railway Hobby plan (about US$5/month after the trial credit) and Vercel Hobby are not sized for production load; services may cold-start, so the team opens the application a few minutes before the demonstration. Demo accounts for every role and enough feedback to show a published trust score are seeded. Both URLs are documented in the README and submitted before the defense.</w:t>
+        <w:t xml:space="preserve"> The Railway Hobby plan (about US$5/month after the trial credit) and Vercel Hobby are not sized for production load; services may cold-start, so the team opens the application a few minutes before the demonstration. Demo accounts for every role and enough feedback to show a published trust score are seeded; a second demo employer has two responses and a demo candidate's hire with the feedback window open, so the third response (test T10) can be shown live. Both URLs are documented in the README and submitted before the defense.</w:t>
       </w:r>
     </w:p>
     <w:p>
@@ -27581,13 +27541,9 @@
       </w:pPr>
     </w:p>
     <w:p>
-      <w:r>
-        <w:br w:type="page"/>
-      </w:r>
-    </w:p>
-    <w:p>
       <w:pPr>
         <w:pStyle w:val="Heading1"/>
+        <w:pageBreakBefore/>
       </w:pPr>
       <w:r>
         <w:t xml:space="preserve">9. Application Screens and Demonstration</w:t>
@@ -28592,13 +28548,9 @@
       </w:r>
     </w:p>
     <w:p>
-      <w:r>
-        <w:br w:type="page"/>
-      </w:r>
-    </w:p>
-    <w:p>
       <w:pPr>
         <w:pStyle w:val="Heading1"/>
+        <w:pageBreakBefore/>
       </w:pPr>
       <w:r>
         <w:t xml:space="preserve">10. Evaluation of the Final Solution</w:t>
@@ -29598,13 +29550,9 @@
       </w:r>
     </w:p>
     <w:p>
-      <w:r>
-        <w:br w:type="page"/>
-      </w:r>
-    </w:p>
-    <w:p>
       <w:pPr>
         <w:pStyle w:val="Heading1"/>
+        <w:pageBreakBefore/>
       </w:pPr>
       <w:r>
         <w:t xml:space="preserve">11. Team Contribution</w:t>
@@ -30388,13 +30336,9 @@
       </w:r>
     </w:p>
     <w:p>
-      <w:r>
-        <w:br w:type="page"/>
-      </w:r>
-    </w:p>
-    <w:p>
       <w:pPr>
         <w:pStyle w:val="Heading1"/>
+        <w:pageBreakBefore/>
       </w:pPr>
       <w:r>
         <w:t xml:space="preserve">12. References</w:t>
@@ -30689,13 +30633,9 @@
       </w:r>
     </w:p>
     <w:p>
-      <w:r>
-        <w:br w:type="page"/>
-      </w:r>
-    </w:p>
-    <w:p>
       <w:pPr>
         <w:pStyle w:val="Heading1"/>
+        <w:pageBreakBefore/>
       </w:pPr>
       <w:r>
         <w:t xml:space="preserve">Appendices</w:t>
@@ -34447,7 +34387,7 @@
                 <w:sz w:val="15"/>
                 <w:szCs w:val="15"/>
               </w:rPr>
-              <w:t xml:space="preserve">Items to rate</w:t>
+              <w:t xml:space="preserve">Items to rate (recorded at hire), window, submitted</w:t>
             </w:r>
           </w:p>
         </w:tc>
@@ -34741,7 +34681,7 @@
                 <w:sz w:val="15"/>
                 <w:szCs w:val="15"/>
               </w:rPr>
-              <w:t xml:space="preserve">Score and breakdown</w:t>
+              <w:t xml:space="preserve">Score and breakdown (from 3 responses)</w:t>
             </w:r>
           </w:p>
         </w:tc>
@@ -40362,7 +40302,7 @@
         <w:spacing w:after="60"/>
       </w:pPr>
       <w:r>
-        <w:t xml:space="preserve">Seeders: categories (about 10 industries), RA 7277-based accommodation types, one administrator, demo candidate/employer accounts, sample feedback that publishes a trust score, and sample DTI/SEC records in </w:t>
+        <w:t xml:space="preserve">Seeders: categories (about 10 industries), RA 7277-based accommodation types, one administrator, demo candidate/employer accounts, sample feedback that publishes one employer's trust score (plus a second employer with two responses and an open demo hire for test T10), and sample DTI/SEC records in </w:t>
       </w:r>
       <w:r>
         <w:rPr>
@@ -41384,6 +41324,95 @@
                 <w:sz w:val="16"/>
                 <w:szCs w:val="16"/>
               </w:rPr>
+              <w:t xml:space="preserve">application_accommodation</w:t>
+            </w:r>
+          </w:p>
+        </w:tc>
+        <w:tc>
+          <w:tcPr>
+            <w:tcW w:type="dxa" w:w="4900"/>
+            <w:tcBorders>
+              <w:top w:val="single" w:color="7F7F7F" w:sz="4"/>
+              <w:left w:val="single" w:color="7F7F7F" w:sz="4"/>
+              <w:bottom w:val="single" w:color="7F7F7F" w:sz="4"/>
+              <w:right w:val="single" w:color="7F7F7F" w:sz="4"/>
+            </w:tcBorders>
+            <w:tcMar>
+              <w:top w:type="dxa" w:w="60"/>
+              <w:left w:type="dxa" w:w="100"/>
+              <w:bottom w:type="dxa" w:w="60"/>
+              <w:right w:type="dxa" w:w="100"/>
+            </w:tcMar>
+          </w:tcPr>
+          <w:p>
+            <w:pPr>
+              <w:spacing w:after="20"/>
+            </w:pPr>
+            <w:r>
+              <w:rPr>
+                <w:sz w:val="16"/>
+                <w:szCs w:val="16"/>
+              </w:rPr>
+              <w:t xml:space="preserve">application_id, accommodation_id</w:t>
+            </w:r>
+          </w:p>
+        </w:tc>
+        <w:tc>
+          <w:tcPr>
+            <w:tcW w:type="dxa" w:w="2880"/>
+            <w:tcBorders>
+              <w:top w:val="single" w:color="7F7F7F" w:sz="4"/>
+              <w:left w:val="single" w:color="7F7F7F" w:sz="4"/>
+              <w:bottom w:val="single" w:color="7F7F7F" w:sz="4"/>
+              <w:right w:val="single" w:color="7F7F7F" w:sz="4"/>
+            </w:tcBorders>
+            <w:tcMar>
+              <w:top w:type="dxa" w:w="60"/>
+              <w:left w:type="dxa" w:w="100"/>
+              <w:bottom w:type="dxa" w:w="60"/>
+              <w:right w:type="dxa" w:w="100"/>
+            </w:tcMar>
+          </w:tcPr>
+          <w:p>
+            <w:pPr>
+              <w:spacing w:after="20"/>
+            </w:pPr>
+            <w:r>
+              <w:rPr>
+                <w:sz w:val="16"/>
+                <w:szCs w:val="16"/>
+              </w:rPr>
+              <w:t xml:space="preserve">Pivot: the posting's accommodations recorded when the application becomes hired (the items the candidate rates)</w:t>
+            </w:r>
+          </w:p>
+        </w:tc>
+      </w:tr>
+      <w:tr>
+        <w:tc>
+          <w:tcPr>
+            <w:tcW w:type="dxa" w:w="2300"/>
+            <w:tcBorders>
+              <w:top w:val="single" w:color="7F7F7F" w:sz="4"/>
+              <w:left w:val="single" w:color="7F7F7F" w:sz="4"/>
+              <w:bottom w:val="single" w:color="7F7F7F" w:sz="4"/>
+              <w:right w:val="single" w:color="7F7F7F" w:sz="4"/>
+            </w:tcBorders>
+            <w:tcMar>
+              <w:top w:type="dxa" w:w="60"/>
+              <w:left w:type="dxa" w:w="100"/>
+              <w:bottom w:type="dxa" w:w="60"/>
+              <w:right w:type="dxa" w:w="100"/>
+            </w:tcMar>
+          </w:tcPr>
+          <w:p>
+            <w:pPr>
+              <w:spacing w:after="20"/>
+            </w:pPr>
+            <w:r>
+              <w:rPr>
+                <w:sz w:val="16"/>
+                <w:szCs w:val="16"/>
+              </w:rPr>
               <w:t xml:space="preserve">feedback / feedback_items</w:t>
             </w:r>
           </w:p>
@@ -41442,7 +41471,7 @@
                 <w:sz w:val="16"/>
                 <w:szCs w:val="16"/>
               </w:rPr>
-              <w:t xml:space="preserve">One feedback per application; one rating per advertised accommodation</w:t>
+              <w:t xml:space="preserve">One feedback per application; one rating per accommodation recorded at hire; hidden feedback leaves the score</w:t>
             </w:r>
           </w:p>
         </w:tc>

</xml_diff>

<commit_message>
docs(sia): document the business registry as built
Lists the admin employer queue endpoints, uses the seeded Bright Path BPO
number in the SOAP sample, and describes number normalization, the stored
registry_checks fields (including ERROR checks) and the registry seed.

Co-Authored-By: Claude Opus 5.5 <noreply@anthropic.com>
</commit_message>
<xml_diff>
--- a/docs/OpenDoor_SIA1_Final_Project_Documentation.docx
+++ b/docs/OpenDoor_SIA1_Final_Project_Documentation.docx
@@ -9129,6 +9129,153 @@
                 <w:sz w:val="16"/>
                 <w:szCs w:val="16"/>
               </w:rPr>
+              <w:t xml:space="preserve">GET</w:t>
+            </w:r>
+          </w:p>
+        </w:tc>
+        <w:tc>
+          <w:tcPr>
+            <w:tcW w:type="dxa" w:w="2700"/>
+            <w:tcBorders>
+              <w:top w:val="single" w:color="7F7F7F" w:sz="4"/>
+              <w:left w:val="single" w:color="7F7F7F" w:sz="4"/>
+              <w:bottom w:val="single" w:color="7F7F7F" w:sz="4"/>
+              <w:right w:val="single" w:color="7F7F7F" w:sz="4"/>
+            </w:tcBorders>
+            <w:tcMar>
+              <w:top w:type="dxa" w:w="60"/>
+              <w:left w:type="dxa" w:w="100"/>
+              <w:bottom w:type="dxa" w:w="60"/>
+              <w:right w:type="dxa" w:w="100"/>
+            </w:tcMar>
+          </w:tcPr>
+          <w:p>
+            <w:pPr>
+              <w:spacing w:after="20"/>
+            </w:pPr>
+            <w:r>
+              <w:rPr>
+                <w:sz w:val="16"/>
+                <w:szCs w:val="16"/>
+              </w:rPr>
+              <w:t xml:space="preserve">/api/admin/employers, /api/admin/employers/{id}</w:t>
+            </w:r>
+          </w:p>
+        </w:tc>
+        <w:tc>
+          <w:tcPr>
+            <w:tcW w:type="dxa" w:w="2280"/>
+            <w:tcBorders>
+              <w:top w:val="single" w:color="7F7F7F" w:sz="4"/>
+              <w:left w:val="single" w:color="7F7F7F" w:sz="4"/>
+              <w:bottom w:val="single" w:color="7F7F7F" w:sz="4"/>
+              <w:right w:val="single" w:color="7F7F7F" w:sz="4"/>
+            </w:tcBorders>
+            <w:tcMar>
+              <w:top w:type="dxa" w:w="60"/>
+              <w:left w:type="dxa" w:w="100"/>
+              <w:bottom w:type="dxa" w:w="60"/>
+              <w:right w:type="dxa" w:w="100"/>
+            </w:tcMar>
+          </w:tcPr>
+          <w:p>
+            <w:pPr>
+              <w:spacing w:after="20"/>
+            </w:pPr>
+            <w:r>
+              <w:rPr>
+                <w:sz w:val="16"/>
+                <w:szCs w:val="16"/>
+              </w:rPr>
+              <w:t xml:space="preserve">Verification queue; one employer with its latest registry check</w:t>
+            </w:r>
+          </w:p>
+        </w:tc>
+        <w:tc>
+          <w:tcPr>
+            <w:tcW w:type="dxa" w:w="2900"/>
+            <w:tcBorders>
+              <w:top w:val="single" w:color="7F7F7F" w:sz="4"/>
+              <w:left w:val="single" w:color="7F7F7F" w:sz="4"/>
+              <w:bottom w:val="single" w:color="7F7F7F" w:sz="4"/>
+              <w:right w:val="single" w:color="7F7F7F" w:sz="4"/>
+            </w:tcBorders>
+            <w:tcMar>
+              <w:top w:type="dxa" w:w="60"/>
+              <w:left w:type="dxa" w:w="100"/>
+              <w:bottom w:type="dxa" w:w="60"/>
+              <w:right w:type="dxa" w:w="100"/>
+            </w:tcMar>
+          </w:tcPr>
+          <w:p>
+            <w:pPr>
+              <w:spacing w:after="20"/>
+            </w:pPr>
+            <w:r>
+              <w:rPr>
+                <w:sz w:val="16"/>
+                <w:szCs w:val="16"/>
+              </w:rPr>
+              <w:t xml:space="preserve">→ AdminEmployer</w:t>
+            </w:r>
+          </w:p>
+        </w:tc>
+      </w:tr>
+      <w:tr>
+        <w:tc>
+          <w:tcPr>
+            <w:tcW w:type="dxa" w:w="1250"/>
+            <w:tcBorders>
+              <w:top w:val="single" w:color="7F7F7F" w:sz="4"/>
+              <w:left w:val="single" w:color="7F7F7F" w:sz="4"/>
+              <w:bottom w:val="single" w:color="7F7F7F" w:sz="4"/>
+              <w:right w:val="single" w:color="7F7F7F" w:sz="4"/>
+            </w:tcBorders>
+            <w:tcMar>
+              <w:top w:type="dxa" w:w="60"/>
+              <w:left w:type="dxa" w:w="100"/>
+              <w:bottom w:type="dxa" w:w="60"/>
+              <w:right w:type="dxa" w:w="100"/>
+            </w:tcMar>
+          </w:tcPr>
+          <w:p>
+            <w:pPr>
+              <w:spacing w:after="20"/>
+            </w:pPr>
+            <w:r>
+              <w:rPr>
+                <w:sz w:val="16"/>
+                <w:szCs w:val="16"/>
+              </w:rPr>
+              <w:t xml:space="preserve">Core</w:t>
+            </w:r>
+          </w:p>
+        </w:tc>
+        <w:tc>
+          <w:tcPr>
+            <w:tcW w:type="dxa" w:w="950"/>
+            <w:tcBorders>
+              <w:top w:val="single" w:color="7F7F7F" w:sz="4"/>
+              <w:left w:val="single" w:color="7F7F7F" w:sz="4"/>
+              <w:bottom w:val="single" w:color="7F7F7F" w:sz="4"/>
+              <w:right w:val="single" w:color="7F7F7F" w:sz="4"/>
+            </w:tcBorders>
+            <w:tcMar>
+              <w:top w:type="dxa" w:w="60"/>
+              <w:left w:type="dxa" w:w="100"/>
+              <w:bottom w:type="dxa" w:w="60"/>
+              <w:right w:type="dxa" w:w="100"/>
+            </w:tcMar>
+          </w:tcPr>
+          <w:p>
+            <w:pPr>
+              <w:spacing w:after="20"/>
+            </w:pPr>
+            <w:r>
+              <w:rPr>
+                <w:sz w:val="16"/>
+                <w:szCs w:val="16"/>
+              </w:rPr>
               <w:t xml:space="preserve">PATCH</w:t>
             </w:r>
           </w:p>
@@ -11691,7 +11838,7 @@
                 <w:sz w:val="16"/>
                 <w:szCs w:val="16"/>
               </w:rPr>
-              <w:t xml:space="preserve">      &lt;reg:RegistrationNumber&gt;CS201912345&lt;/reg:RegistrationNumber&gt;</w:t>
+              <w:t xml:space="preserve">      &lt;reg:RegistrationNumber&gt;CS201800777&lt;/reg:RegistrationNumber&gt;</w:t>
             </w:r>
           </w:p>
           <w:p>
@@ -12414,7 +12561,7 @@
                 <w:sz w:val="16"/>
                 <w:szCs w:val="16"/>
               </w:rPr>
-              <w:t xml:space="preserve">Request fails validation: missing/empty </w:t>
+              <w:t xml:space="preserve">Request fails validation: </w:t>
             </w:r>
             <w:r>
               <w:rPr>
@@ -12429,7 +12576,22 @@
                 <w:sz w:val="16"/>
                 <w:szCs w:val="16"/>
               </w:rPr>
-              <w:t xml:space="preserve">, </w:t>
+              <w:t xml:space="preserve"> not 5–20 letters or digits (hyphens and spaces are ignored, so </w:t>
+            </w:r>
+            <w:r>
+              <w:rPr>
+                <w:rFonts w:ascii="Consolas" w:cs="Consolas" w:eastAsia="Consolas" w:hAnsi="Consolas"/>
+                <w:sz w:val="16"/>
+                <w:szCs w:val="16"/>
+              </w:rPr>
+              <w:t xml:space="preserve">CS-2018-00777</w:t>
+            </w:r>
+            <w:r>
+              <w:rPr>
+                <w:sz w:val="16"/>
+                <w:szCs w:val="16"/>
+              </w:rPr>
+              <w:t xml:space="preserve"> matches), </w:t>
             </w:r>
             <w:r>
               <w:rPr>
@@ -12646,7 +12808,7 @@
         <w:t xml:space="preserve">registry_checks</w:t>
       </w:r>
       <w:r>
-        <w:t xml:space="preserve"> record (status, registered name, match score, checked time). </w:t>
+        <w:t xml:space="preserve"> record (the number and registry type that were checked, status, registered name, match score, the XML answer, the administrator and the time; the request itself is never stored because it carries the password). </w:t>
       </w:r>
       <w:r>
         <w:rPr>
@@ -12655,7 +12817,16 @@
         <w:t xml:space="preserve">NameMatchScore</w:t>
       </w:r>
       <w:r>
-        <w:t xml:space="preserve"> is a normalized similarity (0–1) between the submitted and registered names. The administrator sees the result and decides; a </w:t>
+        <w:t xml:space="preserve"> is a normalized similarity (0–1) between the submitted and registered names (upper case, punctuation and trailing INC./CORP./CO. removed, then PHP </w:t>
+      </w:r>
+      <w:r>
+        <w:rPr>
+          <w:rFonts w:ascii="Consolas" w:cs="Consolas" w:eastAsia="Consolas" w:hAnsi="Consolas"/>
+        </w:rPr>
+        <w:t xml:space="preserve">similar_text</w:t>
+      </w:r>
+      <w:r>
+        <w:t xml:space="preserve">); for </w:t>
       </w:r>
       <w:r>
         <w:rPr>
@@ -12664,6 +12835,24 @@
         <w:t xml:space="preserve">NOT_FOUND</w:t>
       </w:r>
       <w:r>
+        <w:t xml:space="preserve"> the API returns </w:t>
+      </w:r>
+      <w:r>
+        <w:rPr>
+          <w:rFonts w:ascii="Consolas" w:cs="Consolas" w:eastAsia="Consolas" w:hAnsi="Consolas"/>
+        </w:rPr>
+        <w:t xml:space="preserve">name_match: null</w:t>
+      </w:r>
+      <w:r>
+        <w:t xml:space="preserve">. A check is shown only while the employer's number and type are unchanged. The administrator sees the result and decides; a </w:t>
+      </w:r>
+      <w:r>
+        <w:rPr>
+          <w:rFonts w:ascii="Consolas" w:cs="Consolas" w:eastAsia="Consolas" w:hAnsi="Consolas"/>
+        </w:rPr>
+        <w:t xml:space="preserve">NOT_FOUND</w:t>
+      </w:r>
+      <w:r>
         <w:t xml:space="preserve">, </w:t>
       </w:r>
       <w:r>
@@ -12700,7 +12889,7 @@
         <w:t xml:space="preserve">REGISTRY_AUTH_FAILED</w:t>
       </w:r>
       <w:r>
-        <w:t xml:space="preserve">; server faults or a 5-second timeout become HTTP 502 </w:t>
+        <w:t xml:space="preserve">; server faults, connection errors or a 5-second timeout become HTTP 502 </w:t>
       </w:r>
       <w:r>
         <w:rPr>
@@ -12709,7 +12898,16 @@
         <w:t xml:space="preserve">REGISTRY_UNAVAILABLE</w:t>
       </w:r>
       <w:r>
-        <w:t xml:space="preserve">, and the employer stays in the manual review queue.</w:t>
+        <w:t xml:space="preserve"> and are stored as an </w:t>
+      </w:r>
+      <w:r>
+        <w:rPr>
+          <w:rFonts w:ascii="Consolas" w:cs="Consolas" w:eastAsia="Consolas" w:hAnsi="Consolas"/>
+        </w:rPr>
+        <w:t xml:space="preserve">ERROR</w:t>
+      </w:r>
+      <w:r>
+        <w:t xml:space="preserve"> check, and the employer stays in the manual review queue.</w:t>
       </w:r>
     </w:p>
     <w:p>
@@ -40819,7 +41017,7 @@
                 <w:sz w:val="16"/>
                 <w:szCs w:val="16"/>
               </w:rPr>
-              <w:t xml:space="preserve">id, employer_id, status, registered_name, name_match_score, checked_at, raw_response (XML)</w:t>
+              <w:t xml:space="preserve">id, employer_id, business_reg_no, registry_type, status, registered_name, name_match_score, raw_response (XML answer), checked_by, checked_at</w:t>
             </w:r>
           </w:p>
         </w:tc>
@@ -40848,7 +41046,22 @@
                 <w:sz w:val="16"/>
                 <w:szCs w:val="16"/>
               </w:rPr>
-              <w:t xml:space="preserve">Result of SOAP verification calls</w:t>
+              <w:t xml:space="preserve">Every SOAP verification call; </w:t>
+            </w:r>
+            <w:r>
+              <w:rPr>
+                <w:rFonts w:ascii="Consolas" w:cs="Consolas" w:eastAsia="Consolas" w:hAnsi="Consolas"/>
+                <w:sz w:val="16"/>
+                <w:szCs w:val="16"/>
+              </w:rPr>
+              <w:t xml:space="preserve">ERROR</w:t>
+            </w:r>
+            <w:r>
+              <w:rPr>
+                <w:sz w:val="16"/>
+                <w:szCs w:val="16"/>
+              </w:rPr>
+              <w:t xml:space="preserve"> when the registry could not answer</w:t>
             </w:r>
           </w:p>
         </w:tc>
@@ -43637,7 +43850,22 @@
                 <w:sz w:val="16"/>
                 <w:szCs w:val="16"/>
               </w:rPr>
-              <w:t xml:space="preserve">Simulated DTI/SEC records seeded by a script; includes EXPIRED and CANCELLED samples</w:t>
+              <w:t xml:space="preserve">Simulated DTI/SEC records seeded by </w:t>
+            </w:r>
+            <w:r>
+              <w:rPr>
+                <w:rFonts w:ascii="Consolas" w:cs="Consolas" w:eastAsia="Consolas" w:hAnsi="Consolas"/>
+                <w:sz w:val="16"/>
+                <w:szCs w:val="16"/>
+              </w:rPr>
+              <w:t xml:space="preserve">seed.php</w:t>
+            </w:r>
+            <w:r>
+              <w:rPr>
+                <w:sz w:val="16"/>
+                <w:szCs w:val="16"/>
+              </w:rPr>
+              <w:t xml:space="preserve">: the two demo employers and three other businesses (ACTIVE), two EXPIRED and two CANCELLED samples</w:t>
             </w:r>
           </w:p>
         </w:tc>

</xml_diff>

<commit_message>
docs(sia): document the Insights mashup as built
Section 4.5 now states the snapshot rules: Core is the only required
source, the 12 s budget, PSGC place names, Nominatim place matching with
bundled city centres, unnamed "other" places dropped and
nearby_accessible null when Overpass has nothing. 4.4, 5.2 and 5.3
describe the real fallbacks, the Insights 422/503 errors, cooldowns and
no automatic retries. Samples use the 10-digit PSGC code and the full
trust score breakdown; T12, T13 and T16 expect what the Postman folder
checks. Adds Axios, nock and the PSA PSGC page to the references.

Co-Authored-By: Claude Opus 5.5 <noreply@anthropic.com>
</commit_message>
<xml_diff>
--- a/docs/OpenDoor_SIA1_Final_Project_Documentation.docx
+++ b/docs/OpenDoor_SIA1_Final_Project_Documentation.docx
@@ -9657,7 +9657,7 @@
                 <w:sz w:val="16"/>
                 <w:szCs w:val="16"/>
               </w:rPr>
-              <w:t xml:space="preserve">X-Service-Key → {address, psgc_code, accommodations, trust_score}</w:t>
+              <w:t xml:space="preserve">X-Service-Key → {address, psgc_code, location_label, accommodations, trust_score}</w:t>
             </w:r>
           </w:p>
         </w:tc>
@@ -9804,7 +9804,7 @@
                 <w:sz w:val="16"/>
                 <w:szCs w:val="16"/>
               </w:rPr>
-              <w:t xml:space="preserve">→ snapshot (Section 4.5)</w:t>
+              <w:t xml:space="preserve">→ 200 snapshot (Section 4.5); 404 posting not visible; 503 Core unreachable</w:t>
             </w:r>
           </w:p>
         </w:tc>
@@ -9922,7 +9922,7 @@
                 <w:sz w:val="16"/>
                 <w:szCs w:val="16"/>
               </w:rPr>
-              <w:t xml:space="preserve">Normalized PSGC lists (regions, provinces, cities)</w:t>
+              <w:t xml:space="preserve">Normalized PSGC lists (regions, provinces, cities/municipalities)</w:t>
             </w:r>
           </w:p>
         </w:tc>
@@ -9951,7 +9951,15 @@
                 <w:sz w:val="16"/>
                 <w:szCs w:val="16"/>
               </w:rPr>
-              <w:t xml:space="preserve">?parent= → [{code,name,level}]</w:t>
+              <w:t xml:space="preserve">?parent=&lt;10-digit PSGC code&gt; → [{code,name,level}]; header </w:t>
+            </w:r>
+            <w:r>
+              <w:rPr>
+                <w:rFonts w:ascii="Consolas" w:cs="Consolas" w:eastAsia="Consolas" w:hAnsi="Consolas"/>
+                <w:sz w:val="16"/>
+                <w:szCs w:val="16"/>
+              </w:rPr>
+              <w:t xml:space="preserve">X-Data-Source</w:t>
             </w:r>
           </w:p>
         </w:tc>
@@ -10284,7 +10292,7 @@
                 <w:sz w:val="16"/>
                 <w:szCs w:val="16"/>
               </w:rPr>
-              <w:t xml:space="preserve">      "location": { "psgc_code": "137404000", "label": "Quezon City, NCR" },</w:t>
+              <w:t xml:space="preserve">      "location": { "psgc_code": "1381300000", "label": "Quezon City, National Capital Region (NCR)" },</w:t>
             </w:r>
           </w:p>
           <w:p>
@@ -10549,7 +10557,7 @@
         <w:t xml:space="preserve">location.psgc_code</w:t>
       </w:r>
       <w:r>
-        <w:t xml:space="preserve"> is the normalized PSGC code used by the Insights Service.</w:t>
+        <w:t xml:space="preserve"> is the official 10-digit PSGC code chosen in the location picker (the label is stored with it) and is used by the Insights Service.</w:t>
       </w:r>
     </w:p>
     <w:p>
@@ -13325,7 +13333,7 @@
                 <w:sz w:val="16"/>
                 <w:szCs w:val="16"/>
               </w:rPr>
-              <w:t xml:space="preserve">Max 1 request/second (throttled queue); results cached 30 days; on error or timeout (5 s) fall back to the PSGC city centroid (</w:t>
+              <w:t xml:space="preserve">Max 1 request/second (throttled queue; a request that would wait more than 2 s is not sent); results cached 30 days; street address not found → the city itself is searched (</w:t>
             </w:r>
             <w:r>
               <w:rPr>
@@ -13340,7 +13348,37 @@
                 <w:sz w:val="16"/>
                 <w:szCs w:val="16"/>
               </w:rPr>
-              <w:t xml:space="preserve">), mark source </w:t>
+              <w:t xml:space="preserve">); on error or timeout (5 s) use an expired cache entry (</w:t>
+            </w:r>
+            <w:r>
+              <w:rPr>
+                <w:rFonts w:ascii="Consolas" w:cs="Consolas" w:eastAsia="Consolas" w:hAnsi="Consolas"/>
+                <w:sz w:val="16"/>
+                <w:szCs w:val="16"/>
+              </w:rPr>
+              <w:t xml:space="preserve">stale</w:t>
+            </w:r>
+            <w:r>
+              <w:rPr>
+                <w:sz w:val="16"/>
+                <w:szCs w:val="16"/>
+              </w:rPr>
+              <w:t xml:space="preserve">), else a bundled city centre for the PSGC code (</w:t>
+            </w:r>
+            <w:r>
+              <w:rPr>
+                <w:rFonts w:ascii="Consolas" w:cs="Consolas" w:eastAsia="Consolas" w:hAnsi="Consolas"/>
+                <w:sz w:val="16"/>
+                <w:szCs w:val="16"/>
+              </w:rPr>
+              <w:t xml:space="preserve">precision: "city"</w:t>
+            </w:r>
+            <w:r>
+              <w:rPr>
+                <w:sz w:val="16"/>
+                <w:szCs w:val="16"/>
+              </w:rPr>
+              <w:t xml:space="preserve">) and mark the source </w:t>
             </w:r>
             <w:r>
               <w:rPr>
@@ -13349,6 +13387,13 @@
                 <w:szCs w:val="16"/>
               </w:rPr>
               <w:t xml:space="preserve">unavailable</w:t>
+            </w:r>
+            <w:r>
+              <w:rPr>
+                <w:sz w:val="16"/>
+                <w:szCs w:val="16"/>
+              </w:rPr>
+              <w:t xml:space="preserve">; Nominatim is never called without the contact email</w:t>
             </w:r>
           </w:p>
         </w:tc>
@@ -13631,7 +13676,22 @@
                 <w:sz w:val="16"/>
                 <w:szCs w:val="16"/>
               </w:rPr>
-              <w:t xml:space="preserve">Cached 24 h; on 429/504 or timeout (8 s) return the last cached result and mark source </w:t>
+              <w:t xml:space="preserve">Cached 24 h (point rounded to 4 decimals + radius); 429/504 pages, a </w:t>
+            </w:r>
+            <w:r>
+              <w:rPr>
+                <w:rFonts w:ascii="Consolas" w:cs="Consolas" w:eastAsia="Consolas" w:hAnsi="Consolas"/>
+                <w:sz w:val="16"/>
+                <w:szCs w:val="16"/>
+              </w:rPr>
+              <w:t xml:space="preserve">runtime error</w:t>
+            </w:r>
+            <w:r>
+              <w:rPr>
+                <w:sz w:val="16"/>
+                <w:szCs w:val="16"/>
+              </w:rPr>
+              <w:t xml:space="preserve"> remark or a timeout (8 s) count as failures and are never cached; then the last cached result is returned as </w:t>
             </w:r>
             <w:r>
               <w:rPr>
@@ -13646,7 +13706,22 @@
                 <w:sz w:val="16"/>
                 <w:szCs w:val="16"/>
               </w:rPr>
-              <w:t xml:space="preserve">, or omit the nearby section and mark source </w:t>
+              <w:t xml:space="preserve">, else </w:t>
+            </w:r>
+            <w:r>
+              <w:rPr>
+                <w:rFonts w:ascii="Consolas" w:cs="Consolas" w:eastAsia="Consolas" w:hAnsi="Consolas"/>
+                <w:sz w:val="16"/>
+                <w:szCs w:val="16"/>
+              </w:rPr>
+              <w:t xml:space="preserve">nearby_accessible</w:t>
+            </w:r>
+            <w:r>
+              <w:rPr>
+                <w:sz w:val="16"/>
+                <w:szCs w:val="16"/>
+              </w:rPr>
+              <w:t xml:space="preserve"> is null and the source </w:t>
             </w:r>
             <w:r>
               <w:rPr>
@@ -13773,6 +13848,21 @@
                 <w:sz w:val="16"/>
                 <w:szCs w:val="16"/>
               </w:rPr>
+              <w:t xml:space="preserve">psgc10DigitCode</w:t>
+            </w:r>
+            <w:r>
+              <w:rPr>
+                <w:sz w:val="16"/>
+                <w:szCs w:val="16"/>
+              </w:rPr>
+              <w:t xml:space="preserve">, </w:t>
+            </w:r>
+            <w:r>
+              <w:rPr>
+                <w:rFonts w:ascii="Consolas" w:cs="Consolas" w:eastAsia="Consolas" w:hAnsi="Consolas"/>
+                <w:sz w:val="16"/>
+                <w:szCs w:val="16"/>
+              </w:rPr>
               <w:t xml:space="preserve">code</w:t>
             </w:r>
             <w:r>
@@ -13803,7 +13893,7 @@
                 <w:sz w:val="16"/>
                 <w:szCs w:val="16"/>
               </w:rPr>
-              <w:t xml:space="preserve">regionCode</w:t>
+              <w:t xml:space="preserve">regionName</w:t>
             </w:r>
             <w:r>
               <w:rPr>
@@ -13818,21 +13908,6 @@
                 <w:sz w:val="16"/>
                 <w:szCs w:val="16"/>
               </w:rPr>
-              <w:t xml:space="preserve">provinceCode</w:t>
-            </w:r>
-            <w:r>
-              <w:rPr>
-                <w:sz w:val="16"/>
-                <w:szCs w:val="16"/>
-              </w:rPr>
-              <w:t xml:space="preserve">, </w:t>
-            </w:r>
-            <w:r>
-              <w:rPr>
-                <w:rFonts w:ascii="Consolas" w:cs="Consolas" w:eastAsia="Consolas" w:hAnsi="Consolas"/>
-                <w:sz w:val="16"/>
-                <w:szCs w:val="16"/>
-              </w:rPr>
               <w:t xml:space="preserve">isCity</w:t>
             </w:r>
           </w:p>
@@ -13862,7 +13937,45 @@
                 <w:sz w:val="16"/>
                 <w:szCs w:val="16"/>
               </w:rPr>
-              <w:t xml:space="preserve">Lists cached 7 days (data rarely changes); a seeded copy of the NCR and major cities list is used if the API is unreachable</w:t>
+              <w:t xml:space="preserve">OpenDoor uses the official 10-digit codes; the API's own 9-digit code is kept only for follow-up requests. Lists cached 7 days; if the API is unreachable: expired cache entry (</w:t>
+            </w:r>
+            <w:r>
+              <w:rPr>
+                <w:rFonts w:ascii="Consolas" w:cs="Consolas" w:eastAsia="Consolas" w:hAnsi="Consolas"/>
+                <w:sz w:val="16"/>
+                <w:szCs w:val="16"/>
+              </w:rPr>
+              <w:t xml:space="preserve">stale</w:t>
+            </w:r>
+            <w:r>
+              <w:rPr>
+                <w:sz w:val="16"/>
+                <w:szCs w:val="16"/>
+              </w:rPr>
+              <w:t xml:space="preserve">), then a bundled copy of all regions, provinces and their cities/municipalities (</w:t>
+            </w:r>
+            <w:r>
+              <w:rPr>
+                <w:rFonts w:ascii="Consolas" w:cs="Consolas" w:eastAsia="Consolas" w:hAnsi="Consolas"/>
+                <w:sz w:val="16"/>
+                <w:szCs w:val="16"/>
+              </w:rPr>
+              <w:t xml:space="preserve">fallback</w:t>
+            </w:r>
+            <w:r>
+              <w:rPr>
+                <w:sz w:val="16"/>
+                <w:szCs w:val="16"/>
+              </w:rPr>
+              <w:t xml:space="preserve">), else 503 </w:t>
+            </w:r>
+            <w:r>
+              <w:rPr>
+                <w:rFonts w:ascii="Consolas" w:cs="Consolas" w:eastAsia="Consolas" w:hAnsi="Consolas"/>
+                <w:sz w:val="16"/>
+                <w:szCs w:val="16"/>
+              </w:rPr>
+              <w:t xml:space="preserve">SERVICE_UNAVAILABLE</w:t>
             </w:r>
           </w:p>
         </w:tc>
@@ -13905,7 +14018,7 @@
         <w:t xml:space="preserve">GET /api/insights/job-postings/{id}</w:t>
       </w:r>
       <w:r>
-        <w:t xml:space="preserve">) combines four sources into one result shown on the job details page:</w:t>
+        <w:t xml:space="preserve">) combines four sources into one result shown on the job details page. Only the Core Service is required; the whole snapshot must be built within 12 seconds (the gateway allows 15):</w:t>
       </w:r>
     </w:p>
     <w:p>
@@ -13934,7 +14047,16 @@
         <w:t xml:space="preserve">GET /internal/job-postings/{id}/summary</w:t>
       </w:r>
       <w:r>
-        <w:t xml:space="preserve"> (service key) to obtain the posting's street address, PSGC code, advertised accommodations (grouped) and the employer's published trust score.</w:t>
+        <w:t xml:space="preserve"> (service key) to obtain the posting's street address, PSGC code and label, advertised accommodations (grouped) and the employer's trust score with its breakdown. Posting data is never cached by the Insights Service. Core 404 (posting missing, not open or not approved) → snapshot 404; any other Core failure (down, timeout, rejected key, unexpected answer) → 503 </w:t>
+      </w:r>
+      <w:r>
+        <w:rPr>
+          <w:rFonts w:ascii="Consolas" w:cs="Consolas" w:eastAsia="Consolas" w:hAnsi="Consolas"/>
+        </w:rPr>
+        <w:t xml:space="preserve">SERVICE_UNAVAILABLE</w:t>
+      </w:r>
+      <w:r>
+        <w:t xml:space="preserve">.</w:t>
       </w:r>
     </w:p>
     <w:p>
@@ -13954,7 +14076,16 @@
         <w:t xml:space="preserve">Extract – PSGC.</w:t>
       </w:r>
       <w:r>
-        <w:t xml:space="preserve"> The PSGC code is resolved to a standard </w:t>
+        <w:t xml:space="preserve"> Locations are chosen from PSGC lists in the location picker instead of typed, so "QC", "Quezon City" and "Q.C." all become code </w:t>
+      </w:r>
+      <w:r>
+        <w:rPr>
+          <w:rFonts w:ascii="Consolas" w:cs="Consolas" w:eastAsia="Consolas" w:hAnsi="Consolas"/>
+        </w:rPr>
+        <w:t xml:space="preserve">1381300000</w:t>
+      </w:r>
+      <w:r>
+        <w:t xml:space="preserve">. The Insights Service resolves the code to the official </w:t>
       </w:r>
       <w:r>
         <w:rPr>
@@ -13963,7 +14094,7 @@
         <w:t xml:space="preserve">City, Province, Region</w:t>
       </w:r>
       <w:r>
-        <w:t xml:space="preserve"> label so that free-text locations such as "QC", "Quezon City" and "Q.C." become one value.</w:t>
+        <w:t xml:space="preserve"> names (NCR has no province; highly urbanized cities such as Cebu City are searched across the region's provinces). If PSGC is unavailable, the label stored by the Core Service is used.</w:t>
       </w:r>
     </w:p>
     <w:p>
@@ -13983,7 +14114,34 @@
         <w:t xml:space="preserve">Extract – Nominatim.</w:t>
       </w:r>
       <w:r>
-        <w:t xml:space="preserve"> The normalized address is geocoded to coordinates (cached).</w:t>
+        <w:t xml:space="preserve"> The query </w:t>
+      </w:r>
+      <w:r>
+        <w:rPr>
+          <w:rFonts w:ascii="Consolas" w:cs="Consolas" w:eastAsia="Consolas" w:hAnsi="Consolas"/>
+        </w:rPr>
+        <w:t xml:space="preserve">street address, City, Province</w:t>
+      </w:r>
+      <w:r>
+        <w:t xml:space="preserve"> is geocoded to coordinates (</w:t>
+      </w:r>
+      <w:r>
+        <w:rPr>
+          <w:rFonts w:ascii="Consolas" w:cs="Consolas" w:eastAsia="Consolas" w:hAnsi="Consolas"/>
+        </w:rPr>
+        <w:t xml:space="preserve">precision: "street"</w:t>
+      </w:r>
+      <w:r>
+        <w:t xml:space="preserve">). If the street is not found, the city itself is searched (e.g. "Makati, Metro Manila"; for PSGC's "City of X" also "X City, Province" and "X City"), accepting only a city, town or municipality – or a result whose address names the city – so that provinces or same-name places elsewhere are not used (</w:t>
+      </w:r>
+      <w:r>
+        <w:rPr>
+          <w:rFonts w:ascii="Consolas" w:cs="Consolas" w:eastAsia="Consolas" w:hAnsi="Consolas"/>
+        </w:rPr>
+        <w:t xml:space="preserve">precision: "city"</w:t>
+      </w:r>
+      <w:r>
+        <w:t xml:space="preserve">). If nothing is found or Nominatim fails, a bundled city centre for the PSGC code is used.</w:t>
       </w:r>
     </w:p>
     <w:p>
@@ -14003,16 +14161,43 @@
         <w:t xml:space="preserve">Extract – Overpass.</w:t>
       </w:r>
       <w:r>
-        <w:t xml:space="preserve"> An Overpass QL query returns OSM elements within 500 m that carry a </w:t>
+        <w:t xml:space="preserve"> An Overpass QL query (Appendix B) returns OSM elements within 500 m tagged </w:t>
       </w:r>
       <w:r>
         <w:rPr>
           <w:rFonts w:ascii="Consolas" w:cs="Consolas" w:eastAsia="Consolas" w:hAnsi="Consolas"/>
         </w:rPr>
-        <w:t xml:space="preserve">wheelchair</w:t>
-      </w:r>
-      <w:r>
-        <w:t xml:space="preserve"> tag.</w:t>
+        <w:t xml:space="preserve">wheelchair=yes</w:t>
+      </w:r>
+      <w:r>
+        <w:t xml:space="preserve"> or </w:t>
+      </w:r>
+      <w:r>
+        <w:rPr>
+          <w:rFonts w:ascii="Consolas" w:cs="Consolas" w:eastAsia="Consolas" w:hAnsi="Consolas"/>
+        </w:rPr>
+        <w:t xml:space="preserve">limited</w:t>
+      </w:r>
+      <w:r>
+        <w:t xml:space="preserve">. Without coordinates, or when Overpass fails and nothing is cached, </w:t>
+      </w:r>
+      <w:r>
+        <w:rPr>
+          <w:rFonts w:ascii="Consolas" w:cs="Consolas" w:eastAsia="Consolas" w:hAnsi="Consolas"/>
+        </w:rPr>
+        <w:t xml:space="preserve">nearby_accessible</w:t>
+      </w:r>
+      <w:r>
+        <w:t xml:space="preserve"> is </w:t>
+      </w:r>
+      <w:r>
+        <w:rPr>
+          <w:rFonts w:ascii="Consolas" w:cs="Consolas" w:eastAsia="Consolas" w:hAnsi="Consolas"/>
+        </w:rPr>
+        <w:t xml:space="preserve">null</w:t>
+      </w:r>
+      <w:r>
+        <w:t xml:space="preserve"> (empty lists mean that nothing was found).</w:t>
       </w:r>
     </w:p>
     <w:p>
@@ -14032,7 +14217,7 @@
         <w:t xml:space="preserve">Transform.</w:t>
       </w:r>
       <w:r>
-        <w:t xml:space="preserve"> OSM tags are mapped to four PWD-relevant categories (Accessible transit stops, Accessible toilets, Accessible parking, Other accessible places); distances are computed with the haversine formula; duplicates are removed; </w:t>
+        <w:t xml:space="preserve"> OSM tags are mapped to four PWD-relevant categories (Accessible transit stops, Accessible toilets, Accessible parking, Other accessible places); distances from the exact workplace point are computed with the haversine formula; duplicates are removed; </w:t>
       </w:r>
       <w:r>
         <w:rPr>
@@ -14070,7 +14255,16 @@
         <w:t xml:space="preserve">Combine.</w:t>
       </w:r>
       <w:r>
-        <w:t xml:space="preserve"> The result merges the employer's own claims (advertised physical-access accommodations), the community verification (trust score and per-accommodation breakdown) and the independent map data, plus a </w:t>
+        <w:t xml:space="preserve"> The result merges the employer's own claims (advertised accommodations by group), the community verification (trust score and per-accommodation breakdown; </w:t>
+      </w:r>
+      <w:r>
+        <w:rPr>
+          <w:rFonts w:ascii="Consolas" w:cs="Consolas" w:eastAsia="Consolas" w:hAnsi="Consolas"/>
+        </w:rPr>
+        <w:t xml:space="preserve">null</w:t>
+      </w:r>
+      <w:r>
+        <w:t xml:space="preserve"> until the score is published) and the independent map data, plus a </w:t>
       </w:r>
       <w:r>
         <w:rPr>
@@ -14079,7 +14273,25 @@
         <w:t xml:space="preserve">sources</w:t>
       </w:r>
       <w:r>
-        <w:t xml:space="preserve"> object that tells the client which parts are live, cached or unavailable.</w:t>
+        <w:t xml:space="preserve"> object that tells the client which parts are live (</w:t>
+      </w:r>
+      <w:r>
+        <w:rPr>
+          <w:rFonts w:ascii="Consolas" w:cs="Consolas" w:eastAsia="Consolas" w:hAnsi="Consolas"/>
+        </w:rPr>
+        <w:t xml:space="preserve">ok</w:t>
+      </w:r>
+      <w:r>
+        <w:t xml:space="preserve">), cached, stale or unavailable. A source that has not answered when the 12-second budget is used up is reported </w:t>
+      </w:r>
+      <w:r>
+        <w:rPr>
+          <w:rFonts w:ascii="Consolas" w:cs="Consolas" w:eastAsia="Consolas" w:hAnsi="Consolas"/>
+        </w:rPr>
+        <w:t xml:space="preserve">unavailable</w:t>
+      </w:r>
+      <w:r>
+        <w:t xml:space="preserve"> and no further source is started; its request still completes and fills the cache for the next visitor.</w:t>
       </w:r>
     </w:p>
     <w:p>
@@ -14647,7 +14859,23 @@
                 <w:sz w:val="16"/>
                 <w:szCs w:val="16"/>
               </w:rPr>
-              <w:t xml:space="preserve">Any other element with a </w:t>
+              <w:t xml:space="preserve">Any other </w:t>
+            </w:r>
+            <w:r>
+              <w:rPr>
+                <w:b/>
+                <w:bCs/>
+                <w:sz w:val="16"/>
+                <w:szCs w:val="16"/>
+              </w:rPr>
+              <w:t xml:space="preserve">named</w:t>
+            </w:r>
+            <w:r>
+              <w:rPr>
+                <w:sz w:val="16"/>
+                <w:szCs w:val="16"/>
+              </w:rPr>
+              <w:t xml:space="preserve"> element with a </w:t>
             </w:r>
             <w:r>
               <w:rPr>
@@ -14662,7 +14890,7 @@
                 <w:sz w:val="16"/>
                 <w:szCs w:val="16"/>
               </w:rPr>
-              <w:t xml:space="preserve"> tag (shops, malls, offices, entrances)</w:t>
+              <w:t xml:space="preserve"> tag (shops, malls, offices); unnamed ones are dropped</w:t>
             </w:r>
           </w:p>
         </w:tc>
@@ -14761,7 +14989,16 @@
         <w:t xml:space="preserve">center</w:t>
       </w:r>
       <w:r>
-        <w:t xml:space="preserve"> coordinates.</w:t>
+        <w:t xml:space="preserve"> coordinates, and a way whose centre lies beyond 500 m is dropped. Unnamed transit stops, toilets and parking are kept, but unnamed </w:t>
+      </w:r>
+      <w:r>
+        <w:rPr>
+          <w:rFonts w:ascii="Consolas" w:cs="Consolas" w:eastAsia="Consolas" w:hAnsi="Consolas"/>
+        </w:rPr>
+        <w:t xml:space="preserve">other</w:t>
+      </w:r>
+      <w:r>
+        <w:t xml:space="preserve"> elements are dropped: in live data these were mostly entrances and kerbs that would only read as "Unnamed place".</w:t>
       </w:r>
     </w:p>
     <w:tbl>
@@ -14833,7 +15070,7 @@
                 <w:sz w:val="16"/>
                 <w:szCs w:val="16"/>
               </w:rPr>
-              <w:t xml:space="preserve">  "location": { "psgc_code": "137404000", "label": "Quezon City, Metro Manila, NCR",</w:t>
+              <w:t xml:space="preserve">  "location": { "psgc_code": "1381300000", "label": "Quezon City, National Capital Region (NCR)",</w:t>
             </w:r>
           </w:p>
           <w:p>
@@ -14859,7 +15096,7 @@
                 <w:sz w:val="16"/>
                 <w:szCs w:val="16"/>
               </w:rPr>
-              <w:t xml:space="preserve">  "employer_claims": { "physical_access": [ "Wheelchair-accessible entrance", "Elevator or ground-floor workspace" ] },</w:t>
+              <w:t xml:space="preserve">  "employer_claims": { "physical_access": [ "Wheelchair-accessible entrance",</w:t>
             </w:r>
           </w:p>
           <w:p>
@@ -14872,6 +15109,19 @@
                 <w:sz w:val="16"/>
                 <w:szCs w:val="16"/>
               </w:rPr>
+              <w:t xml:space="preserve">                                           "Elevator or ground-floor workspace" ] },</w:t>
+            </w:r>
+          </w:p>
+          <w:p>
+            <w:pPr>
+              <w:spacing w:after="0" w:line="240"/>
+            </w:pPr>
+            <w:r>
+              <w:rPr>
+                <w:rFonts w:ascii="Consolas" w:cs="Consolas" w:eastAsia="Consolas" w:hAnsi="Consolas"/>
+                <w:sz w:val="16"/>
+                <w:szCs w:val="16"/>
+              </w:rPr>
               <w:t xml:space="preserve">  "community_verification": { "trust_score": 86, "based_on": 5,</w:t>
             </w:r>
           </w:p>
@@ -14885,7 +15135,20 @@
                 <w:sz w:val="16"/>
                 <w:szCs w:val="16"/>
               </w:rPr>
-              <w:t xml:space="preserve">      "breakdown": [ { "accommodation": "Wheelchair-accessible entrance", "delivered": 5, "of": 5 } ] },</w:t>
+              <w:t xml:space="preserve">      "breakdown": [ { "accommodation_id": 1, "name": "Wheelchair-accessible entrance",</w:t>
+            </w:r>
+          </w:p>
+          <w:p>
+            <w:pPr>
+              <w:spacing w:after="0" w:line="240"/>
+            </w:pPr>
+            <w:r>
+              <w:rPr>
+                <w:rFonts w:ascii="Consolas" w:cs="Consolas" w:eastAsia="Consolas" w:hAnsi="Consolas"/>
+                <w:sz w:val="16"/>
+                <w:szCs w:val="16"/>
+              </w:rPr>
+              <w:t xml:space="preserve">                       "delivered": 5, "partial": 0, "not_delivered": 0, "of": 5 } ] },</w:t>
             </w:r>
           </w:p>
           <w:p>
@@ -16117,7 +16380,7 @@
                 <w:sz w:val="16"/>
                 <w:szCs w:val="16"/>
               </w:rPr>
-              <w:t xml:space="preserve">Address, PSGC code, accommodations, trust score</w:t>
+              <w:t xml:space="preserve">Address, PSGC code and label, accommodations, trust score with breakdown</w:t>
             </w:r>
           </w:p>
         </w:tc>
@@ -16146,7 +16409,7 @@
                 <w:sz w:val="16"/>
                 <w:szCs w:val="16"/>
               </w:rPr>
-              <w:t xml:space="preserve">200 summary; 404 if posting is not open/approved (snapshot not built)</w:t>
+              <w:t xml:space="preserve">200 summary (never cached); 404 if posting is not open/approved → snapshot 404; any other failure → snapshot 503</w:t>
             </w:r>
           </w:p>
         </w:tc>
@@ -16438,6 +16701,43 @@
               </w:rPr>
               <w:t xml:space="preserve">GET /search?q=&amp;countrycodes=ph&amp;format=jsonv2&amp;limit=1</w:t>
             </w:r>
+            <w:r>
+              <w:rPr>
+                <w:sz w:val="16"/>
+                <w:szCs w:val="16"/>
+              </w:rPr>
+              <w:t xml:space="preserve"> (city searches </w:t>
+            </w:r>
+            <w:r>
+              <w:rPr>
+                <w:rFonts w:ascii="Consolas" w:cs="Consolas" w:eastAsia="Consolas" w:hAnsi="Consolas"/>
+                <w:sz w:val="16"/>
+                <w:szCs w:val="16"/>
+              </w:rPr>
+              <w:t xml:space="preserve">limit=5</w:t>
+            </w:r>
+            <w:r>
+              <w:rPr>
+                <w:sz w:val="16"/>
+                <w:szCs w:val="16"/>
+              </w:rPr>
+              <w:t xml:space="preserve">); </w:t>
+            </w:r>
+            <w:r>
+              <w:rPr>
+                <w:rFonts w:ascii="Consolas" w:cs="Consolas" w:eastAsia="Consolas" w:hAnsi="Consolas"/>
+                <w:sz w:val="16"/>
+                <w:szCs w:val="16"/>
+              </w:rPr>
+              <w:t xml:space="preserve">User-Agent</w:t>
+            </w:r>
+            <w:r>
+              <w:rPr>
+                <w:sz w:val="16"/>
+                <w:szCs w:val="16"/>
+              </w:rPr>
+              <w:t xml:space="preserve"> with contact email</w:t>
+            </w:r>
           </w:p>
         </w:tc>
         <w:tc>
@@ -16465,7 +16765,7 @@
                 <w:sz w:val="16"/>
                 <w:szCs w:val="16"/>
               </w:rPr>
-              <w:t xml:space="preserve">Normalized address → lat/lon</w:t>
+              <w:t xml:space="preserve">Street address and PSGC place names → lat/lon</w:t>
             </w:r>
           </w:p>
         </w:tc>
@@ -16494,7 +16794,7 @@
                 <w:sz w:val="16"/>
                 <w:szCs w:val="16"/>
               </w:rPr>
-              <w:t xml:space="preserve">Coordinates cached 30 days</w:t>
+              <w:t xml:space="preserve">Coordinates cached 30 days (key: SHA-256 of the normalized query)</w:t>
             </w:r>
           </w:p>
         </w:tc>
@@ -16799,6 +17099,21 @@
                 <w:sz w:val="16"/>
                 <w:szCs w:val="16"/>
               </w:rPr>
+              <w:t xml:space="preserve">/regions/{code}/cities-municipalities</w:t>
+            </w:r>
+            <w:r>
+              <w:rPr>
+                <w:sz w:val="16"/>
+                <w:szCs w:val="16"/>
+              </w:rPr>
+              <w:t xml:space="preserve"> (NCR), </w:t>
+            </w:r>
+            <w:r>
+              <w:rPr>
+                <w:rFonts w:ascii="Consolas" w:cs="Consolas" w:eastAsia="Consolas" w:hAnsi="Consolas"/>
+                <w:sz w:val="16"/>
+                <w:szCs w:val="16"/>
+              </w:rPr>
               <w:t xml:space="preserve">/provinces/{code}/cities-municipalities</w:t>
             </w:r>
           </w:p>
@@ -16857,7 +17172,7 @@
                 <w:sz w:val="16"/>
                 <w:szCs w:val="16"/>
               </w:rPr>
-              <w:t xml:space="preserve">Normalized location lists cached 7 days</w:t>
+              <w:t xml:space="preserve">Normalized location lists (10-digit codes, sorted by name) cached 7 days</w:t>
             </w:r>
           </w:p>
         </w:tc>
@@ -17662,7 +17977,7 @@
                 <w:sz w:val="16"/>
                 <w:szCs w:val="16"/>
               </w:rPr>
-              <w:t xml:space="preserve">Unknown ID, or a posting that is not open and approved</w:t>
+              <w:t xml:space="preserve">Unknown ID, or a posting that is not open and approved; unknown PSGC region/province</w:t>
             </w:r>
           </w:p>
         </w:tc>
@@ -17869,7 +18184,7 @@
                 <w:sz w:val="16"/>
                 <w:szCs w:val="16"/>
               </w:rPr>
-              <w:t xml:space="preserve">Core</w:t>
+              <w:t xml:space="preserve">Core, Insights</w:t>
             </w:r>
           </w:p>
         </w:tc>
@@ -17898,7 +18213,22 @@
                 <w:sz w:val="16"/>
                 <w:szCs w:val="16"/>
               </w:rPr>
-              <w:t xml:space="preserve">Form Request validation fails; field errors returned in </w:t>
+              <w:t xml:space="preserve">Form Request validation fails, or a location list </w:t>
+            </w:r>
+            <w:r>
+              <w:rPr>
+                <w:rFonts w:ascii="Consolas" w:cs="Consolas" w:eastAsia="Consolas" w:hAnsi="Consolas"/>
+                <w:sz w:val="16"/>
+                <w:szCs w:val="16"/>
+              </w:rPr>
+              <w:t xml:space="preserve">parent</w:t>
+            </w:r>
+            <w:r>
+              <w:rPr>
+                <w:sz w:val="16"/>
+                <w:szCs w:val="16"/>
+              </w:rPr>
+              <w:t xml:space="preserve"> that is not a 10-digit PSGC code; field errors returned in </w:t>
             </w:r>
             <w:r>
               <w:rPr>
@@ -18882,7 +19212,7 @@
                 <w:sz w:val="16"/>
                 <w:szCs w:val="16"/>
               </w:rPr>
-              <w:t xml:space="preserve">Gateway</w:t>
+              <w:t xml:space="preserve">Gateway, Insights</w:t>
             </w:r>
           </w:p>
         </w:tc>
@@ -18911,7 +19241,7 @@
                 <w:sz w:val="16"/>
                 <w:szCs w:val="16"/>
               </w:rPr>
-              <w:t xml:space="preserve">Health check shows the target service down (e.g., sleeping free-tier instance)</w:t>
+              <w:t xml:space="preserve">Gateway: target service down (e.g., sleeping free-tier instance). Insights: Core Service unreachable for a snapshot, or a PSGC list neither cached nor bundled</w:t>
             </w:r>
           </w:p>
         </w:tc>
@@ -19052,7 +19382,7 @@
         <w:t xml:space="preserve">Graceful degradation.</w:t>
       </w:r>
       <w:r>
-        <w:t xml:space="preserve"> External and legacy integrations never block the core hiring transaction. The Insights Service uses per-source timeouts (Nominatim 5 s, Overpass 8 s, Core 3 s), returns HTTP 200 with whatever parts it could build, and reports each source as </w:t>
+        <w:t xml:space="preserve"> External and legacy integrations never block the core hiring transaction. The Insights Service uses per-source timeouts (Core 3 s, PSGC 5 s, Nominatim 5 s, Overpass 8 s) within a 12-second budget for the whole snapshot, returns HTTP 200 with whatever parts it could build, and reports each source as </w:t>
       </w:r>
       <w:r>
         <w:rPr>
@@ -19088,7 +19418,7 @@
         <w:t xml:space="preserve">unavailable</w:t>
       </w:r>
       <w:r>
-        <w:t xml:space="preserve">; the client hides empty sections and shows "Nearby accessibility information is temporarily unavailable." If the Insights Service itself is down, the job details page still renders the posting, match result and trust score from the Core Service. If the Business Registry is down, administrators can still verify manually and the check can be retried. Retries are limited to one retry with back-off for idempotent GET calls; POST/PATCH calls are never retried automatically.</w:t>
+        <w:t xml:space="preserve">. A source that failed is skipped for 60 seconds (cooldown), so during an outage each request waits for at most one timeout and is answered from the cache. The client explains each gap in plain language (for example "Nearby places could not be loaded right now. Please check again later." or, with city-level coordinates, that distances are measured from the city centre). If the snapshot fails (503) or the Insights Service itself is down, the job details page still renders the posting, match result and trust score from the Core Service and the snapshot section shows a short warning. If the Business Registry is down, administrators can still verify manually and the check can be repeated. Neither the gateway nor the services retry a call automatically; the user or administrator repeats the action.</w:t>
       </w:r>
     </w:p>
     <w:p>
@@ -22301,22 +22631,37 @@
                 <w:sz w:val="16"/>
                 <w:szCs w:val="16"/>
               </w:rPr>
-              <w:t xml:space="preserve">200; </w:t>
-            </w:r>
-            <w:r>
-              <w:rPr>
-                <w:rFonts w:ascii="Consolas" w:cs="Consolas" w:eastAsia="Consolas" w:hAnsi="Consolas"/>
-                <w:sz w:val="16"/>
-                <w:szCs w:val="16"/>
-              </w:rPr>
-              <w:t xml:space="preserve">location.lat/lon</w:t>
-            </w:r>
-            <w:r>
-              <w:rPr>
-                <w:sz w:val="16"/>
-                <w:szCs w:val="16"/>
-              </w:rPr>
-              <w:t xml:space="preserve"> present; </w:t>
+              <w:t xml:space="preserve">200 within 15 s; </w:t>
+            </w:r>
+            <w:r>
+              <w:rPr>
+                <w:rFonts w:ascii="Consolas" w:cs="Consolas" w:eastAsia="Consolas" w:hAnsi="Consolas"/>
+                <w:sz w:val="16"/>
+                <w:szCs w:val="16"/>
+              </w:rPr>
+              <w:t xml:space="preserve">location</w:t>
+            </w:r>
+            <w:r>
+              <w:rPr>
+                <w:sz w:val="16"/>
+                <w:szCs w:val="16"/>
+              </w:rPr>
+              <w:t xml:space="preserve"> has the PSGC code, label and coordinates in the Philippines (</w:t>
+            </w:r>
+            <w:r>
+              <w:rPr>
+                <w:rFonts w:ascii="Consolas" w:cs="Consolas" w:eastAsia="Consolas" w:hAnsi="Consolas"/>
+                <w:sz w:val="16"/>
+                <w:szCs w:val="16"/>
+              </w:rPr>
+              <w:t xml:space="preserve">precision</w:t>
+            </w:r>
+            <w:r>
+              <w:rPr>
+                <w:sz w:val="16"/>
+                <w:szCs w:val="16"/>
+              </w:rPr>
+              <w:t xml:space="preserve"> street or city); </w:t>
             </w:r>
             <w:r>
               <w:rPr>
@@ -22444,7 +22789,22 @@
                 <w:sz w:val="16"/>
                 <w:szCs w:val="16"/>
               </w:rPr>
-              <w:t xml:space="preserve">Snapshot with Overpass unreachable (invalid URL in test env)</w:t>
+              <w:t xml:space="preserve">Snapshot with Overpass unreachable (invalid </w:t>
+            </w:r>
+            <w:r>
+              <w:rPr>
+                <w:rFonts w:ascii="Consolas" w:cs="Consolas" w:eastAsia="Consolas" w:hAnsi="Consolas"/>
+                <w:sz w:val="16"/>
+                <w:szCs w:val="16"/>
+              </w:rPr>
+              <w:t xml:space="preserve">OVERPASS_URL</w:t>
+            </w:r>
+            <w:r>
+              <w:rPr>
+                <w:sz w:val="16"/>
+                <w:szCs w:val="16"/>
+              </w:rPr>
+              <w:t xml:space="preserve"> in test env)</w:t>
             </w:r>
           </w:p>
         </w:tc>
@@ -22517,7 +22877,52 @@
                 <w:sz w:val="16"/>
                 <w:szCs w:val="16"/>
               </w:rPr>
-              <w:t xml:space="preserve">; other sections present</w:t>
+              <w:t xml:space="preserve"> and </w:t>
+            </w:r>
+            <w:r>
+              <w:rPr>
+                <w:rFonts w:ascii="Consolas" w:cs="Consolas" w:eastAsia="Consolas" w:hAnsi="Consolas"/>
+                <w:sz w:val="16"/>
+                <w:szCs w:val="16"/>
+              </w:rPr>
+              <w:t xml:space="preserve">nearby_accessible=null</w:t>
+            </w:r>
+            <w:r>
+              <w:rPr>
+                <w:sz w:val="16"/>
+                <w:szCs w:val="16"/>
+              </w:rPr>
+              <w:t xml:space="preserve"> (</w:t>
+            </w:r>
+            <w:r>
+              <w:rPr>
+                <w:rFonts w:ascii="Consolas" w:cs="Consolas" w:eastAsia="Consolas" w:hAnsi="Consolas"/>
+                <w:sz w:val="16"/>
+                <w:szCs w:val="16"/>
+              </w:rPr>
+              <w:t xml:space="preserve">cached</w:t>
+            </w:r>
+            <w:r>
+              <w:rPr>
+                <w:sz w:val="16"/>
+                <w:szCs w:val="16"/>
+              </w:rPr>
+              <w:t xml:space="preserve">/</w:t>
+            </w:r>
+            <w:r>
+              <w:rPr>
+                <w:rFonts w:ascii="Consolas" w:cs="Consolas" w:eastAsia="Consolas" w:hAnsi="Consolas"/>
+                <w:sz w:val="16"/>
+                <w:szCs w:val="16"/>
+              </w:rPr>
+              <w:t xml:space="preserve">stale</w:t>
+            </w:r>
+            <w:r>
+              <w:rPr>
+                <w:sz w:val="16"/>
+                <w:szCs w:val="16"/>
+              </w:rPr>
+              <w:t xml:space="preserve"> if a cached result exists); location and employer claims present</w:t>
             </w:r>
           </w:p>
         </w:tc>
@@ -23046,15 +23451,15 @@
                 <w:sz w:val="16"/>
                 <w:szCs w:val="16"/>
               </w:rPr>
-              <w:t xml:space="preserve">Insights calls </w:t>
-            </w:r>
-            <w:r>
-              <w:rPr>
-                <w:rFonts w:ascii="Consolas" w:cs="Consolas" w:eastAsia="Consolas" w:hAnsi="Consolas"/>
-                <w:sz w:val="16"/>
-                <w:szCs w:val="16"/>
-              </w:rPr>
-              <w:t xml:space="preserve">/internal/...</w:t>
+              <w:t xml:space="preserve">Call Core </w:t>
+            </w:r>
+            <w:r>
+              <w:rPr>
+                <w:rFonts w:ascii="Consolas" w:cs="Consolas" w:eastAsia="Consolas" w:hAnsi="Consolas"/>
+                <w:sz w:val="16"/>
+                <w:szCs w:val="16"/>
+              </w:rPr>
+              <w:t xml:space="preserve">/internal/job-postings/{id}/summary</w:t>
             </w:r>
             <w:r>
               <w:rPr>
@@ -23127,7 +23532,30 @@
                 <w:sz w:val="16"/>
                 <w:szCs w:val="16"/>
               </w:rPr>
-              <w:t xml:space="preserve">401</w:t>
+              <w:t xml:space="preserve">401 </w:t>
+            </w:r>
+            <w:r>
+              <w:rPr>
+                <w:rFonts w:ascii="Consolas" w:cs="Consolas" w:eastAsia="Consolas" w:hAnsi="Consolas"/>
+                <w:sz w:val="16"/>
+                <w:szCs w:val="16"/>
+              </w:rPr>
+              <w:t xml:space="preserve">UNAUTHENTICATED</w:t>
+            </w:r>
+            <w:r>
+              <w:rPr>
+                <w:sz w:val="16"/>
+                <w:szCs w:val="16"/>
+              </w:rPr>
+              <w:t xml:space="preserve">; the gateway does not route </w:t>
+            </w:r>
+            <w:r>
+              <w:rPr>
+                <w:rFonts w:ascii="Consolas" w:cs="Consolas" w:eastAsia="Consolas" w:hAnsi="Consolas"/>
+                <w:sz w:val="16"/>
+                <w:szCs w:val="16"/>
+              </w:rPr>
+              <w:t xml:space="preserve">/internal/*</w:t>
             </w:r>
           </w:p>
         </w:tc>
@@ -25842,7 +26270,52 @@
                 <w:sz w:val="16"/>
                 <w:szCs w:val="16"/>
               </w:rPr>
-              <w:t xml:space="preserve">, timeouts</w:t>
+              <w:t xml:space="preserve">; optional </w:t>
+            </w:r>
+            <w:r>
+              <w:rPr>
+                <w:rFonts w:ascii="Consolas" w:cs="Consolas" w:eastAsia="Consolas" w:hAnsi="Consolas"/>
+                <w:sz w:val="16"/>
+                <w:szCs w:val="16"/>
+              </w:rPr>
+              <w:t xml:space="preserve">PSGC_URL</w:t>
+            </w:r>
+            <w:r>
+              <w:rPr>
+                <w:sz w:val="16"/>
+                <w:szCs w:val="16"/>
+              </w:rPr>
+              <w:t xml:space="preserve">, </w:t>
+            </w:r>
+            <w:r>
+              <w:rPr>
+                <w:rFonts w:ascii="Consolas" w:cs="Consolas" w:eastAsia="Consolas" w:hAnsi="Consolas"/>
+                <w:sz w:val="16"/>
+                <w:szCs w:val="16"/>
+              </w:rPr>
+              <w:t xml:space="preserve">NOMINATIM_URL</w:t>
+            </w:r>
+            <w:r>
+              <w:rPr>
+                <w:sz w:val="16"/>
+                <w:szCs w:val="16"/>
+              </w:rPr>
+              <w:t xml:space="preserve">, </w:t>
+            </w:r>
+            <w:r>
+              <w:rPr>
+                <w:rFonts w:ascii="Consolas" w:cs="Consolas" w:eastAsia="Consolas" w:hAnsi="Consolas"/>
+                <w:sz w:val="16"/>
+                <w:szCs w:val="16"/>
+              </w:rPr>
+              <w:t xml:space="preserve">OVERPASS_URL</w:t>
+            </w:r>
+            <w:r>
+              <w:rPr>
+                <w:sz w:val="16"/>
+                <w:szCs w:val="16"/>
+              </w:rPr>
+              <w:t xml:space="preserve"> (e.g., a second Overpass instance)</w:t>
             </w:r>
           </w:p>
         </w:tc>
@@ -30566,7 +31039,7 @@
         <w:ind w:left="720" w:hanging="720"/>
       </w:pPr>
       <w:r>
-        <w:t xml:space="preserve">Department of Labor and Employment. (n.d.). PhilJobNet and PESO Employment Information System. Retrieved September 28, 2026, from https://philjobnet.gov.ph/</w:t>
+        <w:t xml:space="preserve">Axios. (n.d.). Axios documentation. https://axios-http.com/docs/intro</w:t>
       </w:r>
     </w:p>
     <w:p>
@@ -30575,7 +31048,7 @@
         <w:ind w:left="720" w:hanging="720"/>
       </w:pPr>
       <w:r>
-        <w:t xml:space="preserve">Deque Systems. (n.d.). axe-core: Accessibility engine for automated web UI testing. https://github.com/dequelabs/axe-core</w:t>
+        <w:t xml:space="preserve">Department of Labor and Employment. (n.d.). PhilJobNet and PESO Employment Information System. Retrieved September 28, 2026, from https://philjobnet.gov.ph/</w:t>
       </w:r>
     </w:p>
     <w:p>
@@ -30584,7 +31057,7 @@
         <w:ind w:left="720" w:hanging="720"/>
       </w:pPr>
       <w:r>
-        <w:t xml:space="preserve">Express.js. (n.d.). Express 4.x API reference. https://expressjs.com/</w:t>
+        <w:t xml:space="preserve">Deque Systems. (n.d.). axe-core: Accessibility engine for automated web UI testing. https://github.com/dequelabs/axe-core</w:t>
       </w:r>
     </w:p>
     <w:p>
@@ -30593,7 +31066,7 @@
         <w:ind w:left="720" w:hanging="720"/>
       </w:pPr>
       <w:r>
-        <w:t xml:space="preserve">GitHub. (n.d.). GitHub Actions documentation. https://docs.github.com/actions</w:t>
+        <w:t xml:space="preserve">Express.js. (n.d.). Express 4.x API reference. https://expressjs.com/</w:t>
       </w:r>
     </w:p>
     <w:p>
@@ -30602,7 +31075,7 @@
         <w:ind w:left="720" w:hanging="720"/>
       </w:pPr>
       <w:r>
-        <w:t xml:space="preserve">Laravel. (n.d.). Laravel 13.x documentation: Sanctum, Authorization, Validation. https://laravel.com/docs/13.x</w:t>
+        <w:t xml:space="preserve">GitHub. (n.d.). GitHub Actions documentation. https://docs.github.com/actions</w:t>
       </w:r>
     </w:p>
     <w:p>
@@ -30611,7 +31084,7 @@
         <w:ind w:left="720" w:hanging="720"/>
       </w:pPr>
       <w:r>
-        <w:t xml:space="preserve">Meta Open Source. (n.d.). React documentation (version 19). https://react.dev/</w:t>
+        <w:t xml:space="preserve">Laravel. (n.d.). Laravel 13.x documentation: Sanctum, Authorization, Validation. https://laravel.com/docs/13.x</w:t>
       </w:r>
     </w:p>
     <w:p>
@@ -30620,7 +31093,7 @@
         <w:ind w:left="720" w:hanging="720"/>
       </w:pPr>
       <w:r>
-        <w:t xml:space="preserve">National Privacy Commission. (2016). Implementing rules and regulations of Republic Act No. 10173, known as the Data Privacy Act of 2012. https://privacy.gov.ph/implementing-rules-regulations-data-privacy-act-2012/</w:t>
+        <w:t xml:space="preserve">Meta Open Source. (n.d.). React documentation (version 19). https://react.dev/</w:t>
       </w:r>
     </w:p>
     <w:p>
@@ -30629,7 +31102,7 @@
         <w:ind w:left="720" w:hanging="720"/>
       </w:pPr>
       <w:r>
-        <w:t xml:space="preserve">OASIS. (2006). Web Services Security UsernameToken Profile 1.1. https://docs.oasis-open.org/wss/v1.1/</w:t>
+        <w:t xml:space="preserve">National Privacy Commission. (2016). Implementing rules and regulations of Republic Act No. 10173, known as the Data Privacy Act of 2012. https://privacy.gov.ph/implementing-rules-regulations-data-privacy-act-2012/</w:t>
       </w:r>
     </w:p>
     <w:p>
@@ -30638,7 +31111,7 @@
         <w:ind w:left="720" w:hanging="720"/>
       </w:pPr>
       <w:r>
-        <w:t xml:space="preserve">OpenJS Foundation. (n.d.). Jest documentation. https://jestjs.io/</w:t>
+        <w:t xml:space="preserve">nock. (n.d.). nock: HTTP server mocking and expectations library for Node.js. https://github.com/nock/nock</w:t>
       </w:r>
     </w:p>
     <w:p>
@@ -30647,7 +31120,7 @@
         <w:ind w:left="720" w:hanging="720"/>
       </w:pPr>
       <w:r>
-        <w:t xml:space="preserve">OpenStreetMap Foundation. (n.d.). Nominatim usage policy. https://operations.osmfoundation.org/policies/nominatim/</w:t>
+        <w:t xml:space="preserve">OASIS. (2006). Web Services Security UsernameToken Profile 1.1. https://docs.oasis-open.org/wss/v1.1/</w:t>
       </w:r>
     </w:p>
     <w:p>
@@ -30656,7 +31129,7 @@
         <w:ind w:left="720" w:hanging="720"/>
       </w:pPr>
       <w:r>
-        <w:t xml:space="preserve">OpenStreetMap Wiki. (n.d.). Overpass API; Key:wheelchair. https://wiki.openstreetmap.org/wiki/Overpass_API</w:t>
+        <w:t xml:space="preserve">OpenJS Foundation. (n.d.). Jest documentation. https://jestjs.io/</w:t>
       </w:r>
     </w:p>
     <w:p>
@@ -30665,7 +31138,34 @@
         <w:ind w:left="720" w:hanging="720"/>
       </w:pPr>
       <w:r>
+        <w:t xml:space="preserve">OpenStreetMap Foundation. (n.d.). Nominatim usage policy. https://operations.osmfoundation.org/policies/nominatim/</w:t>
+      </w:r>
+    </w:p>
+    <w:p>
+      <w:pPr>
+        <w:spacing w:after="100"/>
+        <w:ind w:left="720" w:hanging="720"/>
+      </w:pPr>
+      <w:r>
+        <w:t xml:space="preserve">OpenStreetMap Wiki. (n.d.). Overpass API; Key:wheelchair. https://wiki.openstreetmap.org/wiki/Overpass_API</w:t>
+      </w:r>
+    </w:p>
+    <w:p>
+      <w:pPr>
+        <w:spacing w:after="100"/>
+        <w:ind w:left="720" w:hanging="720"/>
+      </w:pPr>
+      <w:r>
         <w:t xml:space="preserve">Oxc Project. (n.d.). Oxlint linter. https://oxc.rs/docs/guide/usage/linter</w:t>
+      </w:r>
+    </w:p>
+    <w:p>
+      <w:pPr>
+        <w:spacing w:after="100"/>
+        <w:ind w:left="720" w:hanging="720"/>
+      </w:pPr>
+      <w:r>
+        <w:t xml:space="preserve">Philippine Statistics Authority. (n.d.). Philippine Standard Geographic Code (PSGC). https://psa.gov.ph/classification/psgc</w:t>
       </w:r>
     </w:p>
     <w:p>
@@ -38936,7 +39436,7 @@
                 <w:sz w:val="16"/>
                 <w:szCs w:val="16"/>
               </w:rPr>
-              <w:t xml:space="preserve">200 { "id": 42, "address": "123 Quezon Ave., Brgy. Paligsahan", "psgc_code": "137404000",</w:t>
+              <w:t xml:space="preserve">200 { "id": 42, "address": "123 Quezon Ave., Brgy. Paligsahan", "psgc_code": "1381300000",</w:t>
             </w:r>
           </w:p>
           <w:p>
@@ -38949,6 +39449,19 @@
                 <w:sz w:val="16"/>
                 <w:szCs w:val="16"/>
               </w:rPr>
+              <w:t xml:space="preserve">      "location_label": "Quezon City, National Capital Region (NCR)",</w:t>
+            </w:r>
+          </w:p>
+          <w:p>
+            <w:pPr>
+              <w:spacing w:after="0" w:line="240"/>
+            </w:pPr>
+            <w:r>
+              <w:rPr>
+                <w:rFonts w:ascii="Consolas" w:cs="Consolas" w:eastAsia="Consolas" w:hAnsi="Consolas"/>
+                <w:sz w:val="16"/>
+                <w:szCs w:val="16"/>
+              </w:rPr>
               <w:t xml:space="preserve">      "accommodations": [ { "id": 1, "name": "Wheelchair-accessible entrance", "group": "physical_access" } ],</w:t>
             </w:r>
           </w:p>
@@ -38975,7 +39488,20 @@
                 <w:sz w:val="16"/>
                 <w:szCs w:val="16"/>
               </w:rPr>
-              <w:t xml:space="preserve">                       "breakdown": [ { "accommodation_id": 1, "delivered": 5, "of": 5 } ] } }</w:t>
+              <w:t xml:space="preserve">                       "breakdown": [ { "accommodation_id": 1, "name": "Wheelchair-accessible entrance",</w:t>
+            </w:r>
+          </w:p>
+          <w:p>
+            <w:pPr>
+              <w:spacing w:after="0" w:line="240"/>
+            </w:pPr>
+            <w:r>
+              <w:rPr>
+                <w:rFonts w:ascii="Consolas" w:cs="Consolas" w:eastAsia="Consolas" w:hAnsi="Consolas"/>
+                <w:sz w:val="16"/>
+                <w:szCs w:val="16"/>
+              </w:rPr>
+              <w:t xml:space="preserve">                                        "delivered": 5, "partial": 0, "not_delivered": 0, "of": 5 } ] } }</w:t>
             </w:r>
           </w:p>
         </w:tc>
@@ -43233,6 +43759,125 @@
           </w:p>
         </w:tc>
       </w:tr>
+      <w:tr>
+        <w:tc>
+          <w:tcPr>
+            <w:tcW w:type="dxa" w:w="3000"/>
+            <w:tcBorders>
+              <w:top w:val="single" w:color="7F7F7F" w:sz="4"/>
+              <w:left w:val="single" w:color="7F7F7F" w:sz="4"/>
+              <w:bottom w:val="single" w:color="7F7F7F" w:sz="4"/>
+              <w:right w:val="single" w:color="7F7F7F" w:sz="4"/>
+            </w:tcBorders>
+            <w:shd w:fill="F2F2F2" w:color="auto" w:val="clear"/>
+            <w:tcMar>
+              <w:top w:type="dxa" w:w="60"/>
+              <w:left w:type="dxa" w:w="100"/>
+              <w:bottom w:type="dxa" w:w="60"/>
+              <w:right w:type="dxa" w:w="100"/>
+            </w:tcMar>
+          </w:tcPr>
+          <w:p>
+            <w:pPr>
+              <w:spacing w:after="20"/>
+            </w:pPr>
+            <w:r>
+              <w:rPr>
+                <w:b/>
+                <w:bCs/>
+                <w:sz w:val="18"/>
+                <w:szCs w:val="18"/>
+              </w:rPr>
+              <w:t xml:space="preserve">Location lists </w:t>
+            </w:r>
+            <w:r>
+              <w:rPr>
+                <w:rFonts w:ascii="Consolas" w:cs="Consolas" w:eastAsia="Consolas" w:hAnsi="Consolas"/>
+                <w:b/>
+                <w:bCs/>
+                <w:sz w:val="18"/>
+                <w:szCs w:val="18"/>
+              </w:rPr>
+              <w:t xml:space="preserve">X-Data-Source</w:t>
+            </w:r>
+          </w:p>
+        </w:tc>
+        <w:tc>
+          <w:tcPr>
+            <w:tcW w:type="dxa" w:w="7080"/>
+            <w:tcBorders>
+              <w:top w:val="single" w:color="7F7F7F" w:sz="4"/>
+              <w:left w:val="single" w:color="7F7F7F" w:sz="4"/>
+              <w:bottom w:val="single" w:color="7F7F7F" w:sz="4"/>
+              <w:right w:val="single" w:color="7F7F7F" w:sz="4"/>
+            </w:tcBorders>
+            <w:tcMar>
+              <w:top w:type="dxa" w:w="60"/>
+              <w:left w:type="dxa" w:w="100"/>
+              <w:bottom w:type="dxa" w:w="60"/>
+              <w:right w:type="dxa" w:w="100"/>
+            </w:tcMar>
+          </w:tcPr>
+          <w:p>
+            <w:pPr>
+              <w:spacing w:after="20"/>
+            </w:pPr>
+            <w:r>
+              <w:rPr>
+                <w:rFonts w:ascii="Consolas" w:cs="Consolas" w:eastAsia="Consolas" w:hAnsi="Consolas"/>
+                <w:sz w:val="16"/>
+                <w:szCs w:val="16"/>
+              </w:rPr>
+              <w:t xml:space="preserve">ok</w:t>
+            </w:r>
+            <w:r>
+              <w:rPr>
+                <w:sz w:val="16"/>
+                <w:szCs w:val="16"/>
+              </w:rPr>
+              <w:t xml:space="preserve">, </w:t>
+            </w:r>
+            <w:r>
+              <w:rPr>
+                <w:rFonts w:ascii="Consolas" w:cs="Consolas" w:eastAsia="Consolas" w:hAnsi="Consolas"/>
+                <w:sz w:val="16"/>
+                <w:szCs w:val="16"/>
+              </w:rPr>
+              <w:t xml:space="preserve">cached</w:t>
+            </w:r>
+            <w:r>
+              <w:rPr>
+                <w:sz w:val="16"/>
+                <w:szCs w:val="16"/>
+              </w:rPr>
+              <w:t xml:space="preserve">, </w:t>
+            </w:r>
+            <w:r>
+              <w:rPr>
+                <w:rFonts w:ascii="Consolas" w:cs="Consolas" w:eastAsia="Consolas" w:hAnsi="Consolas"/>
+                <w:sz w:val="16"/>
+                <w:szCs w:val="16"/>
+              </w:rPr>
+              <w:t xml:space="preserve">stale</w:t>
+            </w:r>
+            <w:r>
+              <w:rPr>
+                <w:sz w:val="16"/>
+                <w:szCs w:val="16"/>
+              </w:rPr>
+              <w:t xml:space="preserve">, </w:t>
+            </w:r>
+            <w:r>
+              <w:rPr>
+                <w:rFonts w:ascii="Consolas" w:cs="Consolas" w:eastAsia="Consolas" w:hAnsi="Consolas"/>
+                <w:sz w:val="16"/>
+                <w:szCs w:val="16"/>
+              </w:rPr>
+              <w:t xml:space="preserve">fallback</w:t>
+            </w:r>
+          </w:p>
+        </w:tc>
+      </w:tr>
     </w:tbl>
     <w:p>
       <w:pPr>
@@ -43449,7 +44094,7 @@
                 <w:sz w:val="16"/>
                 <w:szCs w:val="16"/>
               </w:rPr>
-              <w:t xml:space="preserve">address_hash (PK), query, lat, lon, precision (</w:t>
+              <w:t xml:space="preserve">address_hash (PK, SHA-256 of the normalized query), query, lat, lon, precision (</w:t>
             </w:r>
             <w:r>
               <w:rPr>
@@ -43508,7 +44153,22 @@
                 <w:sz w:val="16"/>
                 <w:szCs w:val="16"/>
               </w:rPr>
-              <w:t xml:space="preserve">30 days</w:t>
+              <w:t xml:space="preserve">30 days; bundled city centres (</w:t>
+            </w:r>
+            <w:r>
+              <w:rPr>
+                <w:rFonts w:ascii="Consolas" w:cs="Consolas" w:eastAsia="Consolas" w:hAnsi="Consolas"/>
+                <w:sz w:val="16"/>
+                <w:szCs w:val="16"/>
+              </w:rPr>
+              <w:t xml:space="preserve">city-centroids.json</w:t>
+            </w:r>
+            <w:r>
+              <w:rPr>
+                <w:sz w:val="16"/>
+                <w:szCs w:val="16"/>
+              </w:rPr>
+              <w:t xml:space="preserve">, by PSGC code) when Nominatim fails</w:t>
             </w:r>
           </w:p>
         </w:tc>
@@ -43761,7 +44421,22 @@
                 <w:sz w:val="16"/>
                 <w:szCs w:val="16"/>
               </w:rPr>
-              <w:t xml:space="preserve">7 days; bundled NCR + major cities JSON as fallback</w:t>
+              <w:t xml:space="preserve">7 days; bundled JSON of all regions, provinces and their cities/municipalities (</w:t>
+            </w:r>
+            <w:r>
+              <w:rPr>
+                <w:rFonts w:ascii="Consolas" w:cs="Consolas" w:eastAsia="Consolas" w:hAnsi="Consolas"/>
+                <w:sz w:val="16"/>
+                <w:szCs w:val="16"/>
+              </w:rPr>
+              <w:t xml:space="preserve">psgc-fallback.json</w:t>
+            </w:r>
+            <w:r>
+              <w:rPr>
+                <w:sz w:val="16"/>
+                <w:szCs w:val="16"/>
+              </w:rPr>
+              <w:t xml:space="preserve">) as fallback</w:t>
             </w:r>
           </w:p>
         </w:tc>

</xml_diff>

<commit_message>
docs(sia): document Phase 8 as built
- 4.1: dashboards, notifications, reports, suspend and saved-jobs
  endpoints
- 5.2/5.3: admin-decision notices; 400 vs malformed JSON (422), 404
  for postings of suspended employers, per-field 422 business checks
- 6.1/6.4: suspension hides an employer's postings; no stack traces,
  X-Powered-By removed, no CORS for unknown origins
- 7.1: test IDs map to Postman request names; folder 09 cases
- Appendix A/F: reports, notifications and saved-jobs permissions, a
  definition of "visible posting", full reports/saved_jobs columns
- 1.4: saved jobs (M12) delivered

Postman folders 04/05 renamed to the documented names; dev skill
references updated to match.

Co-Authored-By: Claude Opus 5.5 <noreply@anthropic.com>
</commit_message>
<xml_diff>
--- a/docs/OpenDoor_SIA1_Final_Project_Documentation.docx
+++ b/docs/OpenDoor_SIA1_Final_Project_Documentation.docx
@@ -2356,7 +2356,7 @@
         <w:spacing w:after="60"/>
       </w:pPr>
       <w:r>
-        <w:t xml:space="preserve">Email notifications, saved jobs and display settings are "Could have" features and may be delivered only if time allows. No mobile app, payments, or video interviews are included.</w:t>
+        <w:t xml:space="preserve">Email notifications and display settings (M13) are "Could have" features and may be delivered only if time allows (saved jobs, M12, was delivered). No mobile app, payments, or video interviews are included.</w:t>
       </w:r>
     </w:p>
     <w:p>
@@ -9541,6 +9541,741 @@
                 <w:sz w:val="16"/>
                 <w:szCs w:val="16"/>
               </w:rPr>
+              <w:t xml:space="preserve">Core</w:t>
+            </w:r>
+          </w:p>
+        </w:tc>
+        <w:tc>
+          <w:tcPr>
+            <w:tcW w:type="dxa" w:w="950"/>
+            <w:tcBorders>
+              <w:top w:val="single" w:color="7F7F7F" w:sz="4"/>
+              <w:left w:val="single" w:color="7F7F7F" w:sz="4"/>
+              <w:bottom w:val="single" w:color="7F7F7F" w:sz="4"/>
+              <w:right w:val="single" w:color="7F7F7F" w:sz="4"/>
+            </w:tcBorders>
+            <w:tcMar>
+              <w:top w:type="dxa" w:w="60"/>
+              <w:left w:type="dxa" w:w="100"/>
+              <w:bottom w:type="dxa" w:w="60"/>
+              <w:right w:type="dxa" w:w="100"/>
+            </w:tcMar>
+          </w:tcPr>
+          <w:p>
+            <w:pPr>
+              <w:spacing w:after="20"/>
+            </w:pPr>
+            <w:r>
+              <w:rPr>
+                <w:sz w:val="16"/>
+                <w:szCs w:val="16"/>
+              </w:rPr>
+              <w:t xml:space="preserve">GET</w:t>
+            </w:r>
+          </w:p>
+        </w:tc>
+        <w:tc>
+          <w:tcPr>
+            <w:tcW w:type="dxa" w:w="2700"/>
+            <w:tcBorders>
+              <w:top w:val="single" w:color="7F7F7F" w:sz="4"/>
+              <w:left w:val="single" w:color="7F7F7F" w:sz="4"/>
+              <w:bottom w:val="single" w:color="7F7F7F" w:sz="4"/>
+              <w:right w:val="single" w:color="7F7F7F" w:sz="4"/>
+            </w:tcBorders>
+            <w:tcMar>
+              <w:top w:type="dxa" w:w="60"/>
+              <w:left w:type="dxa" w:w="100"/>
+              <w:bottom w:type="dxa" w:w="60"/>
+              <w:right w:type="dxa" w:w="100"/>
+            </w:tcMar>
+          </w:tcPr>
+          <w:p>
+            <w:pPr>
+              <w:spacing w:after="20"/>
+            </w:pPr>
+            <w:r>
+              <w:rPr>
+                <w:sz w:val="16"/>
+                <w:szCs w:val="16"/>
+              </w:rPr>
+              <w:t xml:space="preserve">/api/candidate/dashboard, /api/employer/dashboard, /api/admin/dashboard</w:t>
+            </w:r>
+          </w:p>
+        </w:tc>
+        <w:tc>
+          <w:tcPr>
+            <w:tcW w:type="dxa" w:w="2280"/>
+            <w:tcBorders>
+              <w:top w:val="single" w:color="7F7F7F" w:sz="4"/>
+              <w:left w:val="single" w:color="7F7F7F" w:sz="4"/>
+              <w:bottom w:val="single" w:color="7F7F7F" w:sz="4"/>
+              <w:right w:val="single" w:color="7F7F7F" w:sz="4"/>
+            </w:tcBorders>
+            <w:tcMar>
+              <w:top w:type="dxa" w:w="60"/>
+              <w:left w:type="dxa" w:w="100"/>
+              <w:bottom w:type="dxa" w:w="60"/>
+              <w:right w:type="dxa" w:w="100"/>
+            </w:tcMar>
+          </w:tcPr>
+          <w:p>
+            <w:pPr>
+              <w:spacing w:after="20"/>
+            </w:pPr>
+            <w:r>
+              <w:rPr>
+                <w:sz w:val="16"/>
+                <w:szCs w:val="16"/>
+              </w:rPr>
+              <w:t xml:space="preserve">Role summaries (M8); counts equal the lists they link to</w:t>
+            </w:r>
+          </w:p>
+        </w:tc>
+        <w:tc>
+          <w:tcPr>
+            <w:tcW w:type="dxa" w:w="2900"/>
+            <w:tcBorders>
+              <w:top w:val="single" w:color="7F7F7F" w:sz="4"/>
+              <w:left w:val="single" w:color="7F7F7F" w:sz="4"/>
+              <w:bottom w:val="single" w:color="7F7F7F" w:sz="4"/>
+              <w:right w:val="single" w:color="7F7F7F" w:sz="4"/>
+            </w:tcBorders>
+            <w:tcMar>
+              <w:top w:type="dxa" w:w="60"/>
+              <w:left w:type="dxa" w:w="100"/>
+              <w:bottom w:type="dxa" w:w="60"/>
+              <w:right w:type="dxa" w:w="100"/>
+            </w:tcMar>
+          </w:tcPr>
+          <w:p>
+            <w:pPr>
+              <w:spacing w:after="20"/>
+            </w:pPr>
+            <w:r>
+              <w:rPr>
+                <w:sz w:val="16"/>
+                <w:szCs w:val="16"/>
+              </w:rPr>
+              <w:t xml:space="preserve">→ zero-filled counts per status, matching jobs, ratings due, trust score, queues</w:t>
+            </w:r>
+          </w:p>
+        </w:tc>
+      </w:tr>
+      <w:tr>
+        <w:tc>
+          <w:tcPr>
+            <w:tcW w:type="dxa" w:w="1250"/>
+            <w:tcBorders>
+              <w:top w:val="single" w:color="7F7F7F" w:sz="4"/>
+              <w:left w:val="single" w:color="7F7F7F" w:sz="4"/>
+              <w:bottom w:val="single" w:color="7F7F7F" w:sz="4"/>
+              <w:right w:val="single" w:color="7F7F7F" w:sz="4"/>
+            </w:tcBorders>
+            <w:tcMar>
+              <w:top w:type="dxa" w:w="60"/>
+              <w:left w:type="dxa" w:w="100"/>
+              <w:bottom w:type="dxa" w:w="60"/>
+              <w:right w:type="dxa" w:w="100"/>
+            </w:tcMar>
+          </w:tcPr>
+          <w:p>
+            <w:pPr>
+              <w:spacing w:after="20"/>
+            </w:pPr>
+            <w:r>
+              <w:rPr>
+                <w:sz w:val="16"/>
+                <w:szCs w:val="16"/>
+              </w:rPr>
+              <w:t xml:space="preserve">Core</w:t>
+            </w:r>
+          </w:p>
+        </w:tc>
+        <w:tc>
+          <w:tcPr>
+            <w:tcW w:type="dxa" w:w="950"/>
+            <w:tcBorders>
+              <w:top w:val="single" w:color="7F7F7F" w:sz="4"/>
+              <w:left w:val="single" w:color="7F7F7F" w:sz="4"/>
+              <w:bottom w:val="single" w:color="7F7F7F" w:sz="4"/>
+              <w:right w:val="single" w:color="7F7F7F" w:sz="4"/>
+            </w:tcBorders>
+            <w:tcMar>
+              <w:top w:type="dxa" w:w="60"/>
+              <w:left w:type="dxa" w:w="100"/>
+              <w:bottom w:type="dxa" w:w="60"/>
+              <w:right w:type="dxa" w:w="100"/>
+            </w:tcMar>
+          </w:tcPr>
+          <w:p>
+            <w:pPr>
+              <w:spacing w:after="20"/>
+            </w:pPr>
+            <w:r>
+              <w:rPr>
+                <w:sz w:val="16"/>
+                <w:szCs w:val="16"/>
+              </w:rPr>
+              <w:t xml:space="preserve">GET, PATCH</w:t>
+            </w:r>
+          </w:p>
+        </w:tc>
+        <w:tc>
+          <w:tcPr>
+            <w:tcW w:type="dxa" w:w="2700"/>
+            <w:tcBorders>
+              <w:top w:val="single" w:color="7F7F7F" w:sz="4"/>
+              <w:left w:val="single" w:color="7F7F7F" w:sz="4"/>
+              <w:bottom w:val="single" w:color="7F7F7F" w:sz="4"/>
+              <w:right w:val="single" w:color="7F7F7F" w:sz="4"/>
+            </w:tcBorders>
+            <w:tcMar>
+              <w:top w:type="dxa" w:w="60"/>
+              <w:left w:type="dxa" w:w="100"/>
+              <w:bottom w:type="dxa" w:w="60"/>
+              <w:right w:type="dxa" w:w="100"/>
+            </w:tcMar>
+          </w:tcPr>
+          <w:p>
+            <w:pPr>
+              <w:spacing w:after="20"/>
+            </w:pPr>
+            <w:r>
+              <w:rPr>
+                <w:sz w:val="16"/>
+                <w:szCs w:val="16"/>
+              </w:rPr>
+              <w:t xml:space="preserve">/api/notifications, /api/notifications/{id}/read, /api/notifications/read-all</w:t>
+            </w:r>
+          </w:p>
+        </w:tc>
+        <w:tc>
+          <w:tcPr>
+            <w:tcW w:type="dxa" w:w="2280"/>
+            <w:tcBorders>
+              <w:top w:val="single" w:color="7F7F7F" w:sz="4"/>
+              <w:left w:val="single" w:color="7F7F7F" w:sz="4"/>
+              <w:bottom w:val="single" w:color="7F7F7F" w:sz="4"/>
+              <w:right w:val="single" w:color="7F7F7F" w:sz="4"/>
+            </w:tcBorders>
+            <w:tcMar>
+              <w:top w:type="dxa" w:w="60"/>
+              <w:left w:type="dxa" w:w="100"/>
+              <w:bottom w:type="dxa" w:w="60"/>
+              <w:right w:type="dxa" w:w="100"/>
+            </w:tcMar>
+          </w:tcPr>
+          <w:p>
+            <w:pPr>
+              <w:spacing w:after="20"/>
+            </w:pPr>
+            <w:r>
+              <w:rPr>
+                <w:sz w:val="16"/>
+                <w:szCs w:val="16"/>
+              </w:rPr>
+              <w:t xml:space="preserve">In-app notices for candidates and employers (M9)</w:t>
+            </w:r>
+          </w:p>
+        </w:tc>
+        <w:tc>
+          <w:tcPr>
+            <w:tcW w:type="dxa" w:w="2900"/>
+            <w:tcBorders>
+              <w:top w:val="single" w:color="7F7F7F" w:sz="4"/>
+              <w:left w:val="single" w:color="7F7F7F" w:sz="4"/>
+              <w:bottom w:val="single" w:color="7F7F7F" w:sz="4"/>
+              <w:right w:val="single" w:color="7F7F7F" w:sz="4"/>
+            </w:tcBorders>
+            <w:tcMar>
+              <w:top w:type="dxa" w:w="60"/>
+              <w:left w:type="dxa" w:w="100"/>
+              <w:bottom w:type="dxa" w:w="60"/>
+              <w:right w:type="dxa" w:w="100"/>
+            </w:tcMar>
+          </w:tcPr>
+          <w:p>
+            <w:pPr>
+              <w:spacing w:after="20"/>
+            </w:pPr>
+            <w:r>
+              <w:rPr>
+                <w:sz w:val="16"/>
+                <w:szCs w:val="16"/>
+              </w:rPr>
+              <w:t xml:space="preserve">→ {data:[{id,type,data:{message,url},read_at}], meta:{unread_count}}</w:t>
+            </w:r>
+          </w:p>
+        </w:tc>
+      </w:tr>
+      <w:tr>
+        <w:tc>
+          <w:tcPr>
+            <w:tcW w:type="dxa" w:w="1250"/>
+            <w:tcBorders>
+              <w:top w:val="single" w:color="7F7F7F" w:sz="4"/>
+              <w:left w:val="single" w:color="7F7F7F" w:sz="4"/>
+              <w:bottom w:val="single" w:color="7F7F7F" w:sz="4"/>
+              <w:right w:val="single" w:color="7F7F7F" w:sz="4"/>
+            </w:tcBorders>
+            <w:tcMar>
+              <w:top w:type="dxa" w:w="60"/>
+              <w:left w:type="dxa" w:w="100"/>
+              <w:bottom w:type="dxa" w:w="60"/>
+              <w:right w:type="dxa" w:w="100"/>
+            </w:tcMar>
+          </w:tcPr>
+          <w:p>
+            <w:pPr>
+              <w:spacing w:after="20"/>
+            </w:pPr>
+            <w:r>
+              <w:rPr>
+                <w:sz w:val="16"/>
+                <w:szCs w:val="16"/>
+              </w:rPr>
+              <w:t xml:space="preserve">Core</w:t>
+            </w:r>
+          </w:p>
+        </w:tc>
+        <w:tc>
+          <w:tcPr>
+            <w:tcW w:type="dxa" w:w="950"/>
+            <w:tcBorders>
+              <w:top w:val="single" w:color="7F7F7F" w:sz="4"/>
+              <w:left w:val="single" w:color="7F7F7F" w:sz="4"/>
+              <w:bottom w:val="single" w:color="7F7F7F" w:sz="4"/>
+              <w:right w:val="single" w:color="7F7F7F" w:sz="4"/>
+            </w:tcBorders>
+            <w:tcMar>
+              <w:top w:type="dxa" w:w="60"/>
+              <w:left w:type="dxa" w:w="100"/>
+              <w:bottom w:type="dxa" w:w="60"/>
+              <w:right w:type="dxa" w:w="100"/>
+            </w:tcMar>
+          </w:tcPr>
+          <w:p>
+            <w:pPr>
+              <w:spacing w:after="20"/>
+            </w:pPr>
+            <w:r>
+              <w:rPr>
+                <w:sz w:val="16"/>
+                <w:szCs w:val="16"/>
+              </w:rPr>
+              <w:t xml:space="preserve">POST; GET, PATCH</w:t>
+            </w:r>
+          </w:p>
+        </w:tc>
+        <w:tc>
+          <w:tcPr>
+            <w:tcW w:type="dxa" w:w="2700"/>
+            <w:tcBorders>
+              <w:top w:val="single" w:color="7F7F7F" w:sz="4"/>
+              <w:left w:val="single" w:color="7F7F7F" w:sz="4"/>
+              <w:bottom w:val="single" w:color="7F7F7F" w:sz="4"/>
+              <w:right w:val="single" w:color="7F7F7F" w:sz="4"/>
+            </w:tcBorders>
+            <w:tcMar>
+              <w:top w:type="dxa" w:w="60"/>
+              <w:left w:type="dxa" w:w="100"/>
+              <w:bottom w:type="dxa" w:w="60"/>
+              <w:right w:type="dxa" w:w="100"/>
+            </w:tcMar>
+          </w:tcPr>
+          <w:p>
+            <w:pPr>
+              <w:spacing w:after="20"/>
+            </w:pPr>
+            <w:r>
+              <w:rPr>
+                <w:sz w:val="16"/>
+                <w:szCs w:val="16"/>
+              </w:rPr>
+              <w:t xml:space="preserve">/api/job-postings/{id}/reports; /api/admin/reports/{id}</w:t>
+            </w:r>
+          </w:p>
+        </w:tc>
+        <w:tc>
+          <w:tcPr>
+            <w:tcW w:type="dxa" w:w="2280"/>
+            <w:tcBorders>
+              <w:top w:val="single" w:color="7F7F7F" w:sz="4"/>
+              <w:left w:val="single" w:color="7F7F7F" w:sz="4"/>
+              <w:bottom w:val="single" w:color="7F7F7F" w:sz="4"/>
+              <w:right w:val="single" w:color="7F7F7F" w:sz="4"/>
+            </w:tcBorders>
+            <w:tcMar>
+              <w:top w:type="dxa" w:w="60"/>
+              <w:left w:type="dxa" w:w="100"/>
+              <w:bottom w:type="dxa" w:w="60"/>
+              <w:right w:type="dxa" w:w="100"/>
+            </w:tcMar>
+          </w:tcPr>
+          <w:p>
+            <w:pPr>
+              <w:spacing w:after="20"/>
+            </w:pPr>
+            <w:r>
+              <w:rPr>
+                <w:sz w:val="16"/>
+                <w:szCs w:val="16"/>
+              </w:rPr>
+              <w:t xml:space="preserve">Report a visible posting; admin dismisses or records action (M10)</w:t>
+            </w:r>
+          </w:p>
+        </w:tc>
+        <w:tc>
+          <w:tcPr>
+            <w:tcW w:type="dxa" w:w="2900"/>
+            <w:tcBorders>
+              <w:top w:val="single" w:color="7F7F7F" w:sz="4"/>
+              <w:left w:val="single" w:color="7F7F7F" w:sz="4"/>
+              <w:bottom w:val="single" w:color="7F7F7F" w:sz="4"/>
+              <w:right w:val="single" w:color="7F7F7F" w:sz="4"/>
+            </w:tcBorders>
+            <w:tcMar>
+              <w:top w:type="dxa" w:w="60"/>
+              <w:left w:type="dxa" w:w="100"/>
+              <w:bottom w:type="dxa" w:w="60"/>
+              <w:right w:type="dxa" w:w="100"/>
+            </w:tcMar>
+          </w:tcPr>
+          <w:p>
+            <w:pPr>
+              <w:spacing w:after="20"/>
+            </w:pPr>
+            <w:r>
+              <w:rPr>
+                <w:sz w:val="16"/>
+                <w:szCs w:val="16"/>
+              </w:rPr>
+              <w:t xml:space="preserve">{reason} → 201; {status:'dismissed'|'actioned', note} → 200</w:t>
+            </w:r>
+          </w:p>
+        </w:tc>
+      </w:tr>
+      <w:tr>
+        <w:tc>
+          <w:tcPr>
+            <w:tcW w:type="dxa" w:w="1250"/>
+            <w:tcBorders>
+              <w:top w:val="single" w:color="7F7F7F" w:sz="4"/>
+              <w:left w:val="single" w:color="7F7F7F" w:sz="4"/>
+              <w:bottom w:val="single" w:color="7F7F7F" w:sz="4"/>
+              <w:right w:val="single" w:color="7F7F7F" w:sz="4"/>
+            </w:tcBorders>
+            <w:tcMar>
+              <w:top w:type="dxa" w:w="60"/>
+              <w:left w:type="dxa" w:w="100"/>
+              <w:bottom w:type="dxa" w:w="60"/>
+              <w:right w:type="dxa" w:w="100"/>
+            </w:tcMar>
+          </w:tcPr>
+          <w:p>
+            <w:pPr>
+              <w:spacing w:after="20"/>
+            </w:pPr>
+            <w:r>
+              <w:rPr>
+                <w:sz w:val="16"/>
+                <w:szCs w:val="16"/>
+              </w:rPr>
+              <w:t xml:space="preserve">Core</w:t>
+            </w:r>
+          </w:p>
+        </w:tc>
+        <w:tc>
+          <w:tcPr>
+            <w:tcW w:type="dxa" w:w="950"/>
+            <w:tcBorders>
+              <w:top w:val="single" w:color="7F7F7F" w:sz="4"/>
+              <w:left w:val="single" w:color="7F7F7F" w:sz="4"/>
+              <w:bottom w:val="single" w:color="7F7F7F" w:sz="4"/>
+              <w:right w:val="single" w:color="7F7F7F" w:sz="4"/>
+            </w:tcBorders>
+            <w:tcMar>
+              <w:top w:type="dxa" w:w="60"/>
+              <w:left w:type="dxa" w:w="100"/>
+              <w:bottom w:type="dxa" w:w="60"/>
+              <w:right w:type="dxa" w:w="100"/>
+            </w:tcMar>
+          </w:tcPr>
+          <w:p>
+            <w:pPr>
+              <w:spacing w:after="20"/>
+            </w:pPr>
+            <w:r>
+              <w:rPr>
+                <w:sz w:val="16"/>
+                <w:szCs w:val="16"/>
+              </w:rPr>
+              <w:t xml:space="preserve">PATCH</w:t>
+            </w:r>
+          </w:p>
+        </w:tc>
+        <w:tc>
+          <w:tcPr>
+            <w:tcW w:type="dxa" w:w="2700"/>
+            <w:tcBorders>
+              <w:top w:val="single" w:color="7F7F7F" w:sz="4"/>
+              <w:left w:val="single" w:color="7F7F7F" w:sz="4"/>
+              <w:bottom w:val="single" w:color="7F7F7F" w:sz="4"/>
+              <w:right w:val="single" w:color="7F7F7F" w:sz="4"/>
+            </w:tcBorders>
+            <w:tcMar>
+              <w:top w:type="dxa" w:w="60"/>
+              <w:left w:type="dxa" w:w="100"/>
+              <w:bottom w:type="dxa" w:w="60"/>
+              <w:right w:type="dxa" w:w="100"/>
+            </w:tcMar>
+          </w:tcPr>
+          <w:p>
+            <w:pPr>
+              <w:spacing w:after="20"/>
+            </w:pPr>
+            <w:r>
+              <w:rPr>
+                <w:sz w:val="16"/>
+                <w:szCs w:val="16"/>
+              </w:rPr>
+              <w:t xml:space="preserve">/api/admin/users/{id}/suspend</w:t>
+            </w:r>
+          </w:p>
+        </w:tc>
+        <w:tc>
+          <w:tcPr>
+            <w:tcW w:type="dxa" w:w="2280"/>
+            <w:tcBorders>
+              <w:top w:val="single" w:color="7F7F7F" w:sz="4"/>
+              <w:left w:val="single" w:color="7F7F7F" w:sz="4"/>
+              <w:bottom w:val="single" w:color="7F7F7F" w:sz="4"/>
+              <w:right w:val="single" w:color="7F7F7F" w:sz="4"/>
+            </w:tcBorders>
+            <w:tcMar>
+              <w:top w:type="dxa" w:w="60"/>
+              <w:left w:type="dxa" w:w="100"/>
+              <w:bottom w:type="dxa" w:w="60"/>
+              <w:right w:type="dxa" w:w="100"/>
+            </w:tcMar>
+          </w:tcPr>
+          <w:p>
+            <w:pPr>
+              <w:spacing w:after="20"/>
+            </w:pPr>
+            <w:r>
+              <w:rPr>
+                <w:sz w:val="16"/>
+                <w:szCs w:val="16"/>
+              </w:rPr>
+              <w:t xml:space="preserve">Suspend (revokes all tokens, hides an employer's postings) or reactivate (M10)</w:t>
+            </w:r>
+          </w:p>
+        </w:tc>
+        <w:tc>
+          <w:tcPr>
+            <w:tcW w:type="dxa" w:w="2900"/>
+            <w:tcBorders>
+              <w:top w:val="single" w:color="7F7F7F" w:sz="4"/>
+              <w:left w:val="single" w:color="7F7F7F" w:sz="4"/>
+              <w:bottom w:val="single" w:color="7F7F7F" w:sz="4"/>
+              <w:right w:val="single" w:color="7F7F7F" w:sz="4"/>
+            </w:tcBorders>
+            <w:tcMar>
+              <w:top w:type="dxa" w:w="60"/>
+              <w:left w:type="dxa" w:w="100"/>
+              <w:bottom w:type="dxa" w:w="60"/>
+              <w:right w:type="dxa" w:w="100"/>
+            </w:tcMar>
+          </w:tcPr>
+          <w:p>
+            <w:pPr>
+              <w:spacing w:after="20"/>
+            </w:pPr>
+            <w:r>
+              <w:rPr>
+                <w:sz w:val="16"/>
+                <w:szCs w:val="16"/>
+              </w:rPr>
+              <w:t xml:space="preserve">{suspended:true|false} → 200 user; own account → 422</w:t>
+            </w:r>
+          </w:p>
+        </w:tc>
+      </w:tr>
+      <w:tr>
+        <w:tc>
+          <w:tcPr>
+            <w:tcW w:type="dxa" w:w="1250"/>
+            <w:tcBorders>
+              <w:top w:val="single" w:color="7F7F7F" w:sz="4"/>
+              <w:left w:val="single" w:color="7F7F7F" w:sz="4"/>
+              <w:bottom w:val="single" w:color="7F7F7F" w:sz="4"/>
+              <w:right w:val="single" w:color="7F7F7F" w:sz="4"/>
+            </w:tcBorders>
+            <w:tcMar>
+              <w:top w:type="dxa" w:w="60"/>
+              <w:left w:type="dxa" w:w="100"/>
+              <w:bottom w:type="dxa" w:w="60"/>
+              <w:right w:type="dxa" w:w="100"/>
+            </w:tcMar>
+          </w:tcPr>
+          <w:p>
+            <w:pPr>
+              <w:spacing w:after="20"/>
+            </w:pPr>
+            <w:r>
+              <w:rPr>
+                <w:sz w:val="16"/>
+                <w:szCs w:val="16"/>
+              </w:rPr>
+              <w:t xml:space="preserve">Core</w:t>
+            </w:r>
+          </w:p>
+        </w:tc>
+        <w:tc>
+          <w:tcPr>
+            <w:tcW w:type="dxa" w:w="950"/>
+            <w:tcBorders>
+              <w:top w:val="single" w:color="7F7F7F" w:sz="4"/>
+              <w:left w:val="single" w:color="7F7F7F" w:sz="4"/>
+              <w:bottom w:val="single" w:color="7F7F7F" w:sz="4"/>
+              <w:right w:val="single" w:color="7F7F7F" w:sz="4"/>
+            </w:tcBorders>
+            <w:tcMar>
+              <w:top w:type="dxa" w:w="60"/>
+              <w:left w:type="dxa" w:w="100"/>
+              <w:bottom w:type="dxa" w:w="60"/>
+              <w:right w:type="dxa" w:w="100"/>
+            </w:tcMar>
+          </w:tcPr>
+          <w:p>
+            <w:pPr>
+              <w:spacing w:after="20"/>
+            </w:pPr>
+            <w:r>
+              <w:rPr>
+                <w:sz w:val="16"/>
+                <w:szCs w:val="16"/>
+              </w:rPr>
+              <w:t xml:space="preserve">GET; POST, DELETE</w:t>
+            </w:r>
+          </w:p>
+        </w:tc>
+        <w:tc>
+          <w:tcPr>
+            <w:tcW w:type="dxa" w:w="2700"/>
+            <w:tcBorders>
+              <w:top w:val="single" w:color="7F7F7F" w:sz="4"/>
+              <w:left w:val="single" w:color="7F7F7F" w:sz="4"/>
+              <w:bottom w:val="single" w:color="7F7F7F" w:sz="4"/>
+              <w:right w:val="single" w:color="7F7F7F" w:sz="4"/>
+            </w:tcBorders>
+            <w:tcMar>
+              <w:top w:type="dxa" w:w="60"/>
+              <w:left w:type="dxa" w:w="100"/>
+              <w:bottom w:type="dxa" w:w="60"/>
+              <w:right w:type="dxa" w:w="100"/>
+            </w:tcMar>
+          </w:tcPr>
+          <w:p>
+            <w:pPr>
+              <w:spacing w:after="20"/>
+            </w:pPr>
+            <w:r>
+              <w:rPr>
+                <w:sz w:val="16"/>
+                <w:szCs w:val="16"/>
+              </w:rPr>
+              <w:t xml:space="preserve">/api/candidate/saved-jobs; /api/candidate/saved-jobs/{jobId}</w:t>
+            </w:r>
+          </w:p>
+        </w:tc>
+        <w:tc>
+          <w:tcPr>
+            <w:tcW w:type="dxa" w:w="2280"/>
+            <w:tcBorders>
+              <w:top w:val="single" w:color="7F7F7F" w:sz="4"/>
+              <w:left w:val="single" w:color="7F7F7F" w:sz="4"/>
+              <w:bottom w:val="single" w:color="7F7F7F" w:sz="4"/>
+              <w:right w:val="single" w:color="7F7F7F" w:sz="4"/>
+            </w:tcBorders>
+            <w:tcMar>
+              <w:top w:type="dxa" w:w="60"/>
+              <w:left w:type="dxa" w:w="100"/>
+              <w:bottom w:type="dxa" w:w="60"/>
+              <w:right w:type="dxa" w:w="100"/>
+            </w:tcMar>
+          </w:tcPr>
+          <w:p>
+            <w:pPr>
+              <w:spacing w:after="20"/>
+            </w:pPr>
+            <w:r>
+              <w:rPr>
+                <w:sz w:val="16"/>
+                <w:szCs w:val="16"/>
+              </w:rPr>
+              <w:t xml:space="preserve">Bookmarks of visible postings (M12)</w:t>
+            </w:r>
+          </w:p>
+        </w:tc>
+        <w:tc>
+          <w:tcPr>
+            <w:tcW w:type="dxa" w:w="2900"/>
+            <w:tcBorders>
+              <w:top w:val="single" w:color="7F7F7F" w:sz="4"/>
+              <w:left w:val="single" w:color="7F7F7F" w:sz="4"/>
+              <w:bottom w:val="single" w:color="7F7F7F" w:sz="4"/>
+              <w:right w:val="single" w:color="7F7F7F" w:sz="4"/>
+            </w:tcBorders>
+            <w:tcMar>
+              <w:top w:type="dxa" w:w="60"/>
+              <w:left w:type="dxa" w:w="100"/>
+              <w:bottom w:type="dxa" w:w="60"/>
+              <w:right w:type="dxa" w:w="100"/>
+            </w:tcMar>
+          </w:tcPr>
+          <w:p>
+            <w:pPr>
+              <w:spacing w:after="20"/>
+            </w:pPr>
+            <w:r>
+              <w:rPr>
+                <w:sz w:val="16"/>
+                <w:szCs w:val="16"/>
+              </w:rPr>
+              <w:t xml:space="preserve">→ {data:[posting+saved], meta}; POST 201 (200 if already saved); DELETE 204</w:t>
+            </w:r>
+          </w:p>
+        </w:tc>
+      </w:tr>
+      <w:tr>
+        <w:tc>
+          <w:tcPr>
+            <w:tcW w:type="dxa" w:w="1250"/>
+            <w:tcBorders>
+              <w:top w:val="single" w:color="7F7F7F" w:sz="4"/>
+              <w:left w:val="single" w:color="7F7F7F" w:sz="4"/>
+              <w:bottom w:val="single" w:color="7F7F7F" w:sz="4"/>
+              <w:right w:val="single" w:color="7F7F7F" w:sz="4"/>
+            </w:tcBorders>
+            <w:tcMar>
+              <w:top w:type="dxa" w:w="60"/>
+              <w:left w:type="dxa" w:w="100"/>
+              <w:bottom w:type="dxa" w:w="60"/>
+              <w:right w:type="dxa" w:w="100"/>
+            </w:tcMar>
+          </w:tcPr>
+          <w:p>
+            <w:pPr>
+              <w:spacing w:after="20"/>
+            </w:pPr>
+            <w:r>
+              <w:rPr>
+                <w:sz w:val="16"/>
+                <w:szCs w:val="16"/>
+              </w:rPr>
               <w:t xml:space="preserve">Core (internal)</w:t>
             </w:r>
           </w:p>
@@ -17261,7 +17996,7 @@
                 <w:sz w:val="16"/>
                 <w:szCs w:val="16"/>
               </w:rPr>
-              <w:t xml:space="preserve">Application status change, feedback saved/hidden (observer)</w:t>
+              <w:t xml:space="preserve">Application status change; admin decision on an employer's verification or a posting's review; feedback saved/hidden (observer)</w:t>
             </w:r>
           </w:p>
         </w:tc>
@@ -17290,7 +18025,7 @@
                 <w:sz w:val="16"/>
                 <w:szCs w:val="16"/>
               </w:rPr>
-              <w:t xml:space="preserve">Application, feedback items</w:t>
+              <w:t xml:space="preserve">Application, decision and reason, feedback items</w:t>
             </w:r>
           </w:p>
         </w:tc>
@@ -17319,7 +18054,67 @@
                 <w:sz w:val="16"/>
                 <w:szCs w:val="16"/>
               </w:rPr>
-              <w:t xml:space="preserve">Notification created; employer trust score and feedback count recalculated</w:t>
+              <w:t xml:space="preserve">In-app notification created (</w:t>
+            </w:r>
+            <w:r>
+              <w:rPr>
+                <w:rFonts w:ascii="Consolas" w:cs="Consolas" w:eastAsia="Consolas" w:hAnsi="Consolas"/>
+                <w:sz w:val="16"/>
+                <w:szCs w:val="16"/>
+              </w:rPr>
+              <w:t xml:space="preserve">application_received</w:t>
+            </w:r>
+            <w:r>
+              <w:rPr>
+                <w:sz w:val="16"/>
+                <w:szCs w:val="16"/>
+              </w:rPr>
+              <w:t xml:space="preserve">, </w:t>
+            </w:r>
+            <w:r>
+              <w:rPr>
+                <w:rFonts w:ascii="Consolas" w:cs="Consolas" w:eastAsia="Consolas" w:hAnsi="Consolas"/>
+                <w:sz w:val="16"/>
+                <w:szCs w:val="16"/>
+              </w:rPr>
+              <w:t xml:space="preserve">application_status_changed</w:t>
+            </w:r>
+            <w:r>
+              <w:rPr>
+                <w:sz w:val="16"/>
+                <w:szCs w:val="16"/>
+              </w:rPr>
+              <w:t xml:space="preserve">, </w:t>
+            </w:r>
+            <w:r>
+              <w:rPr>
+                <w:rFonts w:ascii="Consolas" w:cs="Consolas" w:eastAsia="Consolas" w:hAnsi="Consolas"/>
+                <w:sz w:val="16"/>
+                <w:szCs w:val="16"/>
+              </w:rPr>
+              <w:t xml:space="preserve">employer_verification</w:t>
+            </w:r>
+            <w:r>
+              <w:rPr>
+                <w:sz w:val="16"/>
+                <w:szCs w:val="16"/>
+              </w:rPr>
+              <w:t xml:space="preserve">, </w:t>
+            </w:r>
+            <w:r>
+              <w:rPr>
+                <w:rFonts w:ascii="Consolas" w:cs="Consolas" w:eastAsia="Consolas" w:hAnsi="Consolas"/>
+                <w:sz w:val="16"/>
+                <w:szCs w:val="16"/>
+              </w:rPr>
+              <w:t xml:space="preserve">posting_review</w:t>
+            </w:r>
+            <w:r>
+              <w:rPr>
+                <w:sz w:val="16"/>
+                <w:szCs w:val="16"/>
+              </w:rPr>
+              <w:t xml:space="preserve">); employer trust score and feedback count recalculated</w:t>
             </w:r>
           </w:p>
         </w:tc>
@@ -17594,7 +18389,7 @@
                 <w:sz w:val="16"/>
                 <w:szCs w:val="16"/>
               </w:rPr>
-              <w:t xml:space="preserve">Gateway, services</w:t>
+              <w:t xml:space="preserve">Core</w:t>
             </w:r>
           </w:p>
         </w:tc>
@@ -17623,7 +18418,22 @@
                 <w:sz w:val="16"/>
                 <w:szCs w:val="16"/>
               </w:rPr>
-              <w:t xml:space="preserve">Malformed JSON or query parameters</w:t>
+              <w:t xml:space="preserve">A request the framework rejects as malformed. A malformed JSON body is read as empty and answered with 422 </w:t>
+            </w:r>
+            <w:r>
+              <w:rPr>
+                <w:rFonts w:ascii="Consolas" w:cs="Consolas" w:eastAsia="Consolas" w:hAnsi="Consolas"/>
+                <w:sz w:val="16"/>
+                <w:szCs w:val="16"/>
+              </w:rPr>
+              <w:t xml:space="preserve">VALIDATION_FAILED</w:t>
+            </w:r>
+            <w:r>
+              <w:rPr>
+                <w:sz w:val="16"/>
+                <w:szCs w:val="16"/>
+              </w:rPr>
+              <w:t xml:space="preserve"> (never a stack trace)</w:t>
             </w:r>
           </w:p>
         </w:tc>
@@ -17741,7 +18551,7 @@
                 <w:sz w:val="16"/>
                 <w:szCs w:val="16"/>
               </w:rPr>
-              <w:t xml:space="preserve">Missing, invalid or revoked Sanctum token; the client logs the user out</w:t>
+              <w:t xml:space="preserve">Missing, invalid or revoked Sanctum token (also every token of a suspended account); the client logs the user out</w:t>
             </w:r>
           </w:p>
         </w:tc>
@@ -17859,7 +18669,7 @@
                 <w:sz w:val="16"/>
                 <w:szCs w:val="16"/>
               </w:rPr>
-              <w:t xml:space="preserve">Wrong role or Policy denies (e.g., editing another employer's posting); suspended account</w:t>
+              <w:t xml:space="preserve">Wrong role or Policy denies (e.g., editing another employer's posting, reading another candidate's application); login to a suspended account</w:t>
             </w:r>
           </w:p>
         </w:tc>
@@ -17977,7 +18787,7 @@
                 <w:sz w:val="16"/>
                 <w:szCs w:val="16"/>
               </w:rPr>
-              <w:t xml:space="preserve">Unknown ID, or a posting that is not open and approved; unknown PSGC region/province</w:t>
+              <w:t xml:space="preserve">Unknown ID; a posting that is not open and approved, or whose employer is suspended (also when saving, applying or reporting); unknown PSGC region/province</w:t>
             </w:r>
           </w:p>
         </w:tc>
@@ -18228,7 +19038,37 @@
                 <w:sz w:val="16"/>
                 <w:szCs w:val="16"/>
               </w:rPr>
-              <w:t xml:space="preserve"> that is not a 10-digit PSGC code; field errors returned in </w:t>
+              <w:t xml:space="preserve"> that is not a 10-digit PSGC code; also business checks reported per field: a second open report on the same posting (</w:t>
+            </w:r>
+            <w:r>
+              <w:rPr>
+                <w:rFonts w:ascii="Consolas" w:cs="Consolas" w:eastAsia="Consolas" w:hAnsi="Consolas"/>
+                <w:sz w:val="16"/>
+                <w:szCs w:val="16"/>
+              </w:rPr>
+              <w:t xml:space="preserve">errors.reason</w:t>
+            </w:r>
+            <w:r>
+              <w:rPr>
+                <w:sz w:val="16"/>
+                <w:szCs w:val="16"/>
+              </w:rPr>
+              <w:t xml:space="preserve">), an administrator suspending their own account (</w:t>
+            </w:r>
+            <w:r>
+              <w:rPr>
+                <w:rFonts w:ascii="Consolas" w:cs="Consolas" w:eastAsia="Consolas" w:hAnsi="Consolas"/>
+                <w:sz w:val="16"/>
+                <w:szCs w:val="16"/>
+              </w:rPr>
+              <w:t xml:space="preserve">errors.suspended</w:t>
+            </w:r>
+            <w:r>
+              <w:rPr>
+                <w:sz w:val="16"/>
+                <w:szCs w:val="16"/>
+              </w:rPr>
+              <w:t xml:space="preserve">); field errors returned in </w:t>
             </w:r>
             <w:r>
               <w:rPr>
@@ -19483,7 +20323,7 @@
         <w:t xml:space="preserve">Authorization: Bearer &lt;token&gt;</w:t>
       </w:r>
       <w:r>
-        <w:t xml:space="preserve"> on each request through the gateway. Logout revokes the token on the server. Suspended accounts cannot log in and their tokens are revoked.</w:t>
+        <w:t xml:space="preserve"> on each request through the gateway. Logout revokes the token on the server. Suspended accounts cannot log in and all their tokens are revoked at once; while an employer is suspended its postings are hidden from candidates and guests (nothing is deleted, so reactivation restores them).</w:t>
       </w:r>
     </w:p>
     <w:p>
@@ -20069,6 +20909,53 @@
       </w:r>
       <w:r>
         <w:t xml:space="preserve"> gateway rate limiting (120 requests/min per IP) and login rate limiting (5 attempts/min).</w:t>
+      </w:r>
+    </w:p>
+    <w:p>
+      <w:pPr>
+        <w:pStyle w:val="ListParagraph"/>
+        <w:numPr>
+          <w:ilvl w:val="0"/>
+          <w:numId w:val="2"/>
+        </w:numPr>
+        <w:spacing w:after="60"/>
+      </w:pPr>
+      <w:r>
+        <w:rPr>
+          <w:b/>
+          <w:bCs/>
+        </w:rPr>
+        <w:t xml:space="preserve">Information disclosure:</w:t>
+      </w:r>
+      <w:r>
+        <w:t xml:space="preserve"> errors carry only a code, a plain message and the </w:t>
+      </w:r>
+      <w:r>
+        <w:rPr>
+          <w:rFonts w:ascii="Consolas" w:cs="Consolas" w:eastAsia="Consolas" w:hAnsi="Consolas"/>
+        </w:rPr>
+        <w:t xml:space="preserve">request_id</w:t>
+      </w:r>
+      <w:r>
+        <w:t xml:space="preserve"> (no stack traces, </w:t>
+      </w:r>
+      <w:r>
+        <w:rPr>
+          <w:rFonts w:ascii="Consolas" w:cs="Consolas" w:eastAsia="Consolas" w:hAnsi="Consolas"/>
+        </w:rPr>
+        <w:t xml:space="preserve">APP_DEBUG=false</w:t>
+      </w:r>
+      <w:r>
+        <w:t xml:space="preserve">); the gateway removes </w:t>
+      </w:r>
+      <w:r>
+        <w:rPr>
+          <w:rFonts w:ascii="Consolas" w:cs="Consolas" w:eastAsia="Consolas" w:hAnsi="Consolas"/>
+        </w:rPr>
+        <w:t xml:space="preserve">X-Powered-By</w:t>
+      </w:r>
+      <w:r>
+        <w:t xml:space="preserve"> headers from upstream responses, so clients cannot read the server stack or PHP version; an unknown origin receives no CORS headers.</w:t>
       </w:r>
     </w:p>
     <w:p>
@@ -23625,6 +24512,32 @@
       <w:pPr>
         <w:spacing w:after="120"/>
       </w:pPr>
+    </w:p>
+    <w:p>
+      <w:pPr>
+        <w:spacing w:after="120" w:line="276"/>
+      </w:pPr>
+      <w:r>
+        <w:t xml:space="preserve">Each test ID is the prefix of at least one request name in the Postman collection (e.g. </w:t>
+      </w:r>
+      <w:r>
+        <w:rPr>
+          <w:rFonts w:ascii="Consolas" w:cs="Consolas" w:eastAsia="Consolas" w:hAnsi="Consolas"/>
+        </w:rPr>
+        <w:t xml:space="preserve">T05 Applying again → 409 ALREADY_APPLIED</w:t>
+      </w:r>
+      <w:r>
+        <w:t xml:space="preserve">), so a Newman report shows the result per test. Folder 09 adds further security cases beyond the plan: a forged token, other roles and other employers denied (403), a candidate or employer reading someone else's application (403), an administrator suspending their own account (422), SQL-like search text treated as plain text, malformed JSON answered without a stack trace, no CORS headers for an unknown origin, no </w:t>
+      </w:r>
+      <w:r>
+        <w:rPr>
+          <w:rFonts w:ascii="Consolas" w:cs="Consolas" w:eastAsia="Consolas" w:hAnsi="Consolas"/>
+        </w:rPr>
+        <w:t xml:space="preserve">X-Powered-By</w:t>
+      </w:r>
+      <w:r>
+        <w:t xml:space="preserve"> header, and the suspension rule end to end (token revoked, login refused, postings hidden, restored on reactivation).</w:t>
+      </w:r>
     </w:p>
     <w:p>
       <w:pPr>
@@ -36849,7 +37762,22 @@
                 <w:sz w:val="15"/>
                 <w:szCs w:val="15"/>
               </w:rPr>
-              <w:t xml:space="preserve">Bookmarks</w:t>
+              <w:t xml:space="preserve">Bookmarks of visible postings; POST and DELETE idempotent; </w:t>
+            </w:r>
+            <w:r>
+              <w:rPr>
+                <w:rFonts w:ascii="Consolas" w:cs="Consolas" w:eastAsia="Consolas" w:hAnsi="Consolas"/>
+                <w:sz w:val="15"/>
+                <w:szCs w:val="15"/>
+              </w:rPr>
+              <w:t xml:space="preserve">saved</w:t>
+            </w:r>
+            <w:r>
+              <w:rPr>
+                <w:sz w:val="15"/>
+                <w:szCs w:val="15"/>
+              </w:rPr>
+              <w:t xml:space="preserve"> flag on posting details</w:t>
             </w:r>
           </w:p>
         </w:tc>
@@ -38828,11 +39756,470 @@
           </w:p>
         </w:tc>
       </w:tr>
+      <w:tr>
+        <w:tc>
+          <w:tcPr>
+            <w:tcW w:type="dxa" w:w="2400"/>
+            <w:tcBorders>
+              <w:top w:val="single" w:color="7F7F7F" w:sz="4"/>
+              <w:left w:val="single" w:color="7F7F7F" w:sz="4"/>
+              <w:bottom w:val="single" w:color="7F7F7F" w:sz="4"/>
+              <w:right w:val="single" w:color="7F7F7F" w:sz="4"/>
+            </w:tcBorders>
+            <w:tcMar>
+              <w:top w:type="dxa" w:w="60"/>
+              <w:left w:type="dxa" w:w="100"/>
+              <w:bottom w:type="dxa" w:w="60"/>
+              <w:right w:type="dxa" w:w="100"/>
+            </w:tcMar>
+          </w:tcPr>
+          <w:p>
+            <w:pPr>
+              <w:spacing w:after="20"/>
+            </w:pPr>
+            <w:r>
+              <w:rPr>
+                <w:sz w:val="16"/>
+                <w:szCs w:val="16"/>
+              </w:rPr>
+              <w:t xml:space="preserve">Reports on postings</w:t>
+            </w:r>
+          </w:p>
+        </w:tc>
+        <w:tc>
+          <w:tcPr>
+            <w:tcW w:type="dxa" w:w="1500"/>
+            <w:tcBorders>
+              <w:top w:val="single" w:color="7F7F7F" w:sz="4"/>
+              <w:left w:val="single" w:color="7F7F7F" w:sz="4"/>
+              <w:bottom w:val="single" w:color="7F7F7F" w:sz="4"/>
+              <w:right w:val="single" w:color="7F7F7F" w:sz="4"/>
+            </w:tcBorders>
+            <w:tcMar>
+              <w:top w:type="dxa" w:w="60"/>
+              <w:left w:type="dxa" w:w="100"/>
+              <w:bottom w:type="dxa" w:w="60"/>
+              <w:right w:type="dxa" w:w="100"/>
+            </w:tcMar>
+          </w:tcPr>
+          <w:p>
+            <w:pPr>
+              <w:spacing w:after="20"/>
+            </w:pPr>
+            <w:r>
+              <w:rPr>
+                <w:sz w:val="16"/>
+                <w:szCs w:val="16"/>
+              </w:rPr>
+              <w:t xml:space="preserve">–</w:t>
+            </w:r>
+          </w:p>
+        </w:tc>
+        <w:tc>
+          <w:tcPr>
+            <w:tcW w:type="dxa" w:w="2200"/>
+            <w:tcBorders>
+              <w:top w:val="single" w:color="7F7F7F" w:sz="4"/>
+              <w:left w:val="single" w:color="7F7F7F" w:sz="4"/>
+              <w:bottom w:val="single" w:color="7F7F7F" w:sz="4"/>
+              <w:right w:val="single" w:color="7F7F7F" w:sz="4"/>
+            </w:tcBorders>
+            <w:tcMar>
+              <w:top w:type="dxa" w:w="60"/>
+              <w:left w:type="dxa" w:w="100"/>
+              <w:bottom w:type="dxa" w:w="60"/>
+              <w:right w:type="dxa" w:w="100"/>
+            </w:tcMar>
+          </w:tcPr>
+          <w:p>
+            <w:pPr>
+              <w:spacing w:after="20"/>
+            </w:pPr>
+            <w:r>
+              <w:rPr>
+                <w:sz w:val="16"/>
+                <w:szCs w:val="16"/>
+              </w:rPr>
+              <w:t xml:space="preserve">C (visible postings, one open per posting)</w:t>
+            </w:r>
+          </w:p>
+        </w:tc>
+        <w:tc>
+          <w:tcPr>
+            <w:tcW w:type="dxa" w:w="2100"/>
+            <w:tcBorders>
+              <w:top w:val="single" w:color="7F7F7F" w:sz="4"/>
+              <w:left w:val="single" w:color="7F7F7F" w:sz="4"/>
+              <w:bottom w:val="single" w:color="7F7F7F" w:sz="4"/>
+              <w:right w:val="single" w:color="7F7F7F" w:sz="4"/>
+            </w:tcBorders>
+            <w:tcMar>
+              <w:top w:type="dxa" w:w="60"/>
+              <w:left w:type="dxa" w:w="100"/>
+              <w:bottom w:type="dxa" w:w="60"/>
+              <w:right w:type="dxa" w:w="100"/>
+            </w:tcMar>
+          </w:tcPr>
+          <w:p>
+            <w:pPr>
+              <w:spacing w:after="20"/>
+            </w:pPr>
+            <w:r>
+              <w:rPr>
+                <w:sz w:val="16"/>
+                <w:szCs w:val="16"/>
+              </w:rPr>
+              <w:t xml:space="preserve">–</w:t>
+            </w:r>
+          </w:p>
+        </w:tc>
+        <w:tc>
+          <w:tcPr>
+            <w:tcW w:type="dxa" w:w="1880"/>
+            <w:tcBorders>
+              <w:top w:val="single" w:color="7F7F7F" w:sz="4"/>
+              <w:left w:val="single" w:color="7F7F7F" w:sz="4"/>
+              <w:bottom w:val="single" w:color="7F7F7F" w:sz="4"/>
+              <w:right w:val="single" w:color="7F7F7F" w:sz="4"/>
+            </w:tcBorders>
+            <w:tcMar>
+              <w:top w:type="dxa" w:w="60"/>
+              <w:left w:type="dxa" w:w="100"/>
+              <w:bottom w:type="dxa" w:w="60"/>
+              <w:right w:type="dxa" w:w="100"/>
+            </w:tcMar>
+          </w:tcPr>
+          <w:p>
+            <w:pPr>
+              <w:spacing w:after="20"/>
+            </w:pPr>
+            <w:r>
+              <w:rPr>
+                <w:sz w:val="16"/>
+                <w:szCs w:val="16"/>
+              </w:rPr>
+              <w:t xml:space="preserve">R, U (dismiss / action)</w:t>
+            </w:r>
+          </w:p>
+        </w:tc>
+      </w:tr>
+      <w:tr>
+        <w:tc>
+          <w:tcPr>
+            <w:tcW w:type="dxa" w:w="2400"/>
+            <w:tcBorders>
+              <w:top w:val="single" w:color="7F7F7F" w:sz="4"/>
+              <w:left w:val="single" w:color="7F7F7F" w:sz="4"/>
+              <w:bottom w:val="single" w:color="7F7F7F" w:sz="4"/>
+              <w:right w:val="single" w:color="7F7F7F" w:sz="4"/>
+            </w:tcBorders>
+            <w:tcMar>
+              <w:top w:type="dxa" w:w="60"/>
+              <w:left w:type="dxa" w:w="100"/>
+              <w:bottom w:type="dxa" w:w="60"/>
+              <w:right w:type="dxa" w:w="100"/>
+            </w:tcMar>
+          </w:tcPr>
+          <w:p>
+            <w:pPr>
+              <w:spacing w:after="20"/>
+            </w:pPr>
+            <w:r>
+              <w:rPr>
+                <w:sz w:val="16"/>
+                <w:szCs w:val="16"/>
+              </w:rPr>
+              <w:t xml:space="preserve">Notifications</w:t>
+            </w:r>
+          </w:p>
+        </w:tc>
+        <w:tc>
+          <w:tcPr>
+            <w:tcW w:type="dxa" w:w="1500"/>
+            <w:tcBorders>
+              <w:top w:val="single" w:color="7F7F7F" w:sz="4"/>
+              <w:left w:val="single" w:color="7F7F7F" w:sz="4"/>
+              <w:bottom w:val="single" w:color="7F7F7F" w:sz="4"/>
+              <w:right w:val="single" w:color="7F7F7F" w:sz="4"/>
+            </w:tcBorders>
+            <w:tcMar>
+              <w:top w:type="dxa" w:w="60"/>
+              <w:left w:type="dxa" w:w="100"/>
+              <w:bottom w:type="dxa" w:w="60"/>
+              <w:right w:type="dxa" w:w="100"/>
+            </w:tcMar>
+          </w:tcPr>
+          <w:p>
+            <w:pPr>
+              <w:spacing w:after="20"/>
+            </w:pPr>
+            <w:r>
+              <w:rPr>
+                <w:sz w:val="16"/>
+                <w:szCs w:val="16"/>
+              </w:rPr>
+              <w:t xml:space="preserve">–</w:t>
+            </w:r>
+          </w:p>
+        </w:tc>
+        <w:tc>
+          <w:tcPr>
+            <w:tcW w:type="dxa" w:w="2200"/>
+            <w:tcBorders>
+              <w:top w:val="single" w:color="7F7F7F" w:sz="4"/>
+              <w:left w:val="single" w:color="7F7F7F" w:sz="4"/>
+              <w:bottom w:val="single" w:color="7F7F7F" w:sz="4"/>
+              <w:right w:val="single" w:color="7F7F7F" w:sz="4"/>
+            </w:tcBorders>
+            <w:tcMar>
+              <w:top w:type="dxa" w:w="60"/>
+              <w:left w:type="dxa" w:w="100"/>
+              <w:bottom w:type="dxa" w:w="60"/>
+              <w:right w:type="dxa" w:w="100"/>
+            </w:tcMar>
+          </w:tcPr>
+          <w:p>
+            <w:pPr>
+              <w:spacing w:after="20"/>
+            </w:pPr>
+            <w:r>
+              <w:rPr>
+                <w:sz w:val="16"/>
+                <w:szCs w:val="16"/>
+              </w:rPr>
+              <w:t xml:space="preserve">R, U own (mark read)</w:t>
+            </w:r>
+          </w:p>
+        </w:tc>
+        <w:tc>
+          <w:tcPr>
+            <w:tcW w:type="dxa" w:w="2100"/>
+            <w:tcBorders>
+              <w:top w:val="single" w:color="7F7F7F" w:sz="4"/>
+              <w:left w:val="single" w:color="7F7F7F" w:sz="4"/>
+              <w:bottom w:val="single" w:color="7F7F7F" w:sz="4"/>
+              <w:right w:val="single" w:color="7F7F7F" w:sz="4"/>
+            </w:tcBorders>
+            <w:tcMar>
+              <w:top w:type="dxa" w:w="60"/>
+              <w:left w:type="dxa" w:w="100"/>
+              <w:bottom w:type="dxa" w:w="60"/>
+              <w:right w:type="dxa" w:w="100"/>
+            </w:tcMar>
+          </w:tcPr>
+          <w:p>
+            <w:pPr>
+              <w:spacing w:after="20"/>
+            </w:pPr>
+            <w:r>
+              <w:rPr>
+                <w:sz w:val="16"/>
+                <w:szCs w:val="16"/>
+              </w:rPr>
+              <w:t xml:space="preserve">R, U own (mark read)</w:t>
+            </w:r>
+          </w:p>
+        </w:tc>
+        <w:tc>
+          <w:tcPr>
+            <w:tcW w:type="dxa" w:w="1880"/>
+            <w:tcBorders>
+              <w:top w:val="single" w:color="7F7F7F" w:sz="4"/>
+              <w:left w:val="single" w:color="7F7F7F" w:sz="4"/>
+              <w:bottom w:val="single" w:color="7F7F7F" w:sz="4"/>
+              <w:right w:val="single" w:color="7F7F7F" w:sz="4"/>
+            </w:tcBorders>
+            <w:tcMar>
+              <w:top w:type="dxa" w:w="60"/>
+              <w:left w:type="dxa" w:w="100"/>
+              <w:bottom w:type="dxa" w:w="60"/>
+              <w:right w:type="dxa" w:w="100"/>
+            </w:tcMar>
+          </w:tcPr>
+          <w:p>
+            <w:pPr>
+              <w:spacing w:after="20"/>
+            </w:pPr>
+            <w:r>
+              <w:rPr>
+                <w:sz w:val="16"/>
+                <w:szCs w:val="16"/>
+              </w:rPr>
+              <w:t xml:space="preserve">–</w:t>
+            </w:r>
+          </w:p>
+        </w:tc>
+      </w:tr>
+      <w:tr>
+        <w:tc>
+          <w:tcPr>
+            <w:tcW w:type="dxa" w:w="2400"/>
+            <w:tcBorders>
+              <w:top w:val="single" w:color="7F7F7F" w:sz="4"/>
+              <w:left w:val="single" w:color="7F7F7F" w:sz="4"/>
+              <w:bottom w:val="single" w:color="7F7F7F" w:sz="4"/>
+              <w:right w:val="single" w:color="7F7F7F" w:sz="4"/>
+            </w:tcBorders>
+            <w:tcMar>
+              <w:top w:type="dxa" w:w="60"/>
+              <w:left w:type="dxa" w:w="100"/>
+              <w:bottom w:type="dxa" w:w="60"/>
+              <w:right w:type="dxa" w:w="100"/>
+            </w:tcMar>
+          </w:tcPr>
+          <w:p>
+            <w:pPr>
+              <w:spacing w:after="20"/>
+            </w:pPr>
+            <w:r>
+              <w:rPr>
+                <w:sz w:val="16"/>
+                <w:szCs w:val="16"/>
+              </w:rPr>
+              <w:t xml:space="preserve">Saved jobs</w:t>
+            </w:r>
+          </w:p>
+        </w:tc>
+        <w:tc>
+          <w:tcPr>
+            <w:tcW w:type="dxa" w:w="1500"/>
+            <w:tcBorders>
+              <w:top w:val="single" w:color="7F7F7F" w:sz="4"/>
+              <w:left w:val="single" w:color="7F7F7F" w:sz="4"/>
+              <w:bottom w:val="single" w:color="7F7F7F" w:sz="4"/>
+              <w:right w:val="single" w:color="7F7F7F" w:sz="4"/>
+            </w:tcBorders>
+            <w:tcMar>
+              <w:top w:type="dxa" w:w="60"/>
+              <w:left w:type="dxa" w:w="100"/>
+              <w:bottom w:type="dxa" w:w="60"/>
+              <w:right w:type="dxa" w:w="100"/>
+            </w:tcMar>
+          </w:tcPr>
+          <w:p>
+            <w:pPr>
+              <w:spacing w:after="20"/>
+            </w:pPr>
+            <w:r>
+              <w:rPr>
+                <w:sz w:val="16"/>
+                <w:szCs w:val="16"/>
+              </w:rPr>
+              <w:t xml:space="preserve">–</w:t>
+            </w:r>
+          </w:p>
+        </w:tc>
+        <w:tc>
+          <w:tcPr>
+            <w:tcW w:type="dxa" w:w="2200"/>
+            <w:tcBorders>
+              <w:top w:val="single" w:color="7F7F7F" w:sz="4"/>
+              <w:left w:val="single" w:color="7F7F7F" w:sz="4"/>
+              <w:bottom w:val="single" w:color="7F7F7F" w:sz="4"/>
+              <w:right w:val="single" w:color="7F7F7F" w:sz="4"/>
+            </w:tcBorders>
+            <w:tcMar>
+              <w:top w:type="dxa" w:w="60"/>
+              <w:left w:type="dxa" w:w="100"/>
+              <w:bottom w:type="dxa" w:w="60"/>
+              <w:right w:type="dxa" w:w="100"/>
+            </w:tcMar>
+          </w:tcPr>
+          <w:p>
+            <w:pPr>
+              <w:spacing w:after="20"/>
+            </w:pPr>
+            <w:r>
+              <w:rPr>
+                <w:sz w:val="16"/>
+                <w:szCs w:val="16"/>
+              </w:rPr>
+              <w:t xml:space="preserve">C, R, D own (visible postings)</w:t>
+            </w:r>
+          </w:p>
+        </w:tc>
+        <w:tc>
+          <w:tcPr>
+            <w:tcW w:type="dxa" w:w="2100"/>
+            <w:tcBorders>
+              <w:top w:val="single" w:color="7F7F7F" w:sz="4"/>
+              <w:left w:val="single" w:color="7F7F7F" w:sz="4"/>
+              <w:bottom w:val="single" w:color="7F7F7F" w:sz="4"/>
+              <w:right w:val="single" w:color="7F7F7F" w:sz="4"/>
+            </w:tcBorders>
+            <w:tcMar>
+              <w:top w:type="dxa" w:w="60"/>
+              <w:left w:type="dxa" w:w="100"/>
+              <w:bottom w:type="dxa" w:w="60"/>
+              <w:right w:type="dxa" w:w="100"/>
+            </w:tcMar>
+          </w:tcPr>
+          <w:p>
+            <w:pPr>
+              <w:spacing w:after="20"/>
+            </w:pPr>
+            <w:r>
+              <w:rPr>
+                <w:sz w:val="16"/>
+                <w:szCs w:val="16"/>
+              </w:rPr>
+              <w:t xml:space="preserve">–</w:t>
+            </w:r>
+          </w:p>
+        </w:tc>
+        <w:tc>
+          <w:tcPr>
+            <w:tcW w:type="dxa" w:w="1880"/>
+            <w:tcBorders>
+              <w:top w:val="single" w:color="7F7F7F" w:sz="4"/>
+              <w:left w:val="single" w:color="7F7F7F" w:sz="4"/>
+              <w:bottom w:val="single" w:color="7F7F7F" w:sz="4"/>
+              <w:right w:val="single" w:color="7F7F7F" w:sz="4"/>
+            </w:tcBorders>
+            <w:tcMar>
+              <w:top w:type="dxa" w:w="60"/>
+              <w:left w:type="dxa" w:w="100"/>
+              <w:bottom w:type="dxa" w:w="60"/>
+              <w:right w:type="dxa" w:w="100"/>
+            </w:tcMar>
+          </w:tcPr>
+          <w:p>
+            <w:pPr>
+              <w:spacing w:after="20"/>
+            </w:pPr>
+            <w:r>
+              <w:rPr>
+                <w:sz w:val="16"/>
+                <w:szCs w:val="16"/>
+              </w:rPr>
+              <w:t xml:space="preserve">–</w:t>
+            </w:r>
+          </w:p>
+        </w:tc>
+      </w:tr>
     </w:tbl>
     <w:p>
       <w:pPr>
         <w:spacing w:after="120"/>
       </w:pPr>
+    </w:p>
+    <w:p>
+      <w:pPr>
+        <w:spacing w:after="120" w:line="276"/>
+      </w:pPr>
+      <w:r>
+        <w:t xml:space="preserve">A </w:t>
+      </w:r>
+      <w:r>
+        <w:rPr>
+          <w:b/>
+          <w:bCs/>
+        </w:rPr>
+        <w:t xml:space="preserve">visible posting</w:t>
+      </w:r>
+      <w:r>
+        <w:t xml:space="preserve"> is open, approved, not deleted, and its employer's account is not suspended. Only visible postings appear in search, on the public employer page and in the Accessibility Snapshot, and only they can be opened, saved, applied to or reported by guests and candidates; owners and administrators still see the others.</w:t>
+      </w:r>
     </w:p>
     <w:p>
       <w:pPr>
@@ -42241,7 +43628,7 @@
                 <w:sz w:val="16"/>
                 <w:szCs w:val="16"/>
               </w:rPr>
-              <w:t xml:space="preserve">notifications, reports, saved_jobs</w:t>
+              <w:t xml:space="preserve">notifications</w:t>
             </w:r>
           </w:p>
         </w:tc>
@@ -42270,7 +43657,7 @@
                 <w:sz w:val="16"/>
                 <w:szCs w:val="16"/>
               </w:rPr>
-              <w:t xml:space="preserve">Laravel notifications; id, reporter_id, job_posting_id, reason, status; candidate_profile_id, job_posting_id</w:t>
+              <w:t xml:space="preserve">Laravel notifications table: id (UUID), type, notifiable, data (message, url, ids), read_at</w:t>
             </w:r>
           </w:p>
         </w:tc>
@@ -42299,7 +43686,200 @@
                 <w:sz w:val="16"/>
                 <w:szCs w:val="16"/>
               </w:rPr>
-              <w:t xml:space="preserve">In-app notices; moderation; bookmarks</w:t>
+              <w:t xml:space="preserve">In-app notices for candidates and employers</w:t>
+            </w:r>
+          </w:p>
+        </w:tc>
+      </w:tr>
+      <w:tr>
+        <w:tc>
+          <w:tcPr>
+            <w:tcW w:type="dxa" w:w="2300"/>
+            <w:tcBorders>
+              <w:top w:val="single" w:color="7F7F7F" w:sz="4"/>
+              <w:left w:val="single" w:color="7F7F7F" w:sz="4"/>
+              <w:bottom w:val="single" w:color="7F7F7F" w:sz="4"/>
+              <w:right w:val="single" w:color="7F7F7F" w:sz="4"/>
+            </w:tcBorders>
+            <w:tcMar>
+              <w:top w:type="dxa" w:w="60"/>
+              <w:left w:type="dxa" w:w="100"/>
+              <w:bottom w:type="dxa" w:w="60"/>
+              <w:right w:type="dxa" w:w="100"/>
+            </w:tcMar>
+          </w:tcPr>
+          <w:p>
+            <w:pPr>
+              <w:spacing w:after="20"/>
+            </w:pPr>
+            <w:r>
+              <w:rPr>
+                <w:sz w:val="16"/>
+                <w:szCs w:val="16"/>
+              </w:rPr>
+              <w:t xml:space="preserve">reports</w:t>
+            </w:r>
+          </w:p>
+        </w:tc>
+        <w:tc>
+          <w:tcPr>
+            <w:tcW w:type="dxa" w:w="4900"/>
+            <w:tcBorders>
+              <w:top w:val="single" w:color="7F7F7F" w:sz="4"/>
+              <w:left w:val="single" w:color="7F7F7F" w:sz="4"/>
+              <w:bottom w:val="single" w:color="7F7F7F" w:sz="4"/>
+              <w:right w:val="single" w:color="7F7F7F" w:sz="4"/>
+            </w:tcBorders>
+            <w:tcMar>
+              <w:top w:type="dxa" w:w="60"/>
+              <w:left w:type="dxa" w:w="100"/>
+              <w:bottom w:type="dxa" w:w="60"/>
+              <w:right w:type="dxa" w:w="100"/>
+            </w:tcMar>
+          </w:tcPr>
+          <w:p>
+            <w:pPr>
+              <w:spacing w:after="20"/>
+            </w:pPr>
+            <w:r>
+              <w:rPr>
+                <w:sz w:val="16"/>
+                <w:szCs w:val="16"/>
+              </w:rPr>
+              <w:t xml:space="preserve">id, reporter_id, job_posting_id, reason, status, note, resolved_by, resolved_at, timestamps</w:t>
+            </w:r>
+          </w:p>
+        </w:tc>
+        <w:tc>
+          <w:tcPr>
+            <w:tcW w:type="dxa" w:w="2880"/>
+            <w:tcBorders>
+              <w:top w:val="single" w:color="7F7F7F" w:sz="4"/>
+              <w:left w:val="single" w:color="7F7F7F" w:sz="4"/>
+              <w:bottom w:val="single" w:color="7F7F7F" w:sz="4"/>
+              <w:right w:val="single" w:color="7F7F7F" w:sz="4"/>
+            </w:tcBorders>
+            <w:tcMar>
+              <w:top w:type="dxa" w:w="60"/>
+              <w:left w:type="dxa" w:w="100"/>
+              <w:bottom w:type="dxa" w:w="60"/>
+              <w:right w:type="dxa" w:w="100"/>
+            </w:tcMar>
+          </w:tcPr>
+          <w:p>
+            <w:pPr>
+              <w:spacing w:after="20"/>
+            </w:pPr>
+            <w:r>
+              <w:rPr>
+                <w:sz w:val="16"/>
+                <w:szCs w:val="16"/>
+              </w:rPr>
+              <w:t xml:space="preserve">One open report per candidate and posting; </w:t>
+            </w:r>
+            <w:r>
+              <w:rPr>
+                <w:rFonts w:ascii="Consolas" w:cs="Consolas" w:eastAsia="Consolas" w:hAnsi="Consolas"/>
+                <w:sz w:val="16"/>
+                <w:szCs w:val="16"/>
+              </w:rPr>
+              <w:t xml:space="preserve">note</w:t>
+            </w:r>
+            <w:r>
+              <w:rPr>
+                <w:sz w:val="16"/>
+                <w:szCs w:val="16"/>
+              </w:rPr>
+              <w:t xml:space="preserve"> and resolver set only when an administrator resolves it</w:t>
+            </w:r>
+          </w:p>
+        </w:tc>
+      </w:tr>
+      <w:tr>
+        <w:tc>
+          <w:tcPr>
+            <w:tcW w:type="dxa" w:w="2300"/>
+            <w:tcBorders>
+              <w:top w:val="single" w:color="7F7F7F" w:sz="4"/>
+              <w:left w:val="single" w:color="7F7F7F" w:sz="4"/>
+              <w:bottom w:val="single" w:color="7F7F7F" w:sz="4"/>
+              <w:right w:val="single" w:color="7F7F7F" w:sz="4"/>
+            </w:tcBorders>
+            <w:tcMar>
+              <w:top w:type="dxa" w:w="60"/>
+              <w:left w:type="dxa" w:w="100"/>
+              <w:bottom w:type="dxa" w:w="60"/>
+              <w:right w:type="dxa" w:w="100"/>
+            </w:tcMar>
+          </w:tcPr>
+          <w:p>
+            <w:pPr>
+              <w:spacing w:after="20"/>
+            </w:pPr>
+            <w:r>
+              <w:rPr>
+                <w:sz w:val="16"/>
+                <w:szCs w:val="16"/>
+              </w:rPr>
+              <w:t xml:space="preserve">saved_jobs</w:t>
+            </w:r>
+          </w:p>
+        </w:tc>
+        <w:tc>
+          <w:tcPr>
+            <w:tcW w:type="dxa" w:w="4900"/>
+            <w:tcBorders>
+              <w:top w:val="single" w:color="7F7F7F" w:sz="4"/>
+              <w:left w:val="single" w:color="7F7F7F" w:sz="4"/>
+              <w:bottom w:val="single" w:color="7F7F7F" w:sz="4"/>
+              <w:right w:val="single" w:color="7F7F7F" w:sz="4"/>
+            </w:tcBorders>
+            <w:tcMar>
+              <w:top w:type="dxa" w:w="60"/>
+              <w:left w:type="dxa" w:w="100"/>
+              <w:bottom w:type="dxa" w:w="60"/>
+              <w:right w:type="dxa" w:w="100"/>
+            </w:tcMar>
+          </w:tcPr>
+          <w:p>
+            <w:pPr>
+              <w:spacing w:after="20"/>
+            </w:pPr>
+            <w:r>
+              <w:rPr>
+                <w:sz w:val="16"/>
+                <w:szCs w:val="16"/>
+              </w:rPr>
+              <w:t xml:space="preserve">candidate_profile_id, job_posting_id, timestamps</w:t>
+            </w:r>
+          </w:p>
+        </w:tc>
+        <w:tc>
+          <w:tcPr>
+            <w:tcW w:type="dxa" w:w="2880"/>
+            <w:tcBorders>
+              <w:top w:val="single" w:color="7F7F7F" w:sz="4"/>
+              <w:left w:val="single" w:color="7F7F7F" w:sz="4"/>
+              <w:bottom w:val="single" w:color="7F7F7F" w:sz="4"/>
+              <w:right w:val="single" w:color="7F7F7F" w:sz="4"/>
+            </w:tcBorders>
+            <w:tcMar>
+              <w:top w:type="dxa" w:w="60"/>
+              <w:left w:type="dxa" w:w="100"/>
+              <w:bottom w:type="dxa" w:w="60"/>
+              <w:right w:type="dxa" w:w="100"/>
+            </w:tcMar>
+          </w:tcPr>
+          <w:p>
+            <w:pPr>
+              <w:spacing w:after="20"/>
+            </w:pPr>
+            <w:r>
+              <w:rPr>
+                <w:sz w:val="16"/>
+                <w:szCs w:val="16"/>
+              </w:rPr>
+              <w:t xml:space="preserve">Composite primary key; bookmarks kept when a posting closes and listed again if it reopens</w:t>
             </w:r>
           </w:p>
         </w:tc>

</xml_diff>

<commit_message>
feat(core): admins can remove job postings, as in the SIA design
The SIA doc gives administrators delete rights on postings, but there
was no endpoint. DELETE /admin/job-postings/{id} needs a reason,
soft-deletes the posting in any status (applications are kept) and
sends the employer a posting_review notice with the reason.

- Admin postings screen: Remove button with a reason dialog
- OpenAPI, SIA doc 4.1 + Appendix A, dev skill api-contract
- 3 Core tests, 1 Vitest test, Postman folder 09 now removes its
  posting through this endpoint

Co-Authored-By: Claude Opus 5.5 <noreply@anthropic.com>
</commit_message>
<xml_diff>
--- a/docs/OpenDoor_SIA1_Final_Project_Documentation.docx
+++ b/docs/OpenDoor_SIA1_Final_Project_Documentation.docx
@@ -10011,6 +10011,153 @@
                 <w:sz w:val="16"/>
                 <w:szCs w:val="16"/>
               </w:rPr>
+              <w:t xml:space="preserve">DELETE</w:t>
+            </w:r>
+          </w:p>
+        </w:tc>
+        <w:tc>
+          <w:tcPr>
+            <w:tcW w:type="dxa" w:w="2700"/>
+            <w:tcBorders>
+              <w:top w:val="single" w:color="7F7F7F" w:sz="4"/>
+              <w:left w:val="single" w:color="7F7F7F" w:sz="4"/>
+              <w:bottom w:val="single" w:color="7F7F7F" w:sz="4"/>
+              <w:right w:val="single" w:color="7F7F7F" w:sz="4"/>
+            </w:tcBorders>
+            <w:tcMar>
+              <w:top w:type="dxa" w:w="60"/>
+              <w:left w:type="dxa" w:w="100"/>
+              <w:bottom w:type="dxa" w:w="60"/>
+              <w:right w:type="dxa" w:w="100"/>
+            </w:tcMar>
+          </w:tcPr>
+          <w:p>
+            <w:pPr>
+              <w:spacing w:after="20"/>
+            </w:pPr>
+            <w:r>
+              <w:rPr>
+                <w:sz w:val="16"/>
+                <w:szCs w:val="16"/>
+              </w:rPr>
+              <w:t xml:space="preserve">/api/admin/job-postings/{id}</w:t>
+            </w:r>
+          </w:p>
+        </w:tc>
+        <w:tc>
+          <w:tcPr>
+            <w:tcW w:type="dxa" w:w="2280"/>
+            <w:tcBorders>
+              <w:top w:val="single" w:color="7F7F7F" w:sz="4"/>
+              <w:left w:val="single" w:color="7F7F7F" w:sz="4"/>
+              <w:bottom w:val="single" w:color="7F7F7F" w:sz="4"/>
+              <w:right w:val="single" w:color="7F7F7F" w:sz="4"/>
+            </w:tcBorders>
+            <w:tcMar>
+              <w:top w:type="dxa" w:w="60"/>
+              <w:left w:type="dxa" w:w="100"/>
+              <w:bottom w:type="dxa" w:w="60"/>
+              <w:right w:type="dxa" w:w="100"/>
+            </w:tcMar>
+          </w:tcPr>
+          <w:p>
+            <w:pPr>
+              <w:spacing w:after="20"/>
+            </w:pPr>
+            <w:r>
+              <w:rPr>
+                <w:sz w:val="16"/>
+                <w:szCs w:val="16"/>
+              </w:rPr>
+              <w:t xml:space="preserve">Remove a posting in any status, e.g. after a report (M4/M10)</w:t>
+            </w:r>
+          </w:p>
+        </w:tc>
+        <w:tc>
+          <w:tcPr>
+            <w:tcW w:type="dxa" w:w="2900"/>
+            <w:tcBorders>
+              <w:top w:val="single" w:color="7F7F7F" w:sz="4"/>
+              <w:left w:val="single" w:color="7F7F7F" w:sz="4"/>
+              <w:bottom w:val="single" w:color="7F7F7F" w:sz="4"/>
+              <w:right w:val="single" w:color="7F7F7F" w:sz="4"/>
+            </w:tcBorders>
+            <w:tcMar>
+              <w:top w:type="dxa" w:w="60"/>
+              <w:left w:type="dxa" w:w="100"/>
+              <w:bottom w:type="dxa" w:w="60"/>
+              <w:right w:type="dxa" w:w="100"/>
+            </w:tcMar>
+          </w:tcPr>
+          <w:p>
+            <w:pPr>
+              <w:spacing w:after="20"/>
+            </w:pPr>
+            <w:r>
+              <w:rPr>
+                <w:sz w:val="16"/>
+                <w:szCs w:val="16"/>
+              </w:rPr>
+              <w:t xml:space="preserve">{reason} → 204; soft delete, applications kept; employer gets a notice with the reason</w:t>
+            </w:r>
+          </w:p>
+        </w:tc>
+      </w:tr>
+      <w:tr>
+        <w:tc>
+          <w:tcPr>
+            <w:tcW w:type="dxa" w:w="1250"/>
+            <w:tcBorders>
+              <w:top w:val="single" w:color="7F7F7F" w:sz="4"/>
+              <w:left w:val="single" w:color="7F7F7F" w:sz="4"/>
+              <w:bottom w:val="single" w:color="7F7F7F" w:sz="4"/>
+              <w:right w:val="single" w:color="7F7F7F" w:sz="4"/>
+            </w:tcBorders>
+            <w:tcMar>
+              <w:top w:type="dxa" w:w="60"/>
+              <w:left w:type="dxa" w:w="100"/>
+              <w:bottom w:type="dxa" w:w="60"/>
+              <w:right w:type="dxa" w:w="100"/>
+            </w:tcMar>
+          </w:tcPr>
+          <w:p>
+            <w:pPr>
+              <w:spacing w:after="20"/>
+            </w:pPr>
+            <w:r>
+              <w:rPr>
+                <w:sz w:val="16"/>
+                <w:szCs w:val="16"/>
+              </w:rPr>
+              <w:t xml:space="preserve">Core</w:t>
+            </w:r>
+          </w:p>
+        </w:tc>
+        <w:tc>
+          <w:tcPr>
+            <w:tcW w:type="dxa" w:w="950"/>
+            <w:tcBorders>
+              <w:top w:val="single" w:color="7F7F7F" w:sz="4"/>
+              <w:left w:val="single" w:color="7F7F7F" w:sz="4"/>
+              <w:bottom w:val="single" w:color="7F7F7F" w:sz="4"/>
+              <w:right w:val="single" w:color="7F7F7F" w:sz="4"/>
+            </w:tcBorders>
+            <w:tcMar>
+              <w:top w:type="dxa" w:w="60"/>
+              <w:left w:type="dxa" w:w="100"/>
+              <w:bottom w:type="dxa" w:w="60"/>
+              <w:right w:type="dxa" w:w="100"/>
+            </w:tcMar>
+          </w:tcPr>
+          <w:p>
+            <w:pPr>
+              <w:spacing w:after="20"/>
+            </w:pPr>
+            <w:r>
+              <w:rPr>
+                <w:sz w:val="16"/>
+                <w:szCs w:val="16"/>
+              </w:rPr>
               <w:t xml:space="preserve">PATCH</w:t>
             </w:r>
           </w:p>
@@ -34970,6 +35117,153 @@
                 <w:szCs w:val="15"/>
               </w:rPr>
               <w:t xml:space="preserve">Approve / reject (with reason)</w:t>
+            </w:r>
+          </w:p>
+        </w:tc>
+      </w:tr>
+      <w:tr>
+        <w:tc>
+          <w:tcPr>
+            <w:tcW w:type="dxa" w:w="1600"/>
+            <w:tcBorders>
+              <w:top w:val="single" w:color="7F7F7F" w:sz="4"/>
+              <w:left w:val="single" w:color="7F7F7F" w:sz="4"/>
+              <w:bottom w:val="single" w:color="7F7F7F" w:sz="4"/>
+              <w:right w:val="single" w:color="7F7F7F" w:sz="4"/>
+            </w:tcBorders>
+            <w:tcMar>
+              <w:top w:type="dxa" w:w="60"/>
+              <w:left w:type="dxa" w:w="100"/>
+              <w:bottom w:type="dxa" w:w="60"/>
+              <w:right w:type="dxa" w:w="100"/>
+            </w:tcMar>
+          </w:tcPr>
+          <w:p>
+            <w:pPr>
+              <w:spacing w:after="20"/>
+            </w:pPr>
+            <w:r>
+              <w:rPr>
+                <w:sz w:val="15"/>
+                <w:szCs w:val="15"/>
+              </w:rPr>
+              <w:t xml:space="preserve">M4 Postings</w:t>
+            </w:r>
+          </w:p>
+        </w:tc>
+        <w:tc>
+          <w:tcPr>
+            <w:tcW w:type="dxa" w:w="1300"/>
+            <w:tcBorders>
+              <w:top w:val="single" w:color="7F7F7F" w:sz="4"/>
+              <w:left w:val="single" w:color="7F7F7F" w:sz="4"/>
+              <w:bottom w:val="single" w:color="7F7F7F" w:sz="4"/>
+              <w:right w:val="single" w:color="7F7F7F" w:sz="4"/>
+            </w:tcBorders>
+            <w:tcMar>
+              <w:top w:type="dxa" w:w="60"/>
+              <w:left w:type="dxa" w:w="100"/>
+              <w:bottom w:type="dxa" w:w="60"/>
+              <w:right w:type="dxa" w:w="100"/>
+            </w:tcMar>
+          </w:tcPr>
+          <w:p>
+            <w:pPr>
+              <w:spacing w:after="20"/>
+            </w:pPr>
+            <w:r>
+              <w:rPr>
+                <w:sz w:val="15"/>
+                <w:szCs w:val="15"/>
+              </w:rPr>
+              <w:t xml:space="preserve">DELETE</w:t>
+            </w:r>
+          </w:p>
+        </w:tc>
+        <w:tc>
+          <w:tcPr>
+            <w:tcW w:type="dxa" w:w="3800"/>
+            <w:tcBorders>
+              <w:top w:val="single" w:color="7F7F7F" w:sz="4"/>
+              <w:left w:val="single" w:color="7F7F7F" w:sz="4"/>
+              <w:bottom w:val="single" w:color="7F7F7F" w:sz="4"/>
+              <w:right w:val="single" w:color="7F7F7F" w:sz="4"/>
+            </w:tcBorders>
+            <w:tcMar>
+              <w:top w:type="dxa" w:w="60"/>
+              <w:left w:type="dxa" w:w="100"/>
+              <w:bottom w:type="dxa" w:w="60"/>
+              <w:right w:type="dxa" w:w="100"/>
+            </w:tcMar>
+          </w:tcPr>
+          <w:p>
+            <w:pPr>
+              <w:spacing w:after="20"/>
+            </w:pPr>
+            <w:r>
+              <w:rPr>
+                <w:sz w:val="15"/>
+                <w:szCs w:val="15"/>
+              </w:rPr>
+              <w:t xml:space="preserve">/admin/job-postings/{id}</w:t>
+            </w:r>
+          </w:p>
+        </w:tc>
+        <w:tc>
+          <w:tcPr>
+            <w:tcW w:type="dxa" w:w="1600"/>
+            <w:tcBorders>
+              <w:top w:val="single" w:color="7F7F7F" w:sz="4"/>
+              <w:left w:val="single" w:color="7F7F7F" w:sz="4"/>
+              <w:bottom w:val="single" w:color="7F7F7F" w:sz="4"/>
+              <w:right w:val="single" w:color="7F7F7F" w:sz="4"/>
+            </w:tcBorders>
+            <w:tcMar>
+              <w:top w:type="dxa" w:w="60"/>
+              <w:left w:type="dxa" w:w="100"/>
+              <w:bottom w:type="dxa" w:w="60"/>
+              <w:right w:type="dxa" w:w="100"/>
+            </w:tcMar>
+          </w:tcPr>
+          <w:p>
+            <w:pPr>
+              <w:spacing w:after="20"/>
+            </w:pPr>
+            <w:r>
+              <w:rPr>
+                <w:sz w:val="15"/>
+                <w:szCs w:val="15"/>
+              </w:rPr>
+              <w:t xml:space="preserve">A</w:t>
+            </w:r>
+          </w:p>
+        </w:tc>
+        <w:tc>
+          <w:tcPr>
+            <w:tcW w:type="dxa" w:w="1780"/>
+            <w:tcBorders>
+              <w:top w:val="single" w:color="7F7F7F" w:sz="4"/>
+              <w:left w:val="single" w:color="7F7F7F" w:sz="4"/>
+              <w:bottom w:val="single" w:color="7F7F7F" w:sz="4"/>
+              <w:right w:val="single" w:color="7F7F7F" w:sz="4"/>
+            </w:tcBorders>
+            <w:tcMar>
+              <w:top w:type="dxa" w:w="60"/>
+              <w:left w:type="dxa" w:w="100"/>
+              <w:bottom w:type="dxa" w:w="60"/>
+              <w:right w:type="dxa" w:w="100"/>
+            </w:tcMar>
+          </w:tcPr>
+          <w:p>
+            <w:pPr>
+              <w:spacing w:after="20"/>
+            </w:pPr>
+            <w:r>
+              <w:rPr>
+                <w:sz w:val="15"/>
+                <w:szCs w:val="15"/>
+              </w:rPr>
+              <w:t xml:space="preserve">Remove any posting with a reason (soft delete; employer notified)</w:t>
             </w:r>
           </w:p>
         </w:tc>

</xml_diff>

<commit_message>
docs(sia): scope, inventory, endpoints and data model as built
Forgot/reset password, M13 settings and emails, saved in search,
reviewed_at, Read aloud and Voice input, email provider, PHP 8.4.

Co-Authored-By: Claude Opus 5.5 <noreply@anthropic.com>
</commit_message>
<xml_diff>
--- a/docs/OpenDoor_SIA1_Final_Project_Documentation.docx
+++ b/docs/OpenDoor_SIA1_Final_Project_Documentation.docx
@@ -2199,7 +2199,7 @@
         <w:spacing w:after="60"/>
       </w:pPr>
       <w:r>
-        <w:t xml:space="preserve">Public area, Candidate, Employer and Admin portals in one React application (13 functional modules, M1–M13, as defined in the OpenDoor Modules and Features Specification).</w:t>
+        <w:t xml:space="preserve">Public area, Candidate, Employer and Admin portals in one React application (13 functional modules, M1–M13, as defined in the OpenDoor Modules and Features Specification), with display settings (text size, high contrast, reduced motion), Read aloud and Voice input.</w:t>
       </w:r>
     </w:p>
     <w:p>
@@ -2225,7 +2225,7 @@
         <w:spacing w:after="60"/>
       </w:pPr>
       <w:r>
-        <w:t xml:space="preserve">Core Service (Laravel 13 + MySQL 8): authentication and roles, candidate and company profiles, job postings with structured accommodations, search/filter/matching, application workflow, feedback and trust score, dashboards, in-app notifications, moderation, master data.</w:t>
+        <w:t xml:space="preserve">Core Service (Laravel 13 + MySQL 8): authentication and roles with password reset by email, candidate and company profiles, job postings with structured accommodations, search/filter/matching, saved jobs, application workflow, feedback and trust score, dashboards, in-app and email notifications, account display settings, moderation, master data.</w:t>
       </w:r>
     </w:p>
     <w:p>
@@ -2356,7 +2356,20 @@
         <w:spacing w:after="60"/>
       </w:pPr>
       <w:r>
-        <w:t xml:space="preserve">Email notifications and display settings (M13) are "Could have" features and may be delivered only if time allows (saved jobs, M12, was delivered). No mobile app, payments, or video interviews are included.</w:t>
+        <w:t xml:space="preserve">All 13 modules were delivered, including the "Could have" saved jobs (M12) and display settings and email notifications (M13). Emails are sent through a mail provider chosen at deployment; during development they are written to the Core Service log. No mobile app, payments, or video interviews are included.</w:t>
+      </w:r>
+    </w:p>
+    <w:p>
+      <w:pPr>
+        <w:pStyle w:val="ListParagraph"/>
+        <w:numPr>
+          <w:ilvl w:val="0"/>
+          <w:numId w:val="2"/>
+        </w:numPr>
+        <w:spacing w:after="60"/>
+      </w:pPr>
+      <w:r>
+        <w:t xml:space="preserve">Read aloud and Voice input use the browser's own speech features (Web Speech API). Voice input works only in browsers that offer a speech service (Chrome, Edge) and is hidden elsewhere; Chrome and Edge send the recorded audio to their vendor's speech service, so a one-time notice is shown before first use and it is never switched on by default.</w:t>
       </w:r>
     </w:p>
     <w:p>
@@ -4838,7 +4851,7 @@
                 <w:sz w:val="16"/>
                 <w:szCs w:val="16"/>
               </w:rPr>
-              <w:t xml:space="preserve">Public area and Candidate, Employer and Admin portals; accessible UI; calls the gateway only</w:t>
+              <w:t xml:space="preserve">Public area and Candidate, Employer and Admin portals; accessible UI with display settings, Read aloud and Voice input; calls the gateway only</w:t>
             </w:r>
           </w:p>
         </w:tc>
@@ -4867,7 +4880,7 @@
                 <w:sz w:val="16"/>
                 <w:szCs w:val="16"/>
               </w:rPr>
-              <w:t xml:space="preserve">React 19, Vite, React Router 7, Axios, AuthContext</w:t>
+              <w:t xml:space="preserve">React 19, Vite, React Router 7, Axios, AuthContext, Lucide icons, self-hosted Lexend and Atkinson Hyperlegible fonts, Web Speech API</w:t>
             </w:r>
           </w:p>
         </w:tc>
@@ -5162,7 +5175,7 @@
                 <w:sz w:val="16"/>
                 <w:szCs w:val="16"/>
               </w:rPr>
-              <w:t xml:space="preserve">Auth and roles, profiles, postings, matching, applications and status workflow, feedback and trust score, dashboards, notifications, moderation, master data</w:t>
+              <w:t xml:space="preserve">Auth and roles, password reset, profiles, postings, matching, saved jobs, applications and status workflow, feedback and trust score, dashboards, in-app and email notifications, moderation, master data; scheduled jobs (close expired postings, rating reminders, queued reset emails)</w:t>
             </w:r>
           </w:p>
         </w:tc>
@@ -5191,7 +5204,7 @@
                 <w:sz w:val="16"/>
                 <w:szCs w:val="16"/>
               </w:rPr>
-              <w:t xml:space="preserve">PHP 8.3, Laravel 13, Sanctum, Eloquent</w:t>
+              <w:t xml:space="preserve">PHP 8.4, Laravel 13, Sanctum, Eloquent; FrankenPHP in the container</w:t>
             </w:r>
           </w:p>
         </w:tc>
@@ -5249,7 +5262,7 @@
                 <w:sz w:val="16"/>
                 <w:szCs w:val="16"/>
               </w:rPr>
-              <w:t xml:space="preserve">MySQL opendoor_core, Business Registry Service</w:t>
+              <w:t xml:space="preserve">MySQL opendoor_core, Business Registry Service, email provider</w:t>
             </w:r>
           </w:p>
         </w:tc>
@@ -5500,7 +5513,7 @@
                 <w:sz w:val="16"/>
                 <w:szCs w:val="16"/>
               </w:rPr>
-              <w:t xml:space="preserve">PHP 8.3 SoapServer, SQLite</w:t>
+              <w:t xml:space="preserve">PHP 8.4 SoapServer (plain PHP, FrankenPHP in the container), SQLite</w:t>
             </w:r>
           </w:p>
         </w:tc>
@@ -6132,7 +6145,7 @@
                 <w:sz w:val="16"/>
                 <w:szCs w:val="16"/>
               </w:rPr>
-              <w:t xml:space="preserve">https://overpass-api.de/api/interpreter</w:t>
+              <w:t xml:space="preserve">https://overpass-api.de/api/interpreter; second server https://overpass.private.coffee/api/interpreter</w:t>
             </w:r>
           </w:p>
         </w:tc>
@@ -6280,6 +6293,176 @@
                 <w:szCs w:val="16"/>
               </w:rPr>
               <w:t xml:space="preserve">https://psgc.gitlab.io/api</w:t>
+            </w:r>
+          </w:p>
+        </w:tc>
+        <w:tc>
+          <w:tcPr>
+            <w:tcW w:type="dxa" w:w="1700"/>
+            <w:tcBorders>
+              <w:top w:val="single" w:color="7F7F7F" w:sz="4"/>
+              <w:left w:val="single" w:color="7F7F7F" w:sz="4"/>
+              <w:bottom w:val="single" w:color="7F7F7F" w:sz="4"/>
+              <w:right w:val="single" w:color="7F7F7F" w:sz="4"/>
+            </w:tcBorders>
+            <w:tcMar>
+              <w:top w:type="dxa" w:w="60"/>
+              <w:left w:type="dxa" w:w="100"/>
+              <w:bottom w:type="dxa" w:w="60"/>
+              <w:right w:type="dxa" w:w="100"/>
+            </w:tcMar>
+          </w:tcPr>
+          <w:p>
+            <w:pPr>
+              <w:spacing w:after="20"/>
+            </w:pPr>
+            <w:r>
+              <w:rPr>
+                <w:sz w:val="16"/>
+                <w:szCs w:val="16"/>
+              </w:rPr>
+              <w:t xml:space="preserve">–</w:t>
+            </w:r>
+          </w:p>
+        </w:tc>
+      </w:tr>
+      <w:tr>
+        <w:tc>
+          <w:tcPr>
+            <w:tcW w:type="dxa" w:w="1700"/>
+            <w:tcBorders>
+              <w:top w:val="single" w:color="7F7F7F" w:sz="4"/>
+              <w:left w:val="single" w:color="7F7F7F" w:sz="4"/>
+              <w:bottom w:val="single" w:color="7F7F7F" w:sz="4"/>
+              <w:right w:val="single" w:color="7F7F7F" w:sz="4"/>
+            </w:tcBorders>
+            <w:tcMar>
+              <w:top w:type="dxa" w:w="60"/>
+              <w:left w:type="dxa" w:w="100"/>
+              <w:bottom w:type="dxa" w:w="60"/>
+              <w:right w:type="dxa" w:w="100"/>
+            </w:tcMar>
+          </w:tcPr>
+          <w:p>
+            <w:pPr>
+              <w:spacing w:after="20"/>
+            </w:pPr>
+            <w:r>
+              <w:rPr>
+                <w:sz w:val="16"/>
+                <w:szCs w:val="16"/>
+              </w:rPr>
+              <w:t xml:space="preserve">Email provider (external)</w:t>
+            </w:r>
+          </w:p>
+        </w:tc>
+        <w:tc>
+          <w:tcPr>
+            <w:tcW w:type="dxa" w:w="2600"/>
+            <w:tcBorders>
+              <w:top w:val="single" w:color="7F7F7F" w:sz="4"/>
+              <w:left w:val="single" w:color="7F7F7F" w:sz="4"/>
+              <w:bottom w:val="single" w:color="7F7F7F" w:sz="4"/>
+              <w:right w:val="single" w:color="7F7F7F" w:sz="4"/>
+            </w:tcBorders>
+            <w:tcMar>
+              <w:top w:type="dxa" w:w="60"/>
+              <w:left w:type="dxa" w:w="100"/>
+              <w:bottom w:type="dxa" w:w="60"/>
+              <w:right w:type="dxa" w:w="100"/>
+            </w:tcMar>
+          </w:tcPr>
+          <w:p>
+            <w:pPr>
+              <w:spacing w:after="20"/>
+            </w:pPr>
+            <w:r>
+              <w:rPr>
+                <w:sz w:val="16"/>
+                <w:szCs w:val="16"/>
+              </w:rPr>
+              <w:t xml:space="preserve">Delivers notification emails and password-reset links</w:t>
+            </w:r>
+          </w:p>
+        </w:tc>
+        <w:tc>
+          <w:tcPr>
+            <w:tcW w:type="dxa" w:w="1900"/>
+            <w:tcBorders>
+              <w:top w:val="single" w:color="7F7F7F" w:sz="4"/>
+              <w:left w:val="single" w:color="7F7F7F" w:sz="4"/>
+              <w:bottom w:val="single" w:color="7F7F7F" w:sz="4"/>
+              <w:right w:val="single" w:color="7F7F7F" w:sz="4"/>
+            </w:tcBorders>
+            <w:tcMar>
+              <w:top w:type="dxa" w:w="60"/>
+              <w:left w:type="dxa" w:w="100"/>
+              <w:bottom w:type="dxa" w:w="60"/>
+              <w:right w:type="dxa" w:w="100"/>
+            </w:tcMar>
+          </w:tcPr>
+          <w:p>
+            <w:pPr>
+              <w:spacing w:after="20"/>
+            </w:pPr>
+            <w:r>
+              <w:rPr>
+                <w:sz w:val="16"/>
+                <w:szCs w:val="16"/>
+              </w:rPr>
+              <w:t xml:space="preserve">SMTP (provider chosen at deployment; </w:t>
+            </w:r>
+            <w:r>
+              <w:rPr>
+                <w:rFonts w:ascii="Consolas" w:cs="Consolas" w:eastAsia="Consolas" w:hAnsi="Consolas"/>
+                <w:sz w:val="16"/>
+                <w:szCs w:val="16"/>
+              </w:rPr>
+              <w:t xml:space="preserve">log</w:t>
+            </w:r>
+            <w:r>
+              <w:rPr>
+                <w:sz w:val="16"/>
+                <w:szCs w:val="16"/>
+              </w:rPr>
+              <w:t xml:space="preserve"> mailer in development)</w:t>
+            </w:r>
+          </w:p>
+        </w:tc>
+        <w:tc>
+          <w:tcPr>
+            <w:tcW w:type="dxa" w:w="2180"/>
+            <w:tcBorders>
+              <w:top w:val="single" w:color="7F7F7F" w:sz="4"/>
+              <w:left w:val="single" w:color="7F7F7F" w:sz="4"/>
+              <w:bottom w:val="single" w:color="7F7F7F" w:sz="4"/>
+              <w:right w:val="single" w:color="7F7F7F" w:sz="4"/>
+            </w:tcBorders>
+            <w:tcMar>
+              <w:top w:type="dxa" w:w="60"/>
+              <w:left w:type="dxa" w:w="100"/>
+              <w:bottom w:type="dxa" w:w="60"/>
+              <w:right w:type="dxa" w:w="100"/>
+            </w:tcMar>
+          </w:tcPr>
+          <w:p>
+            <w:pPr>
+              <w:spacing w:after="20"/>
+            </w:pPr>
+            <w:r>
+              <w:rPr>
+                <w:rFonts w:ascii="Consolas" w:cs="Consolas" w:eastAsia="Consolas" w:hAnsi="Consolas"/>
+                <w:sz w:val="16"/>
+                <w:szCs w:val="16"/>
+              </w:rPr>
+              <w:t xml:space="preserve">MAIL_*</w:t>
+            </w:r>
+            <w:r>
+              <w:rPr>
+                <w:sz w:val="16"/>
+                <w:szCs w:val="16"/>
+              </w:rPr>
+              <w:t xml:space="preserve"> settings of the Core Service</w:t>
             </w:r>
           </w:p>
         </w:tc>
@@ -7203,7 +7386,7 @@
                 <w:sz w:val="16"/>
                 <w:szCs w:val="16"/>
               </w:rPr>
-              <w:t xml:space="preserve">GET, PUT</w:t>
+              <w:t xml:space="preserve">POST</w:t>
             </w:r>
           </w:p>
         </w:tc>
@@ -7232,7 +7415,7 @@
                 <w:sz w:val="16"/>
                 <w:szCs w:val="16"/>
               </w:rPr>
-              <w:t xml:space="preserve">/api/candidate/profile</w:t>
+              <w:t xml:space="preserve">/api/forgot-password, /api/reset-password</w:t>
             </w:r>
           </w:p>
         </w:tc>
@@ -7261,7 +7444,7 @@
                 <w:sz w:val="16"/>
                 <w:szCs w:val="16"/>
               </w:rPr>
-              <w:t xml:space="preserve">View or update own profile</w:t>
+              <w:t xml:space="preserve">Email a password-reset link; set a new password with it</w:t>
             </w:r>
           </w:p>
         </w:tc>
@@ -7290,7 +7473,7 @@
                 <w:sz w:val="16"/>
                 <w:szCs w:val="16"/>
               </w:rPr>
-              <w:t xml:space="preserve">{headline,skills[],experience,location_psgc,...} → profile</w:t>
+              <w:t xml:space="preserve">{email} → 200 (same message for every email); {token,email,password,password_confirmation} → 200, every session signed out; bad or expired link → 422</w:t>
             </w:r>
           </w:p>
         </w:tc>
@@ -7379,7 +7562,7 @@
                 <w:sz w:val="16"/>
                 <w:szCs w:val="16"/>
               </w:rPr>
-              <w:t xml:space="preserve">/api/candidate/accommodations</w:t>
+              <w:t xml:space="preserve">/api/me/display-prefs, /api/me/email-notifications</w:t>
             </w:r>
           </w:p>
         </w:tc>
@@ -7408,7 +7591,7 @@
                 <w:sz w:val="16"/>
                 <w:szCs w:val="16"/>
               </w:rPr>
-              <w:t xml:space="preserve">Replace list of accommodation needs</w:t>
+              <w:t xml:space="preserve">Account settings (M13): display settings; notification emails on or off</w:t>
             </w:r>
           </w:p>
         </w:tc>
@@ -7437,7 +7620,7 @@
                 <w:sz w:val="16"/>
                 <w:szCs w:val="16"/>
               </w:rPr>
-              <w:t xml:space="preserve">{accommodation_ids:[1,4,9]} → 200 needs[]</w:t>
+              <w:t xml:space="preserve">{text_size:100|125|150, contrast:'normal'|'high', motion:'normal'|'reduce'} → 200; {enabled:true|false} → 200</w:t>
             </w:r>
           </w:p>
         </w:tc>
@@ -7497,7 +7680,7 @@
                 <w:sz w:val="16"/>
                 <w:szCs w:val="16"/>
               </w:rPr>
-              <w:t xml:space="preserve">POST, GET</w:t>
+              <w:t xml:space="preserve">GET, PUT</w:t>
             </w:r>
           </w:p>
         </w:tc>
@@ -7526,7 +7709,7 @@
                 <w:sz w:val="16"/>
                 <w:szCs w:val="16"/>
               </w:rPr>
-              <w:t xml:space="preserve">/api/candidate/resume, /api/resumes/{id}</w:t>
+              <w:t xml:space="preserve">/api/candidate/profile</w:t>
             </w:r>
           </w:p>
         </w:tc>
@@ -7555,7 +7738,7 @@
                 <w:sz w:val="16"/>
                 <w:szCs w:val="16"/>
               </w:rPr>
-              <w:t xml:space="preserve">Upload PDF résumé (max 5 MB); open it from a 30-minute signed link</w:t>
+              <w:t xml:space="preserve">View or update own profile</w:t>
             </w:r>
           </w:p>
         </w:tc>
@@ -7584,22 +7767,7 @@
                 <w:sz w:val="16"/>
                 <w:szCs w:val="16"/>
               </w:rPr>
-              <w:t xml:space="preserve">multipart </w:t>
-            </w:r>
-            <w:r>
-              <w:rPr>
-                <w:rFonts w:ascii="Consolas" w:cs="Consolas" w:eastAsia="Consolas" w:hAnsi="Consolas"/>
-                <w:sz w:val="16"/>
-                <w:szCs w:val="16"/>
-              </w:rPr>
-              <w:t xml:space="preserve">resume</w:t>
-            </w:r>
-            <w:r>
-              <w:rPr>
-                <w:sz w:val="16"/>
-                <w:szCs w:val="16"/>
-              </w:rPr>
-              <w:t xml:space="preserve"> → 200 {resume_url}; signed link → PDF</w:t>
+              <w:t xml:space="preserve">{headline,skills[],experience,location_psgc,...} → profile</w:t>
             </w:r>
           </w:p>
         </w:tc>
@@ -7659,7 +7827,7 @@
                 <w:sz w:val="16"/>
                 <w:szCs w:val="16"/>
               </w:rPr>
-              <w:t xml:space="preserve">GET</w:t>
+              <w:t xml:space="preserve">PUT</w:t>
             </w:r>
           </w:p>
         </w:tc>
@@ -7688,7 +7856,7 @@
                 <w:sz w:val="16"/>
                 <w:szCs w:val="16"/>
               </w:rPr>
-              <w:t xml:space="preserve">/api/job-postings</w:t>
+              <w:t xml:space="preserve">/api/candidate/accommodations</w:t>
             </w:r>
           </w:p>
         </w:tc>
@@ -7717,7 +7885,7 @@
                 <w:sz w:val="16"/>
                 <w:szCs w:val="16"/>
               </w:rPr>
-              <w:t xml:space="preserve">Search, filter and match postings</w:t>
+              <w:t xml:space="preserve">Replace list of accommodation needs</w:t>
             </w:r>
           </w:p>
         </w:tc>
@@ -7746,7 +7914,7 @@
                 <w:sz w:val="16"/>
                 <w:szCs w:val="16"/>
               </w:rPr>
-              <w:t xml:space="preserve">?q=&amp;category=&amp;accommodations[]=&amp;match=1&amp;sort=&amp;page= → {data:[posting+match], meta}</w:t>
+              <w:t xml:space="preserve">{accommodation_ids:[1,4,9]} → 200 needs[]</w:t>
             </w:r>
           </w:p>
         </w:tc>
@@ -7806,7 +7974,7 @@
                 <w:sz w:val="16"/>
                 <w:szCs w:val="16"/>
               </w:rPr>
-              <w:t xml:space="preserve">GET</w:t>
+              <w:t xml:space="preserve">POST, GET</w:t>
             </w:r>
           </w:p>
         </w:tc>
@@ -7835,7 +8003,7 @@
                 <w:sz w:val="16"/>
                 <w:szCs w:val="16"/>
               </w:rPr>
-              <w:t xml:space="preserve">/api/job-postings/{id}</w:t>
+              <w:t xml:space="preserve">/api/candidate/resume, /api/resumes/{id}</w:t>
             </w:r>
           </w:p>
         </w:tc>
@@ -7864,7 +8032,7 @@
                 <w:sz w:val="16"/>
                 <w:szCs w:val="16"/>
               </w:rPr>
-              <w:t xml:space="preserve">Posting details with match result and trust score</w:t>
+              <w:t xml:space="preserve">Upload PDF résumé (max 5 MB); open it from a 30-minute signed link</w:t>
             </w:r>
           </w:p>
         </w:tc>
@@ -7893,7 +8061,22 @@
                 <w:sz w:val="16"/>
                 <w:szCs w:val="16"/>
               </w:rPr>
-              <w:t xml:space="preserve">→ posting (Section 4.2)</w:t>
+              <w:t xml:space="preserve">multipart </w:t>
+            </w:r>
+            <w:r>
+              <w:rPr>
+                <w:rFonts w:ascii="Consolas" w:cs="Consolas" w:eastAsia="Consolas" w:hAnsi="Consolas"/>
+                <w:sz w:val="16"/>
+                <w:szCs w:val="16"/>
+              </w:rPr>
+              <w:t xml:space="preserve">resume</w:t>
+            </w:r>
+            <w:r>
+              <w:rPr>
+                <w:sz w:val="16"/>
+                <w:szCs w:val="16"/>
+              </w:rPr>
+              <w:t xml:space="preserve"> → 200 {resume_url}; signed link → PDF</w:t>
             </w:r>
           </w:p>
         </w:tc>
@@ -7953,7 +8136,7 @@
                 <w:sz w:val="16"/>
                 <w:szCs w:val="16"/>
               </w:rPr>
-              <w:t xml:space="preserve">POST</w:t>
+              <w:t xml:space="preserve">GET</w:t>
             </w:r>
           </w:p>
         </w:tc>
@@ -8011,7 +8194,7 @@
                 <w:sz w:val="16"/>
                 <w:szCs w:val="16"/>
               </w:rPr>
-              <w:t xml:space="preserve">Create posting (draft or submit)</w:t>
+              <w:t xml:space="preserve">Search, filter and match postings</w:t>
             </w:r>
           </w:p>
         </w:tc>
@@ -8040,7 +8223,7 @@
                 <w:sz w:val="16"/>
                 <w:szCs w:val="16"/>
               </w:rPr>
-              <w:t xml:space="preserve">{title,description,category_id,...,accommodations:[{id,note}]} → 201</w:t>
+              <w:t xml:space="preserve">?q=&amp;category=&amp;accommodations[]=&amp;match=1&amp;sort=&amp;page= → {data:[posting+match+saved], meta}</w:t>
             </w:r>
           </w:p>
         </w:tc>
@@ -8100,7 +8283,7 @@
                 <w:sz w:val="16"/>
                 <w:szCs w:val="16"/>
               </w:rPr>
-              <w:t xml:space="preserve">PUT, DELETE</w:t>
+              <w:t xml:space="preserve">GET</w:t>
             </w:r>
           </w:p>
         </w:tc>
@@ -8158,7 +8341,7 @@
                 <w:sz w:val="16"/>
                 <w:szCs w:val="16"/>
               </w:rPr>
-              <w:t xml:space="preserve">Update or soft-delete own posting</w:t>
+              <w:t xml:space="preserve">Posting details with match result and trust score</w:t>
             </w:r>
           </w:p>
         </w:tc>
@@ -8187,7 +8370,7 @@
                 <w:sz w:val="16"/>
                 <w:szCs w:val="16"/>
               </w:rPr>
-              <w:t xml:space="preserve">→ 200 / 204</w:t>
+              <w:t xml:space="preserve">→ posting (Section 4.2)</w:t>
             </w:r>
           </w:p>
         </w:tc>
@@ -8276,7 +8459,7 @@
                 <w:sz w:val="16"/>
                 <w:szCs w:val="16"/>
               </w:rPr>
-              <w:t xml:space="preserve">/api/job-postings/{id}/applications</w:t>
+              <w:t xml:space="preserve">/api/job-postings</w:t>
             </w:r>
           </w:p>
         </w:tc>
@@ -8305,7 +8488,7 @@
                 <w:sz w:val="16"/>
                 <w:szCs w:val="16"/>
               </w:rPr>
-              <w:t xml:space="preserve">Apply</w:t>
+              <w:t xml:space="preserve">Create posting (draft or submit)</w:t>
             </w:r>
           </w:p>
         </w:tc>
@@ -8334,7 +8517,7 @@
                 <w:sz w:val="16"/>
                 <w:szCs w:val="16"/>
               </w:rPr>
-              <w:t xml:space="preserve">{cover_note, interview_request} → 201 application</w:t>
+              <w:t xml:space="preserve">{title,description,category_id,...,accommodations:[{id,note}]} → 201</w:t>
             </w:r>
           </w:p>
         </w:tc>
@@ -8394,7 +8577,7 @@
                 <w:sz w:val="16"/>
                 <w:szCs w:val="16"/>
               </w:rPr>
-              <w:t xml:space="preserve">GET</w:t>
+              <w:t xml:space="preserve">PUT, DELETE</w:t>
             </w:r>
           </w:p>
         </w:tc>
@@ -8423,7 +8606,7 @@
                 <w:sz w:val="16"/>
                 <w:szCs w:val="16"/>
               </w:rPr>
-              <w:t xml:space="preserve">/api/applications</w:t>
+              <w:t xml:space="preserve">/api/job-postings/{id}</w:t>
             </w:r>
           </w:p>
         </w:tc>
@@ -8452,7 +8635,7 @@
                 <w:sz w:val="16"/>
                 <w:szCs w:val="16"/>
               </w:rPr>
-              <w:t xml:space="preserve">Own applications (candidate) or applicants (employer)</w:t>
+              <w:t xml:space="preserve">Update or soft-delete own posting</w:t>
             </w:r>
           </w:p>
         </w:tc>
@@ -8481,7 +8664,7 @@
                 <w:sz w:val="16"/>
                 <w:szCs w:val="16"/>
               </w:rPr>
-              <w:t xml:space="preserve">?status= → {data:[application]}</w:t>
+              <w:t xml:space="preserve">→ 200 / 204</w:t>
             </w:r>
           </w:p>
         </w:tc>
@@ -8541,6 +8724,300 @@
                 <w:sz w:val="16"/>
                 <w:szCs w:val="16"/>
               </w:rPr>
+              <w:t xml:space="preserve">POST</w:t>
+            </w:r>
+          </w:p>
+        </w:tc>
+        <w:tc>
+          <w:tcPr>
+            <w:tcW w:type="dxa" w:w="2700"/>
+            <w:tcBorders>
+              <w:top w:val="single" w:color="7F7F7F" w:sz="4"/>
+              <w:left w:val="single" w:color="7F7F7F" w:sz="4"/>
+              <w:bottom w:val="single" w:color="7F7F7F" w:sz="4"/>
+              <w:right w:val="single" w:color="7F7F7F" w:sz="4"/>
+            </w:tcBorders>
+            <w:tcMar>
+              <w:top w:type="dxa" w:w="60"/>
+              <w:left w:type="dxa" w:w="100"/>
+              <w:bottom w:type="dxa" w:w="60"/>
+              <w:right w:type="dxa" w:w="100"/>
+            </w:tcMar>
+          </w:tcPr>
+          <w:p>
+            <w:pPr>
+              <w:spacing w:after="20"/>
+            </w:pPr>
+            <w:r>
+              <w:rPr>
+                <w:sz w:val="16"/>
+                <w:szCs w:val="16"/>
+              </w:rPr>
+              <w:t xml:space="preserve">/api/job-postings/{id}/applications</w:t>
+            </w:r>
+          </w:p>
+        </w:tc>
+        <w:tc>
+          <w:tcPr>
+            <w:tcW w:type="dxa" w:w="2280"/>
+            <w:tcBorders>
+              <w:top w:val="single" w:color="7F7F7F" w:sz="4"/>
+              <w:left w:val="single" w:color="7F7F7F" w:sz="4"/>
+              <w:bottom w:val="single" w:color="7F7F7F" w:sz="4"/>
+              <w:right w:val="single" w:color="7F7F7F" w:sz="4"/>
+            </w:tcBorders>
+            <w:tcMar>
+              <w:top w:type="dxa" w:w="60"/>
+              <w:left w:type="dxa" w:w="100"/>
+              <w:bottom w:type="dxa" w:w="60"/>
+              <w:right w:type="dxa" w:w="100"/>
+            </w:tcMar>
+          </w:tcPr>
+          <w:p>
+            <w:pPr>
+              <w:spacing w:after="20"/>
+            </w:pPr>
+            <w:r>
+              <w:rPr>
+                <w:sz w:val="16"/>
+                <w:szCs w:val="16"/>
+              </w:rPr>
+              <w:t xml:space="preserve">Apply</w:t>
+            </w:r>
+          </w:p>
+        </w:tc>
+        <w:tc>
+          <w:tcPr>
+            <w:tcW w:type="dxa" w:w="2900"/>
+            <w:tcBorders>
+              <w:top w:val="single" w:color="7F7F7F" w:sz="4"/>
+              <w:left w:val="single" w:color="7F7F7F" w:sz="4"/>
+              <w:bottom w:val="single" w:color="7F7F7F" w:sz="4"/>
+              <w:right w:val="single" w:color="7F7F7F" w:sz="4"/>
+            </w:tcBorders>
+            <w:tcMar>
+              <w:top w:type="dxa" w:w="60"/>
+              <w:left w:type="dxa" w:w="100"/>
+              <w:bottom w:type="dxa" w:w="60"/>
+              <w:right w:type="dxa" w:w="100"/>
+            </w:tcMar>
+          </w:tcPr>
+          <w:p>
+            <w:pPr>
+              <w:spacing w:after="20"/>
+            </w:pPr>
+            <w:r>
+              <w:rPr>
+                <w:sz w:val="16"/>
+                <w:szCs w:val="16"/>
+              </w:rPr>
+              <w:t xml:space="preserve">{cover_note, interview_request} → 201 application</w:t>
+            </w:r>
+          </w:p>
+        </w:tc>
+      </w:tr>
+      <w:tr>
+        <w:tc>
+          <w:tcPr>
+            <w:tcW w:type="dxa" w:w="1250"/>
+            <w:tcBorders>
+              <w:top w:val="single" w:color="7F7F7F" w:sz="4"/>
+              <w:left w:val="single" w:color="7F7F7F" w:sz="4"/>
+              <w:bottom w:val="single" w:color="7F7F7F" w:sz="4"/>
+              <w:right w:val="single" w:color="7F7F7F" w:sz="4"/>
+            </w:tcBorders>
+            <w:tcMar>
+              <w:top w:type="dxa" w:w="60"/>
+              <w:left w:type="dxa" w:w="100"/>
+              <w:bottom w:type="dxa" w:w="60"/>
+              <w:right w:type="dxa" w:w="100"/>
+            </w:tcMar>
+          </w:tcPr>
+          <w:p>
+            <w:pPr>
+              <w:spacing w:after="20"/>
+            </w:pPr>
+            <w:r>
+              <w:rPr>
+                <w:sz w:val="16"/>
+                <w:szCs w:val="16"/>
+              </w:rPr>
+              <w:t xml:space="preserve">Core</w:t>
+            </w:r>
+          </w:p>
+        </w:tc>
+        <w:tc>
+          <w:tcPr>
+            <w:tcW w:type="dxa" w:w="950"/>
+            <w:tcBorders>
+              <w:top w:val="single" w:color="7F7F7F" w:sz="4"/>
+              <w:left w:val="single" w:color="7F7F7F" w:sz="4"/>
+              <w:bottom w:val="single" w:color="7F7F7F" w:sz="4"/>
+              <w:right w:val="single" w:color="7F7F7F" w:sz="4"/>
+            </w:tcBorders>
+            <w:tcMar>
+              <w:top w:type="dxa" w:w="60"/>
+              <w:left w:type="dxa" w:w="100"/>
+              <w:bottom w:type="dxa" w:w="60"/>
+              <w:right w:type="dxa" w:w="100"/>
+            </w:tcMar>
+          </w:tcPr>
+          <w:p>
+            <w:pPr>
+              <w:spacing w:after="20"/>
+            </w:pPr>
+            <w:r>
+              <w:rPr>
+                <w:sz w:val="16"/>
+                <w:szCs w:val="16"/>
+              </w:rPr>
+              <w:t xml:space="preserve">GET</w:t>
+            </w:r>
+          </w:p>
+        </w:tc>
+        <w:tc>
+          <w:tcPr>
+            <w:tcW w:type="dxa" w:w="2700"/>
+            <w:tcBorders>
+              <w:top w:val="single" w:color="7F7F7F" w:sz="4"/>
+              <w:left w:val="single" w:color="7F7F7F" w:sz="4"/>
+              <w:bottom w:val="single" w:color="7F7F7F" w:sz="4"/>
+              <w:right w:val="single" w:color="7F7F7F" w:sz="4"/>
+            </w:tcBorders>
+            <w:tcMar>
+              <w:top w:type="dxa" w:w="60"/>
+              <w:left w:type="dxa" w:w="100"/>
+              <w:bottom w:type="dxa" w:w="60"/>
+              <w:right w:type="dxa" w:w="100"/>
+            </w:tcMar>
+          </w:tcPr>
+          <w:p>
+            <w:pPr>
+              <w:spacing w:after="20"/>
+            </w:pPr>
+            <w:r>
+              <w:rPr>
+                <w:sz w:val="16"/>
+                <w:szCs w:val="16"/>
+              </w:rPr>
+              <w:t xml:space="preserve">/api/applications</w:t>
+            </w:r>
+          </w:p>
+        </w:tc>
+        <w:tc>
+          <w:tcPr>
+            <w:tcW w:type="dxa" w:w="2280"/>
+            <w:tcBorders>
+              <w:top w:val="single" w:color="7F7F7F" w:sz="4"/>
+              <w:left w:val="single" w:color="7F7F7F" w:sz="4"/>
+              <w:bottom w:val="single" w:color="7F7F7F" w:sz="4"/>
+              <w:right w:val="single" w:color="7F7F7F" w:sz="4"/>
+            </w:tcBorders>
+            <w:tcMar>
+              <w:top w:type="dxa" w:w="60"/>
+              <w:left w:type="dxa" w:w="100"/>
+              <w:bottom w:type="dxa" w:w="60"/>
+              <w:right w:type="dxa" w:w="100"/>
+            </w:tcMar>
+          </w:tcPr>
+          <w:p>
+            <w:pPr>
+              <w:spacing w:after="20"/>
+            </w:pPr>
+            <w:r>
+              <w:rPr>
+                <w:sz w:val="16"/>
+                <w:szCs w:val="16"/>
+              </w:rPr>
+              <w:t xml:space="preserve">Own applications (candidate) or applicants (employer)</w:t>
+            </w:r>
+          </w:p>
+        </w:tc>
+        <w:tc>
+          <w:tcPr>
+            <w:tcW w:type="dxa" w:w="2900"/>
+            <w:tcBorders>
+              <w:top w:val="single" w:color="7F7F7F" w:sz="4"/>
+              <w:left w:val="single" w:color="7F7F7F" w:sz="4"/>
+              <w:bottom w:val="single" w:color="7F7F7F" w:sz="4"/>
+              <w:right w:val="single" w:color="7F7F7F" w:sz="4"/>
+            </w:tcBorders>
+            <w:tcMar>
+              <w:top w:type="dxa" w:w="60"/>
+              <w:left w:type="dxa" w:w="100"/>
+              <w:bottom w:type="dxa" w:w="60"/>
+              <w:right w:type="dxa" w:w="100"/>
+            </w:tcMar>
+          </w:tcPr>
+          <w:p>
+            <w:pPr>
+              <w:spacing w:after="20"/>
+            </w:pPr>
+            <w:r>
+              <w:rPr>
+                <w:sz w:val="16"/>
+                <w:szCs w:val="16"/>
+              </w:rPr>
+              <w:t xml:space="preserve">?status= → {data:[application]}</w:t>
+            </w:r>
+          </w:p>
+        </w:tc>
+      </w:tr>
+      <w:tr>
+        <w:tc>
+          <w:tcPr>
+            <w:tcW w:type="dxa" w:w="1250"/>
+            <w:tcBorders>
+              <w:top w:val="single" w:color="7F7F7F" w:sz="4"/>
+              <w:left w:val="single" w:color="7F7F7F" w:sz="4"/>
+              <w:bottom w:val="single" w:color="7F7F7F" w:sz="4"/>
+              <w:right w:val="single" w:color="7F7F7F" w:sz="4"/>
+            </w:tcBorders>
+            <w:tcMar>
+              <w:top w:type="dxa" w:w="60"/>
+              <w:left w:type="dxa" w:w="100"/>
+              <w:bottom w:type="dxa" w:w="60"/>
+              <w:right w:type="dxa" w:w="100"/>
+            </w:tcMar>
+          </w:tcPr>
+          <w:p>
+            <w:pPr>
+              <w:spacing w:after="20"/>
+            </w:pPr>
+            <w:r>
+              <w:rPr>
+                <w:sz w:val="16"/>
+                <w:szCs w:val="16"/>
+              </w:rPr>
+              <w:t xml:space="preserve">Core</w:t>
+            </w:r>
+          </w:p>
+        </w:tc>
+        <w:tc>
+          <w:tcPr>
+            <w:tcW w:type="dxa" w:w="950"/>
+            <w:tcBorders>
+              <w:top w:val="single" w:color="7F7F7F" w:sz="4"/>
+              <w:left w:val="single" w:color="7F7F7F" w:sz="4"/>
+              <w:bottom w:val="single" w:color="7F7F7F" w:sz="4"/>
+              <w:right w:val="single" w:color="7F7F7F" w:sz="4"/>
+            </w:tcBorders>
+            <w:tcMar>
+              <w:top w:type="dxa" w:w="60"/>
+              <w:left w:type="dxa" w:w="100"/>
+              <w:bottom w:type="dxa" w:w="60"/>
+              <w:right w:type="dxa" w:w="100"/>
+            </w:tcMar>
+          </w:tcPr>
+          <w:p>
+            <w:pPr>
+              <w:spacing w:after="20"/>
+            </w:pPr>
+            <w:r>
+              <w:rPr>
+                <w:sz w:val="16"/>
+                <w:szCs w:val="16"/>
+              </w:rPr>
               <w:t xml:space="preserve">PATCH</w:t>
             </w:r>
           </w:p>
@@ -8628,7 +9105,37 @@
                 <w:sz w:val="16"/>
                 <w:szCs w:val="16"/>
               </w:rPr>
-              <w:t xml:space="preserve">{status:'reviewed'|'hired'|'rejected'|'withdrawn'} → 200</w:t>
+              <w:t xml:space="preserve">{status:'reviewed'|'hired'|'rejected'|'withdrawn'} → 200 (dates </w:t>
+            </w:r>
+            <w:r>
+              <w:rPr>
+                <w:rFonts w:ascii="Consolas" w:cs="Consolas" w:eastAsia="Consolas" w:hAnsi="Consolas"/>
+                <w:sz w:val="16"/>
+                <w:szCs w:val="16"/>
+              </w:rPr>
+              <w:t xml:space="preserve">reviewed_at</w:t>
+            </w:r>
+            <w:r>
+              <w:rPr>
+                <w:sz w:val="16"/>
+                <w:szCs w:val="16"/>
+              </w:rPr>
+              <w:t xml:space="preserve">, </w:t>
+            </w:r>
+            <w:r>
+              <w:rPr>
+                <w:rFonts w:ascii="Consolas" w:cs="Consolas" w:eastAsia="Consolas" w:hAnsi="Consolas"/>
+                <w:sz w:val="16"/>
+                <w:szCs w:val="16"/>
+              </w:rPr>
+              <w:t xml:space="preserve">hired_at</w:t>
+            </w:r>
+            <w:r>
+              <w:rPr>
+                <w:sz w:val="16"/>
+                <w:szCs w:val="16"/>
+              </w:rPr>
+              <w:t xml:space="preserve"> for the timeline)</w:t>
             </w:r>
           </w:p>
         </w:tc>
@@ -11317,6 +11824,19 @@
                 <w:sz w:val="16"/>
                 <w:szCs w:val="16"/>
               </w:rPr>
+              <w:t xml:space="preserve">      "saved": false,</w:t>
+            </w:r>
+          </w:p>
+          <w:p>
+            <w:pPr>
+              <w:spacing w:after="0" w:line="240"/>
+            </w:pPr>
+            <w:r>
+              <w:rPr>
+                <w:rFonts w:ascii="Consolas" w:cs="Consolas" w:eastAsia="Consolas" w:hAnsi="Consolas"/>
+                <w:sz w:val="16"/>
+                <w:szCs w:val="16"/>
+              </w:rPr>
               <w:t xml:space="preserve">      "trust_score": { "published": true, "score": 86, "based_on": 5 }</w:t>
             </w:r>
           </w:p>
@@ -11413,6 +11933,15 @@
       </w:r>
       <w:r>
         <w:t xml:space="preserve"> names the unmet accommodation; </w:t>
+      </w:r>
+      <w:r>
+        <w:rPr>
+          <w:rFonts w:ascii="Consolas" w:cs="Consolas" w:eastAsia="Consolas" w:hAnsi="Consolas"/>
+        </w:rPr>
+        <w:t xml:space="preserve">saved</w:t>
+      </w:r>
+      <w:r>
+        <w:t xml:space="preserve"> (logged-in candidates only) drives the Save button on each result; </w:t>
       </w:r>
       <w:r>
         <w:rPr>
@@ -32942,7 +33471,7 @@
                 <w:sz w:val="15"/>
                 <w:szCs w:val="15"/>
               </w:rPr>
-              <w:t xml:space="preserve">M2 Profile</w:t>
+              <w:t xml:space="preserve">M1 Auth</w:t>
             </w:r>
           </w:p>
         </w:tc>
@@ -32971,7 +33500,7 @@
                 <w:sz w:val="15"/>
                 <w:szCs w:val="15"/>
               </w:rPr>
-              <w:t xml:space="preserve">GET, PUT</w:t>
+              <w:t xml:space="preserve">POST</w:t>
             </w:r>
           </w:p>
         </w:tc>
@@ -33000,7 +33529,7 @@
                 <w:sz w:val="15"/>
                 <w:szCs w:val="15"/>
               </w:rPr>
-              <w:t xml:space="preserve">/candidate/profile</w:t>
+              <w:t xml:space="preserve">/forgot-password, /reset-password</w:t>
             </w:r>
           </w:p>
         </w:tc>
@@ -33029,7 +33558,7 @@
                 <w:sz w:val="15"/>
                 <w:szCs w:val="15"/>
               </w:rPr>
-              <w:t xml:space="preserve">C</w:t>
+              <w:t xml:space="preserve">P</w:t>
             </w:r>
           </w:p>
         </w:tc>
@@ -33058,7 +33587,7 @@
                 <w:sz w:val="15"/>
                 <w:szCs w:val="15"/>
               </w:rPr>
-              <w:t xml:space="preserve">Own profile</w:t>
+              <w:t xml:space="preserve">Email a reset link (same answer for every email, 5/min); new password with the link (valid 60 min; signs out everywhere)</w:t>
             </w:r>
           </w:p>
         </w:tc>
@@ -33118,7 +33647,7 @@
                 <w:sz w:val="15"/>
                 <w:szCs w:val="15"/>
               </w:rPr>
-              <w:t xml:space="preserve">PUT</w:t>
+              <w:t xml:space="preserve">GET, PUT</w:t>
             </w:r>
           </w:p>
         </w:tc>
@@ -33147,7 +33676,7 @@
                 <w:sz w:val="15"/>
                 <w:szCs w:val="15"/>
               </w:rPr>
-              <w:t xml:space="preserve">/candidate/accommodations</w:t>
+              <w:t xml:space="preserve">/candidate/profile</w:t>
             </w:r>
           </w:p>
         </w:tc>
@@ -33205,7 +33734,7 @@
                 <w:sz w:val="15"/>
                 <w:szCs w:val="15"/>
               </w:rPr>
-              <w:t xml:space="preserve">Replace needs</w:t>
+              <w:t xml:space="preserve">Own profile</w:t>
             </w:r>
           </w:p>
         </w:tc>
@@ -33265,7 +33794,7 @@
                 <w:sz w:val="15"/>
                 <w:szCs w:val="15"/>
               </w:rPr>
-              <w:t xml:space="preserve">POST</w:t>
+              <w:t xml:space="preserve">PUT</w:t>
             </w:r>
           </w:p>
         </w:tc>
@@ -33294,7 +33823,7 @@
                 <w:sz w:val="15"/>
                 <w:szCs w:val="15"/>
               </w:rPr>
-              <w:t xml:space="preserve">/candidate/resume</w:t>
+              <w:t xml:space="preserve">/candidate/accommodations</w:t>
             </w:r>
           </w:p>
         </w:tc>
@@ -33352,7 +33881,7 @@
                 <w:sz w:val="15"/>
                 <w:szCs w:val="15"/>
               </w:rPr>
-              <w:t xml:space="preserve">Upload PDF résumé (max 5 MB)</w:t>
+              <w:t xml:space="preserve">Replace needs</w:t>
             </w:r>
           </w:p>
         </w:tc>
@@ -33412,7 +33941,7 @@
                 <w:sz w:val="15"/>
                 <w:szCs w:val="15"/>
               </w:rPr>
-              <w:t xml:space="preserve">GET</w:t>
+              <w:t xml:space="preserve">POST</w:t>
             </w:r>
           </w:p>
         </w:tc>
@@ -33441,7 +33970,7 @@
                 <w:sz w:val="15"/>
                 <w:szCs w:val="15"/>
               </w:rPr>
-              <w:t xml:space="preserve">/resumes/{id}?expires=&amp;signature=</w:t>
+              <w:t xml:space="preserve">/candidate/resume</w:t>
             </w:r>
           </w:p>
         </w:tc>
@@ -33470,7 +33999,7 @@
                 <w:sz w:val="15"/>
                 <w:szCs w:val="15"/>
               </w:rPr>
-              <w:t xml:space="preserve">P (signed link)</w:t>
+              <w:t xml:space="preserve">C</w:t>
             </w:r>
           </w:p>
         </w:tc>
@@ -33499,7 +34028,7 @@
                 <w:sz w:val="15"/>
                 <w:szCs w:val="15"/>
               </w:rPr>
-              <w:t xml:space="preserve">Open résumé PDF (link valid 30 min)</w:t>
+              <w:t xml:space="preserve">Upload PDF résumé (max 5 MB)</w:t>
             </w:r>
           </w:p>
         </w:tc>
@@ -33530,7 +34059,7 @@
                 <w:sz w:val="15"/>
                 <w:szCs w:val="15"/>
               </w:rPr>
-              <w:t xml:space="preserve">M3 Company</w:t>
+              <w:t xml:space="preserve">M2 Profile</w:t>
             </w:r>
           </w:p>
         </w:tc>
@@ -33559,7 +34088,7 @@
                 <w:sz w:val="15"/>
                 <w:szCs w:val="15"/>
               </w:rPr>
-              <w:t xml:space="preserve">GET, PUT</w:t>
+              <w:t xml:space="preserve">GET</w:t>
             </w:r>
           </w:p>
         </w:tc>
@@ -33588,7 +34117,7 @@
                 <w:sz w:val="15"/>
                 <w:szCs w:val="15"/>
               </w:rPr>
-              <w:t xml:space="preserve">/employer/company</w:t>
+              <w:t xml:space="preserve">/resumes/{id}?expires=&amp;signature=</w:t>
             </w:r>
           </w:p>
         </w:tc>
@@ -33617,7 +34146,7 @@
                 <w:sz w:val="15"/>
                 <w:szCs w:val="15"/>
               </w:rPr>
-              <w:t xml:space="preserve">E</w:t>
+              <w:t xml:space="preserve">P (signed link)</w:t>
             </w:r>
           </w:p>
         </w:tc>
@@ -33646,7 +34175,7 @@
                 <w:sz w:val="15"/>
                 <w:szCs w:val="15"/>
               </w:rPr>
-              <w:t xml:space="preserve">Own company profile</w:t>
+              <w:t xml:space="preserve">Open résumé PDF (link valid 30 min)</w:t>
             </w:r>
           </w:p>
         </w:tc>
@@ -33706,7 +34235,7 @@
                 <w:sz w:val="15"/>
                 <w:szCs w:val="15"/>
               </w:rPr>
-              <w:t xml:space="preserve">GET</w:t>
+              <w:t xml:space="preserve">GET, PUT</w:t>
             </w:r>
           </w:p>
         </w:tc>
@@ -33735,7 +34264,7 @@
                 <w:sz w:val="15"/>
                 <w:szCs w:val="15"/>
               </w:rPr>
-              <w:t xml:space="preserve">/employers/{id}</w:t>
+              <w:t xml:space="preserve">/employer/company</w:t>
             </w:r>
           </w:p>
         </w:tc>
@@ -33764,7 +34293,7 @@
                 <w:sz w:val="15"/>
                 <w:szCs w:val="15"/>
               </w:rPr>
-              <w:t xml:space="preserve">P</w:t>
+              <w:t xml:space="preserve">E</w:t>
             </w:r>
           </w:p>
         </w:tc>
@@ -33793,7 +34322,7 @@
                 <w:sz w:val="15"/>
                 <w:szCs w:val="15"/>
               </w:rPr>
-              <w:t xml:space="preserve">Public employer page</w:t>
+              <w:t xml:space="preserve">Own company profile</w:t>
             </w:r>
           </w:p>
         </w:tc>
@@ -33882,7 +34411,7 @@
                 <w:sz w:val="15"/>
                 <w:szCs w:val="15"/>
               </w:rPr>
-              <w:t xml:space="preserve">/employers/{id}/logo</w:t>
+              <w:t xml:space="preserve">/employers/{id}</w:t>
             </w:r>
           </w:p>
         </w:tc>
@@ -33940,7 +34469,7 @@
                 <w:sz w:val="15"/>
                 <w:szCs w:val="15"/>
               </w:rPr>
-              <w:t xml:space="preserve">Company logo (PNG/JPG/WebP, max 2 MB)</w:t>
+              <w:t xml:space="preserve">Public employer page</w:t>
             </w:r>
           </w:p>
         </w:tc>
@@ -34029,7 +34558,7 @@
                 <w:sz w:val="15"/>
                 <w:szCs w:val="15"/>
               </w:rPr>
-              <w:t xml:space="preserve">/admin/employers, /admin/employers/{id}</w:t>
+              <w:t xml:space="preserve">/employers/{id}/logo</w:t>
             </w:r>
           </w:p>
         </w:tc>
@@ -34058,7 +34587,7 @@
                 <w:sz w:val="15"/>
                 <w:szCs w:val="15"/>
               </w:rPr>
-              <w:t xml:space="preserve">A</w:t>
+              <w:t xml:space="preserve">P</w:t>
             </w:r>
           </w:p>
         </w:tc>
@@ -34087,7 +34616,7 @@
                 <w:sz w:val="15"/>
                 <w:szCs w:val="15"/>
               </w:rPr>
-              <w:t xml:space="preserve">Verification queue / details with latest registry check</w:t>
+              <w:t xml:space="preserve">Company logo (PNG/JPG/WebP, max 2 MB)</w:t>
             </w:r>
           </w:p>
         </w:tc>
@@ -34147,7 +34676,7 @@
                 <w:sz w:val="15"/>
                 <w:szCs w:val="15"/>
               </w:rPr>
-              <w:t xml:space="preserve">PATCH</w:t>
+              <w:t xml:space="preserve">GET</w:t>
             </w:r>
           </w:p>
         </w:tc>
@@ -34176,7 +34705,7 @@
                 <w:sz w:val="15"/>
                 <w:szCs w:val="15"/>
               </w:rPr>
-              <w:t xml:space="preserve">/admin/employers/{id}/verify</w:t>
+              <w:t xml:space="preserve">/admin/employers, /admin/employers/{id}</w:t>
             </w:r>
           </w:p>
         </w:tc>
@@ -34234,7 +34763,7 @@
                 <w:sz w:val="15"/>
                 <w:szCs w:val="15"/>
               </w:rPr>
-              <w:t xml:space="preserve">check (SOAP) / approve / reject</w:t>
+              <w:t xml:space="preserve">Verification queue / details with latest registry check</w:t>
             </w:r>
           </w:p>
         </w:tc>
@@ -34265,7 +34794,7 @@
                 <w:sz w:val="15"/>
                 <w:szCs w:val="15"/>
               </w:rPr>
-              <w:t xml:space="preserve">M4 Postings</w:t>
+              <w:t xml:space="preserve">M3 Company</w:t>
             </w:r>
           </w:p>
         </w:tc>
@@ -34294,7 +34823,7 @@
                 <w:sz w:val="15"/>
                 <w:szCs w:val="15"/>
               </w:rPr>
-              <w:t xml:space="preserve">GET</w:t>
+              <w:t xml:space="preserve">PATCH</w:t>
             </w:r>
           </w:p>
         </w:tc>
@@ -34323,7 +34852,7 @@
                 <w:sz w:val="15"/>
                 <w:szCs w:val="15"/>
               </w:rPr>
-              <w:t xml:space="preserve">/employer/job-postings</w:t>
+              <w:t xml:space="preserve">/admin/employers/{id}/verify</w:t>
             </w:r>
           </w:p>
         </w:tc>
@@ -34352,7 +34881,7 @@
                 <w:sz w:val="15"/>
                 <w:szCs w:val="15"/>
               </w:rPr>
-              <w:t xml:space="preserve">E</w:t>
+              <w:t xml:space="preserve">A</w:t>
             </w:r>
           </w:p>
         </w:tc>
@@ -34381,7 +34910,7 @@
                 <w:sz w:val="15"/>
                 <w:szCs w:val="15"/>
               </w:rPr>
-              <w:t xml:space="preserve">Own postings</w:t>
+              <w:t xml:space="preserve">check (SOAP) / approve / reject</w:t>
             </w:r>
           </w:p>
         </w:tc>
@@ -34441,7 +34970,7 @@
                 <w:sz w:val="15"/>
                 <w:szCs w:val="15"/>
               </w:rPr>
-              <w:t xml:space="preserve">POST</w:t>
+              <w:t xml:space="preserve">GET</w:t>
             </w:r>
           </w:p>
         </w:tc>
@@ -34470,7 +34999,7 @@
                 <w:sz w:val="15"/>
                 <w:szCs w:val="15"/>
               </w:rPr>
-              <w:t xml:space="preserve">/job-postings</w:t>
+              <w:t xml:space="preserve">/employer/job-postings</w:t>
             </w:r>
           </w:p>
         </w:tc>
@@ -34528,7 +35057,7 @@
                 <w:sz w:val="15"/>
                 <w:szCs w:val="15"/>
               </w:rPr>
-              <w:t xml:space="preserve">Create</w:t>
+              <w:t xml:space="preserve">Own postings</w:t>
             </w:r>
           </w:p>
         </w:tc>
@@ -34588,7 +35117,7 @@
                 <w:sz w:val="15"/>
                 <w:szCs w:val="15"/>
               </w:rPr>
-              <w:t xml:space="preserve">PUT, DELETE</w:t>
+              <w:t xml:space="preserve">POST</w:t>
             </w:r>
           </w:p>
         </w:tc>
@@ -34617,7 +35146,7 @@
                 <w:sz w:val="15"/>
                 <w:szCs w:val="15"/>
               </w:rPr>
-              <w:t xml:space="preserve">/job-postings/{id}</w:t>
+              <w:t xml:space="preserve">/job-postings</w:t>
             </w:r>
           </w:p>
         </w:tc>
@@ -34646,7 +35175,7 @@
                 <w:sz w:val="15"/>
                 <w:szCs w:val="15"/>
               </w:rPr>
-              <w:t xml:space="preserve">E (owner)</w:t>
+              <w:t xml:space="preserve">E</w:t>
             </w:r>
           </w:p>
         </w:tc>
@@ -34675,7 +35204,7 @@
                 <w:sz w:val="15"/>
                 <w:szCs w:val="15"/>
               </w:rPr>
-              <w:t xml:space="preserve">Update / soft-delete</w:t>
+              <w:t xml:space="preserve">Create</w:t>
             </w:r>
           </w:p>
         </w:tc>
@@ -34735,7 +35264,7 @@
                 <w:sz w:val="15"/>
                 <w:szCs w:val="15"/>
               </w:rPr>
-              <w:t xml:space="preserve">PATCH</w:t>
+              <w:t xml:space="preserve">PUT, DELETE</w:t>
             </w:r>
           </w:p>
         </w:tc>
@@ -34764,7 +35293,7 @@
                 <w:sz w:val="15"/>
                 <w:szCs w:val="15"/>
               </w:rPr>
-              <w:t xml:space="preserve">/job-postings/{id}/status</w:t>
+              <w:t xml:space="preserve">/job-postings/{id}</w:t>
             </w:r>
           </w:p>
         </w:tc>
@@ -34822,7 +35351,7 @@
                 <w:sz w:val="15"/>
                 <w:szCs w:val="15"/>
               </w:rPr>
-              <w:t xml:space="preserve">Close / reopen</w:t>
+              <w:t xml:space="preserve">Update / soft-delete</w:t>
             </w:r>
           </w:p>
         </w:tc>
@@ -34882,7 +35411,7 @@
                 <w:sz w:val="15"/>
                 <w:szCs w:val="15"/>
               </w:rPr>
-              <w:t xml:space="preserve">GET</w:t>
+              <w:t xml:space="preserve">PATCH</w:t>
             </w:r>
           </w:p>
         </w:tc>
@@ -34911,7 +35440,7 @@
                 <w:sz w:val="15"/>
                 <w:szCs w:val="15"/>
               </w:rPr>
-              <w:t xml:space="preserve">/admin/job-postings</w:t>
+              <w:t xml:space="preserve">/job-postings/{id}/status</w:t>
             </w:r>
           </w:p>
         </w:tc>
@@ -34940,7 +35469,7 @@
                 <w:sz w:val="15"/>
                 <w:szCs w:val="15"/>
               </w:rPr>
-              <w:t xml:space="preserve">A</w:t>
+              <w:t xml:space="preserve">E (owner)</w:t>
             </w:r>
           </w:p>
         </w:tc>
@@ -34969,7 +35498,7 @@
                 <w:sz w:val="15"/>
                 <w:szCs w:val="15"/>
               </w:rPr>
-              <w:t xml:space="preserve">Approval queue</w:t>
+              <w:t xml:space="preserve">Close / reopen</w:t>
             </w:r>
           </w:p>
         </w:tc>
@@ -35029,7 +35558,7 @@
                 <w:sz w:val="15"/>
                 <w:szCs w:val="15"/>
               </w:rPr>
-              <w:t xml:space="preserve">PATCH</w:t>
+              <w:t xml:space="preserve">GET</w:t>
             </w:r>
           </w:p>
         </w:tc>
@@ -35058,7 +35587,7 @@
                 <w:sz w:val="15"/>
                 <w:szCs w:val="15"/>
               </w:rPr>
-              <w:t xml:space="preserve">/admin/job-postings/{id}/approve</w:t>
+              <w:t xml:space="preserve">/admin/job-postings</w:t>
             </w:r>
           </w:p>
         </w:tc>
@@ -35116,7 +35645,7 @@
                 <w:sz w:val="15"/>
                 <w:szCs w:val="15"/>
               </w:rPr>
-              <w:t xml:space="preserve">Approve / reject (with reason)</w:t>
+              <w:t xml:space="preserve">Approval queue</w:t>
             </w:r>
           </w:p>
         </w:tc>
@@ -35176,7 +35705,7 @@
                 <w:sz w:val="15"/>
                 <w:szCs w:val="15"/>
               </w:rPr>
-              <w:t xml:space="preserve">DELETE</w:t>
+              <w:t xml:space="preserve">PATCH</w:t>
             </w:r>
           </w:p>
         </w:tc>
@@ -35205,7 +35734,7 @@
                 <w:sz w:val="15"/>
                 <w:szCs w:val="15"/>
               </w:rPr>
-              <w:t xml:space="preserve">/admin/job-postings/{id}</w:t>
+              <w:t xml:space="preserve">/admin/job-postings/{id}/approve</w:t>
             </w:r>
           </w:p>
         </w:tc>
@@ -35263,7 +35792,7 @@
                 <w:sz w:val="15"/>
                 <w:szCs w:val="15"/>
               </w:rPr>
-              <w:t xml:space="preserve">Remove any posting with a reason (soft delete; employer notified)</w:t>
+              <w:t xml:space="preserve">Approve / reject (with reason)</w:t>
             </w:r>
           </w:p>
         </w:tc>
@@ -35294,7 +35823,7 @@
                 <w:sz w:val="15"/>
                 <w:szCs w:val="15"/>
               </w:rPr>
-              <w:t xml:space="preserve">M5 Search</w:t>
+              <w:t xml:space="preserve">M4 Postings</w:t>
             </w:r>
           </w:p>
         </w:tc>
@@ -35323,7 +35852,7 @@
                 <w:sz w:val="15"/>
                 <w:szCs w:val="15"/>
               </w:rPr>
-              <w:t xml:space="preserve">GET</w:t>
+              <w:t xml:space="preserve">DELETE</w:t>
             </w:r>
           </w:p>
         </w:tc>
@@ -35352,7 +35881,7 @@
                 <w:sz w:val="15"/>
                 <w:szCs w:val="15"/>
               </w:rPr>
-              <w:t xml:space="preserve">/job-postings?q=&amp;category=&amp;accommodations[]=&amp;match=1&amp;sort=&amp;page=</w:t>
+              <w:t xml:space="preserve">/admin/job-postings/{id}</w:t>
             </w:r>
           </w:p>
         </w:tc>
@@ -35381,7 +35910,7 @@
                 <w:sz w:val="15"/>
                 <w:szCs w:val="15"/>
               </w:rPr>
-              <w:t xml:space="preserve">P (match: C)</w:t>
+              <w:t xml:space="preserve">A</w:t>
             </w:r>
           </w:p>
         </w:tc>
@@ -35410,7 +35939,7 @@
                 <w:sz w:val="15"/>
                 <w:szCs w:val="15"/>
               </w:rPr>
-              <w:t xml:space="preserve">Search, filter, match</w:t>
+              <w:t xml:space="preserve">Remove any posting with a reason (soft delete; employer notified)</w:t>
             </w:r>
           </w:p>
         </w:tc>
@@ -35499,7 +36028,7 @@
                 <w:sz w:val="15"/>
                 <w:szCs w:val="15"/>
               </w:rPr>
-              <w:t xml:space="preserve">/job-postings/{id}</w:t>
+              <w:t xml:space="preserve">/job-postings?q=&amp;category=&amp;accommodations[]=&amp;match=1&amp;sort=&amp;page=</w:t>
             </w:r>
           </w:p>
         </w:tc>
@@ -35528,7 +36057,7 @@
                 <w:sz w:val="15"/>
                 <w:szCs w:val="15"/>
               </w:rPr>
-              <w:t xml:space="preserve">P</w:t>
+              <w:t xml:space="preserve">P (match, saved: C)</w:t>
             </w:r>
           </w:p>
         </w:tc>
@@ -35557,7 +36086,7 @@
                 <w:sz w:val="15"/>
                 <w:szCs w:val="15"/>
               </w:rPr>
-              <w:t xml:space="preserve">Details (+ match for C)</w:t>
+              <w:t xml:space="preserve">Search, filter, match</w:t>
             </w:r>
           </w:p>
         </w:tc>
@@ -35588,7 +36117,7 @@
                 <w:sz w:val="15"/>
                 <w:szCs w:val="15"/>
               </w:rPr>
-              <w:t xml:space="preserve">M5/M11</w:t>
+              <w:t xml:space="preserve">M5 Search</w:t>
             </w:r>
           </w:p>
         </w:tc>
@@ -35646,7 +36175,7 @@
                 <w:sz w:val="15"/>
                 <w:szCs w:val="15"/>
               </w:rPr>
-              <w:t xml:space="preserve">/categories, /accommodations</w:t>
+              <w:t xml:space="preserve">/job-postings/{id}</w:t>
             </w:r>
           </w:p>
         </w:tc>
@@ -35704,7 +36233,7 @@
                 <w:sz w:val="15"/>
                 <w:szCs w:val="15"/>
               </w:rPr>
-              <w:t xml:space="preserve">Filter options</w:t>
+              <w:t xml:space="preserve">Details (+ match, saved and own application for C)</w:t>
             </w:r>
           </w:p>
         </w:tc>
@@ -35735,7 +36264,7 @@
                 <w:sz w:val="15"/>
                 <w:szCs w:val="15"/>
               </w:rPr>
-              <w:t xml:space="preserve">M6 Applications</w:t>
+              <w:t xml:space="preserve">M5/M11</w:t>
             </w:r>
           </w:p>
         </w:tc>
@@ -35764,7 +36293,7 @@
                 <w:sz w:val="15"/>
                 <w:szCs w:val="15"/>
               </w:rPr>
-              <w:t xml:space="preserve">POST</w:t>
+              <w:t xml:space="preserve">GET</w:t>
             </w:r>
           </w:p>
         </w:tc>
@@ -35793,7 +36322,7 @@
                 <w:sz w:val="15"/>
                 <w:szCs w:val="15"/>
               </w:rPr>
-              <w:t xml:space="preserve">/job-postings/{id}/applications</w:t>
+              <w:t xml:space="preserve">/categories, /accommodations</w:t>
             </w:r>
           </w:p>
         </w:tc>
@@ -35822,7 +36351,7 @@
                 <w:sz w:val="15"/>
                 <w:szCs w:val="15"/>
               </w:rPr>
-              <w:t xml:space="preserve">C</w:t>
+              <w:t xml:space="preserve">P</w:t>
             </w:r>
           </w:p>
         </w:tc>
@@ -35851,7 +36380,7 @@
                 <w:sz w:val="15"/>
                 <w:szCs w:val="15"/>
               </w:rPr>
-              <w:t xml:space="preserve">Apply</w:t>
+              <w:t xml:space="preserve">Filter options</w:t>
             </w:r>
           </w:p>
         </w:tc>
@@ -35911,7 +36440,7 @@
                 <w:sz w:val="15"/>
                 <w:szCs w:val="15"/>
               </w:rPr>
-              <w:t xml:space="preserve">GET</w:t>
+              <w:t xml:space="preserve">POST</w:t>
             </w:r>
           </w:p>
         </w:tc>
@@ -35940,7 +36469,7 @@
                 <w:sz w:val="15"/>
                 <w:szCs w:val="15"/>
               </w:rPr>
-              <w:t xml:space="preserve">/applications, /applications/{id}</w:t>
+              <w:t xml:space="preserve">/job-postings/{id}/applications</w:t>
             </w:r>
           </w:p>
         </w:tc>
@@ -35969,7 +36498,7 @@
                 <w:sz w:val="15"/>
                 <w:szCs w:val="15"/>
               </w:rPr>
-              <w:t xml:space="preserve">C (own) / E (own postings)</w:t>
+              <w:t xml:space="preserve">C</w:t>
             </w:r>
           </w:p>
         </w:tc>
@@ -35998,7 +36527,7 @@
                 <w:sz w:val="15"/>
                 <w:szCs w:val="15"/>
               </w:rPr>
-              <w:t xml:space="preserve">List / details</w:t>
+              <w:t xml:space="preserve">Apply</w:t>
             </w:r>
           </w:p>
         </w:tc>
@@ -36058,7 +36587,7 @@
                 <w:sz w:val="15"/>
                 <w:szCs w:val="15"/>
               </w:rPr>
-              <w:t xml:space="preserve">PATCH</w:t>
+              <w:t xml:space="preserve">GET</w:t>
             </w:r>
           </w:p>
         </w:tc>
@@ -36087,7 +36616,7 @@
                 <w:sz w:val="15"/>
                 <w:szCs w:val="15"/>
               </w:rPr>
-              <w:t xml:space="preserve">/applications/{id}/status</w:t>
+              <w:t xml:space="preserve">/applications, /applications/{id}</w:t>
             </w:r>
           </w:p>
         </w:tc>
@@ -36116,7 +36645,7 @@
                 <w:sz w:val="15"/>
                 <w:szCs w:val="15"/>
               </w:rPr>
-              <w:t xml:space="preserve">C / E</w:t>
+              <w:t xml:space="preserve">C (own) / E (own postings)</w:t>
             </w:r>
           </w:p>
         </w:tc>
@@ -36145,7 +36674,7 @@
                 <w:sz w:val="15"/>
                 <w:szCs w:val="15"/>
               </w:rPr>
-              <w:t xml:space="preserve">Status transition</w:t>
+              <w:t xml:space="preserve">List / details</w:t>
             </w:r>
           </w:p>
         </w:tc>
@@ -36176,7 +36705,7 @@
                 <w:sz w:val="15"/>
                 <w:szCs w:val="15"/>
               </w:rPr>
-              <w:t xml:space="preserve">M7 Feedback</w:t>
+              <w:t xml:space="preserve">M6 Applications</w:t>
             </w:r>
           </w:p>
         </w:tc>
@@ -36205,7 +36734,7 @@
                 <w:sz w:val="15"/>
                 <w:szCs w:val="15"/>
               </w:rPr>
-              <w:t xml:space="preserve">GET</w:t>
+              <w:t xml:space="preserve">PATCH</w:t>
             </w:r>
           </w:p>
         </w:tc>
@@ -36234,7 +36763,7 @@
                 <w:sz w:val="15"/>
                 <w:szCs w:val="15"/>
               </w:rPr>
-              <w:t xml:space="preserve">/applications/{id}/feedback-form</w:t>
+              <w:t xml:space="preserve">/applications/{id}/status</w:t>
             </w:r>
           </w:p>
         </w:tc>
@@ -36263,7 +36792,7 @@
                 <w:sz w:val="15"/>
                 <w:szCs w:val="15"/>
               </w:rPr>
-              <w:t xml:space="preserve">C (hired)</w:t>
+              <w:t xml:space="preserve">C / E</w:t>
             </w:r>
           </w:p>
         </w:tc>
@@ -36292,7 +36821,7 @@
                 <w:sz w:val="15"/>
                 <w:szCs w:val="15"/>
               </w:rPr>
-              <w:t xml:space="preserve">Items to rate (recorded at hire), window, submitted</w:t>
+              <w:t xml:space="preserve">Status transition</w:t>
             </w:r>
           </w:p>
         </w:tc>
@@ -36352,7 +36881,7 @@
                 <w:sz w:val="15"/>
                 <w:szCs w:val="15"/>
               </w:rPr>
-              <w:t xml:space="preserve">POST</w:t>
+              <w:t xml:space="preserve">GET</w:t>
             </w:r>
           </w:p>
         </w:tc>
@@ -36381,7 +36910,7 @@
                 <w:sz w:val="15"/>
                 <w:szCs w:val="15"/>
               </w:rPr>
-              <w:t xml:space="preserve">/applications/{id}/feedback</w:t>
+              <w:t xml:space="preserve">/applications/{id}/feedback-form</w:t>
             </w:r>
           </w:p>
         </w:tc>
@@ -36410,7 +36939,7 @@
                 <w:sz w:val="15"/>
                 <w:szCs w:val="15"/>
               </w:rPr>
-              <w:t xml:space="preserve">C (hired, 30 days)</w:t>
+              <w:t xml:space="preserve">C (hired)</w:t>
             </w:r>
           </w:p>
         </w:tc>
@@ -36439,7 +36968,7 @@
                 <w:sz w:val="15"/>
                 <w:szCs w:val="15"/>
               </w:rPr>
-              <w:t xml:space="preserve">Submit</w:t>
+              <w:t xml:space="preserve">Items to rate (recorded at hire), window, submitted</w:t>
             </w:r>
           </w:p>
         </w:tc>
@@ -36499,7 +37028,7 @@
                 <w:sz w:val="15"/>
                 <w:szCs w:val="15"/>
               </w:rPr>
-              <w:t xml:space="preserve">GET</w:t>
+              <w:t xml:space="preserve">POST</w:t>
             </w:r>
           </w:p>
         </w:tc>
@@ -36528,7 +37057,7 @@
                 <w:sz w:val="15"/>
                 <w:szCs w:val="15"/>
               </w:rPr>
-              <w:t xml:space="preserve">/employers/{id}/trust-score</w:t>
+              <w:t xml:space="preserve">/applications/{id}/feedback</w:t>
             </w:r>
           </w:p>
         </w:tc>
@@ -36557,7 +37086,7 @@
                 <w:sz w:val="15"/>
                 <w:szCs w:val="15"/>
               </w:rPr>
-              <w:t xml:space="preserve">P</w:t>
+              <w:t xml:space="preserve">C (hired, 30 days)</w:t>
             </w:r>
           </w:p>
         </w:tc>
@@ -36586,7 +37115,7 @@
                 <w:sz w:val="15"/>
                 <w:szCs w:val="15"/>
               </w:rPr>
-              <w:t xml:space="preserve">Score and breakdown (from 3 responses)</w:t>
+              <w:t xml:space="preserve">Submit</w:t>
             </w:r>
           </w:p>
         </w:tc>
@@ -36617,7 +37146,7 @@
                 <w:sz w:val="15"/>
                 <w:szCs w:val="15"/>
               </w:rPr>
-              <w:t xml:space="preserve">M8 Dashboards</w:t>
+              <w:t xml:space="preserve">M7 Feedback</w:t>
             </w:r>
           </w:p>
         </w:tc>
@@ -36675,7 +37204,7 @@
                 <w:sz w:val="15"/>
                 <w:szCs w:val="15"/>
               </w:rPr>
-              <w:t xml:space="preserve">/candidate/dashboard, /employer/dashboard, /admin/dashboard</w:t>
+              <w:t xml:space="preserve">/employers/{id}/trust-score</w:t>
             </w:r>
           </w:p>
         </w:tc>
@@ -36704,7 +37233,7 @@
                 <w:sz w:val="15"/>
                 <w:szCs w:val="15"/>
               </w:rPr>
-              <w:t xml:space="preserve">C / E / A</w:t>
+              <w:t xml:space="preserve">P</w:t>
             </w:r>
           </w:p>
         </w:tc>
@@ -36733,7 +37262,7 @@
                 <w:sz w:val="15"/>
                 <w:szCs w:val="15"/>
               </w:rPr>
-              <w:t xml:space="preserve">Summaries</w:t>
+              <w:t xml:space="preserve">Score and breakdown (from 3 responses)</w:t>
             </w:r>
           </w:p>
         </w:tc>
@@ -36764,7 +37293,7 @@
                 <w:sz w:val="15"/>
                 <w:szCs w:val="15"/>
               </w:rPr>
-              <w:t xml:space="preserve">M9 Notifications</w:t>
+              <w:t xml:space="preserve">M8 Dashboards</w:t>
             </w:r>
           </w:p>
         </w:tc>
@@ -36793,7 +37322,7 @@
                 <w:sz w:val="15"/>
                 <w:szCs w:val="15"/>
               </w:rPr>
-              <w:t xml:space="preserve">GET, PATCH</w:t>
+              <w:t xml:space="preserve">GET</w:t>
             </w:r>
           </w:p>
         </w:tc>
@@ -36822,7 +37351,7 @@
                 <w:sz w:val="15"/>
                 <w:szCs w:val="15"/>
               </w:rPr>
-              <w:t xml:space="preserve">/notifications, /notifications/{id}/read, /notifications/read-all</w:t>
+              <w:t xml:space="preserve">/candidate/dashboard, /employer/dashboard, /admin/dashboard</w:t>
             </w:r>
           </w:p>
         </w:tc>
@@ -36851,7 +37380,7 @@
                 <w:sz w:val="15"/>
                 <w:szCs w:val="15"/>
               </w:rPr>
-              <w:t xml:space="preserve">C / E</w:t>
+              <w:t xml:space="preserve">C / E / A</w:t>
             </w:r>
           </w:p>
         </w:tc>
@@ -36880,7 +37409,7 @@
                 <w:sz w:val="15"/>
                 <w:szCs w:val="15"/>
               </w:rPr>
-              <w:t xml:space="preserve">List, mark read</w:t>
+              <w:t xml:space="preserve">Summaries</w:t>
             </w:r>
           </w:p>
         </w:tc>
@@ -36911,7 +37440,7 @@
                 <w:sz w:val="15"/>
                 <w:szCs w:val="15"/>
               </w:rPr>
-              <w:t xml:space="preserve">M10 Moderation</w:t>
+              <w:t xml:space="preserve">M9 Notifications</w:t>
             </w:r>
           </w:p>
         </w:tc>
@@ -36969,7 +37498,7 @@
                 <w:sz w:val="15"/>
                 <w:szCs w:val="15"/>
               </w:rPr>
-              <w:t xml:space="preserve">/admin/users, /admin/users/{id}/suspend</w:t>
+              <w:t xml:space="preserve">/notifications, /notifications/{id}/read, /notifications/read-all</w:t>
             </w:r>
           </w:p>
         </w:tc>
@@ -36998,7 +37527,7 @@
                 <w:sz w:val="15"/>
                 <w:szCs w:val="15"/>
               </w:rPr>
-              <w:t xml:space="preserve">A</w:t>
+              <w:t xml:space="preserve">C / E</w:t>
             </w:r>
           </w:p>
         </w:tc>
@@ -37027,7 +37556,7 @@
                 <w:sz w:val="15"/>
                 <w:szCs w:val="15"/>
               </w:rPr>
-              <w:t xml:space="preserve">Users</w:t>
+              <w:t xml:space="preserve">List, mark read</w:t>
             </w:r>
           </w:p>
         </w:tc>
@@ -37087,7 +37616,7 @@
                 <w:sz w:val="15"/>
                 <w:szCs w:val="15"/>
               </w:rPr>
-              <w:t xml:space="preserve">POST</w:t>
+              <w:t xml:space="preserve">GET, PATCH</w:t>
             </w:r>
           </w:p>
         </w:tc>
@@ -37116,7 +37645,7 @@
                 <w:sz w:val="15"/>
                 <w:szCs w:val="15"/>
               </w:rPr>
-              <w:t xml:space="preserve">/job-postings/{id}/reports</w:t>
+              <w:t xml:space="preserve">/admin/users, /admin/users/{id}/suspend</w:t>
             </w:r>
           </w:p>
         </w:tc>
@@ -37145,7 +37674,7 @@
                 <w:sz w:val="15"/>
                 <w:szCs w:val="15"/>
               </w:rPr>
-              <w:t xml:space="preserve">C</w:t>
+              <w:t xml:space="preserve">A</w:t>
             </w:r>
           </w:p>
         </w:tc>
@@ -37174,7 +37703,7 @@
                 <w:sz w:val="15"/>
                 <w:szCs w:val="15"/>
               </w:rPr>
-              <w:t xml:space="preserve">Report posting</w:t>
+              <w:t xml:space="preserve">Users</w:t>
             </w:r>
           </w:p>
         </w:tc>
@@ -37234,7 +37763,7 @@
                 <w:sz w:val="15"/>
                 <w:szCs w:val="15"/>
               </w:rPr>
-              <w:t xml:space="preserve">GET, PATCH</w:t>
+              <w:t xml:space="preserve">POST</w:t>
             </w:r>
           </w:p>
         </w:tc>
@@ -37263,7 +37792,7 @@
                 <w:sz w:val="15"/>
                 <w:szCs w:val="15"/>
               </w:rPr>
-              <w:t xml:space="preserve">/admin/reports, /admin/reports/{id}</w:t>
+              <w:t xml:space="preserve">/job-postings/{id}/reports</w:t>
             </w:r>
           </w:p>
         </w:tc>
@@ -37292,7 +37821,7 @@
                 <w:sz w:val="15"/>
                 <w:szCs w:val="15"/>
               </w:rPr>
-              <w:t xml:space="preserve">A</w:t>
+              <w:t xml:space="preserve">C</w:t>
             </w:r>
           </w:p>
         </w:tc>
@@ -37321,7 +37850,7 @@
                 <w:sz w:val="15"/>
                 <w:szCs w:val="15"/>
               </w:rPr>
-              <w:t xml:space="preserve">Review reports</w:t>
+              <w:t xml:space="preserve">Report posting</w:t>
             </w:r>
           </w:p>
         </w:tc>
@@ -37381,7 +37910,7 @@
                 <w:sz w:val="15"/>
                 <w:szCs w:val="15"/>
               </w:rPr>
-              <w:t xml:space="preserve">GET</w:t>
+              <w:t xml:space="preserve">GET, PATCH</w:t>
             </w:r>
           </w:p>
         </w:tc>
@@ -37410,7 +37939,7 @@
                 <w:sz w:val="15"/>
                 <w:szCs w:val="15"/>
               </w:rPr>
-              <w:t xml:space="preserve">/admin/feedback</w:t>
+              <w:t xml:space="preserve">/admin/reports, /admin/reports/{id}</w:t>
             </w:r>
           </w:p>
         </w:tc>
@@ -37468,7 +37997,7 @@
                 <w:sz w:val="15"/>
                 <w:szCs w:val="15"/>
               </w:rPr>
-              <w:t xml:space="preserve">Feedback for moderation (anonymous)</w:t>
+              <w:t xml:space="preserve">Review reports</w:t>
             </w:r>
           </w:p>
         </w:tc>
@@ -37528,7 +38057,7 @@
                 <w:sz w:val="15"/>
                 <w:szCs w:val="15"/>
               </w:rPr>
-              <w:t xml:space="preserve">PATCH</w:t>
+              <w:t xml:space="preserve">GET</w:t>
             </w:r>
           </w:p>
         </w:tc>
@@ -37557,7 +38086,7 @@
                 <w:sz w:val="15"/>
                 <w:szCs w:val="15"/>
               </w:rPr>
-              <w:t xml:space="preserve">/admin/feedback/{id}/hide</w:t>
+              <w:t xml:space="preserve">/admin/feedback</w:t>
             </w:r>
           </w:p>
         </w:tc>
@@ -37615,7 +38144,7 @@
                 <w:sz w:val="15"/>
                 <w:szCs w:val="15"/>
               </w:rPr>
-              <w:t xml:space="preserve">Hide feedback</w:t>
+              <w:t xml:space="preserve">Feedback for moderation (anonymous)</w:t>
             </w:r>
           </w:p>
         </w:tc>
@@ -37646,7 +38175,7 @@
                 <w:sz w:val="15"/>
                 <w:szCs w:val="15"/>
               </w:rPr>
-              <w:t xml:space="preserve">M11 Master data</w:t>
+              <w:t xml:space="preserve">M10 Moderation</w:t>
             </w:r>
           </w:p>
         </w:tc>
@@ -37675,7 +38204,7 @@
                 <w:sz w:val="15"/>
                 <w:szCs w:val="15"/>
               </w:rPr>
-              <w:t xml:space="preserve">GET</w:t>
+              <w:t xml:space="preserve">PATCH</w:t>
             </w:r>
           </w:p>
         </w:tc>
@@ -37704,7 +38233,7 @@
                 <w:sz w:val="15"/>
                 <w:szCs w:val="15"/>
               </w:rPr>
-              <w:t xml:space="preserve">/admin/accommodations</w:t>
+              <w:t xml:space="preserve">/admin/feedback/{id}/hide</w:t>
             </w:r>
           </w:p>
         </w:tc>
@@ -37762,7 +38291,7 @@
                 <w:sz w:val="15"/>
                 <w:szCs w:val="15"/>
               </w:rPr>
-              <w:t xml:space="preserve">All types incl. retired</w:t>
+              <w:t xml:space="preserve">Hide feedback</w:t>
             </w:r>
           </w:p>
         </w:tc>
@@ -37822,7 +38351,7 @@
                 <w:sz w:val="15"/>
                 <w:szCs w:val="15"/>
               </w:rPr>
-              <w:t xml:space="preserve">POST, PUT, DELETE</w:t>
+              <w:t xml:space="preserve">GET</w:t>
             </w:r>
           </w:p>
         </w:tc>
@@ -37851,7 +38380,7 @@
                 <w:sz w:val="15"/>
                 <w:szCs w:val="15"/>
               </w:rPr>
-              <w:t xml:space="preserve">/admin/categories/{id}, /admin/accommodations/{id}</w:t>
+              <w:t xml:space="preserve">/admin/accommodations</w:t>
             </w:r>
           </w:p>
         </w:tc>
@@ -37909,7 +38438,7 @@
                 <w:sz w:val="15"/>
                 <w:szCs w:val="15"/>
               </w:rPr>
-              <w:t xml:space="preserve">Manage lists (in use: category 422, accommodation retired)</w:t>
+              <w:t xml:space="preserve">All types incl. retired</w:t>
             </w:r>
           </w:p>
         </w:tc>
@@ -37940,7 +38469,7 @@
                 <w:sz w:val="15"/>
                 <w:szCs w:val="15"/>
               </w:rPr>
-              <w:t xml:space="preserve">M12 Saved jobs</w:t>
+              <w:t xml:space="preserve">M11 Master data</w:t>
             </w:r>
           </w:p>
         </w:tc>
@@ -37969,7 +38498,7 @@
                 <w:sz w:val="15"/>
                 <w:szCs w:val="15"/>
               </w:rPr>
-              <w:t xml:space="preserve">GET, POST, DELETE</w:t>
+              <w:t xml:space="preserve">POST, PUT, DELETE</w:t>
             </w:r>
           </w:p>
         </w:tc>
@@ -37998,7 +38527,7 @@
                 <w:sz w:val="15"/>
                 <w:szCs w:val="15"/>
               </w:rPr>
-              <w:t xml:space="preserve">/candidate/saved-jobs, /candidate/saved-jobs/{jobId}</w:t>
+              <w:t xml:space="preserve">/admin/categories/{id}, /admin/accommodations/{id}</w:t>
             </w:r>
           </w:p>
         </w:tc>
@@ -38027,7 +38556,7 @@
                 <w:sz w:val="15"/>
                 <w:szCs w:val="15"/>
               </w:rPr>
-              <w:t xml:space="preserve">C</w:t>
+              <w:t xml:space="preserve">A</w:t>
             </w:r>
           </w:p>
         </w:tc>
@@ -38056,22 +38585,463 @@
                 <w:sz w:val="15"/>
                 <w:szCs w:val="15"/>
               </w:rPr>
-              <w:t xml:space="preserve">Bookmarks of visible postings; POST and DELETE idempotent; </w:t>
-            </w:r>
-            <w:r>
-              <w:rPr>
-                <w:rFonts w:ascii="Consolas" w:cs="Consolas" w:eastAsia="Consolas" w:hAnsi="Consolas"/>
+              <w:t xml:space="preserve">Manage lists (in use: category 422, accommodation retired)</w:t>
+            </w:r>
+          </w:p>
+        </w:tc>
+      </w:tr>
+      <w:tr>
+        <w:tc>
+          <w:tcPr>
+            <w:tcW w:type="dxa" w:w="1600"/>
+            <w:tcBorders>
+              <w:top w:val="single" w:color="7F7F7F" w:sz="4"/>
+              <w:left w:val="single" w:color="7F7F7F" w:sz="4"/>
+              <w:bottom w:val="single" w:color="7F7F7F" w:sz="4"/>
+              <w:right w:val="single" w:color="7F7F7F" w:sz="4"/>
+            </w:tcBorders>
+            <w:tcMar>
+              <w:top w:type="dxa" w:w="60"/>
+              <w:left w:type="dxa" w:w="100"/>
+              <w:bottom w:type="dxa" w:w="60"/>
+              <w:right w:type="dxa" w:w="100"/>
+            </w:tcMar>
+          </w:tcPr>
+          <w:p>
+            <w:pPr>
+              <w:spacing w:after="20"/>
+            </w:pPr>
+            <w:r>
+              <w:rPr>
                 <w:sz w:val="15"/>
                 <w:szCs w:val="15"/>
               </w:rPr>
-              <w:t xml:space="preserve">saved</w:t>
-            </w:r>
+              <w:t xml:space="preserve">M12 Saved jobs</w:t>
+            </w:r>
+          </w:p>
+        </w:tc>
+        <w:tc>
+          <w:tcPr>
+            <w:tcW w:type="dxa" w:w="1300"/>
+            <w:tcBorders>
+              <w:top w:val="single" w:color="7F7F7F" w:sz="4"/>
+              <w:left w:val="single" w:color="7F7F7F" w:sz="4"/>
+              <w:bottom w:val="single" w:color="7F7F7F" w:sz="4"/>
+              <w:right w:val="single" w:color="7F7F7F" w:sz="4"/>
+            </w:tcBorders>
+            <w:tcMar>
+              <w:top w:type="dxa" w:w="60"/>
+              <w:left w:type="dxa" w:w="100"/>
+              <w:bottom w:type="dxa" w:w="60"/>
+              <w:right w:type="dxa" w:w="100"/>
+            </w:tcMar>
+          </w:tcPr>
+          <w:p>
+            <w:pPr>
+              <w:spacing w:after="20"/>
+            </w:pPr>
             <w:r>
               <w:rPr>
                 <w:sz w:val="15"/>
                 <w:szCs w:val="15"/>
               </w:rPr>
-              <w:t xml:space="preserve"> flag on posting details</w:t>
+              <w:t xml:space="preserve">GET, POST, DELETE</w:t>
+            </w:r>
+          </w:p>
+        </w:tc>
+        <w:tc>
+          <w:tcPr>
+            <w:tcW w:type="dxa" w:w="3800"/>
+            <w:tcBorders>
+              <w:top w:val="single" w:color="7F7F7F" w:sz="4"/>
+              <w:left w:val="single" w:color="7F7F7F" w:sz="4"/>
+              <w:bottom w:val="single" w:color="7F7F7F" w:sz="4"/>
+              <w:right w:val="single" w:color="7F7F7F" w:sz="4"/>
+            </w:tcBorders>
+            <w:tcMar>
+              <w:top w:type="dxa" w:w="60"/>
+              <w:left w:type="dxa" w:w="100"/>
+              <w:bottom w:type="dxa" w:w="60"/>
+              <w:right w:type="dxa" w:w="100"/>
+            </w:tcMar>
+          </w:tcPr>
+          <w:p>
+            <w:pPr>
+              <w:spacing w:after="20"/>
+            </w:pPr>
+            <w:r>
+              <w:rPr>
+                <w:sz w:val="15"/>
+                <w:szCs w:val="15"/>
+              </w:rPr>
+              <w:t xml:space="preserve">/candidate/saved-jobs, /candidate/saved-jobs/{jobId}</w:t>
+            </w:r>
+          </w:p>
+        </w:tc>
+        <w:tc>
+          <w:tcPr>
+            <w:tcW w:type="dxa" w:w="1600"/>
+            <w:tcBorders>
+              <w:top w:val="single" w:color="7F7F7F" w:sz="4"/>
+              <w:left w:val="single" w:color="7F7F7F" w:sz="4"/>
+              <w:bottom w:val="single" w:color="7F7F7F" w:sz="4"/>
+              <w:right w:val="single" w:color="7F7F7F" w:sz="4"/>
+            </w:tcBorders>
+            <w:tcMar>
+              <w:top w:type="dxa" w:w="60"/>
+              <w:left w:type="dxa" w:w="100"/>
+              <w:bottom w:type="dxa" w:w="60"/>
+              <w:right w:type="dxa" w:w="100"/>
+            </w:tcMar>
+          </w:tcPr>
+          <w:p>
+            <w:pPr>
+              <w:spacing w:after="20"/>
+            </w:pPr>
+            <w:r>
+              <w:rPr>
+                <w:sz w:val="15"/>
+                <w:szCs w:val="15"/>
+              </w:rPr>
+              <w:t xml:space="preserve">C</w:t>
+            </w:r>
+          </w:p>
+        </w:tc>
+        <w:tc>
+          <w:tcPr>
+            <w:tcW w:type="dxa" w:w="1780"/>
+            <w:tcBorders>
+              <w:top w:val="single" w:color="7F7F7F" w:sz="4"/>
+              <w:left w:val="single" w:color="7F7F7F" w:sz="4"/>
+              <w:bottom w:val="single" w:color="7F7F7F" w:sz="4"/>
+              <w:right w:val="single" w:color="7F7F7F" w:sz="4"/>
+            </w:tcBorders>
+            <w:tcMar>
+              <w:top w:type="dxa" w:w="60"/>
+              <w:left w:type="dxa" w:w="100"/>
+              <w:bottom w:type="dxa" w:w="60"/>
+              <w:right w:type="dxa" w:w="100"/>
+            </w:tcMar>
+          </w:tcPr>
+          <w:p>
+            <w:pPr>
+              <w:spacing w:after="20"/>
+            </w:pPr>
+            <w:r>
+              <w:rPr>
+                <w:sz w:val="15"/>
+                <w:szCs w:val="15"/>
+              </w:rPr>
+              <w:t xml:space="preserve">Bookmarks of visible postings; POST and DELETE idempotent; </w:t>
+            </w:r>
+            <w:r>
+              <w:rPr>
+                <w:rFonts w:ascii="Consolas" w:cs="Consolas" w:eastAsia="Consolas" w:hAnsi="Consolas"/>
+                <w:sz w:val="15"/>
+                <w:szCs w:val="15"/>
+              </w:rPr>
+              <w:t xml:space="preserve">saved</w:t>
+            </w:r>
+            <w:r>
+              <w:rPr>
+                <w:sz w:val="15"/>
+                <w:szCs w:val="15"/>
+              </w:rPr>
+              <w:t xml:space="preserve"> flag on search results and posting details</w:t>
+            </w:r>
+          </w:p>
+        </w:tc>
+      </w:tr>
+      <w:tr>
+        <w:tc>
+          <w:tcPr>
+            <w:tcW w:type="dxa" w:w="1600"/>
+            <w:tcBorders>
+              <w:top w:val="single" w:color="7F7F7F" w:sz="4"/>
+              <w:left w:val="single" w:color="7F7F7F" w:sz="4"/>
+              <w:bottom w:val="single" w:color="7F7F7F" w:sz="4"/>
+              <w:right w:val="single" w:color="7F7F7F" w:sz="4"/>
+            </w:tcBorders>
+            <w:tcMar>
+              <w:top w:type="dxa" w:w="60"/>
+              <w:left w:type="dxa" w:w="100"/>
+              <w:bottom w:type="dxa" w:w="60"/>
+              <w:right w:type="dxa" w:w="100"/>
+            </w:tcMar>
+          </w:tcPr>
+          <w:p>
+            <w:pPr>
+              <w:spacing w:after="20"/>
+            </w:pPr>
+            <w:r>
+              <w:rPr>
+                <w:sz w:val="15"/>
+                <w:szCs w:val="15"/>
+              </w:rPr>
+              <w:t xml:space="preserve">M13 Settings</w:t>
+            </w:r>
+          </w:p>
+        </w:tc>
+        <w:tc>
+          <w:tcPr>
+            <w:tcW w:type="dxa" w:w="1300"/>
+            <w:tcBorders>
+              <w:top w:val="single" w:color="7F7F7F" w:sz="4"/>
+              <w:left w:val="single" w:color="7F7F7F" w:sz="4"/>
+              <w:bottom w:val="single" w:color="7F7F7F" w:sz="4"/>
+              <w:right w:val="single" w:color="7F7F7F" w:sz="4"/>
+            </w:tcBorders>
+            <w:tcMar>
+              <w:top w:type="dxa" w:w="60"/>
+              <w:left w:type="dxa" w:w="100"/>
+              <w:bottom w:type="dxa" w:w="60"/>
+              <w:right w:type="dxa" w:w="100"/>
+            </w:tcMar>
+          </w:tcPr>
+          <w:p>
+            <w:pPr>
+              <w:spacing w:after="20"/>
+            </w:pPr>
+            <w:r>
+              <w:rPr>
+                <w:sz w:val="15"/>
+                <w:szCs w:val="15"/>
+              </w:rPr>
+              <w:t xml:space="preserve">PUT</w:t>
+            </w:r>
+          </w:p>
+        </w:tc>
+        <w:tc>
+          <w:tcPr>
+            <w:tcW w:type="dxa" w:w="3800"/>
+            <w:tcBorders>
+              <w:top w:val="single" w:color="7F7F7F" w:sz="4"/>
+              <w:left w:val="single" w:color="7F7F7F" w:sz="4"/>
+              <w:bottom w:val="single" w:color="7F7F7F" w:sz="4"/>
+              <w:right w:val="single" w:color="7F7F7F" w:sz="4"/>
+            </w:tcBorders>
+            <w:tcMar>
+              <w:top w:type="dxa" w:w="60"/>
+              <w:left w:type="dxa" w:w="100"/>
+              <w:bottom w:type="dxa" w:w="60"/>
+              <w:right w:type="dxa" w:w="100"/>
+            </w:tcMar>
+          </w:tcPr>
+          <w:p>
+            <w:pPr>
+              <w:spacing w:after="20"/>
+            </w:pPr>
+            <w:r>
+              <w:rPr>
+                <w:sz w:val="15"/>
+                <w:szCs w:val="15"/>
+              </w:rPr>
+              <w:t xml:space="preserve">/me/display-prefs</w:t>
+            </w:r>
+          </w:p>
+        </w:tc>
+        <w:tc>
+          <w:tcPr>
+            <w:tcW w:type="dxa" w:w="1600"/>
+            <w:tcBorders>
+              <w:top w:val="single" w:color="7F7F7F" w:sz="4"/>
+              <w:left w:val="single" w:color="7F7F7F" w:sz="4"/>
+              <w:bottom w:val="single" w:color="7F7F7F" w:sz="4"/>
+              <w:right w:val="single" w:color="7F7F7F" w:sz="4"/>
+            </w:tcBorders>
+            <w:tcMar>
+              <w:top w:type="dxa" w:w="60"/>
+              <w:left w:type="dxa" w:w="100"/>
+              <w:bottom w:type="dxa" w:w="60"/>
+              <w:right w:type="dxa" w:w="100"/>
+            </w:tcMar>
+          </w:tcPr>
+          <w:p>
+            <w:pPr>
+              <w:spacing w:after="20"/>
+            </w:pPr>
+            <w:r>
+              <w:rPr>
+                <w:sz w:val="15"/>
+                <w:szCs w:val="15"/>
+              </w:rPr>
+              <w:t xml:space="preserve">any</w:t>
+            </w:r>
+          </w:p>
+        </w:tc>
+        <w:tc>
+          <w:tcPr>
+            <w:tcW w:type="dxa" w:w="1780"/>
+            <w:tcBorders>
+              <w:top w:val="single" w:color="7F7F7F" w:sz="4"/>
+              <w:left w:val="single" w:color="7F7F7F" w:sz="4"/>
+              <w:bottom w:val="single" w:color="7F7F7F" w:sz="4"/>
+              <w:right w:val="single" w:color="7F7F7F" w:sz="4"/>
+            </w:tcBorders>
+            <w:tcMar>
+              <w:top w:type="dxa" w:w="60"/>
+              <w:left w:type="dxa" w:w="100"/>
+              <w:bottom w:type="dxa" w:w="60"/>
+              <w:right w:type="dxa" w:w="100"/>
+            </w:tcMar>
+          </w:tcPr>
+          <w:p>
+            <w:pPr>
+              <w:spacing w:after="20"/>
+            </w:pPr>
+            <w:r>
+              <w:rPr>
+                <w:sz w:val="15"/>
+                <w:szCs w:val="15"/>
+              </w:rPr>
+              <w:t xml:space="preserve">Text size, contrast, motion saved with the account (returned by login and /me)</w:t>
+            </w:r>
+          </w:p>
+        </w:tc>
+      </w:tr>
+      <w:tr>
+        <w:tc>
+          <w:tcPr>
+            <w:tcW w:type="dxa" w:w="1600"/>
+            <w:tcBorders>
+              <w:top w:val="single" w:color="7F7F7F" w:sz="4"/>
+              <w:left w:val="single" w:color="7F7F7F" w:sz="4"/>
+              <w:bottom w:val="single" w:color="7F7F7F" w:sz="4"/>
+              <w:right w:val="single" w:color="7F7F7F" w:sz="4"/>
+            </w:tcBorders>
+            <w:tcMar>
+              <w:top w:type="dxa" w:w="60"/>
+              <w:left w:type="dxa" w:w="100"/>
+              <w:bottom w:type="dxa" w:w="60"/>
+              <w:right w:type="dxa" w:w="100"/>
+            </w:tcMar>
+          </w:tcPr>
+          <w:p>
+            <w:pPr>
+              <w:spacing w:after="20"/>
+            </w:pPr>
+            <w:r>
+              <w:rPr>
+                <w:sz w:val="15"/>
+                <w:szCs w:val="15"/>
+              </w:rPr>
+              <w:t xml:space="preserve">M13 Settings</w:t>
+            </w:r>
+          </w:p>
+        </w:tc>
+        <w:tc>
+          <w:tcPr>
+            <w:tcW w:type="dxa" w:w="1300"/>
+            <w:tcBorders>
+              <w:top w:val="single" w:color="7F7F7F" w:sz="4"/>
+              <w:left w:val="single" w:color="7F7F7F" w:sz="4"/>
+              <w:bottom w:val="single" w:color="7F7F7F" w:sz="4"/>
+              <w:right w:val="single" w:color="7F7F7F" w:sz="4"/>
+            </w:tcBorders>
+            <w:tcMar>
+              <w:top w:type="dxa" w:w="60"/>
+              <w:left w:type="dxa" w:w="100"/>
+              <w:bottom w:type="dxa" w:w="60"/>
+              <w:right w:type="dxa" w:w="100"/>
+            </w:tcMar>
+          </w:tcPr>
+          <w:p>
+            <w:pPr>
+              <w:spacing w:after="20"/>
+            </w:pPr>
+            <w:r>
+              <w:rPr>
+                <w:sz w:val="15"/>
+                <w:szCs w:val="15"/>
+              </w:rPr>
+              <w:t xml:space="preserve">PUT</w:t>
+            </w:r>
+          </w:p>
+        </w:tc>
+        <w:tc>
+          <w:tcPr>
+            <w:tcW w:type="dxa" w:w="3800"/>
+            <w:tcBorders>
+              <w:top w:val="single" w:color="7F7F7F" w:sz="4"/>
+              <w:left w:val="single" w:color="7F7F7F" w:sz="4"/>
+              <w:bottom w:val="single" w:color="7F7F7F" w:sz="4"/>
+              <w:right w:val="single" w:color="7F7F7F" w:sz="4"/>
+            </w:tcBorders>
+            <w:tcMar>
+              <w:top w:type="dxa" w:w="60"/>
+              <w:left w:type="dxa" w:w="100"/>
+              <w:bottom w:type="dxa" w:w="60"/>
+              <w:right w:type="dxa" w:w="100"/>
+            </w:tcMar>
+          </w:tcPr>
+          <w:p>
+            <w:pPr>
+              <w:spacing w:after="20"/>
+            </w:pPr>
+            <w:r>
+              <w:rPr>
+                <w:sz w:val="15"/>
+                <w:szCs w:val="15"/>
+              </w:rPr>
+              <w:t xml:space="preserve">/me/email-notifications</w:t>
+            </w:r>
+          </w:p>
+        </w:tc>
+        <w:tc>
+          <w:tcPr>
+            <w:tcW w:type="dxa" w:w="1600"/>
+            <w:tcBorders>
+              <w:top w:val="single" w:color="7F7F7F" w:sz="4"/>
+              <w:left w:val="single" w:color="7F7F7F" w:sz="4"/>
+              <w:bottom w:val="single" w:color="7F7F7F" w:sz="4"/>
+              <w:right w:val="single" w:color="7F7F7F" w:sz="4"/>
+            </w:tcBorders>
+            <w:tcMar>
+              <w:top w:type="dxa" w:w="60"/>
+              <w:left w:type="dxa" w:w="100"/>
+              <w:bottom w:type="dxa" w:w="60"/>
+              <w:right w:type="dxa" w:w="100"/>
+            </w:tcMar>
+          </w:tcPr>
+          <w:p>
+            <w:pPr>
+              <w:spacing w:after="20"/>
+            </w:pPr>
+            <w:r>
+              <w:rPr>
+                <w:sz w:val="15"/>
+                <w:szCs w:val="15"/>
+              </w:rPr>
+              <w:t xml:space="preserve">C / E</w:t>
+            </w:r>
+          </w:p>
+        </w:tc>
+        <w:tc>
+          <w:tcPr>
+            <w:tcW w:type="dxa" w:w="1780"/>
+            <w:tcBorders>
+              <w:top w:val="single" w:color="7F7F7F" w:sz="4"/>
+              <w:left w:val="single" w:color="7F7F7F" w:sz="4"/>
+              <w:bottom w:val="single" w:color="7F7F7F" w:sz="4"/>
+              <w:right w:val="single" w:color="7F7F7F" w:sz="4"/>
+            </w:tcBorders>
+            <w:tcMar>
+              <w:top w:type="dxa" w:w="60"/>
+              <w:left w:type="dxa" w:w="100"/>
+              <w:bottom w:type="dxa" w:w="60"/>
+              <w:right w:type="dxa" w:w="100"/>
+            </w:tcMar>
+          </w:tcPr>
+          <w:p>
+            <w:pPr>
+              <w:spacing w:after="20"/>
+            </w:pPr>
+            <w:r>
+              <w:rPr>
+                <w:sz w:val="15"/>
+                <w:szCs w:val="15"/>
+              </w:rPr>
+              <w:t xml:space="preserve">Notification emails on (default) or off</w:t>
             </w:r>
           </w:p>
         </w:tc>
@@ -38929,7 +39899,7 @@
                 <w:sz w:val="16"/>
                 <w:szCs w:val="16"/>
               </w:rPr>
-              <w:t xml:space="preserve">C (register)</w:t>
+              <w:t xml:space="preserve">C (register), U (reset password by email link)</w:t>
             </w:r>
           </w:p>
         </w:tc>
@@ -38958,7 +39928,7 @@
                 <w:sz w:val="16"/>
                 <w:szCs w:val="16"/>
               </w:rPr>
-              <w:t xml:space="preserve">R, U own</w:t>
+              <w:t xml:space="preserve">R, U own (password, settings)</w:t>
             </w:r>
           </w:p>
         </w:tc>
@@ -38987,7 +39957,7 @@
                 <w:sz w:val="16"/>
                 <w:szCs w:val="16"/>
               </w:rPr>
-              <w:t xml:space="preserve">R, U own</w:t>
+              <w:t xml:space="preserve">R, U own (password, settings)</w:t>
             </w:r>
           </w:p>
         </w:tc>
@@ -42949,7 +43919,7 @@
                 <w:sz w:val="16"/>
                 <w:szCs w:val="16"/>
               </w:rPr>
-              <w:t xml:space="preserve">id, name, email, password, role, is_active, consented_at, display_prefs, timestamps</w:t>
+              <w:t xml:space="preserve">id, name, email, password, role, is_active, consented_at, display_prefs (JSON), email_notifications, timestamps</w:t>
             </w:r>
           </w:p>
         </w:tc>
@@ -42978,7 +43948,7 @@
                 <w:sz w:val="16"/>
                 <w:szCs w:val="16"/>
               </w:rPr>
-              <w:t xml:space="preserve">Shared auth table (Sanctum); unique email; suspension; consent</w:t>
+              <w:t xml:space="preserve">Shared auth table (Sanctum); unique email; suspension; consent; M13 settings (emails on by default)</w:t>
             </w:r>
           </w:p>
         </w:tc>
@@ -43009,7 +43979,7 @@
                 <w:sz w:val="16"/>
                 <w:szCs w:val="16"/>
               </w:rPr>
-              <w:t xml:space="preserve">candidate_profiles</w:t>
+              <w:t xml:space="preserve">password_reset_tokens</w:t>
             </w:r>
           </w:p>
         </w:tc>
@@ -43038,7 +44008,7 @@
                 <w:sz w:val="16"/>
                 <w:szCs w:val="16"/>
               </w:rPr>
-              <w:t xml:space="preserve">id, user_id, headline, skills, experience, location_psgc, location_label, disability_type (nullable), show_disability, resume_path</w:t>
+              <w:t xml:space="preserve">email (PK), token (hashed), created_at</w:t>
             </w:r>
           </w:p>
         </w:tc>
@@ -43067,7 +44037,7 @@
                 <w:sz w:val="16"/>
                 <w:szCs w:val="16"/>
               </w:rPr>
-              <w:t xml:space="preserve">1:1 with candidate users; disability type optional and hidden</w:t>
+              <w:t xml:space="preserve">One reset link per account; valid 60 minutes, removed once used</w:t>
             </w:r>
           </w:p>
         </w:tc>
@@ -43098,7 +44068,7 @@
                 <w:sz w:val="16"/>
                 <w:szCs w:val="16"/>
               </w:rPr>
-              <w:t xml:space="preserve">employers</w:t>
+              <w:t xml:space="preserve">candidate_profiles</w:t>
             </w:r>
           </w:p>
         </w:tc>
@@ -43127,7 +44097,7 @@
                 <w:sz w:val="16"/>
                 <w:szCs w:val="16"/>
               </w:rPr>
-              <w:t xml:space="preserve">id, user_id, company_name, business_reg_no, registry_type, industry, address, location_psgc, location_label, description, logo_path, verified_at, verification_rejected_reason, trust_score, feedback_count</w:t>
+              <w:t xml:space="preserve">id, user_id, headline, skills, experience, location_psgc, location_label, disability_type (nullable), show_disability, resume_path</w:t>
             </w:r>
           </w:p>
         </w:tc>
@@ -43153,18 +44123,10 @@
             </w:pPr>
             <w:r>
               <w:rPr>
-                <w:rFonts w:ascii="Consolas" w:cs="Consolas" w:eastAsia="Consolas" w:hAnsi="Consolas"/>
-                <w:sz w:val="16"/>
-                <w:szCs w:val="16"/>
-              </w:rPr>
-              <w:t xml:space="preserve">trust_score</w:t>
-            </w:r>
-            <w:r>
-              <w:rPr>
-                <w:sz w:val="16"/>
-                <w:szCs w:val="16"/>
-              </w:rPr>
-              <w:t xml:space="preserve"> is a whole percentage 0–100 (null until rated); shown publicly only from 3 responses</w:t>
+                <w:sz w:val="16"/>
+                <w:szCs w:val="16"/>
+              </w:rPr>
+              <w:t xml:space="preserve">1:1 with candidate users; disability type optional and hidden</w:t>
             </w:r>
           </w:p>
         </w:tc>
@@ -43195,7 +44157,7 @@
                 <w:sz w:val="16"/>
                 <w:szCs w:val="16"/>
               </w:rPr>
-              <w:t xml:space="preserve">registry_checks</w:t>
+              <w:t xml:space="preserve">employers</w:t>
             </w:r>
           </w:p>
         </w:tc>
@@ -43224,7 +44186,7 @@
                 <w:sz w:val="16"/>
                 <w:szCs w:val="16"/>
               </w:rPr>
-              <w:t xml:space="preserve">id, employer_id, business_reg_no, registry_type, status, registered_name, name_match_score, raw_response (XML answer), checked_by, checked_at</w:t>
+              <w:t xml:space="preserve">id, user_id, company_name, business_reg_no, registry_type, industry, address, location_psgc, location_label, description, logo_path, verified_at, verification_rejected_reason, trust_score, feedback_count</w:t>
             </w:r>
           </w:p>
         </w:tc>
@@ -43250,25 +44212,18 @@
             </w:pPr>
             <w:r>
               <w:rPr>
-                <w:sz w:val="16"/>
-                <w:szCs w:val="16"/>
-              </w:rPr>
-              <w:t xml:space="preserve">Every SOAP verification call; </w:t>
-            </w:r>
-            <w:r>
-              <w:rPr>
-                <w:rFonts w:ascii="Consolas" w:cs="Consolas" w:eastAsia="Consolas" w:hAnsi="Consolas"/>
-                <w:sz w:val="16"/>
-                <w:szCs w:val="16"/>
-              </w:rPr>
-              <w:t xml:space="preserve">ERROR</w:t>
-            </w:r>
-            <w:r>
-              <w:rPr>
-                <w:sz w:val="16"/>
-                <w:szCs w:val="16"/>
-              </w:rPr>
-              <w:t xml:space="preserve"> when the registry could not answer</w:t>
+                <w:rFonts w:ascii="Consolas" w:cs="Consolas" w:eastAsia="Consolas" w:hAnsi="Consolas"/>
+                <w:sz w:val="16"/>
+                <w:szCs w:val="16"/>
+              </w:rPr>
+              <w:t xml:space="preserve">trust_score</w:t>
+            </w:r>
+            <w:r>
+              <w:rPr>
+                <w:sz w:val="16"/>
+                <w:szCs w:val="16"/>
+              </w:rPr>
+              <w:t xml:space="preserve"> is a whole percentage 0–100 (null until rated); shown publicly only from 3 responses</w:t>
             </w:r>
           </w:p>
         </w:tc>
@@ -43299,7 +44254,7 @@
                 <w:sz w:val="16"/>
                 <w:szCs w:val="16"/>
               </w:rPr>
-              <w:t xml:space="preserve">categories / accommodations</w:t>
+              <w:t xml:space="preserve">registry_checks</w:t>
             </w:r>
           </w:p>
         </w:tc>
@@ -43328,7 +44283,7 @@
                 <w:sz w:val="16"/>
                 <w:szCs w:val="16"/>
               </w:rPr>
-              <w:t xml:space="preserve">id, name / id, name, group, description, is_retired</w:t>
+              <w:t xml:space="preserve">id, employer_id, business_reg_no, registry_type, status, registered_name, name_match_score, raw_response (XML answer), checked_by, checked_at</w:t>
             </w:r>
           </w:p>
         </w:tc>
@@ -43357,7 +44312,22 @@
                 <w:sz w:val="16"/>
                 <w:szCs w:val="16"/>
               </w:rPr>
-              <w:t xml:space="preserve">Admin-managed lists</w:t>
+              <w:t xml:space="preserve">Every SOAP verification call; </w:t>
+            </w:r>
+            <w:r>
+              <w:rPr>
+                <w:rFonts w:ascii="Consolas" w:cs="Consolas" w:eastAsia="Consolas" w:hAnsi="Consolas"/>
+                <w:sz w:val="16"/>
+                <w:szCs w:val="16"/>
+              </w:rPr>
+              <w:t xml:space="preserve">ERROR</w:t>
+            </w:r>
+            <w:r>
+              <w:rPr>
+                <w:sz w:val="16"/>
+                <w:szCs w:val="16"/>
+              </w:rPr>
+              <w:t xml:space="preserve"> when the registry could not answer</w:t>
             </w:r>
           </w:p>
         </w:tc>
@@ -43388,7 +44358,7 @@
                 <w:sz w:val="16"/>
                 <w:szCs w:val="16"/>
               </w:rPr>
-              <w:t xml:space="preserve">job_postings</w:t>
+              <w:t xml:space="preserve">categories / accommodations</w:t>
             </w:r>
           </w:p>
         </w:tc>
@@ -43417,7 +44387,7 @@
                 <w:sz w:val="16"/>
                 <w:szCs w:val="16"/>
               </w:rPr>
-              <w:t xml:space="preserve">id, employer_id, category_id, title, description, address, location_psgc, location_label, employment_type, work_setup, interview_format, status, closes_at, is_approved, rejection_reason, deleted_at</w:t>
+              <w:t xml:space="preserve">id, name / id, name, group, description, is_retired</w:t>
             </w:r>
           </w:p>
         </w:tc>
@@ -43446,7 +44416,7 @@
                 <w:sz w:val="16"/>
                 <w:szCs w:val="16"/>
               </w:rPr>
-              <w:t xml:space="preserve">Soft deletes; indexes (status, category_id) and (employer_id, status); MySQL full-text index on title and description (keyword search currently uses a case-insensitive LIKE)</w:t>
+              <w:t xml:space="preserve">Admin-managed lists</w:t>
             </w:r>
           </w:p>
         </w:tc>
@@ -43477,7 +44447,7 @@
                 <w:sz w:val="16"/>
                 <w:szCs w:val="16"/>
               </w:rPr>
-              <w:t xml:space="preserve">job_posting_accommodation</w:t>
+              <w:t xml:space="preserve">job_postings</w:t>
             </w:r>
           </w:p>
         </w:tc>
@@ -43506,7 +44476,7 @@
                 <w:sz w:val="16"/>
                 <w:szCs w:val="16"/>
               </w:rPr>
-              <w:t xml:space="preserve">job_posting_id, accommodation_id, note</w:t>
+              <w:t xml:space="preserve">id, employer_id, category_id, title, description, address, location_psgc, location_label, employment_type, work_setup, interview_format, status, closes_at, is_approved, rejection_reason, deleted_at</w:t>
             </w:r>
           </w:p>
         </w:tc>
@@ -43535,7 +44505,7 @@
                 <w:sz w:val="16"/>
                 <w:szCs w:val="16"/>
               </w:rPr>
-              <w:t xml:space="preserve">Pivot: accommodations provided</w:t>
+              <w:t xml:space="preserve">Soft deletes; indexes (status, category_id) and (employer_id, status); MySQL full-text index on title and description (keyword search currently uses a case-insensitive LIKE)</w:t>
             </w:r>
           </w:p>
         </w:tc>
@@ -43566,7 +44536,7 @@
                 <w:sz w:val="16"/>
                 <w:szCs w:val="16"/>
               </w:rPr>
-              <w:t xml:space="preserve">candidate_accommodation</w:t>
+              <w:t xml:space="preserve">job_posting_accommodation</w:t>
             </w:r>
           </w:p>
         </w:tc>
@@ -43595,7 +44565,7 @@
                 <w:sz w:val="16"/>
                 <w:szCs w:val="16"/>
               </w:rPr>
-              <w:t xml:space="preserve">candidate_profile_id, accommodation_id</w:t>
+              <w:t xml:space="preserve">job_posting_id, accommodation_id, note</w:t>
             </w:r>
           </w:p>
         </w:tc>
@@ -43624,7 +44594,7 @@
                 <w:sz w:val="16"/>
                 <w:szCs w:val="16"/>
               </w:rPr>
-              <w:t xml:space="preserve">Pivot: accommodations needed</w:t>
+              <w:t xml:space="preserve">Pivot: accommodations provided</w:t>
             </w:r>
           </w:p>
         </w:tc>
@@ -43655,7 +44625,7 @@
                 <w:sz w:val="16"/>
                 <w:szCs w:val="16"/>
               </w:rPr>
-              <w:t xml:space="preserve">applications</w:t>
+              <w:t xml:space="preserve">candidate_accommodation</w:t>
             </w:r>
           </w:p>
         </w:tc>
@@ -43684,7 +44654,7 @@
                 <w:sz w:val="16"/>
                 <w:szCs w:val="16"/>
               </w:rPr>
-              <w:t xml:space="preserve">id, job_posting_id, candidate_profile_id, status, cover_note, interview_request, hired_at, hire_confirmed_by</w:t>
+              <w:t xml:space="preserve">candidate_profile_id, accommodation_id</w:t>
             </w:r>
           </w:p>
         </w:tc>
@@ -43713,7 +44683,7 @@
                 <w:sz w:val="16"/>
                 <w:szCs w:val="16"/>
               </w:rPr>
-              <w:t xml:space="preserve">Unique (job_posting_id, candidate_profile_id)</w:t>
+              <w:t xml:space="preserve">Pivot: accommodations needed</w:t>
             </w:r>
           </w:p>
         </w:tc>
@@ -43744,7 +44714,7 @@
                 <w:sz w:val="16"/>
                 <w:szCs w:val="16"/>
               </w:rPr>
-              <w:t xml:space="preserve">application_accommodation</w:t>
+              <w:t xml:space="preserve">applications</w:t>
             </w:r>
           </w:p>
         </w:tc>
@@ -43773,7 +44743,7 @@
                 <w:sz w:val="16"/>
                 <w:szCs w:val="16"/>
               </w:rPr>
-              <w:t xml:space="preserve">application_id, accommodation_id</w:t>
+              <w:t xml:space="preserve">id, job_posting_id, candidate_profile_id, status, reviewed_at, cover_note, interview_request, hired_at, feedback_reminded_at, hire_confirmed_by, timestamps</w:t>
             </w:r>
           </w:p>
         </w:tc>
@@ -43802,7 +44772,52 @@
                 <w:sz w:val="16"/>
                 <w:szCs w:val="16"/>
               </w:rPr>
-              <w:t xml:space="preserve">Pivot: the posting's accommodations recorded when the application becomes hired (the items the candidate rates)</w:t>
+              <w:t xml:space="preserve">Unique (job_posting_id, candidate_profile_id); </w:t>
+            </w:r>
+            <w:r>
+              <w:rPr>
+                <w:rFonts w:ascii="Consolas" w:cs="Consolas" w:eastAsia="Consolas" w:hAnsi="Consolas"/>
+                <w:sz w:val="16"/>
+                <w:szCs w:val="16"/>
+              </w:rPr>
+              <w:t xml:space="preserve">reviewed_at</w:t>
+            </w:r>
+            <w:r>
+              <w:rPr>
+                <w:sz w:val="16"/>
+                <w:szCs w:val="16"/>
+              </w:rPr>
+              <w:t xml:space="preserve">/</w:t>
+            </w:r>
+            <w:r>
+              <w:rPr>
+                <w:rFonts w:ascii="Consolas" w:cs="Consolas" w:eastAsia="Consolas" w:hAnsi="Consolas"/>
+                <w:sz w:val="16"/>
+                <w:szCs w:val="16"/>
+              </w:rPr>
+              <w:t xml:space="preserve">hired_at</w:t>
+            </w:r>
+            <w:r>
+              <w:rPr>
+                <w:sz w:val="16"/>
+                <w:szCs w:val="16"/>
+              </w:rPr>
+              <w:t xml:space="preserve"> date the status timeline; </w:t>
+            </w:r>
+            <w:r>
+              <w:rPr>
+                <w:rFonts w:ascii="Consolas" w:cs="Consolas" w:eastAsia="Consolas" w:hAnsi="Consolas"/>
+                <w:sz w:val="16"/>
+                <w:szCs w:val="16"/>
+              </w:rPr>
+              <w:t xml:space="preserve">feedback_reminded_at</w:t>
+            </w:r>
+            <w:r>
+              <w:rPr>
+                <w:sz w:val="16"/>
+                <w:szCs w:val="16"/>
+              </w:rPr>
+              <w:t xml:space="preserve"> makes the rating reminder a one-time notice</w:t>
             </w:r>
           </w:p>
         </w:tc>
@@ -43833,7 +44848,7 @@
                 <w:sz w:val="16"/>
                 <w:szCs w:val="16"/>
               </w:rPr>
-              <w:t xml:space="preserve">feedback / feedback_items</w:t>
+              <w:t xml:space="preserve">application_accommodation</w:t>
             </w:r>
           </w:p>
         </w:tc>
@@ -43862,7 +44877,7 @@
                 <w:sz w:val="16"/>
                 <w:szCs w:val="16"/>
               </w:rPr>
-              <w:t xml:space="preserve">id, application_id, comments, is_hidden / id, feedback_id, accommodation_id, rating</w:t>
+              <w:t xml:space="preserve">application_id, accommodation_id</w:t>
             </w:r>
           </w:p>
         </w:tc>
@@ -43891,7 +44906,7 @@
                 <w:sz w:val="16"/>
                 <w:szCs w:val="16"/>
               </w:rPr>
-              <w:t xml:space="preserve">One feedback per application; one rating per accommodation recorded at hire; hidden feedback leaves the score</w:t>
+              <w:t xml:space="preserve">Pivot: the posting's accommodations recorded when the application becomes hired (the items the candidate rates)</w:t>
             </w:r>
           </w:p>
         </w:tc>
@@ -43922,7 +44937,7 @@
                 <w:sz w:val="16"/>
                 <w:szCs w:val="16"/>
               </w:rPr>
-              <w:t xml:space="preserve">notifications</w:t>
+              <w:t xml:space="preserve">feedback / feedback_items</w:t>
             </w:r>
           </w:p>
         </w:tc>
@@ -43951,7 +44966,7 @@
                 <w:sz w:val="16"/>
                 <w:szCs w:val="16"/>
               </w:rPr>
-              <w:t xml:space="preserve">Laravel notifications table: id (UUID), type, notifiable, data (message, url, ids), read_at</w:t>
+              <w:t xml:space="preserve">id, application_id, comments, is_hidden / id, feedback_id, accommodation_id, rating</w:t>
             </w:r>
           </w:p>
         </w:tc>
@@ -43980,7 +44995,7 @@
                 <w:sz w:val="16"/>
                 <w:szCs w:val="16"/>
               </w:rPr>
-              <w:t xml:space="preserve">In-app notices for candidates and employers</w:t>
+              <w:t xml:space="preserve">One feedback per application; one rating per accommodation recorded at hire; hidden feedback leaves the score</w:t>
             </w:r>
           </w:p>
         </w:tc>
@@ -44011,7 +45026,7 @@
                 <w:sz w:val="16"/>
                 <w:szCs w:val="16"/>
               </w:rPr>
-              <w:t xml:space="preserve">reports</w:t>
+              <w:t xml:space="preserve">notifications</w:t>
             </w:r>
           </w:p>
         </w:tc>
@@ -44040,7 +45055,7 @@
                 <w:sz w:val="16"/>
                 <w:szCs w:val="16"/>
               </w:rPr>
-              <w:t xml:space="preserve">id, reporter_id, job_posting_id, reason, status, note, resolved_by, resolved_at, timestamps</w:t>
+              <w:t xml:space="preserve">Laravel notifications table: id (time-ordered UUIDv7), type, notifiable, data (message, url, ids), read_at</w:t>
             </w:r>
           </w:p>
         </w:tc>
@@ -44069,22 +45084,7 @@
                 <w:sz w:val="16"/>
                 <w:szCs w:val="16"/>
               </w:rPr>
-              <w:t xml:space="preserve">One open report per candidate and posting; </w:t>
-            </w:r>
-            <w:r>
-              <w:rPr>
-                <w:rFonts w:ascii="Consolas" w:cs="Consolas" w:eastAsia="Consolas" w:hAnsi="Consolas"/>
-                <w:sz w:val="16"/>
-                <w:szCs w:val="16"/>
-              </w:rPr>
-              <w:t xml:space="preserve">note</w:t>
-            </w:r>
-            <w:r>
-              <w:rPr>
-                <w:sz w:val="16"/>
-                <w:szCs w:val="16"/>
-              </w:rPr>
-              <w:t xml:space="preserve"> and resolver set only when an administrator resolves it</w:t>
+              <w:t xml:space="preserve">In-app notices for candidates and employers; the same notice is emailed when the user's emails are on</w:t>
             </w:r>
           </w:p>
         </w:tc>
@@ -44115,6 +45115,110 @@
                 <w:sz w:val="16"/>
                 <w:szCs w:val="16"/>
               </w:rPr>
+              <w:t xml:space="preserve">reports</w:t>
+            </w:r>
+          </w:p>
+        </w:tc>
+        <w:tc>
+          <w:tcPr>
+            <w:tcW w:type="dxa" w:w="4900"/>
+            <w:tcBorders>
+              <w:top w:val="single" w:color="7F7F7F" w:sz="4"/>
+              <w:left w:val="single" w:color="7F7F7F" w:sz="4"/>
+              <w:bottom w:val="single" w:color="7F7F7F" w:sz="4"/>
+              <w:right w:val="single" w:color="7F7F7F" w:sz="4"/>
+            </w:tcBorders>
+            <w:tcMar>
+              <w:top w:type="dxa" w:w="60"/>
+              <w:left w:type="dxa" w:w="100"/>
+              <w:bottom w:type="dxa" w:w="60"/>
+              <w:right w:type="dxa" w:w="100"/>
+            </w:tcMar>
+          </w:tcPr>
+          <w:p>
+            <w:pPr>
+              <w:spacing w:after="20"/>
+            </w:pPr>
+            <w:r>
+              <w:rPr>
+                <w:sz w:val="16"/>
+                <w:szCs w:val="16"/>
+              </w:rPr>
+              <w:t xml:space="preserve">id, reporter_id, job_posting_id, reason, status, note, resolved_by, resolved_at, timestamps</w:t>
+            </w:r>
+          </w:p>
+        </w:tc>
+        <w:tc>
+          <w:tcPr>
+            <w:tcW w:type="dxa" w:w="2880"/>
+            <w:tcBorders>
+              <w:top w:val="single" w:color="7F7F7F" w:sz="4"/>
+              <w:left w:val="single" w:color="7F7F7F" w:sz="4"/>
+              <w:bottom w:val="single" w:color="7F7F7F" w:sz="4"/>
+              <w:right w:val="single" w:color="7F7F7F" w:sz="4"/>
+            </w:tcBorders>
+            <w:tcMar>
+              <w:top w:type="dxa" w:w="60"/>
+              <w:left w:type="dxa" w:w="100"/>
+              <w:bottom w:type="dxa" w:w="60"/>
+              <w:right w:type="dxa" w:w="100"/>
+            </w:tcMar>
+          </w:tcPr>
+          <w:p>
+            <w:pPr>
+              <w:spacing w:after="20"/>
+            </w:pPr>
+            <w:r>
+              <w:rPr>
+                <w:sz w:val="16"/>
+                <w:szCs w:val="16"/>
+              </w:rPr>
+              <w:t xml:space="preserve">One open report per candidate and posting; </w:t>
+            </w:r>
+            <w:r>
+              <w:rPr>
+                <w:rFonts w:ascii="Consolas" w:cs="Consolas" w:eastAsia="Consolas" w:hAnsi="Consolas"/>
+                <w:sz w:val="16"/>
+                <w:szCs w:val="16"/>
+              </w:rPr>
+              <w:t xml:space="preserve">note</w:t>
+            </w:r>
+            <w:r>
+              <w:rPr>
+                <w:sz w:val="16"/>
+                <w:szCs w:val="16"/>
+              </w:rPr>
+              <w:t xml:space="preserve"> and resolver set only when an administrator resolves it</w:t>
+            </w:r>
+          </w:p>
+        </w:tc>
+      </w:tr>
+      <w:tr>
+        <w:tc>
+          <w:tcPr>
+            <w:tcW w:type="dxa" w:w="2300"/>
+            <w:tcBorders>
+              <w:top w:val="single" w:color="7F7F7F" w:sz="4"/>
+              <w:left w:val="single" w:color="7F7F7F" w:sz="4"/>
+              <w:bottom w:val="single" w:color="7F7F7F" w:sz="4"/>
+              <w:right w:val="single" w:color="7F7F7F" w:sz="4"/>
+            </w:tcBorders>
+            <w:tcMar>
+              <w:top w:type="dxa" w:w="60"/>
+              <w:left w:type="dxa" w:w="100"/>
+              <w:bottom w:type="dxa" w:w="60"/>
+              <w:right w:type="dxa" w:w="100"/>
+            </w:tcMar>
+          </w:tcPr>
+          <w:p>
+            <w:pPr>
+              <w:spacing w:after="20"/>
+            </w:pPr>
+            <w:r>
+              <w:rPr>
+                <w:sz w:val="16"/>
+                <w:szCs w:val="16"/>
+              </w:rPr>
               <w:t xml:space="preserve">saved_jobs</w:t>
             </w:r>
           </w:p>
@@ -44174,6 +45278,95 @@
                 <w:szCs w:val="16"/>
               </w:rPr>
               <w:t xml:space="preserve">Composite primary key; bookmarks kept when a posting closes and listed again if it reopens</w:t>
+            </w:r>
+          </w:p>
+        </w:tc>
+      </w:tr>
+      <w:tr>
+        <w:tc>
+          <w:tcPr>
+            <w:tcW w:type="dxa" w:w="2300"/>
+            <w:tcBorders>
+              <w:top w:val="single" w:color="7F7F7F" w:sz="4"/>
+              <w:left w:val="single" w:color="7F7F7F" w:sz="4"/>
+              <w:bottom w:val="single" w:color="7F7F7F" w:sz="4"/>
+              <w:right w:val="single" w:color="7F7F7F" w:sz="4"/>
+            </w:tcBorders>
+            <w:tcMar>
+              <w:top w:type="dxa" w:w="60"/>
+              <w:left w:type="dxa" w:w="100"/>
+              <w:bottom w:type="dxa" w:w="60"/>
+              <w:right w:type="dxa" w:w="100"/>
+            </w:tcMar>
+          </w:tcPr>
+          <w:p>
+            <w:pPr>
+              <w:spacing w:after="20"/>
+            </w:pPr>
+            <w:r>
+              <w:rPr>
+                <w:sz w:val="16"/>
+                <w:szCs w:val="16"/>
+              </w:rPr>
+              <w:t xml:space="preserve">jobs / failed_jobs</w:t>
+            </w:r>
+          </w:p>
+        </w:tc>
+        <w:tc>
+          <w:tcPr>
+            <w:tcW w:type="dxa" w:w="4900"/>
+            <w:tcBorders>
+              <w:top w:val="single" w:color="7F7F7F" w:sz="4"/>
+              <w:left w:val="single" w:color="7F7F7F" w:sz="4"/>
+              <w:bottom w:val="single" w:color="7F7F7F" w:sz="4"/>
+              <w:right w:val="single" w:color="7F7F7F" w:sz="4"/>
+            </w:tcBorders>
+            <w:tcMar>
+              <w:top w:type="dxa" w:w="60"/>
+              <w:left w:type="dxa" w:w="100"/>
+              <w:bottom w:type="dxa" w:w="60"/>
+              <w:right w:type="dxa" w:w="100"/>
+            </w:tcMar>
+          </w:tcPr>
+          <w:p>
+            <w:pPr>
+              <w:spacing w:after="20"/>
+            </w:pPr>
+            <w:r>
+              <w:rPr>
+                <w:sz w:val="16"/>
+                <w:szCs w:val="16"/>
+              </w:rPr>
+              <w:t xml:space="preserve">Laravel database queue tables</w:t>
+            </w:r>
+          </w:p>
+        </w:tc>
+        <w:tc>
+          <w:tcPr>
+            <w:tcW w:type="dxa" w:w="2880"/>
+            <w:tcBorders>
+              <w:top w:val="single" w:color="7F7F7F" w:sz="4"/>
+              <w:left w:val="single" w:color="7F7F7F" w:sz="4"/>
+              <w:bottom w:val="single" w:color="7F7F7F" w:sz="4"/>
+              <w:right w:val="single" w:color="7F7F7F" w:sz="4"/>
+            </w:tcBorders>
+            <w:tcMar>
+              <w:top w:type="dxa" w:w="60"/>
+              <w:left w:type="dxa" w:w="100"/>
+              <w:bottom w:type="dxa" w:w="60"/>
+              <w:right w:type="dxa" w:w="100"/>
+            </w:tcMar>
+          </w:tcPr>
+          <w:p>
+            <w:pPr>
+              <w:spacing w:after="20"/>
+            </w:pPr>
+            <w:r>
+              <w:rPr>
+                <w:sz w:val="16"/>
+                <w:szCs w:val="16"/>
+              </w:rPr>
+              <w:t xml:space="preserve">Queued password-reset emails, worked by the scheduler every minute</w:t>
             </w:r>
           </w:p>
         </w:tc>
@@ -44394,6 +45587,284 @@
                 <w:szCs w:val="16"/>
               </w:rPr>
               <w:t xml:space="preserve">admin</w:t>
+            </w:r>
+          </w:p>
+        </w:tc>
+      </w:tr>
+      <w:tr>
+        <w:tc>
+          <w:tcPr>
+            <w:tcW w:type="dxa" w:w="3000"/>
+            <w:tcBorders>
+              <w:top w:val="single" w:color="7F7F7F" w:sz="4"/>
+              <w:left w:val="single" w:color="7F7F7F" w:sz="4"/>
+              <w:bottom w:val="single" w:color="7F7F7F" w:sz="4"/>
+              <w:right w:val="single" w:color="7F7F7F" w:sz="4"/>
+            </w:tcBorders>
+            <w:shd w:fill="F2F2F2" w:color="auto" w:val="clear"/>
+            <w:tcMar>
+              <w:top w:type="dxa" w:w="60"/>
+              <w:left w:type="dxa" w:w="100"/>
+              <w:bottom w:type="dxa" w:w="60"/>
+              <w:right w:type="dxa" w:w="100"/>
+            </w:tcMar>
+          </w:tcPr>
+          <w:p>
+            <w:pPr>
+              <w:spacing w:after="20"/>
+            </w:pPr>
+            <w:r>
+              <w:rPr>
+                <w:b/>
+                <w:bCs/>
+                <w:sz w:val="18"/>
+                <w:szCs w:val="18"/>
+              </w:rPr>
+              <w:t xml:space="preserve">users.display_prefs</w:t>
+            </w:r>
+          </w:p>
+        </w:tc>
+        <w:tc>
+          <w:tcPr>
+            <w:tcW w:type="dxa" w:w="7080"/>
+            <w:tcBorders>
+              <w:top w:val="single" w:color="7F7F7F" w:sz="4"/>
+              <w:left w:val="single" w:color="7F7F7F" w:sz="4"/>
+              <w:bottom w:val="single" w:color="7F7F7F" w:sz="4"/>
+              <w:right w:val="single" w:color="7F7F7F" w:sz="4"/>
+            </w:tcBorders>
+            <w:tcMar>
+              <w:top w:type="dxa" w:w="60"/>
+              <w:left w:type="dxa" w:w="100"/>
+              <w:bottom w:type="dxa" w:w="60"/>
+              <w:right w:type="dxa" w:w="100"/>
+            </w:tcMar>
+          </w:tcPr>
+          <w:p>
+            <w:pPr>
+              <w:spacing w:after="20"/>
+            </w:pPr>
+            <w:r>
+              <w:rPr>
+                <w:rFonts w:ascii="Consolas" w:cs="Consolas" w:eastAsia="Consolas" w:hAnsi="Consolas"/>
+                <w:sz w:val="16"/>
+                <w:szCs w:val="16"/>
+              </w:rPr>
+              <w:t xml:space="preserve">text_size</w:t>
+            </w:r>
+            <w:r>
+              <w:rPr>
+                <w:sz w:val="16"/>
+                <w:szCs w:val="16"/>
+              </w:rPr>
+              <w:t xml:space="preserve">: 100, 125, 150 · </w:t>
+            </w:r>
+            <w:r>
+              <w:rPr>
+                <w:rFonts w:ascii="Consolas" w:cs="Consolas" w:eastAsia="Consolas" w:hAnsi="Consolas"/>
+                <w:sz w:val="16"/>
+                <w:szCs w:val="16"/>
+              </w:rPr>
+              <w:t xml:space="preserve">contrast</w:t>
+            </w:r>
+            <w:r>
+              <w:rPr>
+                <w:sz w:val="16"/>
+                <w:szCs w:val="16"/>
+              </w:rPr>
+              <w:t xml:space="preserve">: </w:t>
+            </w:r>
+            <w:r>
+              <w:rPr>
+                <w:rFonts w:ascii="Consolas" w:cs="Consolas" w:eastAsia="Consolas" w:hAnsi="Consolas"/>
+                <w:sz w:val="16"/>
+                <w:szCs w:val="16"/>
+              </w:rPr>
+              <w:t xml:space="preserve">normal</w:t>
+            </w:r>
+            <w:r>
+              <w:rPr>
+                <w:sz w:val="16"/>
+                <w:szCs w:val="16"/>
+              </w:rPr>
+              <w:t xml:space="preserve">, </w:t>
+            </w:r>
+            <w:r>
+              <w:rPr>
+                <w:rFonts w:ascii="Consolas" w:cs="Consolas" w:eastAsia="Consolas" w:hAnsi="Consolas"/>
+                <w:sz w:val="16"/>
+                <w:szCs w:val="16"/>
+              </w:rPr>
+              <w:t xml:space="preserve">high</w:t>
+            </w:r>
+            <w:r>
+              <w:rPr>
+                <w:sz w:val="16"/>
+                <w:szCs w:val="16"/>
+              </w:rPr>
+              <w:t xml:space="preserve"> · </w:t>
+            </w:r>
+            <w:r>
+              <w:rPr>
+                <w:rFonts w:ascii="Consolas" w:cs="Consolas" w:eastAsia="Consolas" w:hAnsi="Consolas"/>
+                <w:sz w:val="16"/>
+                <w:szCs w:val="16"/>
+              </w:rPr>
+              <w:t xml:space="preserve">motion</w:t>
+            </w:r>
+            <w:r>
+              <w:rPr>
+                <w:sz w:val="16"/>
+                <w:szCs w:val="16"/>
+              </w:rPr>
+              <w:t xml:space="preserve">: </w:t>
+            </w:r>
+            <w:r>
+              <w:rPr>
+                <w:rFonts w:ascii="Consolas" w:cs="Consolas" w:eastAsia="Consolas" w:hAnsi="Consolas"/>
+                <w:sz w:val="16"/>
+                <w:szCs w:val="16"/>
+              </w:rPr>
+              <w:t xml:space="preserve">normal</w:t>
+            </w:r>
+            <w:r>
+              <w:rPr>
+                <w:sz w:val="16"/>
+                <w:szCs w:val="16"/>
+              </w:rPr>
+              <w:t xml:space="preserve">, </w:t>
+            </w:r>
+            <w:r>
+              <w:rPr>
+                <w:rFonts w:ascii="Consolas" w:cs="Consolas" w:eastAsia="Consolas" w:hAnsi="Consolas"/>
+                <w:sz w:val="16"/>
+                <w:szCs w:val="16"/>
+              </w:rPr>
+              <w:t xml:space="preserve">reduce</w:t>
+            </w:r>
+          </w:p>
+        </w:tc>
+      </w:tr>
+      <w:tr>
+        <w:tc>
+          <w:tcPr>
+            <w:tcW w:type="dxa" w:w="3000"/>
+            <w:tcBorders>
+              <w:top w:val="single" w:color="7F7F7F" w:sz="4"/>
+              <w:left w:val="single" w:color="7F7F7F" w:sz="4"/>
+              <w:bottom w:val="single" w:color="7F7F7F" w:sz="4"/>
+              <w:right w:val="single" w:color="7F7F7F" w:sz="4"/>
+            </w:tcBorders>
+            <w:shd w:fill="F2F2F2" w:color="auto" w:val="clear"/>
+            <w:tcMar>
+              <w:top w:type="dxa" w:w="60"/>
+              <w:left w:type="dxa" w:w="100"/>
+              <w:bottom w:type="dxa" w:w="60"/>
+              <w:right w:type="dxa" w:w="100"/>
+            </w:tcMar>
+          </w:tcPr>
+          <w:p>
+            <w:pPr>
+              <w:spacing w:after="20"/>
+            </w:pPr>
+            <w:r>
+              <w:rPr>
+                <w:b/>
+                <w:bCs/>
+                <w:sz w:val="18"/>
+                <w:szCs w:val="18"/>
+              </w:rPr>
+              <w:t xml:space="preserve">notifications.type</w:t>
+            </w:r>
+          </w:p>
+        </w:tc>
+        <w:tc>
+          <w:tcPr>
+            <w:tcW w:type="dxa" w:w="7080"/>
+            <w:tcBorders>
+              <w:top w:val="single" w:color="7F7F7F" w:sz="4"/>
+              <w:left w:val="single" w:color="7F7F7F" w:sz="4"/>
+              <w:bottom w:val="single" w:color="7F7F7F" w:sz="4"/>
+              <w:right w:val="single" w:color="7F7F7F" w:sz="4"/>
+            </w:tcBorders>
+            <w:tcMar>
+              <w:top w:type="dxa" w:w="60"/>
+              <w:left w:type="dxa" w:w="100"/>
+              <w:bottom w:type="dxa" w:w="60"/>
+              <w:right w:type="dxa" w:w="100"/>
+            </w:tcMar>
+          </w:tcPr>
+          <w:p>
+            <w:pPr>
+              <w:spacing w:after="20"/>
+            </w:pPr>
+            <w:r>
+              <w:rPr>
+                <w:rFonts w:ascii="Consolas" w:cs="Consolas" w:eastAsia="Consolas" w:hAnsi="Consolas"/>
+                <w:sz w:val="16"/>
+                <w:szCs w:val="16"/>
+              </w:rPr>
+              <w:t xml:space="preserve">application_received</w:t>
+            </w:r>
+            <w:r>
+              <w:rPr>
+                <w:sz w:val="16"/>
+                <w:szCs w:val="16"/>
+              </w:rPr>
+              <w:t xml:space="preserve">, </w:t>
+            </w:r>
+            <w:r>
+              <w:rPr>
+                <w:rFonts w:ascii="Consolas" w:cs="Consolas" w:eastAsia="Consolas" w:hAnsi="Consolas"/>
+                <w:sz w:val="16"/>
+                <w:szCs w:val="16"/>
+              </w:rPr>
+              <w:t xml:space="preserve">application_status_changed</w:t>
+            </w:r>
+            <w:r>
+              <w:rPr>
+                <w:sz w:val="16"/>
+                <w:szCs w:val="16"/>
+              </w:rPr>
+              <w:t xml:space="preserve">, </w:t>
+            </w:r>
+            <w:r>
+              <w:rPr>
+                <w:rFonts w:ascii="Consolas" w:cs="Consolas" w:eastAsia="Consolas" w:hAnsi="Consolas"/>
+                <w:sz w:val="16"/>
+                <w:szCs w:val="16"/>
+              </w:rPr>
+              <w:t xml:space="preserve">employer_verification</w:t>
+            </w:r>
+            <w:r>
+              <w:rPr>
+                <w:sz w:val="16"/>
+                <w:szCs w:val="16"/>
+              </w:rPr>
+              <w:t xml:space="preserve">, </w:t>
+            </w:r>
+            <w:r>
+              <w:rPr>
+                <w:rFonts w:ascii="Consolas" w:cs="Consolas" w:eastAsia="Consolas" w:hAnsi="Consolas"/>
+                <w:sz w:val="16"/>
+                <w:szCs w:val="16"/>
+              </w:rPr>
+              <w:t xml:space="preserve">posting_review</w:t>
+            </w:r>
+            <w:r>
+              <w:rPr>
+                <w:sz w:val="16"/>
+                <w:szCs w:val="16"/>
+              </w:rPr>
+              <w:t xml:space="preserve">, </w:t>
+            </w:r>
+            <w:r>
+              <w:rPr>
+                <w:rFonts w:ascii="Consolas" w:cs="Consolas" w:eastAsia="Consolas" w:hAnsi="Consolas"/>
+                <w:sz w:val="16"/>
+                <w:szCs w:val="16"/>
+              </w:rPr>
+              <w:t xml:space="preserve">feedback_reminder</w:t>
             </w:r>
           </w:p>
         </w:tc>

</xml_diff>

<commit_message>
docs(sia): Overpass failover, scheduler, email and password reset
4.4/5.3 Overpass 25 s per server, second server, background retry;
5.2 scheduler and email provider; 6.x password reset, CI secrets,
email and voice-input privacy.

Co-Authored-By: Claude Opus 5.5 <noreply@anthropic.com>
</commit_message>
<xml_diff>
--- a/docs/OpenDoor_SIA1_Final_Project_Documentation.docx
+++ b/docs/OpenDoor_SIA1_Final_Project_Documentation.docx
@@ -15087,7 +15087,37 @@
                 <w:sz w:val="16"/>
                 <w:szCs w:val="16"/>
               </w:rPr>
-              <w:t xml:space="preserve">Cached 24 h (point rounded to 4 decimals + radius); 429/504 pages, a </w:t>
+              <w:t xml:space="preserve">Cached 24 h (point rounded to 4 decimals + radius). Public servers are often overloaded, so the client waits up to 25 s per server (the query itself keeps </w:t>
+            </w:r>
+            <w:r>
+              <w:rPr>
+                <w:rFonts w:ascii="Consolas" w:cs="Consolas" w:eastAsia="Consolas" w:hAnsi="Consolas"/>
+                <w:sz w:val="16"/>
+                <w:szCs w:val="16"/>
+              </w:rPr>
+              <w:t xml:space="preserve">[timeout:8]</w:t>
+            </w:r>
+            <w:r>
+              <w:rPr>
+                <w:sz w:val="16"/>
+                <w:szCs w:val="16"/>
+              </w:rPr>
+              <w:t xml:space="preserve">) and asks a second, independent server (</w:t>
+            </w:r>
+            <w:r>
+              <w:rPr>
+                <w:rFonts w:ascii="Consolas" w:cs="Consolas" w:eastAsia="Consolas" w:hAnsi="Consolas"/>
+                <w:sz w:val="16"/>
+                <w:szCs w:val="16"/>
+              </w:rPr>
+              <w:t xml:space="preserve">OVERPASS_FALLBACK_URL</w:t>
+            </w:r>
+            <w:r>
+              <w:rPr>
+                <w:sz w:val="16"/>
+                <w:szCs w:val="16"/>
+              </w:rPr>
+              <w:t xml:space="preserve">) when the first fails or has not answered after 5 s – the first good answer wins and the other request is cancelled. 429/504 pages, a </w:t>
             </w:r>
             <w:r>
               <w:rPr>
@@ -15102,7 +15132,7 @@
                 <w:sz w:val="16"/>
                 <w:szCs w:val="16"/>
               </w:rPr>
-              <w:t xml:space="preserve"> remark or a timeout (8 s) count as failures and are never cached; then the last cached result is returned as </w:t>
+              <w:t xml:space="preserve"> remark or a timeout count as failures and are never cached; then the last cached result is returned as </w:t>
             </w:r>
             <w:r>
               <w:rPr>
@@ -15141,6 +15171,13 @@
                 <w:szCs w:val="16"/>
               </w:rPr>
               <w:t xml:space="preserve">unavailable</w:t>
+            </w:r>
+            <w:r>
+              <w:rPr>
+                <w:sz w:val="16"/>
+                <w:szCs w:val="16"/>
+              </w:rPr>
+              <w:t xml:space="preserve">. A place that failed or was served stale is fetched again in the background after 90 s, 5 min and 15 min until the cache is filled (at most 50 places at a time)</w:t>
             </w:r>
           </w:p>
         </w:tc>
@@ -18317,7 +18354,7 @@
                 <w:sz w:val="16"/>
                 <w:szCs w:val="16"/>
               </w:rPr>
-              <w:t xml:space="preserve">)</w:t>
+              <w:t xml:space="preserve">) on the main server; the second server after 5 s or a failure</w:t>
             </w:r>
           </w:p>
         </w:tc>
@@ -18390,7 +18427,7 @@
                 <w:sz w:val="16"/>
                 <w:szCs w:val="16"/>
               </w:rPr>
-              <w:t xml:space="preserve">Nearby accessible places cached 24 h</w:t>
+              <w:t xml:space="preserve">Nearby accessible places cached 24 h; a failed place is retried in the background</w:t>
             </w:r>
           </w:p>
         </w:tc>
@@ -18791,6 +18828,360 @@
                 <w:szCs w:val="16"/>
               </w:rPr>
               <w:t xml:space="preserve">); employer trust score and feedback count recalculated</w:t>
+            </w:r>
+          </w:p>
+        </w:tc>
+      </w:tr>
+      <w:tr>
+        <w:tc>
+          <w:tcPr>
+            <w:tcW w:type="dxa" w:w="1500"/>
+            <w:tcBorders>
+              <w:top w:val="single" w:color="7F7F7F" w:sz="4"/>
+              <w:left w:val="single" w:color="7F7F7F" w:sz="4"/>
+              <w:bottom w:val="single" w:color="7F7F7F" w:sz="4"/>
+              <w:right w:val="single" w:color="7F7F7F" w:sz="4"/>
+            </w:tcBorders>
+            <w:tcMar>
+              <w:top w:type="dxa" w:w="60"/>
+              <w:left w:type="dxa" w:w="100"/>
+              <w:bottom w:type="dxa" w:w="60"/>
+              <w:right w:type="dxa" w:w="100"/>
+            </w:tcMar>
+          </w:tcPr>
+          <w:p>
+            <w:pPr>
+              <w:spacing w:after="20"/>
+            </w:pPr>
+            <w:r>
+              <w:rPr>
+                <w:sz w:val="16"/>
+                <w:szCs w:val="16"/>
+              </w:rPr>
+              <w:t xml:space="preserve">Core scheduler</w:t>
+            </w:r>
+          </w:p>
+        </w:tc>
+        <w:tc>
+          <w:tcPr>
+            <w:tcW w:type="dxa" w:w="1600"/>
+            <w:tcBorders>
+              <w:top w:val="single" w:color="7F7F7F" w:sz="4"/>
+              <w:left w:val="single" w:color="7F7F7F" w:sz="4"/>
+              <w:bottom w:val="single" w:color="7F7F7F" w:sz="4"/>
+              <w:right w:val="single" w:color="7F7F7F" w:sz="4"/>
+            </w:tcBorders>
+            <w:tcMar>
+              <w:top w:type="dxa" w:w="60"/>
+              <w:left w:type="dxa" w:w="100"/>
+              <w:bottom w:type="dxa" w:w="60"/>
+              <w:right w:type="dxa" w:w="100"/>
+            </w:tcMar>
+          </w:tcPr>
+          <w:p>
+            <w:pPr>
+              <w:spacing w:after="20"/>
+            </w:pPr>
+            <w:r>
+              <w:rPr>
+                <w:sz w:val="16"/>
+                <w:szCs w:val="16"/>
+              </w:rPr>
+              <w:t xml:space="preserve">Core Service (commands)</w:t>
+            </w:r>
+          </w:p>
+        </w:tc>
+        <w:tc>
+          <w:tcPr>
+            <w:tcW w:type="dxa" w:w="2600"/>
+            <w:tcBorders>
+              <w:top w:val="single" w:color="7F7F7F" w:sz="4"/>
+              <w:left w:val="single" w:color="7F7F7F" w:sz="4"/>
+              <w:bottom w:val="single" w:color="7F7F7F" w:sz="4"/>
+              <w:right w:val="single" w:color="7F7F7F" w:sz="4"/>
+            </w:tcBorders>
+            <w:tcMar>
+              <w:top w:type="dxa" w:w="60"/>
+              <w:left w:type="dxa" w:w="100"/>
+              <w:bottom w:type="dxa" w:w="60"/>
+              <w:right w:type="dxa" w:w="100"/>
+            </w:tcMar>
+          </w:tcPr>
+          <w:p>
+            <w:pPr>
+              <w:spacing w:after="20"/>
+            </w:pPr>
+            <w:r>
+              <w:rPr>
+                <w:sz w:val="16"/>
+                <w:szCs w:val="16"/>
+              </w:rPr>
+              <w:t xml:space="preserve">Daily 00:05 </w:t>
+            </w:r>
+            <w:r>
+              <w:rPr>
+                <w:rFonts w:ascii="Consolas" w:cs="Consolas" w:eastAsia="Consolas" w:hAnsi="Consolas"/>
+                <w:sz w:val="16"/>
+                <w:szCs w:val="16"/>
+              </w:rPr>
+              <w:t xml:space="preserve">postings:close-expired</w:t>
+            </w:r>
+            <w:r>
+              <w:rPr>
+                <w:sz w:val="16"/>
+                <w:szCs w:val="16"/>
+              </w:rPr>
+              <w:t xml:space="preserve">; daily 08:00 </w:t>
+            </w:r>
+            <w:r>
+              <w:rPr>
+                <w:rFonts w:ascii="Consolas" w:cs="Consolas" w:eastAsia="Consolas" w:hAnsi="Consolas"/>
+                <w:sz w:val="16"/>
+                <w:szCs w:val="16"/>
+              </w:rPr>
+              <w:t xml:space="preserve">feedback:remind</w:t>
+            </w:r>
+            <w:r>
+              <w:rPr>
+                <w:sz w:val="16"/>
+                <w:szCs w:val="16"/>
+              </w:rPr>
+              <w:t xml:space="preserve">; every minute the database queue worker</w:t>
+            </w:r>
+          </w:p>
+        </w:tc>
+        <w:tc>
+          <w:tcPr>
+            <w:tcW w:type="dxa" w:w="2180"/>
+            <w:tcBorders>
+              <w:top w:val="single" w:color="7F7F7F" w:sz="4"/>
+              <w:left w:val="single" w:color="7F7F7F" w:sz="4"/>
+              <w:bottom w:val="single" w:color="7F7F7F" w:sz="4"/>
+              <w:right w:val="single" w:color="7F7F7F" w:sz="4"/>
+            </w:tcBorders>
+            <w:tcMar>
+              <w:top w:type="dxa" w:w="60"/>
+              <w:left w:type="dxa" w:w="100"/>
+              <w:bottom w:type="dxa" w:w="60"/>
+              <w:right w:type="dxa" w:w="100"/>
+            </w:tcMar>
+          </w:tcPr>
+          <w:p>
+            <w:pPr>
+              <w:spacing w:after="20"/>
+            </w:pPr>
+            <w:r>
+              <w:rPr>
+                <w:sz w:val="16"/>
+                <w:szCs w:val="16"/>
+              </w:rPr>
+              <w:t xml:space="preserve">Postings past their closing date; hired applications whose rating opens today; queued reset-link jobs</w:t>
+            </w:r>
+          </w:p>
+        </w:tc>
+        <w:tc>
+          <w:tcPr>
+            <w:tcW w:type="dxa" w:w="2200"/>
+            <w:tcBorders>
+              <w:top w:val="single" w:color="7F7F7F" w:sz="4"/>
+              <w:left w:val="single" w:color="7F7F7F" w:sz="4"/>
+              <w:bottom w:val="single" w:color="7F7F7F" w:sz="4"/>
+              <w:right w:val="single" w:color="7F7F7F" w:sz="4"/>
+            </w:tcBorders>
+            <w:tcMar>
+              <w:top w:type="dxa" w:w="60"/>
+              <w:left w:type="dxa" w:w="100"/>
+              <w:bottom w:type="dxa" w:w="60"/>
+              <w:right w:type="dxa" w:w="100"/>
+            </w:tcMar>
+          </w:tcPr>
+          <w:p>
+            <w:pPr>
+              <w:spacing w:after="20"/>
+            </w:pPr>
+            <w:r>
+              <w:rPr>
+                <w:sz w:val="16"/>
+                <w:szCs w:val="16"/>
+              </w:rPr>
+              <w:t xml:space="preserve">Postings closed; </w:t>
+            </w:r>
+            <w:r>
+              <w:rPr>
+                <w:rFonts w:ascii="Consolas" w:cs="Consolas" w:eastAsia="Consolas" w:hAnsi="Consolas"/>
+                <w:sz w:val="16"/>
+                <w:szCs w:val="16"/>
+              </w:rPr>
+              <w:t xml:space="preserve">feedback_reminder</w:t>
+            </w:r>
+            <w:r>
+              <w:rPr>
+                <w:sz w:val="16"/>
+                <w:szCs w:val="16"/>
+              </w:rPr>
+              <w:t xml:space="preserve"> notice to the hired candidate (once); password-reset emails sent within about a minute</w:t>
+            </w:r>
+          </w:p>
+        </w:tc>
+      </w:tr>
+      <w:tr>
+        <w:tc>
+          <w:tcPr>
+            <w:tcW w:type="dxa" w:w="1500"/>
+            <w:tcBorders>
+              <w:top w:val="single" w:color="7F7F7F" w:sz="4"/>
+              <w:left w:val="single" w:color="7F7F7F" w:sz="4"/>
+              <w:bottom w:val="single" w:color="7F7F7F" w:sz="4"/>
+              <w:right w:val="single" w:color="7F7F7F" w:sz="4"/>
+            </w:tcBorders>
+            <w:tcMar>
+              <w:top w:type="dxa" w:w="60"/>
+              <w:left w:type="dxa" w:w="100"/>
+              <w:bottom w:type="dxa" w:w="60"/>
+              <w:right w:type="dxa" w:w="100"/>
+            </w:tcMar>
+          </w:tcPr>
+          <w:p>
+            <w:pPr>
+              <w:spacing w:after="20"/>
+            </w:pPr>
+            <w:r>
+              <w:rPr>
+                <w:sz w:val="16"/>
+                <w:szCs w:val="16"/>
+              </w:rPr>
+              <w:t xml:space="preserve">Core Service</w:t>
+            </w:r>
+          </w:p>
+        </w:tc>
+        <w:tc>
+          <w:tcPr>
+            <w:tcW w:type="dxa" w:w="1600"/>
+            <w:tcBorders>
+              <w:top w:val="single" w:color="7F7F7F" w:sz="4"/>
+              <w:left w:val="single" w:color="7F7F7F" w:sz="4"/>
+              <w:bottom w:val="single" w:color="7F7F7F" w:sz="4"/>
+              <w:right w:val="single" w:color="7F7F7F" w:sz="4"/>
+            </w:tcBorders>
+            <w:tcMar>
+              <w:top w:type="dxa" w:w="60"/>
+              <w:left w:type="dxa" w:w="100"/>
+              <w:bottom w:type="dxa" w:w="60"/>
+              <w:right w:type="dxa" w:w="100"/>
+            </w:tcMar>
+          </w:tcPr>
+          <w:p>
+            <w:pPr>
+              <w:spacing w:after="20"/>
+            </w:pPr>
+            <w:r>
+              <w:rPr>
+                <w:sz w:val="16"/>
+                <w:szCs w:val="16"/>
+              </w:rPr>
+              <w:t xml:space="preserve">Email provider (external)</w:t>
+            </w:r>
+          </w:p>
+        </w:tc>
+        <w:tc>
+          <w:tcPr>
+            <w:tcW w:type="dxa" w:w="2600"/>
+            <w:tcBorders>
+              <w:top w:val="single" w:color="7F7F7F" w:sz="4"/>
+              <w:left w:val="single" w:color="7F7F7F" w:sz="4"/>
+              <w:bottom w:val="single" w:color="7F7F7F" w:sz="4"/>
+              <w:right w:val="single" w:color="7F7F7F" w:sz="4"/>
+            </w:tcBorders>
+            <w:tcMar>
+              <w:top w:type="dxa" w:w="60"/>
+              <w:left w:type="dxa" w:w="100"/>
+              <w:bottom w:type="dxa" w:w="60"/>
+              <w:right w:type="dxa" w:w="100"/>
+            </w:tcMar>
+          </w:tcPr>
+          <w:p>
+            <w:pPr>
+              <w:spacing w:after="20"/>
+            </w:pPr>
+            <w:r>
+              <w:rPr>
+                <w:sz w:val="16"/>
+                <w:szCs w:val="16"/>
+              </w:rPr>
+              <w:t xml:space="preserve">Every in-app notice of a user whose emails are on (sent after the HTTP response); </w:t>
+            </w:r>
+            <w:r>
+              <w:rPr>
+                <w:rFonts w:ascii="Consolas" w:cs="Consolas" w:eastAsia="Consolas" w:hAnsi="Consolas"/>
+                <w:sz w:val="16"/>
+                <w:szCs w:val="16"/>
+              </w:rPr>
+              <w:t xml:space="preserve">POST /api/forgot-password</w:t>
+            </w:r>
+            <w:r>
+              <w:rPr>
+                <w:sz w:val="16"/>
+                <w:szCs w:val="16"/>
+              </w:rPr>
+              <w:t xml:space="preserve"> (queued job)</w:t>
+            </w:r>
+          </w:p>
+        </w:tc>
+        <w:tc>
+          <w:tcPr>
+            <w:tcW w:type="dxa" w:w="2180"/>
+            <w:tcBorders>
+              <w:top w:val="single" w:color="7F7F7F" w:sz="4"/>
+              <w:left w:val="single" w:color="7F7F7F" w:sz="4"/>
+              <w:bottom w:val="single" w:color="7F7F7F" w:sz="4"/>
+              <w:right w:val="single" w:color="7F7F7F" w:sz="4"/>
+            </w:tcBorders>
+            <w:tcMar>
+              <w:top w:type="dxa" w:w="60"/>
+              <w:left w:type="dxa" w:w="100"/>
+              <w:bottom w:type="dxa" w:w="60"/>
+              <w:right w:type="dxa" w:w="100"/>
+            </w:tcMar>
+          </w:tcPr>
+          <w:p>
+            <w:pPr>
+              <w:spacing w:after="20"/>
+            </w:pPr>
+            <w:r>
+              <w:rPr>
+                <w:sz w:val="16"/>
+                <w:szCs w:val="16"/>
+              </w:rPr>
+              <w:t xml:space="preserve">Subject, the notice text and a link to the page in OpenDoor – never disability or accommodation-need details; the reset link</w:t>
+            </w:r>
+          </w:p>
+        </w:tc>
+        <w:tc>
+          <w:tcPr>
+            <w:tcW w:type="dxa" w:w="2200"/>
+            <w:tcBorders>
+              <w:top w:val="single" w:color="7F7F7F" w:sz="4"/>
+              <w:left w:val="single" w:color="7F7F7F" w:sz="4"/>
+              <w:bottom w:val="single" w:color="7F7F7F" w:sz="4"/>
+              <w:right w:val="single" w:color="7F7F7F" w:sz="4"/>
+            </w:tcBorders>
+            <w:tcMar>
+              <w:top w:type="dxa" w:w="60"/>
+              <w:left w:type="dxa" w:w="100"/>
+              <w:bottom w:type="dxa" w:w="60"/>
+              <w:right w:type="dxa" w:w="100"/>
+            </w:tcMar>
+          </w:tcPr>
+          <w:p>
+            <w:pPr>
+              <w:spacing w:after="20"/>
+            </w:pPr>
+            <w:r>
+              <w:rPr>
+                <w:sz w:val="16"/>
+                <w:szCs w:val="16"/>
+              </w:rPr>
+              <w:t xml:space="preserve">Email delivered; a mail failure is logged and never fails the user's action; suspended accounts get no email</w:t>
             </w:r>
           </w:p>
         </w:tc>
@@ -20239,7 +20630,7 @@
                 <w:sz w:val="16"/>
                 <w:szCs w:val="16"/>
               </w:rPr>
-              <w:t xml:space="preserve">Over 120 requests/min per IP at the gateway, or over 5 login attempts/min; </w:t>
+              <w:t xml:space="preserve">Over 120 requests/min per IP at the gateway, or over 5 login or password-reset requests/min; </w:t>
             </w:r>
             <w:r>
               <w:rPr>
@@ -20898,7 +21289,7 @@
         <w:t xml:space="preserve">Graceful degradation.</w:t>
       </w:r>
       <w:r>
-        <w:t xml:space="preserve"> External and legacy integrations never block the core hiring transaction. The Insights Service uses per-source timeouts (Core 3 s, PSGC 5 s, Nominatim 5 s, Overpass 8 s) within a 12-second budget for the whole snapshot, returns HTTP 200 with whatever parts it could build, and reports each source as </w:t>
+        <w:t xml:space="preserve"> External and legacy integrations never block the core hiring transaction. The Insights Service uses per-source timeouts (Core 3 s, PSGC 5 s, Nominatim 5 s, Overpass 25 s per server with the second server asked after 5 s) within a 12-second budget for the whole snapshot – a later Overpass answer still fills the cache – returns HTTP 200 with whatever parts it could build, and reports each source as </w:t>
       </w:r>
       <w:r>
         <w:rPr>
@@ -20934,7 +21325,7 @@
         <w:t xml:space="preserve">unavailable</w:t>
       </w:r>
       <w:r>
-        <w:t xml:space="preserve">. A source that failed is skipped for 60 seconds (cooldown), so during an outage each request waits for at most one timeout and is answered from the cache. The client explains each gap in plain language (for example "Nearby places could not be loaded right now. Please check again later." or, with city-level coordinates, that distances are measured from the city centre). If the snapshot fails (503) or the Insights Service itself is down, the job details page still renders the posting, match result and trust score from the Core Service and the snapshot section shows a short warning. If the Business Registry is down, administrators can still verify manually and the check can be repeated. Neither the gateway nor the services retry a call automatically; the user or administrator repeats the action.</w:t>
+        <w:t xml:space="preserve">. A source that failed is skipped for 60 seconds (cooldown), so during an outage each request waits for at most one timeout and is answered from the cache. The client explains each gap in plain language (for example "Nearby places could not be loaded right now. Please check again later." or, with city-level coordinates, that distances are measured from the city centre). If the snapshot fails (503) or the Insights Service itself is down, the job details page still renders the posting, match result and trust score from the Core Service and the snapshot section shows a short warning. If the Business Registry is down, administrators can still verify manually and the check can be repeated. The gateway and the Core Service never retry a call automatically; the user or administrator repeats the action. The only automatic retries are in the Insights Service for Overpass (second server, background refresh of a failed place), because they only refresh cached map data and change nothing in the hiring records. Notification emails are sent after the response, so a slow or failing mail server never delays or breaks the action.</w:t>
       </w:r>
     </w:p>
     <w:p>
@@ -21016,10 +21407,19 @@
           <w:b/>
           <w:bCs/>
         </w:rPr>
-        <w:t xml:space="preserve">Administrators</w:t>
-      </w:r>
-      <w:r>
-        <w:t xml:space="preserve"> are never self-registered; they are created by the seeder or by another administrator.</w:t>
+        <w:t xml:space="preserve">Forgotten passwords:</w:t>
+      </w:r>
+      <w:r>
+        <w:t xml:space="preserve"> </w:t>
+      </w:r>
+      <w:r>
+        <w:rPr>
+          <w:rFonts w:ascii="Consolas" w:cs="Consolas" w:eastAsia="Consolas" w:hAnsi="Consolas"/>
+        </w:rPr>
+        <w:t xml:space="preserve">POST /api/forgot-password</w:t>
+      </w:r>
+      <w:r>
+        <w:t xml:space="preserve"> gives the same answer for every email and only queues a job, so neither the message nor the response time reveals whether an account exists (an OpenDoor account hints at a disability – RA 10173). The job emails a link to active accounts only; the link is valid for 60 minutes and can be used once, the reset signs the user out on every device, and both endpoints allow 5 requests per minute. The reset email is a security message, so it is sent even when notification emails are turned off.</w:t>
       </w:r>
     </w:p>
     <w:p>
@@ -21036,10 +21436,10 @@
           <w:b/>
           <w:bCs/>
         </w:rPr>
-        <w:t xml:space="preserve">Gateway → services:</w:t>
-      </w:r>
-      <w:r>
-        <w:t xml:space="preserve"> the gateway forwards the bearer token unchanged; the Core Service validates it (the gateway does not trust or decode it).</w:t>
+        <w:t xml:space="preserve">Administrators</w:t>
+      </w:r>
+      <w:r>
+        <w:t xml:space="preserve"> are never self-registered; they are created by the seeder or by another administrator.</w:t>
       </w:r>
     </w:p>
     <w:p>
@@ -21056,28 +21456,10 @@
           <w:b/>
           <w:bCs/>
         </w:rPr>
-        <w:t xml:space="preserve">Insights → Core (service-to-service):</w:t>
-      </w:r>
-      <w:r>
-        <w:t xml:space="preserve"> internal endpoints under </w:t>
-      </w:r>
-      <w:r>
-        <w:rPr>
-          <w:rFonts w:ascii="Consolas" w:cs="Consolas" w:eastAsia="Consolas" w:hAnsi="Consolas"/>
-        </w:rPr>
-        <w:t xml:space="preserve">/internal/*</w:t>
-      </w:r>
-      <w:r>
-        <w:t xml:space="preserve"> are not routed by the gateway and require an </w:t>
-      </w:r>
-      <w:r>
-        <w:rPr>
-          <w:rFonts w:ascii="Consolas" w:cs="Consolas" w:eastAsia="Consolas" w:hAnsi="Consolas"/>
-        </w:rPr>
-        <w:t xml:space="preserve">X-Service-Key</w:t>
-      </w:r>
-      <w:r>
-        <w:t xml:space="preserve"> header whose value is a shared secret held only by the two services; requests without it receive 401.</w:t>
+        <w:t xml:space="preserve">Gateway → services:</w:t>
+      </w:r>
+      <w:r>
+        <w:t xml:space="preserve"> the gateway forwards the bearer token unchanged; the Core Service validates it (the gateway does not trust or decode it).</w:t>
       </w:r>
     </w:p>
     <w:p>
@@ -21094,141 +21476,28 @@
           <w:b/>
           <w:bCs/>
         </w:rPr>
-        <w:t xml:space="preserve">Core → Business Registry (legacy):</w:t>
-      </w:r>
-      <w:r>
-        <w:t xml:space="preserve"> a WS-Security </w:t>
+        <w:t xml:space="preserve">Insights → Core (service-to-service):</w:t>
+      </w:r>
+      <w:r>
+        <w:t xml:space="preserve"> internal endpoints under </w:t>
       </w:r>
       <w:r>
         <w:rPr>
           <w:rFonts w:ascii="Consolas" w:cs="Consolas" w:eastAsia="Consolas" w:hAnsi="Consolas"/>
         </w:rPr>
-        <w:t xml:space="preserve">UsernameToken</w:t>
-      </w:r>
-      <w:r>
-        <w:t xml:space="preserve"> in the SOAP header identifies the Core Service; the registry rejects missing or wrong credentials with a SOAP fault.</w:t>
-      </w:r>
-    </w:p>
-    <w:p>
-      <w:pPr>
-        <w:pStyle w:val="Heading2"/>
-      </w:pPr>
-      <w:r>
-        <w:t xml:space="preserve">6.2 Authorization</w:t>
-      </w:r>
-    </w:p>
-    <w:p>
-      <w:pPr>
-        <w:spacing w:after="120" w:line="276"/>
-      </w:pPr>
-      <w:r>
-        <w:t xml:space="preserve">Authorization is enforced on the server in three layers: (1) </w:t>
+        <w:t xml:space="preserve">/internal/*</w:t>
+      </w:r>
+      <w:r>
+        <w:t xml:space="preserve"> are not routed by the gateway and require an </w:t>
       </w:r>
       <w:r>
         <w:rPr>
           <w:rFonts w:ascii="Consolas" w:cs="Consolas" w:eastAsia="Consolas" w:hAnsi="Consolas"/>
         </w:rPr>
-        <w:t xml:space="preserve">auth:sanctum</w:t>
-      </w:r>
-      <w:r>
-        <w:t xml:space="preserve"> middleware requires a valid token; (2) a </w:t>
-      </w:r>
-      <w:r>
-        <w:rPr>
-          <w:b/>
-          <w:bCs/>
-        </w:rPr>
-        <w:t xml:space="preserve">role middleware</w:t>
-      </w:r>
-      <w:r>
-        <w:t xml:space="preserve"> restricts route groups to </w:t>
-      </w:r>
-      <w:r>
-        <w:rPr>
-          <w:rFonts w:ascii="Consolas" w:cs="Consolas" w:eastAsia="Consolas" w:hAnsi="Consolas"/>
-        </w:rPr>
-        <w:t xml:space="preserve">candidate</w:t>
-      </w:r>
-      <w:r>
-        <w:t xml:space="preserve">, </w:t>
-      </w:r>
-      <w:r>
-        <w:rPr>
-          <w:rFonts w:ascii="Consolas" w:cs="Consolas" w:eastAsia="Consolas" w:hAnsi="Consolas"/>
-        </w:rPr>
-        <w:t xml:space="preserve">employer</w:t>
-      </w:r>
-      <w:r>
-        <w:t xml:space="preserve"> or </w:t>
-      </w:r>
-      <w:r>
-        <w:rPr>
-          <w:rFonts w:ascii="Consolas" w:cs="Consolas" w:eastAsia="Consolas" w:hAnsi="Consolas"/>
-        </w:rPr>
-        <w:t xml:space="preserve">admin</w:t>
-      </w:r>
-      <w:r>
-        <w:t xml:space="preserve">; and (3) </w:t>
-      </w:r>
-      <w:r>
-        <w:rPr>
-          <w:b/>
-          <w:bCs/>
-        </w:rPr>
-        <w:t xml:space="preserve">Laravel Policies</w:t>
-      </w:r>
-      <w:r>
-        <w:t xml:space="preserve"> (</w:t>
-      </w:r>
-      <w:r>
-        <w:rPr>
-          <w:rFonts w:ascii="Consolas" w:cs="Consolas" w:eastAsia="Consolas" w:hAnsi="Consolas"/>
-        </w:rPr>
-        <w:t xml:space="preserve">JobPostingPolicy</w:t>
-      </w:r>
-      <w:r>
-        <w:t xml:space="preserve">; </w:t>
-      </w:r>
-      <w:r>
-        <w:rPr>
-          <w:rFonts w:ascii="Consolas" w:cs="Consolas" w:eastAsia="Consolas" w:hAnsi="Consolas"/>
-        </w:rPr>
-        <w:t xml:space="preserve">ApplicationPolicy</w:t>
-      </w:r>
-      <w:r>
-        <w:t xml:space="preserve"> for viewing, status changes and feedback) check ownership of the specific record – for example, an employer can update only its own postings and can see a candidate's accommodation needs only through an application to its own posting, and only the hired candidate can submit feedback. API Resources control which fields each role receives (feedback authors are never exposed to employers). The React </w:t>
-      </w:r>
-      <w:r>
-        <w:rPr>
-          <w:rFonts w:ascii="Consolas" w:cs="Consolas" w:eastAsia="Consolas" w:hAnsi="Consolas"/>
-        </w:rPr>
-        <w:t xml:space="preserve">ProtectedRoute</w:t>
-      </w:r>
-      <w:r>
-        <w:t xml:space="preserve"> component only improves navigation; the server is the real protection. The full permission matrix is reproduced in Appendix A.</w:t>
-      </w:r>
-    </w:p>
-    <w:p>
-      <w:pPr>
-        <w:spacing w:after="120" w:line="276"/>
-      </w:pPr>
-      <w:r>
-        <w:rPr>
-          <w:b/>
-          <w:bCs/>
-        </w:rPr>
-        <w:t xml:space="preserve">OAuth 2.0</w:t>
-      </w:r>
-      <w:r>
-        <w:t xml:space="preserve"> is not used in this version: all users authenticate directly with OpenDoor, and the external APIs used require no delegated access. A delegated-authorization scenario (e.g., "Sign in with Google" or letting a candidate import a résumé from a third-party service) is listed as a future improvement.</w:t>
-      </w:r>
-    </w:p>
-    <w:p>
-      <w:pPr>
-        <w:pStyle w:val="Heading2"/>
-      </w:pPr>
-      <w:r>
-        <w:t xml:space="preserve">6.3 Secret and Credential Management</w:t>
+        <w:t xml:space="preserve">X-Service-Key</w:t>
+      </w:r>
+      <w:r>
+        <w:t xml:space="preserve"> header whose value is a shared secret held only by the two services; requests without it receive 401.</w:t>
       </w:r>
     </w:p>
     <w:p>
@@ -21241,31 +21510,64 @@
         <w:spacing w:after="60"/>
       </w:pPr>
       <w:r>
-        <w:t xml:space="preserve">All secrets are environment variables: </w:t>
+        <w:rPr>
+          <w:b/>
+          <w:bCs/>
+        </w:rPr>
+        <w:t xml:space="preserve">Core → Business Registry (legacy):</w:t>
+      </w:r>
+      <w:r>
+        <w:t xml:space="preserve"> a WS-Security </w:t>
       </w:r>
       <w:r>
         <w:rPr>
           <w:rFonts w:ascii="Consolas" w:cs="Consolas" w:eastAsia="Consolas" w:hAnsi="Consolas"/>
         </w:rPr>
-        <w:t xml:space="preserve">APP_KEY</w:t>
-      </w:r>
-      <w:r>
-        <w:t xml:space="preserve">, </w:t>
+        <w:t xml:space="preserve">UsernameToken</w:t>
+      </w:r>
+      <w:r>
+        <w:t xml:space="preserve"> in the SOAP header identifies the Core Service; the registry rejects missing or wrong credentials with a SOAP fault.</w:t>
+      </w:r>
+    </w:p>
+    <w:p>
+      <w:pPr>
+        <w:pStyle w:val="Heading2"/>
+      </w:pPr>
+      <w:r>
+        <w:t xml:space="preserve">6.2 Authorization</w:t>
+      </w:r>
+    </w:p>
+    <w:p>
+      <w:pPr>
+        <w:spacing w:after="120" w:line="276"/>
+      </w:pPr>
+      <w:r>
+        <w:t xml:space="preserve">Authorization is enforced on the server in three layers: (1) </w:t>
       </w:r>
       <w:r>
         <w:rPr>
           <w:rFonts w:ascii="Consolas" w:cs="Consolas" w:eastAsia="Consolas" w:hAnsi="Consolas"/>
         </w:rPr>
-        <w:t xml:space="preserve">DB_*</w:t>
-      </w:r>
-      <w:r>
-        <w:t xml:space="preserve">, </w:t>
+        <w:t xml:space="preserve">auth:sanctum</w:t>
+      </w:r>
+      <w:r>
+        <w:t xml:space="preserve"> middleware requires a valid token; (2) a </w:t>
+      </w:r>
+      <w:r>
+        <w:rPr>
+          <w:b/>
+          <w:bCs/>
+        </w:rPr>
+        <w:t xml:space="preserve">role middleware</w:t>
+      </w:r>
+      <w:r>
+        <w:t xml:space="preserve"> restricts route groups to </w:t>
       </w:r>
       <w:r>
         <w:rPr>
           <w:rFonts w:ascii="Consolas" w:cs="Consolas" w:eastAsia="Consolas" w:hAnsi="Consolas"/>
         </w:rPr>
-        <w:t xml:space="preserve">SERVICE_KEY_INSIGHTS</w:t>
+        <w:t xml:space="preserve">candidate</w:t>
       </w:r>
       <w:r>
         <w:t xml:space="preserve">, </w:t>
@@ -21274,37 +21576,79 @@
         <w:rPr>
           <w:rFonts w:ascii="Consolas" w:cs="Consolas" w:eastAsia="Consolas" w:hAnsi="Consolas"/>
         </w:rPr>
-        <w:t xml:space="preserve">REGISTRY_SOAP_USER/PASSWORD</w:t>
-      </w:r>
-      <w:r>
-        <w:t xml:space="preserve">, </w:t>
+        <w:t xml:space="preserve">employer</w:t>
+      </w:r>
+      <w:r>
+        <w:t xml:space="preserve"> or </w:t>
       </w:r>
       <w:r>
         <w:rPr>
           <w:rFonts w:ascii="Consolas" w:cs="Consolas" w:eastAsia="Consolas" w:hAnsi="Consolas"/>
         </w:rPr>
-        <w:t xml:space="preserve">NOMINATIM_CONTACT_EMAIL</w:t>
-      </w:r>
-      <w:r>
-        <w:t xml:space="preserve">, </w:t>
+        <w:t xml:space="preserve">admin</w:t>
+      </w:r>
+      <w:r>
+        <w:t xml:space="preserve">; and (3) </w:t>
+      </w:r>
+      <w:r>
+        <w:rPr>
+          <w:b/>
+          <w:bCs/>
+        </w:rPr>
+        <w:t xml:space="preserve">Laravel Policies</w:t>
+      </w:r>
+      <w:r>
+        <w:t xml:space="preserve"> (</w:t>
       </w:r>
       <w:r>
         <w:rPr>
           <w:rFonts w:ascii="Consolas" w:cs="Consolas" w:eastAsia="Consolas" w:hAnsi="Consolas"/>
         </w:rPr>
-        <w:t xml:space="preserve">CORS_ALLOWED_ORIGIN</w:t>
-      </w:r>
-      <w:r>
-        <w:t xml:space="preserve">, </w:t>
+        <w:t xml:space="preserve">JobPostingPolicy</w:t>
+      </w:r>
+      <w:r>
+        <w:t xml:space="preserve">; </w:t>
       </w:r>
       <w:r>
         <w:rPr>
           <w:rFonts w:ascii="Consolas" w:cs="Consolas" w:eastAsia="Consolas" w:hAnsi="Consolas"/>
         </w:rPr>
-        <w:t xml:space="preserve">VITE_API_URL</w:t>
-      </w:r>
-      <w:r>
-        <w:t xml:space="preserve">.</w:t>
+        <w:t xml:space="preserve">ApplicationPolicy</w:t>
+      </w:r>
+      <w:r>
+        <w:t xml:space="preserve"> for viewing, status changes and feedback) check ownership of the specific record – for example, an employer can update only its own postings and can see a candidate's accommodation needs only through an application to its own posting, and only the hired candidate can submit feedback. API Resources control which fields each role receives (feedback authors are never exposed to employers). The React </w:t>
+      </w:r>
+      <w:r>
+        <w:rPr>
+          <w:rFonts w:ascii="Consolas" w:cs="Consolas" w:eastAsia="Consolas" w:hAnsi="Consolas"/>
+        </w:rPr>
+        <w:t xml:space="preserve">ProtectedRoute</w:t>
+      </w:r>
+      <w:r>
+        <w:t xml:space="preserve"> component only improves navigation; the server is the real protection. The full permission matrix is reproduced in Appendix A.</w:t>
+      </w:r>
+    </w:p>
+    <w:p>
+      <w:pPr>
+        <w:spacing w:after="120" w:line="276"/>
+      </w:pPr>
+      <w:r>
+        <w:rPr>
+          <w:b/>
+          <w:bCs/>
+        </w:rPr>
+        <w:t xml:space="preserve">OAuth 2.0</w:t>
+      </w:r>
+      <w:r>
+        <w:t xml:space="preserve"> is not used in this version: all users authenticate directly with OpenDoor, and the external APIs used require no delegated access. A delegated-authorization scenario (e.g., "Sign in with Google" or letting a candidate import a résumé from a third-party service) is listed as a future improvement.</w:t>
+      </w:r>
+    </w:p>
+    <w:p>
+      <w:pPr>
+        <w:pStyle w:val="Heading2"/>
+      </w:pPr>
+      <w:r>
+        <w:t xml:space="preserve">6.3 Secret and Credential Management</w:t>
       </w:r>
     </w:p>
     <w:p>
@@ -21317,34 +21661,88 @@
         <w:spacing w:after="60"/>
       </w:pPr>
       <w:r>
-        <w:t xml:space="preserve">Each component has a committed </w:t>
+        <w:t xml:space="preserve">All secrets are environment variables: </w:t>
       </w:r>
       <w:r>
         <w:rPr>
           <w:rFonts w:ascii="Consolas" w:cs="Consolas" w:eastAsia="Consolas" w:hAnsi="Consolas"/>
         </w:rPr>
-        <w:t xml:space="preserve">.env.example</w:t>
-      </w:r>
-      <w:r>
-        <w:t xml:space="preserve"> with placeholder values only; real </w:t>
+        <w:t xml:space="preserve">APP_KEY</w:t>
+      </w:r>
+      <w:r>
+        <w:t xml:space="preserve">, </w:t>
       </w:r>
       <w:r>
         <w:rPr>
           <w:rFonts w:ascii="Consolas" w:cs="Consolas" w:eastAsia="Consolas" w:hAnsi="Consolas"/>
         </w:rPr>
-        <w:t xml:space="preserve">.env</w:t>
-      </w:r>
-      <w:r>
-        <w:t xml:space="preserve"> files are listed in </w:t>
+        <w:t xml:space="preserve">DB_*</w:t>
+      </w:r>
+      <w:r>
+        <w:t xml:space="preserve">, </w:t>
       </w:r>
       <w:r>
         <w:rPr>
           <w:rFonts w:ascii="Consolas" w:cs="Consolas" w:eastAsia="Consolas" w:hAnsi="Consolas"/>
         </w:rPr>
-        <w:t xml:space="preserve">.gitignore</w:t>
-      </w:r>
-      <w:r>
-        <w:t xml:space="preserve"> and are never committed.</w:t>
+        <w:t xml:space="preserve">SERVICE_KEY_INSIGHTS</w:t>
+      </w:r>
+      <w:r>
+        <w:t xml:space="preserve">, </w:t>
+      </w:r>
+      <w:r>
+        <w:rPr>
+          <w:rFonts w:ascii="Consolas" w:cs="Consolas" w:eastAsia="Consolas" w:hAnsi="Consolas"/>
+        </w:rPr>
+        <w:t xml:space="preserve">REGISTRY_SOAP_USER/PASSWORD</w:t>
+      </w:r>
+      <w:r>
+        <w:t xml:space="preserve">, </w:t>
+      </w:r>
+      <w:r>
+        <w:rPr>
+          <w:rFonts w:ascii="Consolas" w:cs="Consolas" w:eastAsia="Consolas" w:hAnsi="Consolas"/>
+        </w:rPr>
+        <w:t xml:space="preserve">MAIL_*</w:t>
+      </w:r>
+      <w:r>
+        <w:t xml:space="preserve"> (mail provider credentials), </w:t>
+      </w:r>
+      <w:r>
+        <w:rPr>
+          <w:rFonts w:ascii="Consolas" w:cs="Consolas" w:eastAsia="Consolas" w:hAnsi="Consolas"/>
+        </w:rPr>
+        <w:t xml:space="preserve">NOMINATIM_CONTACT_EMAIL</w:t>
+      </w:r>
+      <w:r>
+        <w:t xml:space="preserve">, </w:t>
+      </w:r>
+      <w:r>
+        <w:rPr>
+          <w:rFonts w:ascii="Consolas" w:cs="Consolas" w:eastAsia="Consolas" w:hAnsi="Consolas"/>
+        </w:rPr>
+        <w:t xml:space="preserve">DEMO_PASSWORD</w:t>
+      </w:r>
+      <w:r>
+        <w:t xml:space="preserve">; settings such as </w:t>
+      </w:r>
+      <w:r>
+        <w:rPr>
+          <w:rFonts w:ascii="Consolas" w:cs="Consolas" w:eastAsia="Consolas" w:hAnsi="Consolas"/>
+        </w:rPr>
+        <w:t xml:space="preserve">CORS_ALLOWED_ORIGIN</w:t>
+      </w:r>
+      <w:r>
+        <w:t xml:space="preserve"> and </w:t>
+      </w:r>
+      <w:r>
+        <w:rPr>
+          <w:rFonts w:ascii="Consolas" w:cs="Consolas" w:eastAsia="Consolas" w:hAnsi="Consolas"/>
+        </w:rPr>
+        <w:t xml:space="preserve">VITE_API_URL</w:t>
+      </w:r>
+      <w:r>
+        <w:t xml:space="preserve"> use the same mechanism.</w:t>
       </w:r>
     </w:p>
     <w:p>
@@ -21357,46 +21755,34 @@
         <w:spacing w:after="60"/>
       </w:pPr>
       <w:r>
-        <w:t xml:space="preserve">Production values are stored in </w:t>
-      </w:r>
-      <w:r>
-        <w:rPr>
-          <w:b/>
-          <w:bCs/>
-        </w:rPr>
-        <w:t xml:space="preserve">Railway service variables</w:t>
-      </w:r>
-      <w:r>
-        <w:t xml:space="preserve"> and </w:t>
-      </w:r>
-      <w:r>
-        <w:rPr>
-          <w:b/>
-          <w:bCs/>
-        </w:rPr>
-        <w:t xml:space="preserve">Vercel environment variables</w:t>
-      </w:r>
-      <w:r>
-        <w:t xml:space="preserve">; CI values in </w:t>
-      </w:r>
-      <w:r>
-        <w:rPr>
-          <w:b/>
-          <w:bCs/>
-        </w:rPr>
-        <w:t xml:space="preserve">GitHub Actions encrypted secrets</w:t>
-      </w:r>
-      <w:r>
-        <w:t xml:space="preserve">. The production </w:t>
+        <w:t xml:space="preserve">Each component has a committed </w:t>
       </w:r>
       <w:r>
         <w:rPr>
           <w:rFonts w:ascii="Consolas" w:cs="Consolas" w:eastAsia="Consolas" w:hAnsi="Consolas"/>
         </w:rPr>
-        <w:t xml:space="preserve">APP_KEY</w:t>
-      </w:r>
-      <w:r>
-        <w:t xml:space="preserve"> is generated fresh and differs from development.</w:t>
+        <w:t xml:space="preserve">.env.example</w:t>
+      </w:r>
+      <w:r>
+        <w:t xml:space="preserve"> with placeholder values only; real </w:t>
+      </w:r>
+      <w:r>
+        <w:rPr>
+          <w:rFonts w:ascii="Consolas" w:cs="Consolas" w:eastAsia="Consolas" w:hAnsi="Consolas"/>
+        </w:rPr>
+        <w:t xml:space="preserve">.env</w:t>
+      </w:r>
+      <w:r>
+        <w:t xml:space="preserve"> files are listed in </w:t>
+      </w:r>
+      <w:r>
+        <w:rPr>
+          <w:rFonts w:ascii="Consolas" w:cs="Consolas" w:eastAsia="Consolas" w:hAnsi="Consolas"/>
+        </w:rPr>
+        <w:t xml:space="preserve">.gitignore</w:t>
+      </w:r>
+      <w:r>
+        <w:t xml:space="preserve"> and are never committed.</w:t>
       </w:r>
     </w:p>
     <w:p>
@@ -21409,7 +21795,36 @@
         <w:spacing w:after="60"/>
       </w:pPr>
       <w:r>
-        <w:t xml:space="preserve">Demo and test accounts (one per role) are created by seeders with passwords read from environment variables; they are shared with the evaluators through the submission notes, not written in the repository or this document.</w:t>
+        <w:t xml:space="preserve">Production values are stored in </w:t>
+      </w:r>
+      <w:r>
+        <w:rPr>
+          <w:b/>
+          <w:bCs/>
+        </w:rPr>
+        <w:t xml:space="preserve">Railway service variables</w:t>
+      </w:r>
+      <w:r>
+        <w:t xml:space="preserve"> and </w:t>
+      </w:r>
+      <w:r>
+        <w:rPr>
+          <w:b/>
+          <w:bCs/>
+        </w:rPr>
+        <w:t xml:space="preserve">Vercel environment variables</w:t>
+      </w:r>
+      <w:r>
+        <w:t xml:space="preserve">. The CI integration job generates throwaway secrets (database passwords, service key, SOAP password, demo password) at the start of every run, so no secret is stored in GitHub. The production </w:t>
+      </w:r>
+      <w:r>
+        <w:rPr>
+          <w:rFonts w:ascii="Consolas" w:cs="Consolas" w:eastAsia="Consolas" w:hAnsi="Consolas"/>
+        </w:rPr>
+        <w:t xml:space="preserve">APP_KEY</w:t>
+      </w:r>
+      <w:r>
+        <w:t xml:space="preserve"> is generated fresh and differs from development.</w:t>
       </w:r>
     </w:p>
     <w:p>
@@ -21422,42 +21837,7 @@
         <w:spacing w:after="60"/>
       </w:pPr>
       <w:r>
-        <w:t xml:space="preserve">Secrets are never logged: the gateway redacts </w:t>
-      </w:r>
-      <w:r>
-        <w:rPr>
-          <w:rFonts w:ascii="Consolas" w:cs="Consolas" w:eastAsia="Consolas" w:hAnsi="Consolas"/>
-        </w:rPr>
-        <w:t xml:space="preserve">Authorization</w:t>
-      </w:r>
-      <w:r>
-        <w:t xml:space="preserve"> and </w:t>
-      </w:r>
-      <w:r>
-        <w:rPr>
-          <w:rFonts w:ascii="Consolas" w:cs="Consolas" w:eastAsia="Consolas" w:hAnsi="Consolas"/>
-        </w:rPr>
-        <w:t xml:space="preserve">X-Service-Key</w:t>
-      </w:r>
-      <w:r>
-        <w:t xml:space="preserve"> headers in logs, and </w:t>
-      </w:r>
-      <w:r>
-        <w:rPr>
-          <w:rFonts w:ascii="Consolas" w:cs="Consolas" w:eastAsia="Consolas" w:hAnsi="Consolas"/>
-        </w:rPr>
-        <w:t xml:space="preserve">APP_DEBUG=false</w:t>
-      </w:r>
-      <w:r>
-        <w:t xml:space="preserve"> in production.</w:t>
-      </w:r>
-    </w:p>
-    <w:p>
-      <w:pPr>
-        <w:pStyle w:val="Heading2"/>
-      </w:pPr>
-      <w:r>
-        <w:t xml:space="preserve">6.4 Security Considerations</w:t>
+        <w:t xml:space="preserve">Demo and test accounts (one per role) are created by seeders with passwords read from environment variables; they are shared with the evaluators through the submission notes, not written in the repository or this document.</w:t>
       </w:r>
     </w:p>
     <w:p>
@@ -21470,32 +21850,42 @@
         <w:spacing w:after="60"/>
       </w:pPr>
       <w:r>
-        <w:rPr>
-          <w:b/>
-          <w:bCs/>
-        </w:rPr>
-        <w:t xml:space="preserve">Input validation:</w:t>
-      </w:r>
-      <w:r>
-        <w:t xml:space="preserve"> Laravel Form Requests validate every create/update (required fields, </w:t>
+        <w:t xml:space="preserve">Secrets are never logged: the gateway redacts </w:t>
       </w:r>
       <w:r>
         <w:rPr>
           <w:rFonts w:ascii="Consolas" w:cs="Consolas" w:eastAsia="Consolas" w:hAnsi="Consolas"/>
         </w:rPr>
-        <w:t xml:space="preserve">Rule::exists</w:t>
-      </w:r>
-      <w:r>
-        <w:t xml:space="preserve"> for accommodation and category IDs, </w:t>
+        <w:t xml:space="preserve">Authorization</w:t>
+      </w:r>
+      <w:r>
+        <w:t xml:space="preserve"> and </w:t>
       </w:r>
       <w:r>
         <w:rPr>
           <w:rFonts w:ascii="Consolas" w:cs="Consolas" w:eastAsia="Consolas" w:hAnsi="Consolas"/>
         </w:rPr>
-        <w:t xml:space="preserve">Rule::enum</w:t>
-      </w:r>
-      <w:r>
-        <w:t xml:space="preserve"> for statuses, max lengths, PDF-only size-limited résumé uploads); Eloquent parameter binding prevents SQL injection; the SOAP request is validated against the WSDL schema; React escapes output by default.</w:t>
+        <w:t xml:space="preserve">X-Service-Key</w:t>
+      </w:r>
+      <w:r>
+        <w:t xml:space="preserve"> headers in logs, and </w:t>
+      </w:r>
+      <w:r>
+        <w:rPr>
+          <w:rFonts w:ascii="Consolas" w:cs="Consolas" w:eastAsia="Consolas" w:hAnsi="Consolas"/>
+        </w:rPr>
+        <w:t xml:space="preserve">APP_DEBUG=false</w:t>
+      </w:r>
+      <w:r>
+        <w:t xml:space="preserve"> in production.</w:t>
+      </w:r>
+    </w:p>
+    <w:p>
+      <w:pPr>
+        <w:pStyle w:val="Heading2"/>
+      </w:pPr>
+      <w:r>
+        <w:t xml:space="preserve">6.4 Security Considerations</w:t>
       </w:r>
     </w:p>
     <w:p>
@@ -21512,19 +21902,28 @@
           <w:b/>
           <w:bCs/>
         </w:rPr>
-        <w:t xml:space="preserve">Uploaded files:</w:t>
-      </w:r>
-      <w:r>
-        <w:t xml:space="preserve"> company logos are public images served through the gateway; résumés are stored on Core's private disk and opened only through a temporary signed link (30 minutes, </w:t>
+        <w:t xml:space="preserve">Input validation:</w:t>
+      </w:r>
+      <w:r>
+        <w:t xml:space="preserve"> Laravel Form Requests validate every create/update (required fields, </w:t>
       </w:r>
       <w:r>
         <w:rPr>
           <w:rFonts w:ascii="Consolas" w:cs="Consolas" w:eastAsia="Consolas" w:hAnsi="Consolas"/>
         </w:rPr>
-        <w:t xml:space="preserve">Cache-Control: no-store</w:t>
-      </w:r>
-      <w:r>
-        <w:t xml:space="preserve">) returned to the candidate, so the PDF can be opened in a new tab without exposing the token. Links in API responses (logos, résumés, page links) always point at the gateway, never at an internal service host.</w:t>
+        <w:t xml:space="preserve">Rule::exists</w:t>
+      </w:r>
+      <w:r>
+        <w:t xml:space="preserve"> for accommodation and category IDs, </w:t>
+      </w:r>
+      <w:r>
+        <w:rPr>
+          <w:rFonts w:ascii="Consolas" w:cs="Consolas" w:eastAsia="Consolas" w:hAnsi="Consolas"/>
+        </w:rPr>
+        <w:t xml:space="preserve">Rule::enum</w:t>
+      </w:r>
+      <w:r>
+        <w:t xml:space="preserve"> for statuses, max lengths, PDF-only size-limited résumé uploads); Eloquent parameter binding prevents SQL injection; the SOAP request is validated against the WSDL schema; React escapes output by default.</w:t>
       </w:r>
     </w:p>
     <w:p>
@@ -21541,10 +21940,19 @@
           <w:b/>
           <w:bCs/>
         </w:rPr>
-        <w:t xml:space="preserve">Transport/HTTPS:</w:t>
-      </w:r>
-      <w:r>
-        <w:t xml:space="preserve"> Vercel and Railway public endpoints use HTTPS only; internal calls stay on Railway's private network and are not exposed to the internet.</w:t>
+        <w:t xml:space="preserve">Uploaded files:</w:t>
+      </w:r>
+      <w:r>
+        <w:t xml:space="preserve"> company logos are public images served through the gateway; résumés are stored on Core's private disk and opened only through a temporary signed link (30 minutes, </w:t>
+      </w:r>
+      <w:r>
+        <w:rPr>
+          <w:rFonts w:ascii="Consolas" w:cs="Consolas" w:eastAsia="Consolas" w:hAnsi="Consolas"/>
+        </w:rPr>
+        <w:t xml:space="preserve">Cache-Control: no-store</w:t>
+      </w:r>
+      <w:r>
+        <w:t xml:space="preserve">) returned to the candidate, so the PDF can be opened in a new tab without exposing the token. Links in API responses (logos, résumés, page links) always point at the gateway, never at an internal service host.</w:t>
       </w:r>
     </w:p>
     <w:p>
@@ -21561,10 +21969,10 @@
           <w:b/>
           <w:bCs/>
         </w:rPr>
-        <w:t xml:space="preserve">Least privilege / access controls:</w:t>
-      </w:r>
-      <w:r>
-        <w:t xml:space="preserve"> only the gateway is public; each service has its own database user limited to its own schema; role middleware and Policies enforce per-record ownership; CORS allows only the deployed frontend origin.</w:t>
+        <w:t xml:space="preserve">Transport/HTTPS:</w:t>
+      </w:r>
+      <w:r>
+        <w:t xml:space="preserve"> Vercel and Railway public endpoints use HTTPS only; internal calls stay on Railway's private network and are not exposed to the internet.</w:t>
       </w:r>
     </w:p>
     <w:p>
@@ -21581,10 +21989,10 @@
           <w:b/>
           <w:bCs/>
         </w:rPr>
-        <w:t xml:space="preserve">Abuse protection:</w:t>
-      </w:r>
-      <w:r>
-        <w:t xml:space="preserve"> gateway rate limiting (120 requests/min per IP) and login rate limiting (5 attempts/min).</w:t>
+        <w:t xml:space="preserve">Least privilege / access controls:</w:t>
+      </w:r>
+      <w:r>
+        <w:t xml:space="preserve"> only the gateway is public; each service has its own database user limited to its own schema; role middleware and Policies enforce per-record ownership; CORS allows only the deployed frontend origin.</w:t>
       </w:r>
     </w:p>
     <w:p>
@@ -21601,37 +22009,10 @@
           <w:b/>
           <w:bCs/>
         </w:rPr>
-        <w:t xml:space="preserve">Information disclosure:</w:t>
-      </w:r>
-      <w:r>
-        <w:t xml:space="preserve"> errors carry only a code, a plain message and the </w:t>
-      </w:r>
-      <w:r>
-        <w:rPr>
-          <w:rFonts w:ascii="Consolas" w:cs="Consolas" w:eastAsia="Consolas" w:hAnsi="Consolas"/>
-        </w:rPr>
-        <w:t xml:space="preserve">request_id</w:t>
-      </w:r>
-      <w:r>
-        <w:t xml:space="preserve"> (no stack traces, </w:t>
-      </w:r>
-      <w:r>
-        <w:rPr>
-          <w:rFonts w:ascii="Consolas" w:cs="Consolas" w:eastAsia="Consolas" w:hAnsi="Consolas"/>
-        </w:rPr>
-        <w:t xml:space="preserve">APP_DEBUG=false</w:t>
-      </w:r>
-      <w:r>
-        <w:t xml:space="preserve">); the gateway removes </w:t>
-      </w:r>
-      <w:r>
-        <w:rPr>
-          <w:rFonts w:ascii="Consolas" w:cs="Consolas" w:eastAsia="Consolas" w:hAnsi="Consolas"/>
-        </w:rPr>
-        <w:t xml:space="preserve">X-Powered-By</w:t>
-      </w:r>
-      <w:r>
-        <w:t xml:space="preserve"> headers from upstream responses, so clients cannot read the server stack or PHP version; an unknown origin receives no CORS headers.</w:t>
+        <w:t xml:space="preserve">Abuse protection:</w:t>
+      </w:r>
+      <w:r>
+        <w:t xml:space="preserve"> gateway rate limiting (120 requests/min per IP) and login and password-reset rate limiting (5 requests/min per email and IP).</w:t>
       </w:r>
     </w:p>
     <w:p>
@@ -21648,6 +22029,53 @@
           <w:b/>
           <w:bCs/>
         </w:rPr>
+        <w:t xml:space="preserve">Information disclosure:</w:t>
+      </w:r>
+      <w:r>
+        <w:t xml:space="preserve"> errors carry only a code, a plain message and the </w:t>
+      </w:r>
+      <w:r>
+        <w:rPr>
+          <w:rFonts w:ascii="Consolas" w:cs="Consolas" w:eastAsia="Consolas" w:hAnsi="Consolas"/>
+        </w:rPr>
+        <w:t xml:space="preserve">request_id</w:t>
+      </w:r>
+      <w:r>
+        <w:t xml:space="preserve"> (no stack traces, </w:t>
+      </w:r>
+      <w:r>
+        <w:rPr>
+          <w:rFonts w:ascii="Consolas" w:cs="Consolas" w:eastAsia="Consolas" w:hAnsi="Consolas"/>
+        </w:rPr>
+        <w:t xml:space="preserve">APP_DEBUG=false</w:t>
+      </w:r>
+      <w:r>
+        <w:t xml:space="preserve">); the gateway removes </w:t>
+      </w:r>
+      <w:r>
+        <w:rPr>
+          <w:rFonts w:ascii="Consolas" w:cs="Consolas" w:eastAsia="Consolas" w:hAnsi="Consolas"/>
+        </w:rPr>
+        <w:t xml:space="preserve">X-Powered-By</w:t>
+      </w:r>
+      <w:r>
+        <w:t xml:space="preserve"> headers from upstream responses, so clients cannot read the server stack or PHP version; an unknown origin receives no CORS headers.</w:t>
+      </w:r>
+    </w:p>
+    <w:p>
+      <w:pPr>
+        <w:pStyle w:val="ListParagraph"/>
+        <w:numPr>
+          <w:ilvl w:val="0"/>
+          <w:numId w:val="2"/>
+        </w:numPr>
+        <w:spacing w:after="60"/>
+      </w:pPr>
+      <w:r>
+        <w:rPr>
+          <w:b/>
+          <w:bCs/>
+        </w:rPr>
         <w:t xml:space="preserve">Data privacy (RA 10173):</w:t>
       </w:r>
       <w:r>
@@ -21660,7 +22088,7 @@
         <w:t xml:space="preserve">consented_at</w:t>
       </w:r>
       <w:r>
-        <w:t xml:space="preserve">) before accommodation data is stored; disability type is optional, hidden by default and never used for matching; candidates' needs are shown to an employer only after the candidate applies; trust scores and their per-accommodation breakdown are aggregated and shown only after three responses so individual employees cannot be identified.</w:t>
+        <w:t xml:space="preserve">) before accommodation data is stored; disability type is optional, hidden by default and never used for matching; candidates' needs are shown to an employer only after the candidate applies; trust scores and their per-accommodation breakdown are aggregated and shown only after three responses so individual employees cannot be identified; notification emails state only what happened and link to OpenDoor – never disability or needs details – and can be turned off in Account settings; Read aloud runs entirely in the browser, and Voice input is never on by default and explains before first use that Chrome and Edge send the audio to their speech service.</w:t>
       </w:r>
     </w:p>
     <w:p>

</xml_diff>

<commit_message>
docs(sia): testing, deployment, demo scenario and diagrams as built
7.3/App. D JMeter with load-test:data, 8.2 FrankenPHP images and
scheduler, 8.3/8.4 CI as built, 9.2 numbers from the seed, 10.2
simplifications, references, email provider in figures 2 and 5.
Dev references synced (PHP 8.4, scheduler, CI).

Co-Authored-By: Claude Opus 5.5 <noreply@anthropic.com>
</commit_message>
<xml_diff>
--- a/docs/OpenDoor_SIA1_Final_Project_Documentation.docx
+++ b/docs/OpenDoor_SIA1_Final_Project_Documentation.docx
@@ -26061,16 +26061,25 @@
         <w:t xml:space="preserve">Schema and timing</w:t>
       </w:r>
       <w:r>
-        <w:t xml:space="preserve"> – key responses validated against JSON schemas with </w:t>
+        <w:t xml:space="preserve"> – key responses validated against JSON schemas written to follow </w:t>
       </w:r>
       <w:r>
         <w:rPr>
           <w:rFonts w:ascii="Consolas" w:cs="Consolas" w:eastAsia="Consolas" w:hAnsi="Consolas"/>
         </w:rPr>
-        <w:t xml:space="preserve">pm.response.to.have.jsonSchema</w:t>
-      </w:r>
-      <w:r>
-        <w:t xml:space="preserve">; response time under 1,000 ms for non-mashup endpoints.</w:t>
+        <w:t xml:space="preserve">docs/openapi.yaml</w:t>
+      </w:r>
+      <w:r>
+        <w:t xml:space="preserve"> (</w:t>
+      </w:r>
+      <w:r>
+        <w:rPr>
+          <w:rFonts w:ascii="Consolas" w:cs="Consolas" w:eastAsia="Consolas" w:hAnsi="Consolas"/>
+        </w:rPr>
+        <w:t xml:space="preserve">pm.expect(body).to.be.jsonSchema(...)</w:t>
+      </w:r>
+      <w:r>
+        <w:t xml:space="preserve">, e.g. "matches the JobPosting shape"); response time under 1,000 ms for non-mashup endpoints and under the gateway timeout (15 s) for the snapshot.</w:t>
       </w:r>
     </w:p>
     <w:p>
@@ -26357,7 +26366,7 @@
                 <w:sz w:val="18"/>
                 <w:szCs w:val="18"/>
               </w:rPr>
-              <w:t xml:space="preserve">Apache JMeter 5.6 (test plan </w:t>
+              <w:t xml:space="preserve">Apache JMeter 5.6.3 (one test plan </w:t>
             </w:r>
             <w:r>
               <w:rPr>
@@ -26372,7 +26381,7 @@
                 <w:sz w:val="18"/>
                 <w:szCs w:val="18"/>
               </w:rPr>
-              <w:t xml:space="preserve">), run in CLI mode: </w:t>
+              <w:t xml:space="preserve">, host and load set with </w:t>
             </w:r>
             <w:r>
               <w:rPr>
@@ -26380,7 +26389,22 @@
                 <w:sz w:val="18"/>
                 <w:szCs w:val="18"/>
               </w:rPr>
-              <w:t xml:space="preserve">jmeter -n -t opendoor-matching.jmx -l results.jtl -e -o report/</w:t>
+              <w:t xml:space="preserve">-J</w:t>
+            </w:r>
+            <w:r>
+              <w:rPr>
+                <w:sz w:val="18"/>
+                <w:szCs w:val="18"/>
+              </w:rPr>
+              <w:t xml:space="preserve"> properties), run in CLI mode: </w:t>
+            </w:r>
+            <w:r>
+              <w:rPr>
+                <w:rFonts w:ascii="Consolas" w:cs="Consolas" w:eastAsia="Consolas" w:hAnsi="Consolas"/>
+                <w:sz w:val="18"/>
+                <w:szCs w:val="18"/>
+              </w:rPr>
+              <w:t xml:space="preserve">jmeter -n -t opendoor-matching.jmx -Jhost=&lt;gateway&gt; -Jthreads=50 -Jloops=10 -l results.jtl -e -o report/</w:t>
             </w:r>
           </w:p>
         </w:tc>
@@ -26443,7 +26467,37 @@
                 <w:sz w:val="18"/>
                 <w:szCs w:val="18"/>
               </w:rPr>
-              <w:t xml:space="preserve">Thread Group: 50 users, ramp-up 60 s, 10 loops each (500 search requests + 500 detail requests); CSV Data Set with 50 seeded candidate tokens; database seeded with 500 postings and 20 accommodation types. A stress step repeats with 100 and 200 users.</w:t>
+              <w:t xml:space="preserve">Thread Group: 50 users, ramp-up 60 s, 10 loops each (500 search requests + 500 detail requests); CSV Data Set with 50 candidate tokens. Test data comes from </w:t>
+            </w:r>
+            <w:r>
+              <w:rPr>
+                <w:rFonts w:ascii="Consolas" w:cs="Consolas" w:eastAsia="Consolas" w:hAnsi="Consolas"/>
+                <w:sz w:val="18"/>
+                <w:szCs w:val="18"/>
+              </w:rPr>
+              <w:t xml:space="preserve">php artisan load-test:data</w:t>
+            </w:r>
+            <w:r>
+              <w:rPr>
+                <w:sz w:val="18"/>
+                <w:szCs w:val="18"/>
+              </w:rPr>
+              <w:t xml:space="preserve"> (not a seeder): 500 open postings from 10 verified load-test companies and 50 load-test candidates with accommodation needs (from the 18 seeded accommodation types), one token each; </w:t>
+            </w:r>
+            <w:r>
+              <w:rPr>
+                <w:rFonts w:ascii="Consolas" w:cs="Consolas" w:eastAsia="Consolas" w:hAnsi="Consolas"/>
+                <w:sz w:val="18"/>
+                <w:szCs w:val="18"/>
+              </w:rPr>
+              <w:t xml:space="preserve">--remove</w:t>
+            </w:r>
+            <w:r>
+              <w:rPr>
+                <w:sz w:val="18"/>
+                <w:szCs w:val="18"/>
+              </w:rPr>
+              <w:t xml:space="preserve"> deletes it all afterwards. A stress step repeats with 100 and 200 users (5 loops). The gateway limit of 120 requests/min per IP is raised for the test window only.</w:t>
             </w:r>
           </w:p>
         </w:tc>
@@ -27810,7 +27864,22 @@
                 <w:sz w:val="16"/>
                 <w:szCs w:val="16"/>
               </w:rPr>
-              <w:t xml:space="preserve">Railway service (Nixpacks/Node 22)</w:t>
+              <w:t xml:space="preserve">Railway service (Dockerfile: </w:t>
+            </w:r>
+            <w:r>
+              <w:rPr>
+                <w:rFonts w:ascii="Consolas" w:cs="Consolas" w:eastAsia="Consolas" w:hAnsi="Consolas"/>
+                <w:sz w:val="16"/>
+                <w:szCs w:val="16"/>
+              </w:rPr>
+              <w:t xml:space="preserve">node:22-alpine</w:t>
+            </w:r>
+            <w:r>
+              <w:rPr>
+                <w:sz w:val="16"/>
+                <w:szCs w:val="16"/>
+              </w:rPr>
+              <w:t xml:space="preserve">)</w:t>
             </w:r>
           </w:p>
         </w:tc>
@@ -27908,6 +27977,21 @@
                 <w:szCs w:val="16"/>
               </w:rPr>
               <w:t xml:space="preserve">CORS_ALLOWED_ORIGIN</w:t>
+            </w:r>
+            <w:r>
+              <w:rPr>
+                <w:sz w:val="16"/>
+                <w:szCs w:val="16"/>
+              </w:rPr>
+              <w:t xml:space="preserve">, </w:t>
+            </w:r>
+            <w:r>
+              <w:rPr>
+                <w:rFonts w:ascii="Consolas" w:cs="Consolas" w:eastAsia="Consolas" w:hAnsi="Consolas"/>
+                <w:sz w:val="16"/>
+                <w:szCs w:val="16"/>
+              </w:rPr>
+              <w:t xml:space="preserve">TRUST_PROXY=1</w:t>
             </w:r>
             <w:r>
               <w:rPr>
@@ -27982,7 +28066,7 @@
                 <w:sz w:val="16"/>
                 <w:szCs w:val="16"/>
               </w:rPr>
-              <w:t xml:space="preserve">Railway service (Dockerfile: php-fpm + nginx)</w:t>
+              <w:t xml:space="preserve">Railway service (Dockerfile: FrankenPHP, PHP 8.4)</w:t>
             </w:r>
           </w:p>
         </w:tc>
@@ -28086,6 +28170,36 @@
                 <w:sz w:val="16"/>
                 <w:szCs w:val="16"/>
               </w:rPr>
+              <w:t xml:space="preserve">PUBLIC_API_URL</w:t>
+            </w:r>
+            <w:r>
+              <w:rPr>
+                <w:sz w:val="16"/>
+                <w:szCs w:val="16"/>
+              </w:rPr>
+              <w:t xml:space="preserve">, </w:t>
+            </w:r>
+            <w:r>
+              <w:rPr>
+                <w:rFonts w:ascii="Consolas" w:cs="Consolas" w:eastAsia="Consolas" w:hAnsi="Consolas"/>
+                <w:sz w:val="16"/>
+                <w:szCs w:val="16"/>
+              </w:rPr>
+              <w:t xml:space="preserve">PUBLIC_APP_URL</w:t>
+            </w:r>
+            <w:r>
+              <w:rPr>
+                <w:sz w:val="16"/>
+                <w:szCs w:val="16"/>
+              </w:rPr>
+              <w:t xml:space="preserve">, </w:t>
+            </w:r>
+            <w:r>
+              <w:rPr>
+                <w:rFonts w:ascii="Consolas" w:cs="Consolas" w:eastAsia="Consolas" w:hAnsi="Consolas"/>
+                <w:sz w:val="16"/>
+                <w:szCs w:val="16"/>
+              </w:rPr>
               <w:t xml:space="preserve">REGISTRY_WSDL_URL</w:t>
             </w:r>
             <w:r>
@@ -28108,7 +28222,22 @@
                 <w:sz w:val="16"/>
                 <w:szCs w:val="16"/>
               </w:rPr>
-              <w:t xml:space="preserve">; release command </w:t>
+              <w:t xml:space="preserve">, </w:t>
+            </w:r>
+            <w:r>
+              <w:rPr>
+                <w:rFonts w:ascii="Consolas" w:cs="Consolas" w:eastAsia="Consolas" w:hAnsi="Consolas"/>
+                <w:sz w:val="16"/>
+                <w:szCs w:val="16"/>
+              </w:rPr>
+              <w:t xml:space="preserve">MAIL_*</w:t>
+            </w:r>
+            <w:r>
+              <w:rPr>
+                <w:sz w:val="16"/>
+                <w:szCs w:val="16"/>
+              </w:rPr>
+              <w:t xml:space="preserve">; pre-deploy command </w:t>
             </w:r>
             <w:r>
               <w:rPr>
@@ -28117,6 +28246,13 @@
                 <w:szCs w:val="16"/>
               </w:rPr>
               <w:t xml:space="preserve">php artisan migrate --force</w:t>
+            </w:r>
+            <w:r>
+              <w:rPr>
+                <w:sz w:val="16"/>
+                <w:szCs w:val="16"/>
+              </w:rPr>
+              <w:t xml:space="preserve">; a Railway volume for logos and résumés (the container disk is not kept between deploys)</w:t>
             </w:r>
           </w:p>
         </w:tc>
@@ -28147,7 +28283,7 @@
                 <w:sz w:val="16"/>
                 <w:szCs w:val="16"/>
               </w:rPr>
-              <w:t xml:space="preserve">Insights Service</w:t>
+              <w:t xml:space="preserve">Core scheduler</w:t>
             </w:r>
           </w:p>
         </w:tc>
@@ -28176,7 +28312,7 @@
                 <w:sz w:val="16"/>
                 <w:szCs w:val="16"/>
               </w:rPr>
-              <w:t xml:space="preserve">Railway service (Node 22)</w:t>
+              <w:t xml:space="preserve">Railway service from the same Core image</w:t>
             </w:r>
           </w:p>
         </w:tc>
@@ -28205,7 +28341,7 @@
                 <w:sz w:val="16"/>
                 <w:szCs w:val="16"/>
               </w:rPr>
-              <w:t xml:space="preserve">insights.railway.internal:8002 (no public domain)</w:t>
+              <w:t xml:space="preserve">no domain</w:t>
             </w:r>
           </w:p>
         </w:tc>
@@ -28231,108 +28367,25 @@
             </w:pPr>
             <w:r>
               <w:rPr>
-                <w:rFonts w:ascii="Consolas" w:cs="Consolas" w:eastAsia="Consolas" w:hAnsi="Consolas"/>
-                <w:sz w:val="16"/>
-                <w:szCs w:val="16"/>
-              </w:rPr>
-              <w:t xml:space="preserve">CORE_INTERNAL_URL</w:t>
-            </w:r>
-            <w:r>
-              <w:rPr>
-                <w:sz w:val="16"/>
-                <w:szCs w:val="16"/>
-              </w:rPr>
-              <w:t xml:space="preserve">, </w:t>
-            </w:r>
-            <w:r>
-              <w:rPr>
-                <w:rFonts w:ascii="Consolas" w:cs="Consolas" w:eastAsia="Consolas" w:hAnsi="Consolas"/>
-                <w:sz w:val="16"/>
-                <w:szCs w:val="16"/>
-              </w:rPr>
-              <w:t xml:space="preserve">SERVICE_KEY_INSIGHTS</w:t>
-            </w:r>
-            <w:r>
-              <w:rPr>
-                <w:sz w:val="16"/>
-                <w:szCs w:val="16"/>
-              </w:rPr>
-              <w:t xml:space="preserve">, </w:t>
-            </w:r>
-            <w:r>
-              <w:rPr>
-                <w:rFonts w:ascii="Consolas" w:cs="Consolas" w:eastAsia="Consolas" w:hAnsi="Consolas"/>
-                <w:sz w:val="16"/>
-                <w:szCs w:val="16"/>
-              </w:rPr>
-              <w:t xml:space="preserve">NOMINATIM_CONTACT_EMAIL</w:t>
-            </w:r>
-            <w:r>
-              <w:rPr>
-                <w:sz w:val="16"/>
-                <w:szCs w:val="16"/>
-              </w:rPr>
-              <w:t xml:space="preserve">, </w:t>
-            </w:r>
-            <w:r>
-              <w:rPr>
-                <w:rFonts w:ascii="Consolas" w:cs="Consolas" w:eastAsia="Consolas" w:hAnsi="Consolas"/>
-                <w:sz w:val="16"/>
-                <w:szCs w:val="16"/>
-              </w:rPr>
-              <w:t xml:space="preserve">CACHE_DB_*</w:t>
-            </w:r>
-            <w:r>
-              <w:rPr>
-                <w:sz w:val="16"/>
-                <w:szCs w:val="16"/>
-              </w:rPr>
-              <w:t xml:space="preserve">; optional </w:t>
-            </w:r>
-            <w:r>
-              <w:rPr>
-                <w:rFonts w:ascii="Consolas" w:cs="Consolas" w:eastAsia="Consolas" w:hAnsi="Consolas"/>
-                <w:sz w:val="16"/>
-                <w:szCs w:val="16"/>
-              </w:rPr>
-              <w:t xml:space="preserve">PSGC_URL</w:t>
-            </w:r>
-            <w:r>
-              <w:rPr>
-                <w:sz w:val="16"/>
-                <w:szCs w:val="16"/>
-              </w:rPr>
-              <w:t xml:space="preserve">, </w:t>
-            </w:r>
-            <w:r>
-              <w:rPr>
-                <w:rFonts w:ascii="Consolas" w:cs="Consolas" w:eastAsia="Consolas" w:hAnsi="Consolas"/>
-                <w:sz w:val="16"/>
-                <w:szCs w:val="16"/>
-              </w:rPr>
-              <w:t xml:space="preserve">NOMINATIM_URL</w:t>
-            </w:r>
-            <w:r>
-              <w:rPr>
-                <w:sz w:val="16"/>
-                <w:szCs w:val="16"/>
-              </w:rPr>
-              <w:t xml:space="preserve">, </w:t>
-            </w:r>
-            <w:r>
-              <w:rPr>
-                <w:rFonts w:ascii="Consolas" w:cs="Consolas" w:eastAsia="Consolas" w:hAnsi="Consolas"/>
-                <w:sz w:val="16"/>
-                <w:szCs w:val="16"/>
-              </w:rPr>
-              <w:t xml:space="preserve">OVERPASS_URL</w:t>
-            </w:r>
-            <w:r>
-              <w:rPr>
-                <w:sz w:val="16"/>
-                <w:szCs w:val="16"/>
-              </w:rPr>
-              <w:t xml:space="preserve"> (e.g., a second Overpass instance)</w:t>
+                <w:sz w:val="16"/>
+                <w:szCs w:val="16"/>
+              </w:rPr>
+              <w:t xml:space="preserve">Runs </w:t>
+            </w:r>
+            <w:r>
+              <w:rPr>
+                <w:rFonts w:ascii="Consolas" w:cs="Consolas" w:eastAsia="Consolas" w:hAnsi="Consolas"/>
+                <w:sz w:val="16"/>
+                <w:szCs w:val="16"/>
+              </w:rPr>
+              <w:t xml:space="preserve">php artisan schedule:work</w:t>
+            </w:r>
+            <w:r>
+              <w:rPr>
+                <w:sz w:val="16"/>
+                <w:szCs w:val="16"/>
+              </w:rPr>
+              <w:t xml:space="preserve">: closes expired postings (00:05), sends rating reminders (08:00) and works the email queue every minute (password-reset links); same variables as the Core Service</w:t>
             </w:r>
           </w:p>
         </w:tc>
@@ -28363,7 +28416,7 @@
                 <w:sz w:val="16"/>
                 <w:szCs w:val="16"/>
               </w:rPr>
-              <w:t xml:space="preserve">Business Registry (SOAP)</w:t>
+              <w:t xml:space="preserve">Insights Service</w:t>
             </w:r>
           </w:p>
         </w:tc>
@@ -28392,7 +28445,22 @@
                 <w:sz w:val="16"/>
                 <w:szCs w:val="16"/>
               </w:rPr>
-              <w:t xml:space="preserve">Railway service (Dockerfile: PHP 8.3 + SoapServer)</w:t>
+              <w:t xml:space="preserve">Railway service (Dockerfile: </w:t>
+            </w:r>
+            <w:r>
+              <w:rPr>
+                <w:rFonts w:ascii="Consolas" w:cs="Consolas" w:eastAsia="Consolas" w:hAnsi="Consolas"/>
+                <w:sz w:val="16"/>
+                <w:szCs w:val="16"/>
+              </w:rPr>
+              <w:t xml:space="preserve">node:22-alpine</w:t>
+            </w:r>
+            <w:r>
+              <w:rPr>
+                <w:sz w:val="16"/>
+                <w:szCs w:val="16"/>
+              </w:rPr>
+              <w:t xml:space="preserve">)</w:t>
             </w:r>
           </w:p>
         </w:tc>
@@ -28421,7 +28489,7 @@
                 <w:sz w:val="16"/>
                 <w:szCs w:val="16"/>
               </w:rPr>
-              <w:t xml:space="preserve">registry.railway.internal:8003 (no public domain)</w:t>
+              <w:t xml:space="preserve">insights.railway.internal:8002 (no public domain)</w:t>
             </w:r>
           </w:p>
         </w:tc>
@@ -28451,14 +28519,119 @@
                 <w:sz w:val="16"/>
                 <w:szCs w:val="16"/>
               </w:rPr>
-              <w:t xml:space="preserve">REGISTRY_SOAP_USER/PASSWORD</w:t>
-            </w:r>
-            <w:r>
-              <w:rPr>
-                <w:sz w:val="16"/>
-                <w:szCs w:val="16"/>
-              </w:rPr>
-              <w:t xml:space="preserve">; SQLite file seeded at build</w:t>
+              <w:t xml:space="preserve">CORE_INTERNAL_URL</w:t>
+            </w:r>
+            <w:r>
+              <w:rPr>
+                <w:sz w:val="16"/>
+                <w:szCs w:val="16"/>
+              </w:rPr>
+              <w:t xml:space="preserve">, </w:t>
+            </w:r>
+            <w:r>
+              <w:rPr>
+                <w:rFonts w:ascii="Consolas" w:cs="Consolas" w:eastAsia="Consolas" w:hAnsi="Consolas"/>
+                <w:sz w:val="16"/>
+                <w:szCs w:val="16"/>
+              </w:rPr>
+              <w:t xml:space="preserve">SERVICE_KEY_INSIGHTS</w:t>
+            </w:r>
+            <w:r>
+              <w:rPr>
+                <w:sz w:val="16"/>
+                <w:szCs w:val="16"/>
+              </w:rPr>
+              <w:t xml:space="preserve">, </w:t>
+            </w:r>
+            <w:r>
+              <w:rPr>
+                <w:rFonts w:ascii="Consolas" w:cs="Consolas" w:eastAsia="Consolas" w:hAnsi="Consolas"/>
+                <w:sz w:val="16"/>
+                <w:szCs w:val="16"/>
+              </w:rPr>
+              <w:t xml:space="preserve">NOMINATIM_CONTACT_EMAIL</w:t>
+            </w:r>
+            <w:r>
+              <w:rPr>
+                <w:sz w:val="16"/>
+                <w:szCs w:val="16"/>
+              </w:rPr>
+              <w:t xml:space="preserve">, </w:t>
+            </w:r>
+            <w:r>
+              <w:rPr>
+                <w:rFonts w:ascii="Consolas" w:cs="Consolas" w:eastAsia="Consolas" w:hAnsi="Consolas"/>
+                <w:sz w:val="16"/>
+                <w:szCs w:val="16"/>
+              </w:rPr>
+              <w:t xml:space="preserve">CACHE_DB_*</w:t>
+            </w:r>
+            <w:r>
+              <w:rPr>
+                <w:sz w:val="16"/>
+                <w:szCs w:val="16"/>
+              </w:rPr>
+              <w:t xml:space="preserve">; optional </w:t>
+            </w:r>
+            <w:r>
+              <w:rPr>
+                <w:rFonts w:ascii="Consolas" w:cs="Consolas" w:eastAsia="Consolas" w:hAnsi="Consolas"/>
+                <w:sz w:val="16"/>
+                <w:szCs w:val="16"/>
+              </w:rPr>
+              <w:t xml:space="preserve">PSGC_URL</w:t>
+            </w:r>
+            <w:r>
+              <w:rPr>
+                <w:sz w:val="16"/>
+                <w:szCs w:val="16"/>
+              </w:rPr>
+              <w:t xml:space="preserve">, </w:t>
+            </w:r>
+            <w:r>
+              <w:rPr>
+                <w:rFonts w:ascii="Consolas" w:cs="Consolas" w:eastAsia="Consolas" w:hAnsi="Consolas"/>
+                <w:sz w:val="16"/>
+                <w:szCs w:val="16"/>
+              </w:rPr>
+              <w:t xml:space="preserve">NOMINATIM_URL</w:t>
+            </w:r>
+            <w:r>
+              <w:rPr>
+                <w:sz w:val="16"/>
+                <w:szCs w:val="16"/>
+              </w:rPr>
+              <w:t xml:space="preserve">, </w:t>
+            </w:r>
+            <w:r>
+              <w:rPr>
+                <w:rFonts w:ascii="Consolas" w:cs="Consolas" w:eastAsia="Consolas" w:hAnsi="Consolas"/>
+                <w:sz w:val="16"/>
+                <w:szCs w:val="16"/>
+              </w:rPr>
+              <w:t xml:space="preserve">OVERPASS_URL</w:t>
+            </w:r>
+            <w:r>
+              <w:rPr>
+                <w:sz w:val="16"/>
+                <w:szCs w:val="16"/>
+              </w:rPr>
+              <w:t xml:space="preserve">, </w:t>
+            </w:r>
+            <w:r>
+              <w:rPr>
+                <w:rFonts w:ascii="Consolas" w:cs="Consolas" w:eastAsia="Consolas" w:hAnsi="Consolas"/>
+                <w:sz w:val="16"/>
+                <w:szCs w:val="16"/>
+              </w:rPr>
+              <w:t xml:space="preserve">OVERPASS_FALLBACK_URL</w:t>
+            </w:r>
+            <w:r>
+              <w:rPr>
+                <w:sz w:val="16"/>
+                <w:szCs w:val="16"/>
+              </w:rPr>
+              <w:t xml:space="preserve"> (second Overpass server; empty = off)</w:t>
             </w:r>
           </w:p>
         </w:tc>
@@ -28489,6 +28662,132 @@
                 <w:sz w:val="16"/>
                 <w:szCs w:val="16"/>
               </w:rPr>
+              <w:t xml:space="preserve">Business Registry (SOAP)</w:t>
+            </w:r>
+          </w:p>
+        </w:tc>
+        <w:tc>
+          <w:tcPr>
+            <w:tcW w:type="dxa" w:w="2200"/>
+            <w:tcBorders>
+              <w:top w:val="single" w:color="7F7F7F" w:sz="4"/>
+              <w:left w:val="single" w:color="7F7F7F" w:sz="4"/>
+              <w:bottom w:val="single" w:color="7F7F7F" w:sz="4"/>
+              <w:right w:val="single" w:color="7F7F7F" w:sz="4"/>
+            </w:tcBorders>
+            <w:tcMar>
+              <w:top w:type="dxa" w:w="60"/>
+              <w:left w:type="dxa" w:w="100"/>
+              <w:bottom w:type="dxa" w:w="60"/>
+              <w:right w:type="dxa" w:w="100"/>
+            </w:tcMar>
+          </w:tcPr>
+          <w:p>
+            <w:pPr>
+              <w:spacing w:after="20"/>
+            </w:pPr>
+            <w:r>
+              <w:rPr>
+                <w:sz w:val="16"/>
+                <w:szCs w:val="16"/>
+              </w:rPr>
+              <w:t xml:space="preserve">Railway service (Dockerfile: FrankenPHP, PHP 8.4 + soap)</w:t>
+            </w:r>
+          </w:p>
+        </w:tc>
+        <w:tc>
+          <w:tcPr>
+            <w:tcW w:type="dxa" w:w="2700"/>
+            <w:tcBorders>
+              <w:top w:val="single" w:color="7F7F7F" w:sz="4"/>
+              <w:left w:val="single" w:color="7F7F7F" w:sz="4"/>
+              <w:bottom w:val="single" w:color="7F7F7F" w:sz="4"/>
+              <w:right w:val="single" w:color="7F7F7F" w:sz="4"/>
+            </w:tcBorders>
+            <w:tcMar>
+              <w:top w:type="dxa" w:w="60"/>
+              <w:left w:type="dxa" w:w="100"/>
+              <w:bottom w:type="dxa" w:w="60"/>
+              <w:right w:type="dxa" w:w="100"/>
+            </w:tcMar>
+          </w:tcPr>
+          <w:p>
+            <w:pPr>
+              <w:spacing w:after="20"/>
+            </w:pPr>
+            <w:r>
+              <w:rPr>
+                <w:sz w:val="16"/>
+                <w:szCs w:val="16"/>
+              </w:rPr>
+              <w:t xml:space="preserve">registry.railway.internal:8003 (no public domain)</w:t>
+            </w:r>
+          </w:p>
+        </w:tc>
+        <w:tc>
+          <w:tcPr>
+            <w:tcW w:type="dxa" w:w="3480"/>
+            <w:tcBorders>
+              <w:top w:val="single" w:color="7F7F7F" w:sz="4"/>
+              <w:left w:val="single" w:color="7F7F7F" w:sz="4"/>
+              <w:bottom w:val="single" w:color="7F7F7F" w:sz="4"/>
+              <w:right w:val="single" w:color="7F7F7F" w:sz="4"/>
+            </w:tcBorders>
+            <w:tcMar>
+              <w:top w:type="dxa" w:w="60"/>
+              <w:left w:type="dxa" w:w="100"/>
+              <w:bottom w:type="dxa" w:w="60"/>
+              <w:right w:type="dxa" w:w="100"/>
+            </w:tcMar>
+          </w:tcPr>
+          <w:p>
+            <w:pPr>
+              <w:spacing w:after="20"/>
+            </w:pPr>
+            <w:r>
+              <w:rPr>
+                <w:rFonts w:ascii="Consolas" w:cs="Consolas" w:eastAsia="Consolas" w:hAnsi="Consolas"/>
+                <w:sz w:val="16"/>
+                <w:szCs w:val="16"/>
+              </w:rPr>
+              <w:t xml:space="preserve">REGISTRY_SOAP_USER/PASSWORD</w:t>
+            </w:r>
+            <w:r>
+              <w:rPr>
+                <w:sz w:val="16"/>
+                <w:szCs w:val="16"/>
+              </w:rPr>
+              <w:t xml:space="preserve">; the SQLite registry is seeded at every start (demo data only)</w:t>
+            </w:r>
+          </w:p>
+        </w:tc>
+      </w:tr>
+      <w:tr>
+        <w:tc>
+          <w:tcPr>
+            <w:tcW w:type="dxa" w:w="1700"/>
+            <w:tcBorders>
+              <w:top w:val="single" w:color="7F7F7F" w:sz="4"/>
+              <w:left w:val="single" w:color="7F7F7F" w:sz="4"/>
+              <w:bottom w:val="single" w:color="7F7F7F" w:sz="4"/>
+              <w:right w:val="single" w:color="7F7F7F" w:sz="4"/>
+            </w:tcBorders>
+            <w:tcMar>
+              <w:top w:type="dxa" w:w="60"/>
+              <w:left w:type="dxa" w:w="100"/>
+              <w:bottom w:type="dxa" w:w="60"/>
+              <w:right w:type="dxa" w:w="100"/>
+            </w:tcMar>
+          </w:tcPr>
+          <w:p>
+            <w:pPr>
+              <w:spacing w:after="20"/>
+            </w:pPr>
+            <w:r>
+              <w:rPr>
+                <w:sz w:val="16"/>
+                <w:szCs w:val="16"/>
+              </w:rPr>
               <w:t xml:space="preserve">MySQL 8</w:t>
             </w:r>
           </w:p>
@@ -28607,6 +28906,193 @@
                 <w:szCs w:val="16"/>
               </w:rPr>
               <w:t xml:space="preserve"> with separate users; daily backups (Railway)</w:t>
+            </w:r>
+          </w:p>
+        </w:tc>
+      </w:tr>
+      <w:tr>
+        <w:tc>
+          <w:tcPr>
+            <w:tcW w:type="dxa" w:w="1700"/>
+            <w:tcBorders>
+              <w:top w:val="single" w:color="7F7F7F" w:sz="4"/>
+              <w:left w:val="single" w:color="7F7F7F" w:sz="4"/>
+              <w:bottom w:val="single" w:color="7F7F7F" w:sz="4"/>
+              <w:right w:val="single" w:color="7F7F7F" w:sz="4"/>
+            </w:tcBorders>
+            <w:tcMar>
+              <w:top w:type="dxa" w:w="60"/>
+              <w:left w:type="dxa" w:w="100"/>
+              <w:bottom w:type="dxa" w:w="60"/>
+              <w:right w:type="dxa" w:w="100"/>
+            </w:tcMar>
+          </w:tcPr>
+          <w:p>
+            <w:pPr>
+              <w:spacing w:after="20"/>
+            </w:pPr>
+            <w:r>
+              <w:rPr>
+                <w:sz w:val="16"/>
+                <w:szCs w:val="16"/>
+              </w:rPr>
+              <w:t xml:space="preserve">Email (SMTP)</w:t>
+            </w:r>
+          </w:p>
+        </w:tc>
+        <w:tc>
+          <w:tcPr>
+            <w:tcW w:type="dxa" w:w="2200"/>
+            <w:tcBorders>
+              <w:top w:val="single" w:color="7F7F7F" w:sz="4"/>
+              <w:left w:val="single" w:color="7F7F7F" w:sz="4"/>
+              <w:bottom w:val="single" w:color="7F7F7F" w:sz="4"/>
+              <w:right w:val="single" w:color="7F7F7F" w:sz="4"/>
+            </w:tcBorders>
+            <w:tcMar>
+              <w:top w:type="dxa" w:w="60"/>
+              <w:left w:type="dxa" w:w="100"/>
+              <w:bottom w:type="dxa" w:w="60"/>
+              <w:right w:type="dxa" w:w="100"/>
+            </w:tcMar>
+          </w:tcPr>
+          <w:p>
+            <w:pPr>
+              <w:spacing w:after="20"/>
+            </w:pPr>
+            <w:r>
+              <w:rPr>
+                <w:sz w:val="16"/>
+                <w:szCs w:val="16"/>
+                <w:highlight w:val="yellow"/>
+              </w:rPr>
+              <w:t xml:space="preserve">[Mail provider – chosen at deployment]</w:t>
+            </w:r>
+          </w:p>
+        </w:tc>
+        <w:tc>
+          <w:tcPr>
+            <w:tcW w:type="dxa" w:w="2700"/>
+            <w:tcBorders>
+              <w:top w:val="single" w:color="7F7F7F" w:sz="4"/>
+              <w:left w:val="single" w:color="7F7F7F" w:sz="4"/>
+              <w:bottom w:val="single" w:color="7F7F7F" w:sz="4"/>
+              <w:right w:val="single" w:color="7F7F7F" w:sz="4"/>
+            </w:tcBorders>
+            <w:tcMar>
+              <w:top w:type="dxa" w:w="60"/>
+              <w:left w:type="dxa" w:w="100"/>
+              <w:bottom w:type="dxa" w:w="60"/>
+              <w:right w:type="dxa" w:w="100"/>
+            </w:tcMar>
+          </w:tcPr>
+          <w:p>
+            <w:pPr>
+              <w:spacing w:after="20"/>
+            </w:pPr>
+            <w:r>
+              <w:rPr>
+                <w:sz w:val="16"/>
+                <w:szCs w:val="16"/>
+              </w:rPr>
+              <w:t xml:space="preserve">Provider's SMTP host</w:t>
+            </w:r>
+          </w:p>
+        </w:tc>
+        <w:tc>
+          <w:tcPr>
+            <w:tcW w:type="dxa" w:w="3480"/>
+            <w:tcBorders>
+              <w:top w:val="single" w:color="7F7F7F" w:sz="4"/>
+              <w:left w:val="single" w:color="7F7F7F" w:sz="4"/>
+              <w:bottom w:val="single" w:color="7F7F7F" w:sz="4"/>
+              <w:right w:val="single" w:color="7F7F7F" w:sz="4"/>
+            </w:tcBorders>
+            <w:tcMar>
+              <w:top w:type="dxa" w:w="60"/>
+              <w:left w:type="dxa" w:w="100"/>
+              <w:bottom w:type="dxa" w:w="60"/>
+              <w:right w:type="dxa" w:w="100"/>
+            </w:tcMar>
+          </w:tcPr>
+          <w:p>
+            <w:pPr>
+              <w:spacing w:after="20"/>
+            </w:pPr>
+            <w:r>
+              <w:rPr>
+                <w:rFonts w:ascii="Consolas" w:cs="Consolas" w:eastAsia="Consolas" w:hAnsi="Consolas"/>
+                <w:sz w:val="16"/>
+                <w:szCs w:val="16"/>
+              </w:rPr>
+              <w:t xml:space="preserve">MAIL_MAILER=smtp</w:t>
+            </w:r>
+            <w:r>
+              <w:rPr>
+                <w:sz w:val="16"/>
+                <w:szCs w:val="16"/>
+              </w:rPr>
+              <w:t xml:space="preserve">, </w:t>
+            </w:r>
+            <w:r>
+              <w:rPr>
+                <w:rFonts w:ascii="Consolas" w:cs="Consolas" w:eastAsia="Consolas" w:hAnsi="Consolas"/>
+                <w:sz w:val="16"/>
+                <w:szCs w:val="16"/>
+              </w:rPr>
+              <w:t xml:space="preserve">MAIL_HOST</w:t>
+            </w:r>
+            <w:r>
+              <w:rPr>
+                <w:sz w:val="16"/>
+                <w:szCs w:val="16"/>
+              </w:rPr>
+              <w:t xml:space="preserve">, </w:t>
+            </w:r>
+            <w:r>
+              <w:rPr>
+                <w:rFonts w:ascii="Consolas" w:cs="Consolas" w:eastAsia="Consolas" w:hAnsi="Consolas"/>
+                <w:sz w:val="16"/>
+                <w:szCs w:val="16"/>
+              </w:rPr>
+              <w:t xml:space="preserve">MAIL_USERNAME</w:t>
+            </w:r>
+            <w:r>
+              <w:rPr>
+                <w:sz w:val="16"/>
+                <w:szCs w:val="16"/>
+              </w:rPr>
+              <w:t xml:space="preserve">, </w:t>
+            </w:r>
+            <w:r>
+              <w:rPr>
+                <w:rFonts w:ascii="Consolas" w:cs="Consolas" w:eastAsia="Consolas" w:hAnsi="Consolas"/>
+                <w:sz w:val="16"/>
+                <w:szCs w:val="16"/>
+              </w:rPr>
+              <w:t xml:space="preserve">MAIL_PASSWORD</w:t>
+            </w:r>
+            <w:r>
+              <w:rPr>
+                <w:sz w:val="16"/>
+                <w:szCs w:val="16"/>
+              </w:rPr>
+              <w:t xml:space="preserve">, </w:t>
+            </w:r>
+            <w:r>
+              <w:rPr>
+                <w:rFonts w:ascii="Consolas" w:cs="Consolas" w:eastAsia="Consolas" w:hAnsi="Consolas"/>
+                <w:sz w:val="16"/>
+                <w:szCs w:val="16"/>
+              </w:rPr>
+              <w:t xml:space="preserve">MAIL_FROM_ADDRESS</w:t>
+            </w:r>
+            <w:r>
+              <w:rPr>
+                <w:sz w:val="16"/>
+                <w:szCs w:val="16"/>
+              </w:rPr>
+              <w:t xml:space="preserve"> on the Core Service and scheduler</w:t>
             </w:r>
           </w:p>
         </w:tc>
@@ -28805,7 +29291,7 @@
                 <w:sz w:val="16"/>
                 <w:szCs w:val="16"/>
               </w:rPr>
-              <w:t xml:space="preserve">│  ├─ postman/                  collection + environments</w:t>
+              <w:t xml:space="preserve">│  ├─ postman/                  collection generator, collection + environments</w:t>
             </w:r>
           </w:p>
           <w:p>
@@ -28818,7 +29304,7 @@
                 <w:sz w:val="16"/>
                 <w:szCs w:val="16"/>
               </w:rPr>
-              <w:t xml:space="preserve">│  └─ jmeter/                   .jmx test plans + CSV data</w:t>
+              <w:t xml:space="preserve">│  ├─ jmeter/                   .jmx test plan, README</w:t>
             </w:r>
           </w:p>
           <w:p>
@@ -28831,7 +29317,7 @@
                 <w:sz w:val="16"/>
                 <w:szCs w:val="16"/>
               </w:rPr>
-              <w:t xml:space="preserve">├─ docs/                        architecture diagrams, API reference, this document</w:t>
+              <w:t xml:space="preserve">│  ├─ a11y/                     axe / WCAG checks (Playwright), UI reference builder</w:t>
             </w:r>
           </w:p>
           <w:p>
@@ -28844,7 +29330,72 @@
                 <w:sz w:val="16"/>
                 <w:szCs w:val="16"/>
               </w:rPr>
-              <w:t xml:space="preserve">├─ .github/workflows/ci.yml     CI/CD pipeline</w:t>
+              <w:t xml:space="preserve">│  └─ mock-external/            stand-in for PSGC, Nominatim and Overpass in CI</w:t>
+            </w:r>
+          </w:p>
+          <w:p>
+            <w:pPr>
+              <w:spacing w:after="0" w:line="240"/>
+            </w:pPr>
+            <w:r>
+              <w:rPr>
+                <w:rFonts w:ascii="Consolas" w:cs="Consolas" w:eastAsia="Consolas" w:hAnsi="Consolas"/>
+                <w:sz w:val="16"/>
+                <w:szCs w:val="16"/>
+              </w:rPr>
+              <w:t xml:space="preserve">├─ docker/                      MySQL init scripts for the container stack</w:t>
+            </w:r>
+          </w:p>
+          <w:p>
+            <w:pPr>
+              <w:spacing w:after="0" w:line="240"/>
+            </w:pPr>
+            <w:r>
+              <w:rPr>
+                <w:rFonts w:ascii="Consolas" w:cs="Consolas" w:eastAsia="Consolas" w:hAnsi="Consolas"/>
+                <w:sz w:val="16"/>
+                <w:szCs w:val="16"/>
+              </w:rPr>
+              <w:t xml:space="preserve">├─ docker-compose*.yml          containers for the CI integration test</w:t>
+            </w:r>
+          </w:p>
+          <w:p>
+            <w:pPr>
+              <w:spacing w:after="0" w:line="240"/>
+            </w:pPr>
+            <w:r>
+              <w:rPr>
+                <w:rFonts w:ascii="Consolas" w:cs="Consolas" w:eastAsia="Consolas" w:hAnsi="Consolas"/>
+                <w:sz w:val="16"/>
+                <w:szCs w:val="16"/>
+              </w:rPr>
+              <w:t xml:space="preserve">├─ docs/                        OpenAPI, diagrams, accessibility audit, this document</w:t>
+            </w:r>
+          </w:p>
+          <w:p>
+            <w:pPr>
+              <w:spacing w:after="0" w:line="240"/>
+            </w:pPr>
+            <w:r>
+              <w:rPr>
+                <w:rFonts w:ascii="Consolas" w:cs="Consolas" w:eastAsia="Consolas" w:hAnsi="Consolas"/>
+                <w:sz w:val="16"/>
+                <w:szCs w:val="16"/>
+              </w:rPr>
+              <w:t xml:space="preserve">├─ .github/workflows/ci.yml     CI pipeline</w:t>
+            </w:r>
+          </w:p>
+          <w:p>
+            <w:pPr>
+              <w:spacing w:after="0" w:line="240"/>
+            </w:pPr>
+            <w:r>
+              <w:rPr>
+                <w:rFonts w:ascii="Consolas" w:cs="Consolas" w:eastAsia="Consolas" w:hAnsi="Consolas"/>
+                <w:sz w:val="16"/>
+                <w:szCs w:val="16"/>
+              </w:rPr>
+              <w:t xml:space="preserve">├─ PROGRESS.md                  checklist, decisions, known issues, session log</w:t>
             </w:r>
           </w:p>
           <w:p>
@@ -28894,7 +29445,7 @@
         <w:t xml:space="preserve">main</w:t>
       </w:r>
       <w:r>
-        <w:t xml:space="preserve"> (deployed, protected), </w:t>
+        <w:t xml:space="preserve"> is the deployed branch and </w:t>
       </w:r>
       <w:r>
         <w:rPr>
@@ -28903,43 +29454,16 @@
         <w:t xml:space="preserve">develop</w:t>
       </w:r>
       <w:r>
-        <w:t xml:space="preserve"> (integration), and short-lived </w:t>
+        <w:t xml:space="preserve"> the integration branch. During development the team committed small, tested changes directly to </w:t>
       </w:r>
       <w:r>
         <w:rPr>
           <w:rFonts w:ascii="Consolas" w:cs="Consolas" w:eastAsia="Consolas" w:hAnsi="Consolas"/>
         </w:rPr>
-        <w:t xml:space="preserve">feature/&lt;module&gt;-&lt;desc&gt;</w:t>
-      </w:r>
-      <w:r>
-        <w:t xml:space="preserve"> branches (e.g., </w:t>
-      </w:r>
-      <w:r>
-        <w:rPr>
-          <w:rFonts w:ascii="Consolas" w:cs="Consolas" w:eastAsia="Consolas" w:hAnsi="Consolas"/>
-        </w:rPr>
-        <w:t xml:space="preserve">feature/M5-matching</w:t>
-      </w:r>
-      <w:r>
-        <w:t xml:space="preserve">, </w:t>
-      </w:r>
-      <w:r>
-        <w:rPr>
-          <w:rFonts w:ascii="Consolas" w:cs="Consolas" w:eastAsia="Consolas" w:hAnsi="Consolas"/>
-        </w:rPr>
-        <w:t xml:space="preserve">feature/soap-registry</w:t>
-      </w:r>
-      <w:r>
-        <w:t xml:space="preserve">), plus </w:t>
-      </w:r>
-      <w:r>
-        <w:rPr>
-          <w:rFonts w:ascii="Consolas" w:cs="Consolas" w:eastAsia="Consolas" w:hAnsi="Consolas"/>
-        </w:rPr>
-        <w:t xml:space="preserve">fix/&lt;desc&gt;</w:t>
-      </w:r>
-      <w:r>
-        <w:t xml:space="preserve">.</w:t>
+        <w:t xml:space="preserve">main</w:t>
+      </w:r>
+      <w:r>
+        <w:t xml:space="preserve">; every push and pull request to either branch runs the CI workflow, so a failing change shows up at once.</w:t>
       </w:r>
     </w:p>
     <w:p>
@@ -28974,7 +29498,7 @@
         <w:rPr>
           <w:rFonts w:ascii="Consolas" w:cs="Consolas" w:eastAsia="Consolas" w:hAnsi="Consolas"/>
         </w:rPr>
-        <w:t xml:space="preserve">fix(gateway): forward Authorization header</w:t>
+        <w:t xml:space="preserve">fix(gateway): strip X-Powered-By</w:t>
       </w:r>
       <w:r>
         <w:t xml:space="preserve">, </w:t>
@@ -28986,7 +29510,7 @@
         <w:t xml:space="preserve">test(postman): add T06</w:t>
       </w:r>
       <w:r>
-        <w:t xml:space="preserve">).</w:t>
+        <w:t xml:space="preserve">), each with its code, tests and progress note together.</w:t>
       </w:r>
     </w:p>
     <w:p>
@@ -29003,75 +29527,19 @@
           <w:b/>
           <w:bCs/>
         </w:rPr>
-        <w:t xml:space="preserve">Pull requests:</w:t>
-      </w:r>
-      <w:r>
-        <w:t xml:space="preserve"> every change goes through a PR into </w:t>
+        <w:t xml:space="preserve">Tracking:</w:t>
+      </w:r>
+      <w:r>
+        <w:t xml:space="preserve"> </w:t>
       </w:r>
       <w:r>
         <w:rPr>
           <w:rFonts w:ascii="Consolas" w:cs="Consolas" w:eastAsia="Consolas" w:hAnsi="Consolas"/>
         </w:rPr>
-        <w:t xml:space="preserve">develop</w:t>
-      </w:r>
-      <w:r>
-        <w:t xml:space="preserve"> with at least one reviewer and a green CI run; </w:t>
-      </w:r>
-      <w:r>
-        <w:rPr>
-          <w:rFonts w:ascii="Consolas" w:cs="Consolas" w:eastAsia="Consolas" w:hAnsi="Consolas"/>
-        </w:rPr>
-        <w:t xml:space="preserve">develop</w:t>
-      </w:r>
-      <w:r>
-        <w:t xml:space="preserve"> is merged into </w:t>
-      </w:r>
-      <w:r>
-        <w:rPr>
-          <w:rFonts w:ascii="Consolas" w:cs="Consolas" w:eastAsia="Consolas" w:hAnsi="Consolas"/>
-        </w:rPr>
-        <w:t xml:space="preserve">main</w:t>
-      </w:r>
-      <w:r>
-        <w:t xml:space="preserve"> for releases, tagged </w:t>
-      </w:r>
-      <w:r>
-        <w:rPr>
-          <w:rFonts w:ascii="Consolas" w:cs="Consolas" w:eastAsia="Consolas" w:hAnsi="Consolas"/>
-        </w:rPr>
-        <w:t xml:space="preserve">v1.0</w:t>
-      </w:r>
-      <w:r>
-        <w:t xml:space="preserve">, </w:t>
-      </w:r>
-      <w:r>
-        <w:rPr>
-          <w:rFonts w:ascii="Consolas" w:cs="Consolas" w:eastAsia="Consolas" w:hAnsi="Consolas"/>
-        </w:rPr>
-        <w:t xml:space="preserve">v1.1</w:t>
-      </w:r>
-      <w:r>
-        <w:t xml:space="preserve">, ….</w:t>
-      </w:r>
-    </w:p>
-    <w:p>
-      <w:pPr>
-        <w:pStyle w:val="ListParagraph"/>
-        <w:numPr>
-          <w:ilvl w:val="0"/>
-          <w:numId w:val="2"/>
-        </w:numPr>
-        <w:spacing w:after="60"/>
-      </w:pPr>
-      <w:r>
-        <w:rPr>
-          <w:b/>
-          <w:bCs/>
-        </w:rPr>
-        <w:t xml:space="preserve">Issues:</w:t>
-      </w:r>
-      <w:r>
-        <w:t xml:space="preserve"> GitHub Issues/Projects board with one issue per module feature (F1.1 … F13.5) and per integration task, linked to PRs.</w:t>
+        <w:t xml:space="preserve">PROGRESS.md</w:t>
+      </w:r>
+      <w:r>
+        <w:t xml:space="preserve"> holds the phase checklist, dated design decisions, known issues and a session log, so any team member can see what is done and what comes next.</w:t>
       </w:r>
     </w:p>
     <w:p>
@@ -29275,7 +29743,22 @@
                 <w:sz w:val="16"/>
                 <w:szCs w:val="16"/>
               </w:rPr>
-              <w:t xml:space="preserve">Pull request to </w:t>
+              <w:t xml:space="preserve">Push to </w:t>
+            </w:r>
+            <w:r>
+              <w:rPr>
+                <w:rFonts w:ascii="Consolas" w:cs="Consolas" w:eastAsia="Consolas" w:hAnsi="Consolas"/>
+                <w:sz w:val="16"/>
+                <w:szCs w:val="16"/>
+              </w:rPr>
+              <w:t xml:space="preserve">main</w:t>
+            </w:r>
+            <w:r>
+              <w:rPr>
+                <w:sz w:val="16"/>
+                <w:szCs w:val="16"/>
+              </w:rPr>
+              <w:t xml:space="preserve"> or </w:t>
             </w:r>
             <w:r>
               <w:rPr>
@@ -29290,30 +29773,7 @@
                 <w:sz w:val="16"/>
                 <w:szCs w:val="16"/>
               </w:rPr>
-              <w:t xml:space="preserve"> or </w:t>
-            </w:r>
-            <w:r>
-              <w:rPr>
-                <w:rFonts w:ascii="Consolas" w:cs="Consolas" w:eastAsia="Consolas" w:hAnsi="Consolas"/>
-                <w:sz w:val="16"/>
-                <w:szCs w:val="16"/>
-              </w:rPr>
-              <w:t xml:space="preserve">main</w:t>
-            </w:r>
-            <w:r>
-              <w:rPr>
-                <w:sz w:val="16"/>
-                <w:szCs w:val="16"/>
-              </w:rPr>
-              <w:t xml:space="preserve">; push to </w:t>
-            </w:r>
-            <w:r>
-              <w:rPr>
-                <w:rFonts w:ascii="Consolas" w:cs="Consolas" w:eastAsia="Consolas" w:hAnsi="Consolas"/>
-                <w:sz w:val="16"/>
-                <w:szCs w:val="16"/>
-              </w:rPr>
-              <w:t xml:space="preserve">develop</w:t>
+              <w:t xml:space="preserve">; pull request to either; manual run (runs every job)</w:t>
             </w:r>
           </w:p>
         </w:tc>
@@ -29342,7 +29802,7 @@
                 <w:sz w:val="16"/>
                 <w:szCs w:val="16"/>
               </w:rPr>
-              <w:t xml:space="preserve">Path-filtered jobs run in parallel: </w:t>
+              <w:t xml:space="preserve">Path-filtered jobs (only the changed components) run in parallel: </w:t>
             </w:r>
             <w:r>
               <w:rPr>
@@ -29403,7 +29863,7 @@
                 <w:sz w:val="16"/>
                 <w:szCs w:val="16"/>
               </w:rPr>
-              <w:t xml:space="preserve">, axe accessibility check on the built pages; </w:t>
+              <w:t xml:space="preserve">; </w:t>
             </w:r>
             <w:r>
               <w:rPr>
@@ -29450,7 +29910,7 @@
                 <w:sz w:val="16"/>
                 <w:szCs w:val="16"/>
               </w:rPr>
-              <w:t xml:space="preserve">, lint, unit tests (Jest, with external APIs mocked); </w:t>
+              <w:t xml:space="preserve">, ESLint, Jest unit tests (external APIs mocked with nock); </w:t>
             </w:r>
             <w:r>
               <w:rPr>
@@ -29496,7 +29956,7 @@
                 <w:sz w:val="16"/>
                 <w:szCs w:val="16"/>
               </w:rPr>
-              <w:t xml:space="preserve"> against a MySQL service container (policies, status transitions, trust score); </w:t>
+              <w:t xml:space="preserve"> against a MySQL 8 service container (policies, status transitions, trust score); </w:t>
             </w:r>
             <w:r>
               <w:rPr>
@@ -29527,7 +29987,7 @@
                 <w:sz w:val="16"/>
                 <w:szCs w:val="16"/>
               </w:rPr>
-              <w:t xml:space="preserve">, WSDL validated with </w:t>
+              <w:t xml:space="preserve">, WSDL checked with </w:t>
             </w:r>
             <w:r>
               <w:rPr>
@@ -29542,7 +30002,7 @@
                 <w:sz w:val="16"/>
                 <w:szCs w:val="16"/>
               </w:rPr>
-              <w:t xml:space="preserve">, SOAP smoke test.</w:t>
+              <w:t xml:space="preserve">, unit and SOAP smoke tests.</w:t>
             </w:r>
           </w:p>
         </w:tc>
@@ -29628,6 +30088,13 @@
             </w:pPr>
             <w:r>
               <w:rPr>
+                <w:sz w:val="16"/>
+                <w:szCs w:val="16"/>
+              </w:rPr>
+              <w:t xml:space="preserve">Throwaway secrets generated; </w:t>
+            </w:r>
+            <w:r>
+              <w:rPr>
                 <w:rFonts w:ascii="Consolas" w:cs="Consolas" w:eastAsia="Consolas" w:hAnsi="Consolas"/>
                 <w:sz w:val="16"/>
                 <w:szCs w:val="16"/>
@@ -29639,22 +30106,7 @@
                 <w:sz w:val="16"/>
                 <w:szCs w:val="16"/>
               </w:rPr>
-              <w:t xml:space="preserve"> of gateway, core, insights (external APIs replaced by a mock server), registry and MySQL; seed data; run Newman with the </w:t>
-            </w:r>
-            <w:r>
-              <w:rPr>
-                <w:rFonts w:ascii="Consolas" w:cs="Consolas" w:eastAsia="Consolas" w:hAnsi="Consolas"/>
-                <w:sz w:val="16"/>
-                <w:szCs w:val="16"/>
-              </w:rPr>
-              <w:t xml:space="preserve">ci</w:t>
-            </w:r>
-            <w:r>
-              <w:rPr>
-                <w:sz w:val="16"/>
-                <w:szCs w:val="16"/>
-              </w:rPr>
-              <w:t xml:space="preserve"> environment; upload the HTML report as an artifact.</w:t>
+              <w:t xml:space="preserve"> of gateway, core, insights, registry and MySQL from the same Dockerfiles as Railway, with PSGC, Nominatim and Overpass replaced by a mock server; migrate and seed; Newman runs the full collection and a second time folder 07 with Overpass unreachable (T13); the built frontend is checked with axe (WCAG 2.1 A/AA) on the main pages of every role with Playwright Chromium; the Newman HTML reports are uploaded as an artifact.</w:t>
             </w:r>
           </w:p>
         </w:tc>
@@ -29872,7 +30324,7 @@
         <w:spacing w:after="120" w:line="276"/>
       </w:pPr>
       <w:r>
-        <w:t xml:space="preserve">Full instructions are in the repository README. Local development runs every component natively (PHP 8.3+, Composer, Node.js 22, MySQL 8); Docker is used only by the CI pipeline and the Railway images. Summary (no real secret values shown):</w:t>
+        <w:t xml:space="preserve">Full instructions are in the repository README. Local development runs every component natively (PHP 8.4, Composer, Node.js 22, MySQL 8); Docker is used only by the CI pipeline and the Railway images. Summary (no real secret values shown):</w:t>
       </w:r>
     </w:p>
     <w:tbl>
@@ -30048,6 +30500,19 @@
                 <w:sz w:val="16"/>
                 <w:szCs w:val="16"/>
               </w:rPr>
+              <w:t xml:space="preserve">php artisan queue:work database --stop-when-empty                # sends queued password-reset emails</w:t>
+            </w:r>
+          </w:p>
+          <w:p>
+            <w:pPr>
+              <w:spacing w:after="0" w:line="240"/>
+            </w:pPr>
+            <w:r>
+              <w:rPr>
+                <w:rFonts w:ascii="Consolas" w:cs="Consolas" w:eastAsia="Consolas" w:hAnsi="Consolas"/>
+                <w:sz w:val="16"/>
+                <w:szCs w:val="16"/>
+              </w:rPr>
               <w:t xml:space="preserve"> </w:t>
             </w:r>
           </w:p>
@@ -30074,7 +30539,7 @@
                 <w:sz w:val="16"/>
                 <w:szCs w:val="16"/>
               </w:rPr>
-              <w:t xml:space="preserve">cd services/business-registry-soap &amp;&amp; php seed.php &amp;&amp; php -S localhost:8003 -t public</w:t>
+              <w:t xml:space="preserve">cd services/business-registry-soap &amp;&amp; php seed.php &amp;&amp; php -S 127.0.0.1:8003 -t public</w:t>
             </w:r>
           </w:p>
           <w:p>
@@ -31077,7 +31542,7 @@
         <w:spacing w:after="120" w:line="276"/>
       </w:pPr>
       <w:r>
-        <w:t xml:space="preserve">Users by role, pending queues, applications and hires per month, most-needed accommodations (M8).</w:t>
+        <w:t xml:space="preserve">Work queues (employers to verify, postings to approve, open reports) and platform counts: users by role, postings and applications by status, feedback responses and published trust scores (M8).</w:t>
       </w:r>
     </w:p>
     <w:p>
@@ -31105,7 +31570,16 @@
         <w:t xml:space="preserve">User action in client application:</w:t>
       </w:r>
       <w:r>
-        <w:t xml:space="preserve"> the demo candidate (needs: wheelchair-accessible entrance, accessible restroom, flexible hours, screen-reader-compatible tools, sign language interpreter) logs in, opens Find jobs and clicks the top-ranked "Data Encoder" posting showing "Meets 4 of 5 of your needs".</w:t>
+        <w:t xml:space="preserve"> the demo candidate (</w:t>
+      </w:r>
+      <w:r>
+        <w:rPr>
+          <w:rFonts w:ascii="Consolas" w:cs="Consolas" w:eastAsia="Consolas" w:hAnsi="Consolas"/>
+        </w:rPr>
+        <w:t xml:space="preserve">candidate@opendoor.test</w:t>
+      </w:r>
+      <w:r>
+        <w:t xml:space="preserve">; needs: wheelchair-accessible entrance, accessible restroom, written or captioned meetings) logs in, opens Find jobs with "Matches my needs" on and sees three results ranked by needs met: "Data Encoder" (Meets all 3 of your needs), "Customer Support Associate (Chat)" (1 of 3) and "Junior Web Developer" (0 of 3). The candidate opens "Data Encoder" by Bayanihan Tech Solutions and then the Workplace Accessibility Snapshot section.</w:t>
       </w:r>
     </w:p>
     <w:p>
@@ -31131,16 +31605,16 @@
         <w:rPr>
           <w:rFonts w:ascii="Consolas" w:cs="Consolas" w:eastAsia="Consolas" w:hAnsi="Consolas"/>
         </w:rPr>
-        <w:t xml:space="preserve">GET /api/job-postings/42?match=1</w:t>
-      </w:r>
-      <w:r>
-        <w:t xml:space="preserve"> and </w:t>
+        <w:t xml:space="preserve">GET /api/job-postings/1</w:t>
+      </w:r>
+      <w:r>
+        <w:t xml:space="preserve"> with the candidate's token (so the match is included) and, when the snapshot section is opened, </w:t>
       </w:r>
       <w:r>
         <w:rPr>
           <w:rFonts w:ascii="Consolas" w:cs="Consolas" w:eastAsia="Consolas" w:hAnsi="Consolas"/>
         </w:rPr>
-        <w:t xml:space="preserve">GET /api/insights/job-postings/42</w:t>
+        <w:t xml:space="preserve">GET /api/insights/job-postings/1</w:t>
       </w:r>
       <w:r>
         <w:t xml:space="preserve"> to the API Gateway, which adds an </w:t>
@@ -31192,7 +31666,16 @@
         <w:t xml:space="preserve">External/legacy API interaction:</w:t>
       </w:r>
       <w:r>
-        <w:t xml:space="preserve"> the Insights Service resolves the PSGC code, geocodes the address with Nominatim and queries Overpass for wheelchair-tagged places within 500 m. (Separately, the admin demo shows the Core Service calling the SOAP Business Registry to verify the posting's employer.)</w:t>
+        <w:t xml:space="preserve"> the Insights Service resolves the PSGC code, geocodes the address with Nominatim and queries Overpass for wheelchair-tagged places within 500 m. (Separately, the admin demo shows the Core Service calling the SOAP Business Registry for the employer waiting for verification, Kalinga Foods Inc., SEC </w:t>
+      </w:r>
+      <w:r>
+        <w:rPr>
+          <w:rFonts w:ascii="Consolas" w:cs="Consolas" w:eastAsia="Consolas" w:hAnsi="Consolas"/>
+        </w:rPr>
+        <w:t xml:space="preserve">CS201912345</w:t>
+      </w:r>
+      <w:r>
+        <w:t xml:space="preserve">: ACTIVE, name match 100%.)</w:t>
       </w:r>
     </w:p>
     <w:p>
@@ -31232,7 +31715,16 @@
         <w:t xml:space="preserve">Final result shown to user:</w:t>
       </w:r>
       <w:r>
-        <w:t xml:space="preserve"> the job details page shows the match badge, the unmet accommodation, the Verified badge, "86% – based on 5 hires", and the nearest accessible MRT stop; the candidate applies with an interview accommodation request and sees the application as Pending, while the employer receives a notification.</w:t>
+        <w:t xml:space="preserve"> the job details page shows "Meets all 3 of your needs", the Verified employer badge, the trust score "79% of promised accommodations were delivered. Based on 3 responses." and the accessible places OpenStreetMap lists within 500 m (when the screenshots in 9.1 were taken: no tagged transit stops, toilets or parking, and two other places 423 m and 462 m away). The candidate applies with an interview accommodation request and sees the application as Submitted (</w:t>
+      </w:r>
+      <w:r>
+        <w:rPr>
+          <w:rFonts w:ascii="Consolas" w:cs="Consolas" w:eastAsia="Consolas" w:hAnsi="Consolas"/>
+        </w:rPr>
+        <w:t xml:space="preserve">pending</w:t>
+      </w:r>
+      <w:r>
+        <w:t xml:space="preserve">), while the employer receives an in-app notification and, with emails on, an email. On a posting that meets only some needs, the details page names the missing accommodations.</w:t>
       </w:r>
     </w:p>
     <w:p>
@@ -32004,7 +32496,7 @@
         <w:t xml:space="preserve">Scale:</w:t>
       </w:r>
       <w:r>
-        <w:t xml:space="preserve"> hobby-tier hosting, a single MySQL instance shared by two schemas, and synchronous calls limit throughput; no message queue or horizontal scaling is used.</w:t>
+        <w:t xml:space="preserve"> hobby-tier hosting, a single MySQL instance shared by two schemas, and synchronous calls limit throughput; apart from the small database queue for password-reset emails there is no message broker, and no horizontal scaling is used.</w:t>
       </w:r>
     </w:p>
     <w:p>
@@ -32058,9 +32550,22 @@
       </w:pPr>
       <w:r>
         <w:rPr>
-          <w:highlight w:val="yellow"/>
+          <w:b/>
+          <w:bCs/>
         </w:rPr>
-        <w:t xml:space="preserve">[Add any feature that was not completed or was simplified in the final build.]</w:t>
+        <w:t xml:space="preserve">Simplified in the final build:</w:t>
+      </w:r>
+      <w:r>
+        <w:t xml:space="preserve"> keyword search uses a case-insensitive </w:t>
+      </w:r>
+      <w:r>
+        <w:rPr>
+          <w:rFonts w:ascii="Consolas" w:cs="Consolas" w:eastAsia="Consolas" w:hAnsi="Consolas"/>
+        </w:rPr>
+        <w:t xml:space="preserve">LIKE</w:t>
+      </w:r>
+      <w:r>
+        <w:t xml:space="preserve"> instead of the MySQL full-text index; Voice input depends on the browser's speech service and is therefore offered only in Chrome and Edge; email delivery depends on a mail provider chosen at deployment; the "Contact us" page of the UI design was not built because no contact details were available.</w:t>
       </w:r>
     </w:p>
     <w:p>
@@ -32085,7 +32590,7 @@
           <w:b/>
           <w:bCs/>
         </w:rPr>
-        <w:t xml:space="preserve">Asynchronous events (message queue):</w:t>
+        <w:t xml:space="preserve">Asynchronous events (message broker):</w:t>
       </w:r>
       <w:r>
         <w:t xml:space="preserve"> publish </w:t>
@@ -32106,7 +32611,7 @@
         <w:t xml:space="preserve">feedback.saved</w:t>
       </w:r>
       <w:r>
-        <w:t xml:space="preserve"> events (e.g., RabbitMQ or Redis Streams) so notifications, email and trust-score recalculation run outside the request – improves response time and resilience.</w:t>
+        <w:t xml:space="preserve"> events (e.g., RabbitMQ or Redis Streams) so notifications, emails and trust-score recalculation run in separate workers with retries, instead of after the response in the same process or on the database queue – improves response time and resilience.</w:t>
       </w:r>
     </w:p>
     <w:p>
@@ -33065,7 +33570,7 @@
         <w:ind w:left="720" w:hanging="720"/>
       </w:pPr>
       <w:r>
-        <w:t xml:space="preserve">Department of Labor and Employment. (n.d.). PhilJobNet and PESO Employment Information System. Retrieved September 28, 2026, from https://philjobnet.gov.ph/</w:t>
+        <w:t xml:space="preserve">Braille Institute of America. (n.d.). Atkinson Hyperlegible font. https://www.brailleinstitute.org/freefont/</w:t>
       </w:r>
     </w:p>
     <w:p>
@@ -33074,7 +33579,7 @@
         <w:ind w:left="720" w:hanging="720"/>
       </w:pPr>
       <w:r>
-        <w:t xml:space="preserve">Deque Systems. (n.d.). axe-core: Accessibility engine for automated web UI testing. https://github.com/dequelabs/axe-core</w:t>
+        <w:t xml:space="preserve">Department of Labor and Employment. (n.d.). PhilJobNet and PESO Employment Information System. Retrieved September 28, 2026, from https://philjobnet.gov.ph/</w:t>
       </w:r>
     </w:p>
     <w:p>
@@ -33083,7 +33588,7 @@
         <w:ind w:left="720" w:hanging="720"/>
       </w:pPr>
       <w:r>
-        <w:t xml:space="preserve">Express.js. (n.d.). Express 4.x API reference. https://expressjs.com/</w:t>
+        <w:t xml:space="preserve">Deque Systems. (n.d.). axe-core: Accessibility engine for automated web UI testing. https://github.com/dequelabs/axe-core</w:t>
       </w:r>
     </w:p>
     <w:p>
@@ -33092,7 +33597,7 @@
         <w:ind w:left="720" w:hanging="720"/>
       </w:pPr>
       <w:r>
-        <w:t xml:space="preserve">GitHub. (n.d.). GitHub Actions documentation. https://docs.github.com/actions</w:t>
+        <w:t xml:space="preserve">Docker. (n.d.). Docker Compose documentation. https://docs.docker.com/compose/</w:t>
       </w:r>
     </w:p>
     <w:p>
@@ -33101,7 +33606,7 @@
         <w:ind w:left="720" w:hanging="720"/>
       </w:pPr>
       <w:r>
-        <w:t xml:space="preserve">Laravel. (n.d.). Laravel 13.x documentation: Sanctum, Authorization, Validation. https://laravel.com/docs/13.x</w:t>
+        <w:t xml:space="preserve">Express.js. (n.d.). Express 4.x API reference. https://expressjs.com/</w:t>
       </w:r>
     </w:p>
     <w:p>
@@ -33110,7 +33615,88 @@
         <w:ind w:left="720" w:hanging="720"/>
       </w:pPr>
       <w:r>
+        <w:t xml:space="preserve">Fontsource. (n.d.). Fontsource: Self-host open source fonts in neatly bundled NPM packages. https://fontsource.org/</w:t>
+      </w:r>
+    </w:p>
+    <w:p>
+      <w:pPr>
+        <w:spacing w:after="100"/>
+        <w:ind w:left="720" w:hanging="720"/>
+      </w:pPr>
+      <w:r>
+        <w:t xml:space="preserve">FrankenPHP. (n.d.). FrankenPHP documentation. https://frankenphp.dev/docs/</w:t>
+      </w:r>
+    </w:p>
+    <w:p>
+      <w:pPr>
+        <w:spacing w:after="100"/>
+        <w:ind w:left="720" w:hanging="720"/>
+      </w:pPr>
+      <w:r>
+        <w:t xml:space="preserve">GitHub. (n.d.). GitHub Actions documentation. https://docs.github.com/actions</w:t>
+      </w:r>
+    </w:p>
+    <w:p>
+      <w:pPr>
+        <w:spacing w:after="100"/>
+        <w:ind w:left="720" w:hanging="720"/>
+      </w:pPr>
+      <w:r>
+        <w:t xml:space="preserve">Google. (n.d.). Lighthouse overview. Chrome for Developers. https://developer.chrome.com/docs/lighthouse/overview</w:t>
+      </w:r>
+    </w:p>
+    <w:p>
+      <w:pPr>
+        <w:spacing w:after="100"/>
+        <w:ind w:left="720" w:hanging="720"/>
+      </w:pPr>
+      <w:r>
+        <w:t xml:space="preserve">Laravel. (n.d.). Laravel 13.x documentation: Sanctum, Authorization, Validation. https://laravel.com/docs/13.x</w:t>
+      </w:r>
+    </w:p>
+    <w:p>
+      <w:pPr>
+        <w:spacing w:after="100"/>
+        <w:ind w:left="720" w:hanging="720"/>
+      </w:pPr>
+      <w:r>
+        <w:t xml:space="preserve">Lexend. (n.d.). Lexend font family. https://www.lexend.com/</w:t>
+      </w:r>
+    </w:p>
+    <w:p>
+      <w:pPr>
+        <w:spacing w:after="100"/>
+        <w:ind w:left="720" w:hanging="720"/>
+      </w:pPr>
+      <w:r>
+        <w:t xml:space="preserve">Lucide Contributors. (n.d.). Lucide icons. https://lucide.dev/</w:t>
+      </w:r>
+    </w:p>
+    <w:p>
+      <w:pPr>
+        <w:spacing w:after="100"/>
+        <w:ind w:left="720" w:hanging="720"/>
+      </w:pPr>
+      <w:r>
         <w:t xml:space="preserve">Meta Open Source. (n.d.). React documentation (version 19). https://react.dev/</w:t>
+      </w:r>
+    </w:p>
+    <w:p>
+      <w:pPr>
+        <w:spacing w:after="100"/>
+        <w:ind w:left="720" w:hanging="720"/>
+      </w:pPr>
+      <w:r>
+        <w:t xml:space="preserve">Microsoft. (n.d.). Playwright documentation. https://playwright.dev/</w:t>
+      </w:r>
+    </w:p>
+    <w:p>
+      <w:pPr>
+        <w:spacing w:after="100"/>
+        <w:ind w:left="720" w:hanging="720"/>
+      </w:pPr>
+      <w:r>
+        <w:t xml:space="preserve">Mozilla. (n.d.). Web Speech API. MDN Web Docs. https://developer.mozilla.org/en-US/docs/Web/API/Web_Speech_API</w:t>
       </w:r>
     </w:p>
     <w:p>
@@ -43402,14 +43988,44 @@
                 <w:sz w:val="18"/>
                 <w:szCs w:val="18"/>
               </w:rPr>
-              <w:t xml:space="preserve">pageSize</w:t>
+              <w:t xml:space="preserve">port</w:t>
             </w:r>
             <w:r>
               <w:rPr>
                 <w:sz w:val="18"/>
                 <w:szCs w:val="18"/>
               </w:rPr>
-              <w:t xml:space="preserve"> = 12</w:t>
+              <w:t xml:space="preserve">, </w:t>
+            </w:r>
+            <w:r>
+              <w:rPr>
+                <w:rFonts w:ascii="Consolas" w:cs="Consolas" w:eastAsia="Consolas" w:hAnsi="Consolas"/>
+                <w:sz w:val="18"/>
+                <w:szCs w:val="18"/>
+              </w:rPr>
+              <w:t xml:space="preserve">pageSize</w:t>
+            </w:r>
+            <w:r>
+              <w:rPr>
+                <w:sz w:val="18"/>
+                <w:szCs w:val="18"/>
+              </w:rPr>
+              <w:t xml:space="preserve"> = 12 (each read from a </w:t>
+            </w:r>
+            <w:r>
+              <w:rPr>
+                <w:rFonts w:ascii="Consolas" w:cs="Consolas" w:eastAsia="Consolas" w:hAnsi="Consolas"/>
+                <w:sz w:val="18"/>
+                <w:szCs w:val="18"/>
+              </w:rPr>
+              <w:t xml:space="preserve">-J</w:t>
+            </w:r>
+            <w:r>
+              <w:rPr>
+                <w:sz w:val="18"/>
+                <w:szCs w:val="18"/>
+              </w:rPr>
+              <w:t xml:space="preserve"> property with a default)</w:t>
             </w:r>
           </w:p>
         </w:tc>
@@ -43480,7 +44096,52 @@
                 <w:sz w:val="18"/>
                 <w:szCs w:val="18"/>
               </w:rPr>
-              <w:t xml:space="preserve"> – 50 seeded candidate tokens (generated by a seeder in a test environment, never production users)</w:t>
+              <w:t xml:space="preserve"> (</w:t>
+            </w:r>
+            <w:r>
+              <w:rPr>
+                <w:rFonts w:ascii="Consolas" w:cs="Consolas" w:eastAsia="Consolas" w:hAnsi="Consolas"/>
+                <w:sz w:val="18"/>
+                <w:szCs w:val="18"/>
+              </w:rPr>
+              <w:t xml:space="preserve">-Jtokens=</w:t>
+            </w:r>
+            <w:r>
+              <w:rPr>
+                <w:sz w:val="18"/>
+                <w:szCs w:val="18"/>
+              </w:rPr>
+              <w:t xml:space="preserve">) – 50 load-test candidate tokens written by </w:t>
+            </w:r>
+            <w:r>
+              <w:rPr>
+                <w:rFonts w:ascii="Consolas" w:cs="Consolas" w:eastAsia="Consolas" w:hAnsi="Consolas"/>
+                <w:sz w:val="18"/>
+                <w:szCs w:val="18"/>
+              </w:rPr>
+              <w:t xml:space="preserve">php artisan load-test:data</w:t>
+            </w:r>
+            <w:r>
+              <w:rPr>
+                <w:sz w:val="18"/>
+                <w:szCs w:val="18"/>
+              </w:rPr>
+              <w:t xml:space="preserve"> (load-test accounts only, never real users; removed with </w:t>
+            </w:r>
+            <w:r>
+              <w:rPr>
+                <w:rFonts w:ascii="Consolas" w:cs="Consolas" w:eastAsia="Consolas" w:hAnsi="Consolas"/>
+                <w:sz w:val="18"/>
+                <w:szCs w:val="18"/>
+              </w:rPr>
+              <w:t xml:space="preserve">--remove</w:t>
+            </w:r>
+            <w:r>
+              <w:rPr>
+                <w:sz w:val="18"/>
+                <w:szCs w:val="18"/>
+              </w:rPr>
+              <w:t xml:space="preserve">)</w:t>
             </w:r>
           </w:p>
         </w:tc>
@@ -43543,7 +44204,52 @@
                 <w:sz w:val="18"/>
                 <w:szCs w:val="18"/>
               </w:rPr>
-              <w:t xml:space="preserve">Load: 50 threads, 60 s ramp-up, 10 loops · Stress: 100 and 200 threads, 60 s ramp-up, 5 loops</w:t>
+              <w:t xml:space="preserve">One Thread Group driven by </w:t>
+            </w:r>
+            <w:r>
+              <w:rPr>
+                <w:rFonts w:ascii="Consolas" w:cs="Consolas" w:eastAsia="Consolas" w:hAnsi="Consolas"/>
+                <w:sz w:val="18"/>
+                <w:szCs w:val="18"/>
+              </w:rPr>
+              <w:t xml:space="preserve">-Jthreads</w:t>
+            </w:r>
+            <w:r>
+              <w:rPr>
+                <w:sz w:val="18"/>
+                <w:szCs w:val="18"/>
+              </w:rPr>
+              <w:t xml:space="preserve">, </w:t>
+            </w:r>
+            <w:r>
+              <w:rPr>
+                <w:rFonts w:ascii="Consolas" w:cs="Consolas" w:eastAsia="Consolas" w:hAnsi="Consolas"/>
+                <w:sz w:val="18"/>
+                <w:szCs w:val="18"/>
+              </w:rPr>
+              <w:t xml:space="preserve">-Jrampup</w:t>
+            </w:r>
+            <w:r>
+              <w:rPr>
+                <w:sz w:val="18"/>
+                <w:szCs w:val="18"/>
+              </w:rPr>
+              <w:t xml:space="preserve">, </w:t>
+            </w:r>
+            <w:r>
+              <w:rPr>
+                <w:rFonts w:ascii="Consolas" w:cs="Consolas" w:eastAsia="Consolas" w:hAnsi="Consolas"/>
+                <w:sz w:val="18"/>
+                <w:szCs w:val="18"/>
+              </w:rPr>
+              <w:t xml:space="preserve">-Jloops</w:t>
+            </w:r>
+            <w:r>
+              <w:rPr>
+                <w:sz w:val="18"/>
+                <w:szCs w:val="18"/>
+              </w:rPr>
+              <w:t xml:space="preserve">: Load 50 threads, 60 s ramp-up, 10 loops · Stress 100 and 200 threads, 60 s ramp-up, 5 loops</w:t>
             </w:r>
           </w:p>
         </w:tc>
@@ -43771,7 +44477,7 @@
                 <w:sz w:val="18"/>
                 <w:szCs w:val="18"/>
               </w:rPr>
-              <w:t xml:space="preserve">Response Assertion: code 200; JSON Assertion: </w:t>
+              <w:t xml:space="preserve">Response Assertion: code 200; JSON Assertions: </w:t>
             </w:r>
             <w:r>
               <w:rPr>
@@ -43780,6 +44486,21 @@
                 <w:szCs w:val="18"/>
               </w:rPr>
               <w:t xml:space="preserve">$.meta.match_mode == true</w:t>
+            </w:r>
+            <w:r>
+              <w:rPr>
+                <w:sz w:val="18"/>
+                <w:szCs w:val="18"/>
+              </w:rPr>
+              <w:t xml:space="preserve"> and </w:t>
+            </w:r>
+            <w:r>
+              <w:rPr>
+                <w:rFonts w:ascii="Consolas" w:cs="Consolas" w:eastAsia="Consolas" w:hAnsi="Consolas"/>
+                <w:sz w:val="18"/>
+                <w:szCs w:val="18"/>
+              </w:rPr>
+              <w:t xml:space="preserve">$.meta.per_page == ${pageSize}</w:t>
             </w:r>
             <w:r>
               <w:rPr>
@@ -44034,7 +44755,61 @@
         <w:spacing w:after="60"/>
       </w:pPr>
       <w:r>
-        <w:t xml:space="preserve">Railway: one project, five services plus MySQL; only </w:t>
+        <w:t xml:space="preserve">Railway: one project with five services – </w:t>
+      </w:r>
+      <w:r>
+        <w:rPr>
+          <w:rFonts w:ascii="Consolas" w:cs="Consolas" w:eastAsia="Consolas" w:hAnsi="Consolas"/>
+        </w:rPr>
+        <w:t xml:space="preserve">gateway</w:t>
+      </w:r>
+      <w:r>
+        <w:t xml:space="preserve">, </w:t>
+      </w:r>
+      <w:r>
+        <w:rPr>
+          <w:rFonts w:ascii="Consolas" w:cs="Consolas" w:eastAsia="Consolas" w:hAnsi="Consolas"/>
+        </w:rPr>
+        <w:t xml:space="preserve">core-api</w:t>
+      </w:r>
+      <w:r>
+        <w:t xml:space="preserve">, </w:t>
+      </w:r>
+      <w:r>
+        <w:rPr>
+          <w:rFonts w:ascii="Consolas" w:cs="Consolas" w:eastAsia="Consolas" w:hAnsi="Consolas"/>
+        </w:rPr>
+        <w:t xml:space="preserve">core-scheduler</w:t>
+      </w:r>
+      <w:r>
+        <w:t xml:space="preserve"> (same image, runs </w:t>
+      </w:r>
+      <w:r>
+        <w:rPr>
+          <w:rFonts w:ascii="Consolas" w:cs="Consolas" w:eastAsia="Consolas" w:hAnsi="Consolas"/>
+        </w:rPr>
+        <w:t xml:space="preserve">schedule:work</w:t>
+      </w:r>
+      <w:r>
+        <w:t xml:space="preserve">), </w:t>
+      </w:r>
+      <w:r>
+        <w:rPr>
+          <w:rFonts w:ascii="Consolas" w:cs="Consolas" w:eastAsia="Consolas" w:hAnsi="Consolas"/>
+        </w:rPr>
+        <w:t xml:space="preserve">insights-service</w:t>
+      </w:r>
+      <w:r>
+        <w:t xml:space="preserve">, </w:t>
+      </w:r>
+      <w:r>
+        <w:rPr>
+          <w:rFonts w:ascii="Consolas" w:cs="Consolas" w:eastAsia="Consolas" w:hAnsi="Consolas"/>
+        </w:rPr>
+        <w:t xml:space="preserve">business-registry-soap</w:t>
+      </w:r>
+      <w:r>
+        <w:t xml:space="preserve"> – plus MySQL; only </w:t>
       </w:r>
       <w:r>
         <w:rPr>
@@ -44083,16 +44858,16 @@
         <w:t xml:space="preserve">migrate --force</w:t>
       </w:r>
       <w:r>
-        <w:t xml:space="preserve"> on release, queue driver </w:t>
+        <w:t xml:space="preserve"> as the pre-deploy command. In-app notices are stored at once and their emails are sent after the HTTP response; password-reset emails go through the </w:t>
       </w:r>
       <w:r>
         <w:rPr>
           <w:rFonts w:ascii="Consolas" w:cs="Consolas" w:eastAsia="Consolas" w:hAnsi="Consolas"/>
         </w:rPr>
-        <w:t xml:space="preserve">sync</w:t>
-      </w:r>
-      <w:r>
-        <w:t xml:space="preserve"> (no worker needed in v1.0).</w:t>
+        <w:t xml:space="preserve">database</w:t>
+      </w:r>
+      <w:r>
+        <w:t xml:space="preserve"> queue, which the scheduler works every minute.</w:t>
       </w:r>
     </w:p>
     <w:p>
@@ -44105,13 +44880,31 @@
         <w:spacing w:after="60"/>
       </w:pPr>
       <w:r>
-        <w:t xml:space="preserve">Seeders: categories (about 10 industries), RA 7277-based accommodation types, one administrator, demo candidate/employer accounts, sample feedback that publishes one employer's trust score (plus a second employer with two responses and an open demo hire for test T10), and sample DTI/SEC records in </w:t>
+        <w:t xml:space="preserve">Seeders: 11 job categories, 18 RA 7277-based accommodation types in five groups, one administrator, demo candidate/employer accounts (passwords from </w:t>
+      </w:r>
+      <w:r>
+        <w:rPr>
+          <w:rFonts w:ascii="Consolas" w:cs="Consolas" w:eastAsia="Consolas" w:hAnsi="Consolas"/>
+        </w:rPr>
+        <w:t xml:space="preserve">DEMO_PASSWORD</w:t>
+      </w:r>
+      <w:r>
+        <w:t xml:space="preserve">), sample feedback that publishes one employer's trust score (79% from three responses), a second employer with two responses and an open demo hire for test T10, and sample DTI/SEC records in </w:t>
       </w:r>
       <w:r>
         <w:rPr>
           <w:rFonts w:ascii="Consolas" w:cs="Consolas" w:eastAsia="Consolas" w:hAnsi="Consolas"/>
         </w:rPr>
         <w:t xml:space="preserve">registry.db</w:t>
+      </w:r>
+      <w:r>
+        <w:t xml:space="preserve">. JMeter data is created separately with </w:t>
+      </w:r>
+      <w:r>
+        <w:rPr>
+          <w:rFonts w:ascii="Consolas" w:cs="Consolas" w:eastAsia="Consolas" w:hAnsi="Consolas"/>
+        </w:rPr>
+        <w:t xml:space="preserve">php artisan load-test:data</w:t>
       </w:r>
       <w:r>
         <w:t xml:space="preserve">.</w:t>

</xml_diff>

<commit_message>
docs(sia): ERD of the Core Service database in Appendix F
Drawn from the migrations with matplotlib (fig6_erd.png).

Co-Authored-By: Claude Opus 5.5 <noreply@anthropic.com>
</commit_message>
<xml_diff>
--- a/docs/OpenDoor_SIA1_Final_Project_Documentation.docx
+++ b/docs/OpenDoor_SIA1_Final_Project_Documentation.docx
@@ -50859,9 +50859,92 @@
       </w:pPr>
       <w:r>
         <w:rPr>
-          <w:highlight w:val="yellow"/>
+          <w:b/>
+          <w:bCs/>
         </w:rPr>
-        <w:t xml:space="preserve">[Insert the ERD image and any additional screenshots here.]</w:t>
+        <w:t xml:space="preserve">Entity-relationship diagram</w:t>
+      </w:r>
+      <w:r>
+        <w:t xml:space="preserve"> of the Core Service database, drawn from the Laravel migrations in </w:t>
+      </w:r>
+      <w:r>
+        <w:rPr>
+          <w:rFonts w:ascii="Consolas" w:cs="Consolas" w:eastAsia="Consolas" w:hAnsi="Consolas"/>
+        </w:rPr>
+        <w:t xml:space="preserve">services/core-api/database/migrations</w:t>
+      </w:r>
+      <w:r>
+        <w:t xml:space="preserve"> (Laravel's own token, queue, cache and session tables are left out). Further screens of every role are in the separate UI reference (</w:t>
+      </w:r>
+      <w:r>
+        <w:rPr>
+          <w:rFonts w:ascii="Consolas" w:cs="Consolas" w:eastAsia="Consolas" w:hAnsi="Consolas"/>
+        </w:rPr>
+        <w:t xml:space="preserve">docs/ui-reference/OpenDoor-UI-Reference.pdf</w:t>
+      </w:r>
+      <w:r>
+        <w:t xml:space="preserve">).</w:t>
+      </w:r>
+    </w:p>
+    <w:p>
+      <w:pPr>
+        <w:spacing w:after="60" w:before="60"/>
+        <w:jc w:val="center"/>
+      </w:pPr>
+      <w:r>
+        <w:drawing>
+          <wp:inline distT="0" distB="0" distL="0" distR="0">
+            <wp:extent cx="6286500" cy="6800850"/>
+            <wp:effectExtent t="0" r="0" b="0" l="0"/>
+            <wp:docPr id="19" name="" descr="" title=""/>
+            <wp:cNvGraphicFramePr>
+              <a:graphicFrameLocks xmlns:a="http://schemas.openxmlformats.org/drawingml/2006/main" noChangeAspect="1"/>
+            </wp:cNvGraphicFramePr>
+            <a:graphic xmlns:a="http://schemas.openxmlformats.org/drawingml/2006/main">
+              <a:graphicData uri="http://schemas.openxmlformats.org/drawingml/2006/picture">
+                <pic:pic xmlns:pic="http://schemas.openxmlformats.org/drawingml/2006/picture">
+                  <pic:nvPicPr>
+                    <pic:cNvPr id="0" name="" descr=""/>
+                    <pic:cNvPicPr>
+                      <a:picLocks noChangeAspect="1" noChangeArrowheads="1"/>
+                    </pic:cNvPicPr>
+                  </pic:nvPicPr>
+                  <pic:blipFill>
+                    <a:blip r:embed="rId26" cstate="none"/>
+                    <a:srcRect/>
+                    <a:stretch>
+                      <a:fillRect/>
+                    </a:stretch>
+                  </pic:blipFill>
+                  <pic:spPr bwMode="auto">
+                    <a:xfrm>
+                      <a:off x="0" y="0"/>
+                      <a:ext cx="6286500" cy="6800850"/>
+                    </a:xfrm>
+                    <a:prstGeom prst="rect">
+                      <a:avLst/>
+                    </a:prstGeom>
+                  </pic:spPr>
+                </pic:pic>
+              </a:graphicData>
+            </a:graphic>
+          </wp:inline>
+        </w:drawing>
+      </w:r>
+    </w:p>
+    <w:p>
+      <w:pPr>
+        <w:spacing w:after="160"/>
+        <w:jc w:val="center"/>
+      </w:pPr>
+      <w:r>
+        <w:rPr>
+          <w:i/>
+          <w:iCs/>
+          <w:sz w:val="18"/>
+          <w:szCs w:val="18"/>
+        </w:rPr>
+        <w:t xml:space="preserve">Figure 7. Entity-relationship diagram of the Core Service database (MySQL opendoor_core)</w:t>
       </w:r>
     </w:p>
     <w:sectPr>

</xml_diff>

<commit_message>
docs(sia): defects from the project history, lessons draft, secret scan
7.4 lists ten real integration defects with cause, fix and test;
10.4 drafted from the project record for the team to review;
gitleaks over the full history found no leaks.

Co-Authored-By: Claude Opus 5.5 <noreply@anthropic.com>
</commit_message>
<xml_diff>
--- a/docs/OpenDoor_SIA1_Final_Project_Documentation.docx
+++ b/docs/OpenDoor_SIA1_Final_Project_Documentation.docx
@@ -27800,10 +27800,16 @@
         <w:spacing w:after="120" w:line="276"/>
       </w:pPr>
       <w:r>
+        <w:t xml:space="preserve">Integration defects that actually occurred during development, found in live checks through the gateway, in the MySQL test runs or in CI, and how each was corrected (dates are in the repository's commit history and </w:t>
+      </w:r>
+      <w:r>
         <w:rPr>
-          <w:highlight w:val="yellow"/>
+          <w:rFonts w:ascii="Consolas" w:cs="Consolas" w:eastAsia="Consolas" w:hAnsi="Consolas"/>
         </w:rPr>
-        <w:t xml:space="preserve">[Record the real integration defects found during development and testing. Use the table below; examples of the kind of defects to watch for are listed so the team can recognize them, but only defects that actually occurred should be submitted.]</w:t>
+        <w:t xml:space="preserve">PROGRESS.md</w:t>
+      </w:r>
+      <w:r>
+        <w:t xml:space="preserve">):</w:t>
       </w:r>
     </w:p>
     <w:tbl>
@@ -27819,11 +27825,11 @@
         </w:tblBorders>
       </w:tblPr>
       <w:tblGrid>
-        <w:gridCol w:w="800"/>
-        <w:gridCol w:w="2400"/>
+        <w:gridCol w:w="560"/>
+        <w:gridCol w:w="2500"/>
         <w:gridCol w:w="2300"/>
         <w:gridCol w:w="2900"/>
-        <w:gridCol w:w="1680"/>
+        <w:gridCol w:w="1820"/>
       </w:tblGrid>
       <w:tr>
         <w:trPr>
@@ -27831,7 +27837,7 @@
         </w:trPr>
         <w:tc>
           <w:tcPr>
-            <w:tcW w:type="dxa" w:w="800"/>
+            <w:tcW w:type="dxa" w:w="560"/>
             <w:tcBorders>
               <w:top w:val="single" w:color="7F7F7F" w:sz="4"/>
               <w:left w:val="single" w:color="7F7F7F" w:sz="4"/>
@@ -27864,7 +27870,7 @@
         </w:tc>
         <w:tc>
           <w:tcPr>
-            <w:tcW w:type="dxa" w:w="2400"/>
+            <w:tcW w:type="dxa" w:w="2500"/>
             <w:tcBorders>
               <w:top w:val="single" w:color="7F7F7F" w:sz="4"/>
               <w:left w:val="single" w:color="7F7F7F" w:sz="4"/>
@@ -27963,7 +27969,7 @@
         </w:tc>
         <w:tc>
           <w:tcPr>
-            <w:tcW w:type="dxa" w:w="1680"/>
+            <w:tcW w:type="dxa" w:w="1820"/>
             <w:tcBorders>
               <w:top w:val="single" w:color="7F7F7F" w:sz="4"/>
               <w:left w:val="single" w:color="7F7F7F" w:sz="4"/>
@@ -27998,28 +28004,28 @@
       <w:tr>
         <w:tc>
           <w:tcPr>
-            <w:tcW w:type="dxa" w:w="800"/>
-            <w:tcBorders>
-              <w:top w:val="single" w:color="7F7F7F" w:sz="4"/>
-              <w:left w:val="single" w:color="7F7F7F" w:sz="4"/>
-              <w:bottom w:val="single" w:color="7F7F7F" w:sz="4"/>
-              <w:right w:val="single" w:color="7F7F7F" w:sz="4"/>
-            </w:tcBorders>
-            <w:tcMar>
-              <w:top w:type="dxa" w:w="60"/>
-              <w:left w:type="dxa" w:w="100"/>
-              <w:bottom w:type="dxa" w:w="60"/>
-              <w:right w:type="dxa" w:w="100"/>
-            </w:tcMar>
-          </w:tcPr>
-          <w:p>
-            <w:pPr>
-              <w:spacing w:after="20"/>
-            </w:pPr>
-            <w:r>
-              <w:rPr>
-                <w:sz w:val="18"/>
-                <w:szCs w:val="18"/>
+            <w:tcW w:type="dxa" w:w="560"/>
+            <w:tcBorders>
+              <w:top w:val="single" w:color="7F7F7F" w:sz="4"/>
+              <w:left w:val="single" w:color="7F7F7F" w:sz="4"/>
+              <w:bottom w:val="single" w:color="7F7F7F" w:sz="4"/>
+              <w:right w:val="single" w:color="7F7F7F" w:sz="4"/>
+            </w:tcBorders>
+            <w:tcMar>
+              <w:top w:type="dxa" w:w="60"/>
+              <w:left w:type="dxa" w:w="100"/>
+              <w:bottom w:type="dxa" w:w="60"/>
+              <w:right w:type="dxa" w:w="100"/>
+            </w:tcMar>
+          </w:tcPr>
+          <w:p>
+            <w:pPr>
+              <w:spacing w:after="20"/>
+            </w:pPr>
+            <w:r>
+              <w:rPr>
+                <w:sz w:val="16"/>
+                <w:szCs w:val="16"/>
               </w:rPr>
               <w:t xml:space="preserve">D01</w:t>
             </w:r>
@@ -28027,31 +28033,45 @@
         </w:tc>
         <w:tc>
           <w:tcPr>
-            <w:tcW w:type="dxa" w:w="2400"/>
-            <w:tcBorders>
-              <w:top w:val="single" w:color="7F7F7F" w:sz="4"/>
-              <w:left w:val="single" w:color="7F7F7F" w:sz="4"/>
-              <w:bottom w:val="single" w:color="7F7F7F" w:sz="4"/>
-              <w:right w:val="single" w:color="7F7F7F" w:sz="4"/>
-            </w:tcBorders>
-            <w:tcMar>
-              <w:top w:type="dxa" w:w="60"/>
-              <w:left w:type="dxa" w:w="100"/>
-              <w:bottom w:type="dxa" w:w="60"/>
-              <w:right w:type="dxa" w:w="100"/>
-            </w:tcMar>
-          </w:tcPr>
-          <w:p>
-            <w:pPr>
-              <w:spacing w:after="20"/>
-            </w:pPr>
-            <w:r>
-              <w:rPr>
-                <w:sz w:val="18"/>
-                <w:szCs w:val="18"/>
-                <w:highlight w:val="yellow"/>
-              </w:rPr>
-              <w:t xml:space="preserve">[Defect]</w:t>
+            <w:tcW w:type="dxa" w:w="2500"/>
+            <w:tcBorders>
+              <w:top w:val="single" w:color="7F7F7F" w:sz="4"/>
+              <w:left w:val="single" w:color="7F7F7F" w:sz="4"/>
+              <w:bottom w:val="single" w:color="7F7F7F" w:sz="4"/>
+              <w:right w:val="single" w:color="7F7F7F" w:sz="4"/>
+            </w:tcBorders>
+            <w:tcMar>
+              <w:top w:type="dxa" w:w="60"/>
+              <w:left w:type="dxa" w:w="100"/>
+              <w:bottom w:type="dxa" w:w="60"/>
+              <w:right w:type="dxa" w:w="100"/>
+            </w:tcMar>
+          </w:tcPr>
+          <w:p>
+            <w:pPr>
+              <w:spacing w:after="20"/>
+            </w:pPr>
+            <w:r>
+              <w:rPr>
+                <w:sz w:val="16"/>
+                <w:szCs w:val="16"/>
+              </w:rPr>
+              <w:t xml:space="preserve">Any website could call the API: responses through the gateway carried </w:t>
+            </w:r>
+            <w:r>
+              <w:rPr>
+                <w:rFonts w:ascii="Consolas" w:cs="Consolas" w:eastAsia="Consolas" w:hAnsi="Consolas"/>
+                <w:sz w:val="16"/>
+                <w:szCs w:val="16"/>
+              </w:rPr>
+              <w:t xml:space="preserve">Access-Control-Allow-Origin: *</w:t>
+            </w:r>
+            <w:r>
+              <w:rPr>
+                <w:sz w:val="16"/>
+                <w:szCs w:val="16"/>
+              </w:rPr>
+              <w:t xml:space="preserve"> (4 Oct 2026)</w:t>
             </w:r>
           </w:p>
         </w:tc>
@@ -28077,11 +28097,25 @@
             </w:pPr>
             <w:r>
               <w:rPr>
-                <w:sz w:val="18"/>
-                <w:szCs w:val="18"/>
-                <w:highlight w:val="yellow"/>
-              </w:rPr>
-              <w:t xml:space="preserve">[Cause]</w:t>
+                <w:sz w:val="16"/>
+                <w:szCs w:val="16"/>
+              </w:rPr>
+              <w:t xml:space="preserve">Laravel's default CORS middleware answered with </w:t>
+            </w:r>
+            <w:r>
+              <w:rPr>
+                <w:rFonts w:ascii="Consolas" w:cs="Consolas" w:eastAsia="Consolas" w:hAnsi="Consolas"/>
+                <w:sz w:val="16"/>
+                <w:szCs w:val="16"/>
+              </w:rPr>
+              <w:t xml:space="preserve">*</w:t>
+            </w:r>
+            <w:r>
+              <w:rPr>
+                <w:sz w:val="16"/>
+                <w:szCs w:val="16"/>
+              </w:rPr>
+              <w:t xml:space="preserve">, and the gateway passed upstream headers through</w:t>
             </w:r>
           </w:p>
         </w:tc>
@@ -28107,41 +28141,39 @@
             </w:pPr>
             <w:r>
               <w:rPr>
-                <w:sz w:val="18"/>
-                <w:szCs w:val="18"/>
-                <w:highlight w:val="yellow"/>
-              </w:rPr>
-              <w:t xml:space="preserve">[Correction]</w:t>
-            </w:r>
-          </w:p>
-        </w:tc>
-        <w:tc>
-          <w:tcPr>
-            <w:tcW w:type="dxa" w:w="1680"/>
-            <w:tcBorders>
-              <w:top w:val="single" w:color="7F7F7F" w:sz="4"/>
-              <w:left w:val="single" w:color="7F7F7F" w:sz="4"/>
-              <w:bottom w:val="single" w:color="7F7F7F" w:sz="4"/>
-              <w:right w:val="single" w:color="7F7F7F" w:sz="4"/>
-            </w:tcBorders>
-            <w:tcMar>
-              <w:top w:type="dxa" w:w="60"/>
-              <w:left w:type="dxa" w:w="100"/>
-              <w:bottom w:type="dxa" w:w="60"/>
-              <w:right w:type="dxa" w:w="100"/>
-            </w:tcMar>
-          </w:tcPr>
-          <w:p>
-            <w:pPr>
-              <w:spacing w:after="20"/>
-            </w:pPr>
-            <w:r>
-              <w:rPr>
-                <w:sz w:val="18"/>
-                <w:szCs w:val="18"/>
-                <w:highlight w:val="yellow"/>
-              </w:rPr>
-              <w:t xml:space="preserve">[Test ID]</w:t>
+                <w:sz w:val="16"/>
+                <w:szCs w:val="16"/>
+              </w:rPr>
+              <w:t xml:space="preserve">The gateway removes the services' CORS headers and sets its own for the frontend origin only</w:t>
+            </w:r>
+          </w:p>
+        </w:tc>
+        <w:tc>
+          <w:tcPr>
+            <w:tcW w:type="dxa" w:w="1820"/>
+            <w:tcBorders>
+              <w:top w:val="single" w:color="7F7F7F" w:sz="4"/>
+              <w:left w:val="single" w:color="7F7F7F" w:sz="4"/>
+              <w:bottom w:val="single" w:color="7F7F7F" w:sz="4"/>
+              <w:right w:val="single" w:color="7F7F7F" w:sz="4"/>
+            </w:tcBorders>
+            <w:tcMar>
+              <w:top w:type="dxa" w:w="60"/>
+              <w:left w:type="dxa" w:w="100"/>
+              <w:bottom w:type="dxa" w:w="60"/>
+              <w:right w:type="dxa" w:w="100"/>
+            </w:tcMar>
+          </w:tcPr>
+          <w:p>
+            <w:pPr>
+              <w:spacing w:after="20"/>
+            </w:pPr>
+            <w:r>
+              <w:rPr>
+                <w:sz w:val="16"/>
+                <w:szCs w:val="16"/>
+              </w:rPr>
+              <w:t xml:space="preserve">Gateway Jest tests; folder 09 "unknown origin gets no CORS header"</w:t>
             </w:r>
           </w:p>
         </w:tc>
@@ -28149,28 +28181,28 @@
       <w:tr>
         <w:tc>
           <w:tcPr>
-            <w:tcW w:type="dxa" w:w="800"/>
-            <w:tcBorders>
-              <w:top w:val="single" w:color="7F7F7F" w:sz="4"/>
-              <w:left w:val="single" w:color="7F7F7F" w:sz="4"/>
-              <w:bottom w:val="single" w:color="7F7F7F" w:sz="4"/>
-              <w:right w:val="single" w:color="7F7F7F" w:sz="4"/>
-            </w:tcBorders>
-            <w:tcMar>
-              <w:top w:type="dxa" w:w="60"/>
-              <w:left w:type="dxa" w:w="100"/>
-              <w:bottom w:type="dxa" w:w="60"/>
-              <w:right w:type="dxa" w:w="100"/>
-            </w:tcMar>
-          </w:tcPr>
-          <w:p>
-            <w:pPr>
-              <w:spacing w:after="20"/>
-            </w:pPr>
-            <w:r>
-              <w:rPr>
-                <w:sz w:val="18"/>
-                <w:szCs w:val="18"/>
+            <w:tcW w:type="dxa" w:w="560"/>
+            <w:tcBorders>
+              <w:top w:val="single" w:color="7F7F7F" w:sz="4"/>
+              <w:left w:val="single" w:color="7F7F7F" w:sz="4"/>
+              <w:bottom w:val="single" w:color="7F7F7F" w:sz="4"/>
+              <w:right w:val="single" w:color="7F7F7F" w:sz="4"/>
+            </w:tcBorders>
+            <w:tcMar>
+              <w:top w:type="dxa" w:w="60"/>
+              <w:left w:type="dxa" w:w="100"/>
+              <w:bottom w:type="dxa" w:w="60"/>
+              <w:right w:type="dxa" w:w="100"/>
+            </w:tcMar>
+          </w:tcPr>
+          <w:p>
+            <w:pPr>
+              <w:spacing w:after="20"/>
+            </w:pPr>
+            <w:r>
+              <w:rPr>
+                <w:sz w:val="16"/>
+                <w:szCs w:val="16"/>
               </w:rPr>
               <w:t xml:space="preserve">D02</w:t>
             </w:r>
@@ -28178,31 +28210,45 @@
         </w:tc>
         <w:tc>
           <w:tcPr>
-            <w:tcW w:type="dxa" w:w="2400"/>
-            <w:tcBorders>
-              <w:top w:val="single" w:color="7F7F7F" w:sz="4"/>
-              <w:left w:val="single" w:color="7F7F7F" w:sz="4"/>
-              <w:bottom w:val="single" w:color="7F7F7F" w:sz="4"/>
-              <w:right w:val="single" w:color="7F7F7F" w:sz="4"/>
-            </w:tcBorders>
-            <w:tcMar>
-              <w:top w:type="dxa" w:w="60"/>
-              <w:left w:type="dxa" w:w="100"/>
-              <w:bottom w:type="dxa" w:w="60"/>
-              <w:right w:type="dxa" w:w="100"/>
-            </w:tcMar>
-          </w:tcPr>
-          <w:p>
-            <w:pPr>
-              <w:spacing w:after="20"/>
-            </w:pPr>
-            <w:r>
-              <w:rPr>
-                <w:sz w:val="18"/>
-                <w:szCs w:val="18"/>
-                <w:highlight w:val="yellow"/>
-              </w:rPr>
-              <w:t xml:space="preserve">[Defect]</w:t>
+            <w:tcW w:type="dxa" w:w="2500"/>
+            <w:tcBorders>
+              <w:top w:val="single" w:color="7F7F7F" w:sz="4"/>
+              <w:left w:val="single" w:color="7F7F7F" w:sz="4"/>
+              <w:bottom w:val="single" w:color="7F7F7F" w:sz="4"/>
+              <w:right w:val="single" w:color="7F7F7F" w:sz="4"/>
+            </w:tcBorders>
+            <w:tcMar>
+              <w:top w:type="dxa" w:w="60"/>
+              <w:left w:type="dxa" w:w="100"/>
+              <w:bottom w:type="dxa" w:w="60"/>
+              <w:right w:type="dxa" w:w="100"/>
+            </w:tcMar>
+          </w:tcPr>
+          <w:p>
+            <w:pPr>
+              <w:spacing w:after="20"/>
+            </w:pPr>
+            <w:r>
+              <w:rPr>
+                <w:sz w:val="16"/>
+                <w:szCs w:val="16"/>
+              </w:rPr>
+              <w:t xml:space="preserve">Responses revealed the server stack: </w:t>
+            </w:r>
+            <w:r>
+              <w:rPr>
+                <w:rFonts w:ascii="Consolas" w:cs="Consolas" w:eastAsia="Consolas" w:hAnsi="Consolas"/>
+                <w:sz w:val="16"/>
+                <w:szCs w:val="16"/>
+              </w:rPr>
+              <w:t xml:space="preserve">X-Powered-By: PHP/8.4.0</w:t>
+            </w:r>
+            <w:r>
+              <w:rPr>
+                <w:sz w:val="16"/>
+                <w:szCs w:val="16"/>
+              </w:rPr>
+              <w:t xml:space="preserve"> (10 Oct)</w:t>
             </w:r>
           </w:p>
         </w:tc>
@@ -28228,11 +28274,10 @@
             </w:pPr>
             <w:r>
               <w:rPr>
-                <w:sz w:val="18"/>
-                <w:szCs w:val="18"/>
-                <w:highlight w:val="yellow"/>
-              </w:rPr>
-              <w:t xml:space="preserve">[Cause]</w:t>
+                <w:sz w:val="16"/>
+                <w:szCs w:val="16"/>
+              </w:rPr>
+              <w:t xml:space="preserve">PHP adds the header and the proxy passed it on</w:t>
             </w:r>
           </w:p>
         </w:tc>
@@ -28258,41 +28303,54 @@
             </w:pPr>
             <w:r>
               <w:rPr>
-                <w:sz w:val="18"/>
-                <w:szCs w:val="18"/>
-                <w:highlight w:val="yellow"/>
-              </w:rPr>
-              <w:t xml:space="preserve">[Correction]</w:t>
-            </w:r>
-          </w:p>
-        </w:tc>
-        <w:tc>
-          <w:tcPr>
-            <w:tcW w:type="dxa" w:w="1680"/>
-            <w:tcBorders>
-              <w:top w:val="single" w:color="7F7F7F" w:sz="4"/>
-              <w:left w:val="single" w:color="7F7F7F" w:sz="4"/>
-              <w:bottom w:val="single" w:color="7F7F7F" w:sz="4"/>
-              <w:right w:val="single" w:color="7F7F7F" w:sz="4"/>
-            </w:tcBorders>
-            <w:tcMar>
-              <w:top w:type="dxa" w:w="60"/>
-              <w:left w:type="dxa" w:w="100"/>
-              <w:bottom w:type="dxa" w:w="60"/>
-              <w:right w:type="dxa" w:w="100"/>
-            </w:tcMar>
-          </w:tcPr>
-          <w:p>
-            <w:pPr>
-              <w:spacing w:after="20"/>
-            </w:pPr>
-            <w:r>
-              <w:rPr>
-                <w:sz w:val="18"/>
-                <w:szCs w:val="18"/>
-                <w:highlight w:val="yellow"/>
-              </w:rPr>
-              <w:t xml:space="preserve">[Test ID]</w:t>
+                <w:sz w:val="16"/>
+                <w:szCs w:val="16"/>
+              </w:rPr>
+              <w:t xml:space="preserve">The gateway strips </w:t>
+            </w:r>
+            <w:r>
+              <w:rPr>
+                <w:rFonts w:ascii="Consolas" w:cs="Consolas" w:eastAsia="Consolas" w:hAnsi="Consolas"/>
+                <w:sz w:val="16"/>
+                <w:szCs w:val="16"/>
+              </w:rPr>
+              <w:t xml:space="preserve">X-Powered-By</w:t>
+            </w:r>
+            <w:r>
+              <w:rPr>
+                <w:sz w:val="16"/>
+                <w:szCs w:val="16"/>
+              </w:rPr>
+              <w:t xml:space="preserve"> from every upstream response</w:t>
+            </w:r>
+          </w:p>
+        </w:tc>
+        <w:tc>
+          <w:tcPr>
+            <w:tcW w:type="dxa" w:w="1820"/>
+            <w:tcBorders>
+              <w:top w:val="single" w:color="7F7F7F" w:sz="4"/>
+              <w:left w:val="single" w:color="7F7F7F" w:sz="4"/>
+              <w:bottom w:val="single" w:color="7F7F7F" w:sz="4"/>
+              <w:right w:val="single" w:color="7F7F7F" w:sz="4"/>
+            </w:tcBorders>
+            <w:tcMar>
+              <w:top w:type="dxa" w:w="60"/>
+              <w:left w:type="dxa" w:w="100"/>
+              <w:bottom w:type="dxa" w:w="60"/>
+              <w:right w:type="dxa" w:w="100"/>
+            </w:tcMar>
+          </w:tcPr>
+          <w:p>
+            <w:pPr>
+              <w:spacing w:after="20"/>
+            </w:pPr>
+            <w:r>
+              <w:rPr>
+                <w:sz w:val="16"/>
+                <w:szCs w:val="16"/>
+              </w:rPr>
+              <w:t xml:space="preserve">Folder 09 "no X-Powered-By"</w:t>
             </w:r>
           </w:p>
         </w:tc>
@@ -28300,28 +28358,28 @@
       <w:tr>
         <w:tc>
           <w:tcPr>
-            <w:tcW w:type="dxa" w:w="800"/>
-            <w:tcBorders>
-              <w:top w:val="single" w:color="7F7F7F" w:sz="4"/>
-              <w:left w:val="single" w:color="7F7F7F" w:sz="4"/>
-              <w:bottom w:val="single" w:color="7F7F7F" w:sz="4"/>
-              <w:right w:val="single" w:color="7F7F7F" w:sz="4"/>
-            </w:tcBorders>
-            <w:tcMar>
-              <w:top w:type="dxa" w:w="60"/>
-              <w:left w:type="dxa" w:w="100"/>
-              <w:bottom w:type="dxa" w:w="60"/>
-              <w:right w:type="dxa" w:w="100"/>
-            </w:tcMar>
-          </w:tcPr>
-          <w:p>
-            <w:pPr>
-              <w:spacing w:after="20"/>
-            </w:pPr>
-            <w:r>
-              <w:rPr>
-                <w:sz w:val="18"/>
-                <w:szCs w:val="18"/>
+            <w:tcW w:type="dxa" w:w="560"/>
+            <w:tcBorders>
+              <w:top w:val="single" w:color="7F7F7F" w:sz="4"/>
+              <w:left w:val="single" w:color="7F7F7F" w:sz="4"/>
+              <w:bottom w:val="single" w:color="7F7F7F" w:sz="4"/>
+              <w:right w:val="single" w:color="7F7F7F" w:sz="4"/>
+            </w:tcBorders>
+            <w:tcMar>
+              <w:top w:type="dxa" w:w="60"/>
+              <w:left w:type="dxa" w:w="100"/>
+              <w:bottom w:type="dxa" w:w="60"/>
+              <w:right w:type="dxa" w:w="100"/>
+            </w:tcMar>
+          </w:tcPr>
+          <w:p>
+            <w:pPr>
+              <w:spacing w:after="20"/>
+            </w:pPr>
+            <w:r>
+              <w:rPr>
+                <w:sz w:val="16"/>
+                <w:szCs w:val="16"/>
               </w:rPr>
               <w:t xml:space="preserve">D03</w:t>
             </w:r>
@@ -28329,31 +28387,75 @@
         </w:tc>
         <w:tc>
           <w:tcPr>
-            <w:tcW w:type="dxa" w:w="2400"/>
-            <w:tcBorders>
-              <w:top w:val="single" w:color="7F7F7F" w:sz="4"/>
-              <w:left w:val="single" w:color="7F7F7F" w:sz="4"/>
-              <w:bottom w:val="single" w:color="7F7F7F" w:sz="4"/>
-              <w:right w:val="single" w:color="7F7F7F" w:sz="4"/>
-            </w:tcBorders>
-            <w:tcMar>
-              <w:top w:type="dxa" w:w="60"/>
-              <w:left w:type="dxa" w:w="100"/>
-              <w:bottom w:type="dxa" w:w="60"/>
-              <w:right w:type="dxa" w:w="100"/>
-            </w:tcMar>
-          </w:tcPr>
-          <w:p>
-            <w:pPr>
-              <w:spacing w:after="20"/>
-            </w:pPr>
-            <w:r>
-              <w:rPr>
-                <w:sz w:val="18"/>
-                <w:szCs w:val="18"/>
-                <w:highlight w:val="yellow"/>
-              </w:rPr>
-              <w:t xml:space="preserve">[Defect]</w:t>
+            <w:tcW w:type="dxa" w:w="2500"/>
+            <w:tcBorders>
+              <w:top w:val="single" w:color="7F7F7F" w:sz="4"/>
+              <w:left w:val="single" w:color="7F7F7F" w:sz="4"/>
+              <w:bottom w:val="single" w:color="7F7F7F" w:sz="4"/>
+              <w:right w:val="single" w:color="7F7F7F" w:sz="4"/>
+            </w:tcBorders>
+            <w:tcMar>
+              <w:top w:type="dxa" w:w="60"/>
+              <w:left w:type="dxa" w:w="100"/>
+              <w:bottom w:type="dxa" w:w="60"/>
+              <w:right w:type="dxa" w:w="100"/>
+            </w:tcMar>
+          </w:tcPr>
+          <w:p>
+            <w:pPr>
+              <w:spacing w:after="20"/>
+            </w:pPr>
+            <w:r>
+              <w:rPr>
+                <w:sz w:val="16"/>
+                <w:szCs w:val="16"/>
+              </w:rPr>
+              <w:t xml:space="preserve">Page links (</w:t>
+            </w:r>
+            <w:r>
+              <w:rPr>
+                <w:rFonts w:ascii="Consolas" w:cs="Consolas" w:eastAsia="Consolas" w:hAnsi="Consolas"/>
+                <w:sz w:val="16"/>
+                <w:szCs w:val="16"/>
+              </w:rPr>
+              <w:t xml:space="preserve">meta.path</w:t>
+            </w:r>
+            <w:r>
+              <w:rPr>
+                <w:sz w:val="16"/>
+                <w:szCs w:val="16"/>
+              </w:rPr>
+              <w:t xml:space="preserve">, </w:t>
+            </w:r>
+            <w:r>
+              <w:rPr>
+                <w:rFonts w:ascii="Consolas" w:cs="Consolas" w:eastAsia="Consolas" w:hAnsi="Consolas"/>
+                <w:sz w:val="16"/>
+                <w:szCs w:val="16"/>
+              </w:rPr>
+              <w:t xml:space="preserve">links</w:t>
+            </w:r>
+            <w:r>
+              <w:rPr>
+                <w:sz w:val="16"/>
+                <w:szCs w:val="16"/>
+              </w:rPr>
+              <w:t xml:space="preserve">) pointed at Core's internal address, e.g. </w:t>
+            </w:r>
+            <w:r>
+              <w:rPr>
+                <w:rFonts w:ascii="Consolas" w:cs="Consolas" w:eastAsia="Consolas" w:hAnsi="Consolas"/>
+                <w:sz w:val="16"/>
+                <w:szCs w:val="16"/>
+              </w:rPr>
+              <w:t xml:space="preserve">http://127.0.0.1:8001</w:t>
+            </w:r>
+            <w:r>
+              <w:rPr>
+                <w:sz w:val="16"/>
+                <w:szCs w:val="16"/>
+              </w:rPr>
+              <w:t xml:space="preserve"> (5 Oct)</w:t>
             </w:r>
           </w:p>
         </w:tc>
@@ -28379,11 +28481,10 @@
             </w:pPr>
             <w:r>
               <w:rPr>
-                <w:sz w:val="18"/>
-                <w:szCs w:val="18"/>
-                <w:highlight w:val="yellow"/>
-              </w:rPr>
-              <w:t xml:space="preserve">[Cause]</w:t>
+                <w:sz w:val="16"/>
+                <w:szCs w:val="16"/>
+              </w:rPr>
+              <w:t xml:space="preserve">Laravel's paginator builds links from the request host, which is the internal one behind the gateway</w:t>
             </w:r>
           </w:p>
         </w:tc>
@@ -28409,41 +28510,1279 @@
             </w:pPr>
             <w:r>
               <w:rPr>
-                <w:sz w:val="18"/>
-                <w:szCs w:val="18"/>
-                <w:highlight w:val="yellow"/>
-              </w:rPr>
-              <w:t xml:space="preserve">[Correction]</w:t>
-            </w:r>
-          </w:p>
-        </w:tc>
-        <w:tc>
-          <w:tcPr>
-            <w:tcW w:type="dxa" w:w="1680"/>
-            <w:tcBorders>
-              <w:top w:val="single" w:color="7F7F7F" w:sz="4"/>
-              <w:left w:val="single" w:color="7F7F7F" w:sz="4"/>
-              <w:bottom w:val="single" w:color="7F7F7F" w:sz="4"/>
-              <w:right w:val="single" w:color="7F7F7F" w:sz="4"/>
-            </w:tcBorders>
-            <w:tcMar>
-              <w:top w:type="dxa" w:w="60"/>
-              <w:left w:type="dxa" w:w="100"/>
-              <w:bottom w:type="dxa" w:w="60"/>
-              <w:right w:type="dxa" w:w="100"/>
-            </w:tcMar>
-          </w:tcPr>
-          <w:p>
-            <w:pPr>
-              <w:spacing w:after="20"/>
-            </w:pPr>
-            <w:r>
-              <w:rPr>
-                <w:sz w:val="18"/>
-                <w:szCs w:val="18"/>
-                <w:highlight w:val="yellow"/>
-              </w:rPr>
-              <w:t xml:space="preserve">[Test ID]</w:t>
+                <w:sz w:val="16"/>
+                <w:szCs w:val="16"/>
+              </w:rPr>
+              <w:t xml:space="preserve">Paginator paths are built from the origin of </w:t>
+            </w:r>
+            <w:r>
+              <w:rPr>
+                <w:rFonts w:ascii="Consolas" w:cs="Consolas" w:eastAsia="Consolas" w:hAnsi="Consolas"/>
+                <w:sz w:val="16"/>
+                <w:szCs w:val="16"/>
+              </w:rPr>
+              <w:t xml:space="preserve">PUBLIC_API_URL</w:t>
+            </w:r>
+            <w:r>
+              <w:rPr>
+                <w:sz w:val="16"/>
+                <w:szCs w:val="16"/>
+              </w:rPr>
+              <w:t xml:space="preserve"> (the gateway) plus the request path</w:t>
+            </w:r>
+          </w:p>
+        </w:tc>
+        <w:tc>
+          <w:tcPr>
+            <w:tcW w:type="dxa" w:w="1820"/>
+            <w:tcBorders>
+              <w:top w:val="single" w:color="7F7F7F" w:sz="4"/>
+              <w:left w:val="single" w:color="7F7F7F" w:sz="4"/>
+              <w:bottom w:val="single" w:color="7F7F7F" w:sz="4"/>
+              <w:right w:val="single" w:color="7F7F7F" w:sz="4"/>
+            </w:tcBorders>
+            <w:tcMar>
+              <w:top w:type="dxa" w:w="60"/>
+              <w:left w:type="dxa" w:w="100"/>
+              <w:bottom w:type="dxa" w:w="60"/>
+              <w:right w:type="dxa" w:w="100"/>
+            </w:tcMar>
+          </w:tcPr>
+          <w:p>
+            <w:pPr>
+              <w:spacing w:after="20"/>
+            </w:pPr>
+            <w:r>
+              <w:rPr>
+                <w:sz w:val="16"/>
+                <w:szCs w:val="16"/>
+              </w:rPr>
+              <w:t xml:space="preserve">Core search feature test</w:t>
+            </w:r>
+          </w:p>
+        </w:tc>
+      </w:tr>
+      <w:tr>
+        <w:tc>
+          <w:tcPr>
+            <w:tcW w:type="dxa" w:w="560"/>
+            <w:tcBorders>
+              <w:top w:val="single" w:color="7F7F7F" w:sz="4"/>
+              <w:left w:val="single" w:color="7F7F7F" w:sz="4"/>
+              <w:bottom w:val="single" w:color="7F7F7F" w:sz="4"/>
+              <w:right w:val="single" w:color="7F7F7F" w:sz="4"/>
+            </w:tcBorders>
+            <w:tcMar>
+              <w:top w:type="dxa" w:w="60"/>
+              <w:left w:type="dxa" w:w="100"/>
+              <w:bottom w:type="dxa" w:w="60"/>
+              <w:right w:type="dxa" w:w="100"/>
+            </w:tcMar>
+          </w:tcPr>
+          <w:p>
+            <w:pPr>
+              <w:spacing w:after="20"/>
+            </w:pPr>
+            <w:r>
+              <w:rPr>
+                <w:sz w:val="16"/>
+                <w:szCs w:val="16"/>
+              </w:rPr>
+              <w:t xml:space="preserve">D04</w:t>
+            </w:r>
+          </w:p>
+        </w:tc>
+        <w:tc>
+          <w:tcPr>
+            <w:tcW w:type="dxa" w:w="2500"/>
+            <w:tcBorders>
+              <w:top w:val="single" w:color="7F7F7F" w:sz="4"/>
+              <w:left w:val="single" w:color="7F7F7F" w:sz="4"/>
+              <w:bottom w:val="single" w:color="7F7F7F" w:sz="4"/>
+              <w:right w:val="single" w:color="7F7F7F" w:sz="4"/>
+            </w:tcBorders>
+            <w:tcMar>
+              <w:top w:type="dxa" w:w="60"/>
+              <w:left w:type="dxa" w:w="100"/>
+              <w:bottom w:type="dxa" w:w="60"/>
+              <w:right w:type="dxa" w:w="100"/>
+            </w:tcMar>
+          </w:tcPr>
+          <w:p>
+            <w:pPr>
+              <w:spacing w:after="20"/>
+            </w:pPr>
+            <w:r>
+              <w:rPr>
+                <w:sz w:val="16"/>
+                <w:szCs w:val="16"/>
+              </w:rPr>
+              <w:t xml:space="preserve">A new rating did not update the employer's </w:t>
+            </w:r>
+            <w:r>
+              <w:rPr>
+                <w:rFonts w:ascii="Consolas" w:cs="Consolas" w:eastAsia="Consolas" w:hAnsi="Consolas"/>
+                <w:sz w:val="16"/>
+                <w:szCs w:val="16"/>
+              </w:rPr>
+              <w:t xml:space="preserve">feedback_count</w:t>
+            </w:r>
+            <w:r>
+              <w:rPr>
+                <w:sz w:val="16"/>
+                <w:szCs w:val="16"/>
+              </w:rPr>
+              <w:t xml:space="preserve">, so the trust score could stay unpublished (5 Oct)</w:t>
+            </w:r>
+          </w:p>
+        </w:tc>
+        <w:tc>
+          <w:tcPr>
+            <w:tcW w:type="dxa" w:w="2300"/>
+            <w:tcBorders>
+              <w:top w:val="single" w:color="7F7F7F" w:sz="4"/>
+              <w:left w:val="single" w:color="7F7F7F" w:sz="4"/>
+              <w:bottom w:val="single" w:color="7F7F7F" w:sz="4"/>
+              <w:right w:val="single" w:color="7F7F7F" w:sz="4"/>
+            </w:tcBorders>
+            <w:tcMar>
+              <w:top w:type="dxa" w:w="60"/>
+              <w:left w:type="dxa" w:w="100"/>
+              <w:bottom w:type="dxa" w:w="60"/>
+              <w:right w:type="dxa" w:w="100"/>
+            </w:tcMar>
+          </w:tcPr>
+          <w:p>
+            <w:pPr>
+              <w:spacing w:after="20"/>
+            </w:pPr>
+            <w:r>
+              <w:rPr>
+                <w:sz w:val="16"/>
+                <w:szCs w:val="16"/>
+              </w:rPr>
+              <w:t xml:space="preserve">The recalculation saved a stale cached Employer model, and Eloquent skipped </w:t>
+            </w:r>
+            <w:r>
+              <w:rPr>
+                <w:rFonts w:ascii="Consolas" w:cs="Consolas" w:eastAsia="Consolas" w:hAnsi="Consolas"/>
+                <w:sz w:val="16"/>
+                <w:szCs w:val="16"/>
+              </w:rPr>
+              <w:t xml:space="preserve">feedback_count</w:t>
+            </w:r>
+            <w:r>
+              <w:rPr>
+                <w:sz w:val="16"/>
+                <w:szCs w:val="16"/>
+              </w:rPr>
+              <w:t xml:space="preserve"> as "unchanged"</w:t>
+            </w:r>
+          </w:p>
+        </w:tc>
+        <w:tc>
+          <w:tcPr>
+            <w:tcW w:type="dxa" w:w="2900"/>
+            <w:tcBorders>
+              <w:top w:val="single" w:color="7F7F7F" w:sz="4"/>
+              <w:left w:val="single" w:color="7F7F7F" w:sz="4"/>
+              <w:bottom w:val="single" w:color="7F7F7F" w:sz="4"/>
+              <w:right w:val="single" w:color="7F7F7F" w:sz="4"/>
+            </w:tcBorders>
+            <w:tcMar>
+              <w:top w:type="dxa" w:w="60"/>
+              <w:left w:type="dxa" w:w="100"/>
+              <w:bottom w:type="dxa" w:w="60"/>
+              <w:right w:type="dxa" w:w="100"/>
+            </w:tcMar>
+          </w:tcPr>
+          <w:p>
+            <w:pPr>
+              <w:spacing w:after="20"/>
+            </w:pPr>
+            <w:r>
+              <w:rPr>
+                <w:sz w:val="16"/>
+                <w:szCs w:val="16"/>
+              </w:rPr>
+              <w:t xml:space="preserve">Score and count are written with a direct UPDATE under a row lock, after the feedback transaction has committed</w:t>
+            </w:r>
+          </w:p>
+        </w:tc>
+        <w:tc>
+          <w:tcPr>
+            <w:tcW w:type="dxa" w:w="1820"/>
+            <w:tcBorders>
+              <w:top w:val="single" w:color="7F7F7F" w:sz="4"/>
+              <w:left w:val="single" w:color="7F7F7F" w:sz="4"/>
+              <w:bottom w:val="single" w:color="7F7F7F" w:sz="4"/>
+              <w:right w:val="single" w:color="7F7F7F" w:sz="4"/>
+            </w:tcBorders>
+            <w:tcMar>
+              <w:top w:type="dxa" w:w="60"/>
+              <w:left w:type="dxa" w:w="100"/>
+              <w:bottom w:type="dxa" w:w="60"/>
+              <w:right w:type="dxa" w:w="100"/>
+            </w:tcMar>
+          </w:tcPr>
+          <w:p>
+            <w:pPr>
+              <w:spacing w:after="20"/>
+            </w:pPr>
+            <w:r>
+              <w:rPr>
+                <w:sz w:val="16"/>
+                <w:szCs w:val="16"/>
+              </w:rPr>
+              <w:t xml:space="preserve">T10; Core feedback tests</w:t>
+            </w:r>
+          </w:p>
+        </w:tc>
+      </w:tr>
+      <w:tr>
+        <w:tc>
+          <w:tcPr>
+            <w:tcW w:type="dxa" w:w="560"/>
+            <w:tcBorders>
+              <w:top w:val="single" w:color="7F7F7F" w:sz="4"/>
+              <w:left w:val="single" w:color="7F7F7F" w:sz="4"/>
+              <w:bottom w:val="single" w:color="7F7F7F" w:sz="4"/>
+              <w:right w:val="single" w:color="7F7F7F" w:sz="4"/>
+            </w:tcBorders>
+            <w:tcMar>
+              <w:top w:type="dxa" w:w="60"/>
+              <w:left w:type="dxa" w:w="100"/>
+              <w:bottom w:type="dxa" w:w="60"/>
+              <w:right w:type="dxa" w:w="100"/>
+            </w:tcMar>
+          </w:tcPr>
+          <w:p>
+            <w:pPr>
+              <w:spacing w:after="20"/>
+            </w:pPr>
+            <w:r>
+              <w:rPr>
+                <w:sz w:val="16"/>
+                <w:szCs w:val="16"/>
+              </w:rPr>
+              <w:t xml:space="preserve">D05</w:t>
+            </w:r>
+          </w:p>
+        </w:tc>
+        <w:tc>
+          <w:tcPr>
+            <w:tcW w:type="dxa" w:w="2500"/>
+            <w:tcBorders>
+              <w:top w:val="single" w:color="7F7F7F" w:sz="4"/>
+              <w:left w:val="single" w:color="7F7F7F" w:sz="4"/>
+              <w:bottom w:val="single" w:color="7F7F7F" w:sz="4"/>
+              <w:right w:val="single" w:color="7F7F7F" w:sz="4"/>
+            </w:tcBorders>
+            <w:tcMar>
+              <w:top w:type="dxa" w:w="60"/>
+              <w:left w:type="dxa" w:w="100"/>
+              <w:bottom w:type="dxa" w:w="60"/>
+              <w:right w:type="dxa" w:w="100"/>
+            </w:tcMar>
+          </w:tcPr>
+          <w:p>
+            <w:pPr>
+              <w:spacing w:after="20"/>
+            </w:pPr>
+            <w:r>
+              <w:rPr>
+                <w:sz w:val="16"/>
+                <w:szCs w:val="16"/>
+              </w:rPr>
+              <w:t xml:space="preserve">The trust-score breakdown failed on MySQL although every test passed (5 Oct)</w:t>
+            </w:r>
+          </w:p>
+        </w:tc>
+        <w:tc>
+          <w:tcPr>
+            <w:tcW w:type="dxa" w:w="2300"/>
+            <w:tcBorders>
+              <w:top w:val="single" w:color="7F7F7F" w:sz="4"/>
+              <w:left w:val="single" w:color="7F7F7F" w:sz="4"/>
+              <w:bottom w:val="single" w:color="7F7F7F" w:sz="4"/>
+              <w:right w:val="single" w:color="7F7F7F" w:sz="4"/>
+            </w:tcBorders>
+            <w:tcMar>
+              <w:top w:type="dxa" w:w="60"/>
+              <w:left w:type="dxa" w:w="100"/>
+              <w:bottom w:type="dxa" w:w="60"/>
+              <w:right w:type="dxa" w:w="100"/>
+            </w:tcMar>
+          </w:tcPr>
+          <w:p>
+            <w:pPr>
+              <w:spacing w:after="20"/>
+            </w:pPr>
+            <w:r>
+              <w:rPr>
+                <w:sz w:val="16"/>
+                <w:szCs w:val="16"/>
+              </w:rPr>
+              <w:t xml:space="preserve">The SQL alias </w:t>
+            </w:r>
+            <w:r>
+              <w:rPr>
+                <w:rFonts w:ascii="Consolas" w:cs="Consolas" w:eastAsia="Consolas" w:hAnsi="Consolas"/>
+                <w:sz w:val="16"/>
+                <w:szCs w:val="16"/>
+              </w:rPr>
+              <w:t xml:space="preserve">of</w:t>
+            </w:r>
+            <w:r>
+              <w:rPr>
+                <w:sz w:val="16"/>
+                <w:szCs w:val="16"/>
+              </w:rPr>
+              <w:t xml:space="preserve"> is a reserved word in MySQL 8 but accepted by SQLite, which the tests used</w:t>
+            </w:r>
+          </w:p>
+        </w:tc>
+        <w:tc>
+          <w:tcPr>
+            <w:tcW w:type="dxa" w:w="2900"/>
+            <w:tcBorders>
+              <w:top w:val="single" w:color="7F7F7F" w:sz="4"/>
+              <w:left w:val="single" w:color="7F7F7F" w:sz="4"/>
+              <w:bottom w:val="single" w:color="7F7F7F" w:sz="4"/>
+              <w:right w:val="single" w:color="7F7F7F" w:sz="4"/>
+            </w:tcBorders>
+            <w:tcMar>
+              <w:top w:type="dxa" w:w="60"/>
+              <w:left w:type="dxa" w:w="100"/>
+              <w:bottom w:type="dxa" w:w="60"/>
+              <w:right w:type="dxa" w:w="100"/>
+            </w:tcMar>
+          </w:tcPr>
+          <w:p>
+            <w:pPr>
+              <w:spacing w:after="20"/>
+            </w:pPr>
+            <w:r>
+              <w:rPr>
+                <w:sz w:val="16"/>
+                <w:szCs w:val="16"/>
+              </w:rPr>
+              <w:t xml:space="preserve">Alias renamed; new raw SQL is also tested on MySQL, and CI runs all Core tests on MySQL 8</w:t>
+            </w:r>
+          </w:p>
+        </w:tc>
+        <w:tc>
+          <w:tcPr>
+            <w:tcW w:type="dxa" w:w="1820"/>
+            <w:tcBorders>
+              <w:top w:val="single" w:color="7F7F7F" w:sz="4"/>
+              <w:left w:val="single" w:color="7F7F7F" w:sz="4"/>
+              <w:bottom w:val="single" w:color="7F7F7F" w:sz="4"/>
+              <w:right w:val="single" w:color="7F7F7F" w:sz="4"/>
+            </w:tcBorders>
+            <w:tcMar>
+              <w:top w:type="dxa" w:w="60"/>
+              <w:left w:type="dxa" w:w="100"/>
+              <w:bottom w:type="dxa" w:w="60"/>
+              <w:right w:type="dxa" w:w="100"/>
+            </w:tcMar>
+          </w:tcPr>
+          <w:p>
+            <w:pPr>
+              <w:spacing w:after="20"/>
+            </w:pPr>
+            <w:r>
+              <w:rPr>
+                <w:sz w:val="16"/>
+                <w:szCs w:val="16"/>
+              </w:rPr>
+              <w:t xml:space="preserve">T10; Core tests on MySQL in CI</w:t>
+            </w:r>
+          </w:p>
+        </w:tc>
+      </w:tr>
+      <w:tr>
+        <w:tc>
+          <w:tcPr>
+            <w:tcW w:type="dxa" w:w="560"/>
+            <w:tcBorders>
+              <w:top w:val="single" w:color="7F7F7F" w:sz="4"/>
+              <w:left w:val="single" w:color="7F7F7F" w:sz="4"/>
+              <w:bottom w:val="single" w:color="7F7F7F" w:sz="4"/>
+              <w:right w:val="single" w:color="7F7F7F" w:sz="4"/>
+            </w:tcBorders>
+            <w:tcMar>
+              <w:top w:type="dxa" w:w="60"/>
+              <w:left w:type="dxa" w:w="100"/>
+              <w:bottom w:type="dxa" w:w="60"/>
+              <w:right w:type="dxa" w:w="100"/>
+            </w:tcMar>
+          </w:tcPr>
+          <w:p>
+            <w:pPr>
+              <w:spacing w:after="20"/>
+            </w:pPr>
+            <w:r>
+              <w:rPr>
+                <w:sz w:val="16"/>
+                <w:szCs w:val="16"/>
+              </w:rPr>
+              <w:t xml:space="preserve">D06</w:t>
+            </w:r>
+          </w:p>
+        </w:tc>
+        <w:tc>
+          <w:tcPr>
+            <w:tcW w:type="dxa" w:w="2500"/>
+            <w:tcBorders>
+              <w:top w:val="single" w:color="7F7F7F" w:sz="4"/>
+              <w:left w:val="single" w:color="7F7F7F" w:sz="4"/>
+              <w:bottom w:val="single" w:color="7F7F7F" w:sz="4"/>
+              <w:right w:val="single" w:color="7F7F7F" w:sz="4"/>
+            </w:tcBorders>
+            <w:tcMar>
+              <w:top w:type="dxa" w:w="60"/>
+              <w:left w:type="dxa" w:w="100"/>
+              <w:bottom w:type="dxa" w:w="60"/>
+              <w:right w:type="dxa" w:w="100"/>
+            </w:tcMar>
+          </w:tcPr>
+          <w:p>
+            <w:pPr>
+              <w:spacing w:after="20"/>
+            </w:pPr>
+            <w:r>
+              <w:rPr>
+                <w:rFonts w:ascii="Consolas" w:cs="Consolas" w:eastAsia="Consolas" w:hAnsi="Consolas"/>
+                <w:sz w:val="16"/>
+                <w:szCs w:val="16"/>
+              </w:rPr>
+              <w:t xml:space="preserve">display_prefs</w:t>
+            </w:r>
+            <w:r>
+              <w:rPr>
+                <w:sz w:val="16"/>
+                <w:szCs w:val="16"/>
+              </w:rPr>
+              <w:t xml:space="preserve"> came back as </w:t>
+            </w:r>
+            <w:r>
+              <w:rPr>
+                <w:rFonts w:ascii="Consolas" w:cs="Consolas" w:eastAsia="Consolas" w:hAnsi="Consolas"/>
+                <w:sz w:val="16"/>
+                <w:szCs w:val="16"/>
+              </w:rPr>
+              <w:t xml:space="preserve">{motion, contrast, text_size}</w:t>
+            </w:r>
+            <w:r>
+              <w:rPr>
+                <w:sz w:val="16"/>
+                <w:szCs w:val="16"/>
+              </w:rPr>
+              <w:t xml:space="preserve"> on MySQL; found by the Core tests on MySQL in CI (11 Oct)</w:t>
+            </w:r>
+          </w:p>
+        </w:tc>
+        <w:tc>
+          <w:tcPr>
+            <w:tcW w:type="dxa" w:w="2300"/>
+            <w:tcBorders>
+              <w:top w:val="single" w:color="7F7F7F" w:sz="4"/>
+              <w:left w:val="single" w:color="7F7F7F" w:sz="4"/>
+              <w:bottom w:val="single" w:color="7F7F7F" w:sz="4"/>
+              <w:right w:val="single" w:color="7F7F7F" w:sz="4"/>
+            </w:tcBorders>
+            <w:tcMar>
+              <w:top w:type="dxa" w:w="60"/>
+              <w:left w:type="dxa" w:w="100"/>
+              <w:bottom w:type="dxa" w:w="60"/>
+              <w:right w:type="dxa" w:w="100"/>
+            </w:tcMar>
+          </w:tcPr>
+          <w:p>
+            <w:pPr>
+              <w:spacing w:after="20"/>
+            </w:pPr>
+            <w:r>
+              <w:rPr>
+                <w:sz w:val="16"/>
+                <w:szCs w:val="16"/>
+              </w:rPr>
+              <w:t xml:space="preserve">MySQL returns JSON object keys in its own order (shortest first)</w:t>
+            </w:r>
+          </w:p>
+        </w:tc>
+        <w:tc>
+          <w:tcPr>
+            <w:tcW w:type="dxa" w:w="2900"/>
+            <w:tcBorders>
+              <w:top w:val="single" w:color="7F7F7F" w:sz="4"/>
+              <w:left w:val="single" w:color="7F7F7F" w:sz="4"/>
+              <w:bottom w:val="single" w:color="7F7F7F" w:sz="4"/>
+              <w:right w:val="single" w:color="7F7F7F" w:sz="4"/>
+            </w:tcBorders>
+            <w:tcMar>
+              <w:top w:type="dxa" w:w="60"/>
+              <w:left w:type="dxa" w:w="100"/>
+              <w:bottom w:type="dxa" w:w="60"/>
+              <w:right w:type="dxa" w:w="100"/>
+            </w:tcMar>
+          </w:tcPr>
+          <w:p>
+            <w:pPr>
+              <w:spacing w:after="20"/>
+            </w:pPr>
+            <w:r>
+              <w:rPr>
+                <w:sz w:val="16"/>
+                <w:szCs w:val="16"/>
+              </w:rPr>
+              <w:t xml:space="preserve">The account resource builds the object key by key in the documented order</w:t>
+            </w:r>
+          </w:p>
+        </w:tc>
+        <w:tc>
+          <w:tcPr>
+            <w:tcW w:type="dxa" w:w="1820"/>
+            <w:tcBorders>
+              <w:top w:val="single" w:color="7F7F7F" w:sz="4"/>
+              <w:left w:val="single" w:color="7F7F7F" w:sz="4"/>
+              <w:bottom w:val="single" w:color="7F7F7F" w:sz="4"/>
+              <w:right w:val="single" w:color="7F7F7F" w:sz="4"/>
+            </w:tcBorders>
+            <w:tcMar>
+              <w:top w:type="dxa" w:w="60"/>
+              <w:left w:type="dxa" w:w="100"/>
+              <w:bottom w:type="dxa" w:w="60"/>
+              <w:right w:type="dxa" w:w="100"/>
+            </w:tcMar>
+          </w:tcPr>
+          <w:p>
+            <w:pPr>
+              <w:spacing w:after="20"/>
+            </w:pPr>
+            <w:r>
+              <w:rPr>
+                <w:sz w:val="16"/>
+                <w:szCs w:val="16"/>
+              </w:rPr>
+              <w:t xml:space="preserve">Core tests on MySQL in CI</w:t>
+            </w:r>
+          </w:p>
+        </w:tc>
+      </w:tr>
+      <w:tr>
+        <w:tc>
+          <w:tcPr>
+            <w:tcW w:type="dxa" w:w="560"/>
+            <w:tcBorders>
+              <w:top w:val="single" w:color="7F7F7F" w:sz="4"/>
+              <w:left w:val="single" w:color="7F7F7F" w:sz="4"/>
+              <w:bottom w:val="single" w:color="7F7F7F" w:sz="4"/>
+              <w:right w:val="single" w:color="7F7F7F" w:sz="4"/>
+            </w:tcBorders>
+            <w:tcMar>
+              <w:top w:type="dxa" w:w="60"/>
+              <w:left w:type="dxa" w:w="100"/>
+              <w:bottom w:type="dxa" w:w="60"/>
+              <w:right w:type="dxa" w:w="100"/>
+            </w:tcMar>
+          </w:tcPr>
+          <w:p>
+            <w:pPr>
+              <w:spacing w:after="20"/>
+            </w:pPr>
+            <w:r>
+              <w:rPr>
+                <w:sz w:val="16"/>
+                <w:szCs w:val="16"/>
+              </w:rPr>
+              <w:t xml:space="preserve">D07</w:t>
+            </w:r>
+          </w:p>
+        </w:tc>
+        <w:tc>
+          <w:tcPr>
+            <w:tcW w:type="dxa" w:w="2500"/>
+            <w:tcBorders>
+              <w:top w:val="single" w:color="7F7F7F" w:sz="4"/>
+              <w:left w:val="single" w:color="7F7F7F" w:sz="4"/>
+              <w:bottom w:val="single" w:color="7F7F7F" w:sz="4"/>
+              <w:right w:val="single" w:color="7F7F7F" w:sz="4"/>
+            </w:tcBorders>
+            <w:tcMar>
+              <w:top w:type="dxa" w:w="60"/>
+              <w:left w:type="dxa" w:w="100"/>
+              <w:bottom w:type="dxa" w:w="60"/>
+              <w:right w:type="dxa" w:w="100"/>
+            </w:tcMar>
+          </w:tcPr>
+          <w:p>
+            <w:pPr>
+              <w:spacing w:after="20"/>
+            </w:pPr>
+            <w:r>
+              <w:rPr>
+                <w:sz w:val="16"/>
+                <w:szCs w:val="16"/>
+              </w:rPr>
+              <w:t xml:space="preserve">Employer verification answered 502 </w:t>
+            </w:r>
+            <w:r>
+              <w:rPr>
+                <w:rFonts w:ascii="Consolas" w:cs="Consolas" w:eastAsia="Consolas" w:hAnsi="Consolas"/>
+                <w:sz w:val="16"/>
+                <w:szCs w:val="16"/>
+              </w:rPr>
+              <w:t xml:space="preserve">REGISTRY_UNAVAILABLE</w:t>
+            </w:r>
+            <w:r>
+              <w:rPr>
+                <w:sz w:val="16"/>
+                <w:szCs w:val="16"/>
+              </w:rPr>
+              <w:t xml:space="preserve"> although the registry was running (10 Oct, local)</w:t>
+            </w:r>
+          </w:p>
+        </w:tc>
+        <w:tc>
+          <w:tcPr>
+            <w:tcW w:type="dxa" w:w="2300"/>
+            <w:tcBorders>
+              <w:top w:val="single" w:color="7F7F7F" w:sz="4"/>
+              <w:left w:val="single" w:color="7F7F7F" w:sz="4"/>
+              <w:bottom w:val="single" w:color="7F7F7F" w:sz="4"/>
+              <w:right w:val="single" w:color="7F7F7F" w:sz="4"/>
+            </w:tcBorders>
+            <w:tcMar>
+              <w:top w:type="dxa" w:w="60"/>
+              <w:left w:type="dxa" w:w="100"/>
+              <w:bottom w:type="dxa" w:w="60"/>
+              <w:right w:type="dxa" w:w="100"/>
+            </w:tcMar>
+          </w:tcPr>
+          <w:p>
+            <w:pPr>
+              <w:spacing w:after="20"/>
+            </w:pPr>
+            <w:r>
+              <w:rPr>
+                <w:sz w:val="16"/>
+                <w:szCs w:val="16"/>
+              </w:rPr>
+              <w:t xml:space="preserve">On Windows the registry started on </w:t>
+            </w:r>
+            <w:r>
+              <w:rPr>
+                <w:rFonts w:ascii="Consolas" w:cs="Consolas" w:eastAsia="Consolas" w:hAnsi="Consolas"/>
+                <w:sz w:val="16"/>
+                <w:szCs w:val="16"/>
+              </w:rPr>
+              <w:t xml:space="preserve">localhost</w:t>
+            </w:r>
+            <w:r>
+              <w:rPr>
+                <w:sz w:val="16"/>
+                <w:szCs w:val="16"/>
+              </w:rPr>
+              <w:t xml:space="preserve"> listened on IPv6 only, while Core called </w:t>
+            </w:r>
+            <w:r>
+              <w:rPr>
+                <w:rFonts w:ascii="Consolas" w:cs="Consolas" w:eastAsia="Consolas" w:hAnsi="Consolas"/>
+                <w:sz w:val="16"/>
+                <w:szCs w:val="16"/>
+              </w:rPr>
+              <w:t xml:space="preserve">127.0.0.1</w:t>
+            </w:r>
+          </w:p>
+        </w:tc>
+        <w:tc>
+          <w:tcPr>
+            <w:tcW w:type="dxa" w:w="2900"/>
+            <w:tcBorders>
+              <w:top w:val="single" w:color="7F7F7F" w:sz="4"/>
+              <w:left w:val="single" w:color="7F7F7F" w:sz="4"/>
+              <w:bottom w:val="single" w:color="7F7F7F" w:sz="4"/>
+              <w:right w:val="single" w:color="7F7F7F" w:sz="4"/>
+            </w:tcBorders>
+            <w:tcMar>
+              <w:top w:type="dxa" w:w="60"/>
+              <w:left w:type="dxa" w:w="100"/>
+              <w:bottom w:type="dxa" w:w="60"/>
+              <w:right w:type="dxa" w:w="100"/>
+            </w:tcMar>
+          </w:tcPr>
+          <w:p>
+            <w:pPr>
+              <w:spacing w:after="20"/>
+            </w:pPr>
+            <w:r>
+              <w:rPr>
+                <w:sz w:val="16"/>
+                <w:szCs w:val="16"/>
+              </w:rPr>
+              <w:t xml:space="preserve">The registry is started on </w:t>
+            </w:r>
+            <w:r>
+              <w:rPr>
+                <w:rFonts w:ascii="Consolas" w:cs="Consolas" w:eastAsia="Consolas" w:hAnsi="Consolas"/>
+                <w:sz w:val="16"/>
+                <w:szCs w:val="16"/>
+              </w:rPr>
+              <w:t xml:space="preserve">127.0.0.1</w:t>
+            </w:r>
+            <w:r>
+              <w:rPr>
+                <w:sz w:val="16"/>
+                <w:szCs w:val="16"/>
+              </w:rPr>
+              <w:t xml:space="preserve"> (README); Core uses </w:t>
+            </w:r>
+            <w:r>
+              <w:rPr>
+                <w:rFonts w:ascii="Consolas" w:cs="Consolas" w:eastAsia="Consolas" w:hAnsi="Consolas"/>
+                <w:sz w:val="16"/>
+                <w:szCs w:val="16"/>
+              </w:rPr>
+              <w:t xml:space="preserve">127.0.0.1</w:t>
+            </w:r>
+            <w:r>
+              <w:rPr>
+                <w:sz w:val="16"/>
+                <w:szCs w:val="16"/>
+              </w:rPr>
+              <w:t xml:space="preserve"> URLs</w:t>
+            </w:r>
+          </w:p>
+        </w:tc>
+        <w:tc>
+          <w:tcPr>
+            <w:tcW w:type="dxa" w:w="1820"/>
+            <w:tcBorders>
+              <w:top w:val="single" w:color="7F7F7F" w:sz="4"/>
+              <w:left w:val="single" w:color="7F7F7F" w:sz="4"/>
+              <w:bottom w:val="single" w:color="7F7F7F" w:sz="4"/>
+              <w:right w:val="single" w:color="7F7F7F" w:sz="4"/>
+            </w:tcBorders>
+            <w:tcMar>
+              <w:top w:type="dxa" w:w="60"/>
+              <w:left w:type="dxa" w:w="100"/>
+              <w:bottom w:type="dxa" w:w="60"/>
+              <w:right w:type="dxa" w:w="100"/>
+            </w:tcMar>
+          </w:tcPr>
+          <w:p>
+            <w:pPr>
+              <w:spacing w:after="20"/>
+            </w:pPr>
+            <w:r>
+              <w:rPr>
+                <w:sz w:val="16"/>
+                <w:szCs w:val="16"/>
+              </w:rPr>
+              <w:t xml:space="preserve">T14</w:t>
+            </w:r>
+          </w:p>
+        </w:tc>
+      </w:tr>
+      <w:tr>
+        <w:tc>
+          <w:tcPr>
+            <w:tcW w:type="dxa" w:w="560"/>
+            <w:tcBorders>
+              <w:top w:val="single" w:color="7F7F7F" w:sz="4"/>
+              <w:left w:val="single" w:color="7F7F7F" w:sz="4"/>
+              <w:bottom w:val="single" w:color="7F7F7F" w:sz="4"/>
+              <w:right w:val="single" w:color="7F7F7F" w:sz="4"/>
+            </w:tcBorders>
+            <w:tcMar>
+              <w:top w:type="dxa" w:w="60"/>
+              <w:left w:type="dxa" w:w="100"/>
+              <w:bottom w:type="dxa" w:w="60"/>
+              <w:right w:type="dxa" w:w="100"/>
+            </w:tcMar>
+          </w:tcPr>
+          <w:p>
+            <w:pPr>
+              <w:spacing w:after="20"/>
+            </w:pPr>
+            <w:r>
+              <w:rPr>
+                <w:sz w:val="16"/>
+                <w:szCs w:val="16"/>
+              </w:rPr>
+              <w:t xml:space="preserve">D08</w:t>
+            </w:r>
+          </w:p>
+        </w:tc>
+        <w:tc>
+          <w:tcPr>
+            <w:tcW w:type="dxa" w:w="2500"/>
+            <w:tcBorders>
+              <w:top w:val="single" w:color="7F7F7F" w:sz="4"/>
+              <w:left w:val="single" w:color="7F7F7F" w:sz="4"/>
+              <w:bottom w:val="single" w:color="7F7F7F" w:sz="4"/>
+              <w:right w:val="single" w:color="7F7F7F" w:sz="4"/>
+            </w:tcBorders>
+            <w:tcMar>
+              <w:top w:type="dxa" w:w="60"/>
+              <w:left w:type="dxa" w:w="100"/>
+              <w:bottom w:type="dxa" w:w="60"/>
+              <w:right w:type="dxa" w:w="100"/>
+            </w:tcMar>
+          </w:tcPr>
+          <w:p>
+            <w:pPr>
+              <w:spacing w:after="20"/>
+            </w:pPr>
+            <w:r>
+              <w:rPr>
+                <w:sz w:val="16"/>
+                <w:szCs w:val="16"/>
+              </w:rPr>
+              <w:t xml:space="preserve">Snapshots placed some workplaces at a province centre or at a same-name place in another city (Davao, Zamboanga, Lapu-Lapu) (7 Oct)</w:t>
+            </w:r>
+          </w:p>
+        </w:tc>
+        <w:tc>
+          <w:tcPr>
+            <w:tcW w:type="dxa" w:w="2300"/>
+            <w:tcBorders>
+              <w:top w:val="single" w:color="7F7F7F" w:sz="4"/>
+              <w:left w:val="single" w:color="7F7F7F" w:sz="4"/>
+              <w:bottom w:val="single" w:color="7F7F7F" w:sz="4"/>
+              <w:right w:val="single" w:color="7F7F7F" w:sz="4"/>
+            </w:tcBorders>
+            <w:tcMar>
+              <w:top w:type="dxa" w:w="60"/>
+              <w:left w:type="dxa" w:w="100"/>
+              <w:bottom w:type="dxa" w:w="60"/>
+              <w:right w:type="dxa" w:w="100"/>
+            </w:tcMar>
+          </w:tcPr>
+          <w:p>
+            <w:pPr>
+              <w:spacing w:after="20"/>
+            </w:pPr>
+            <w:r>
+              <w:rPr>
+                <w:sz w:val="16"/>
+                <w:szCs w:val="16"/>
+              </w:rPr>
+              <w:t xml:space="preserve">Nominatim's first result for a city name is not always the city</w:t>
+            </w:r>
+          </w:p>
+        </w:tc>
+        <w:tc>
+          <w:tcPr>
+            <w:tcW w:type="dxa" w:w="2900"/>
+            <w:tcBorders>
+              <w:top w:val="single" w:color="7F7F7F" w:sz="4"/>
+              <w:left w:val="single" w:color="7F7F7F" w:sz="4"/>
+              <w:bottom w:val="single" w:color="7F7F7F" w:sz="4"/>
+              <w:right w:val="single" w:color="7F7F7F" w:sz="4"/>
+            </w:tcBorders>
+            <w:tcMar>
+              <w:top w:type="dxa" w:w="60"/>
+              <w:left w:type="dxa" w:w="100"/>
+              <w:bottom w:type="dxa" w:w="60"/>
+              <w:right w:type="dxa" w:w="100"/>
+            </w:tcMar>
+          </w:tcPr>
+          <w:p>
+            <w:pPr>
+              <w:spacing w:after="20"/>
+            </w:pPr>
+            <w:r>
+              <w:rPr>
+                <w:sz w:val="16"/>
+                <w:szCs w:val="16"/>
+              </w:rPr>
+              <w:t xml:space="preserve">Search "X, Province" and, for PSGC's "City of X", "X City"; accept only a city, town or municipality or a result whose address names it; bundled city centres rebuilt and compared</w:t>
+            </w:r>
+          </w:p>
+        </w:tc>
+        <w:tc>
+          <w:tcPr>
+            <w:tcW w:type="dxa" w:w="1820"/>
+            <w:tcBorders>
+              <w:top w:val="single" w:color="7F7F7F" w:sz="4"/>
+              <w:left w:val="single" w:color="7F7F7F" w:sz="4"/>
+              <w:bottom w:val="single" w:color="7F7F7F" w:sz="4"/>
+              <w:right w:val="single" w:color="7F7F7F" w:sz="4"/>
+            </w:tcBorders>
+            <w:tcMar>
+              <w:top w:type="dxa" w:w="60"/>
+              <w:left w:type="dxa" w:w="100"/>
+              <w:bottom w:type="dxa" w:w="60"/>
+              <w:right w:type="dxa" w:w="100"/>
+            </w:tcMar>
+          </w:tcPr>
+          <w:p>
+            <w:pPr>
+              <w:spacing w:after="20"/>
+            </w:pPr>
+            <w:r>
+              <w:rPr>
+                <w:sz w:val="16"/>
+                <w:szCs w:val="16"/>
+              </w:rPr>
+              <w:t xml:space="preserve">Insights Jest tests (geocoder); T12</w:t>
+            </w:r>
+          </w:p>
+        </w:tc>
+      </w:tr>
+      <w:tr>
+        <w:tc>
+          <w:tcPr>
+            <w:tcW w:type="dxa" w:w="560"/>
+            <w:tcBorders>
+              <w:top w:val="single" w:color="7F7F7F" w:sz="4"/>
+              <w:left w:val="single" w:color="7F7F7F" w:sz="4"/>
+              <w:bottom w:val="single" w:color="7F7F7F" w:sz="4"/>
+              <w:right w:val="single" w:color="7F7F7F" w:sz="4"/>
+            </w:tcBorders>
+            <w:tcMar>
+              <w:top w:type="dxa" w:w="60"/>
+              <w:left w:type="dxa" w:w="100"/>
+              <w:bottom w:type="dxa" w:w="60"/>
+              <w:right w:type="dxa" w:w="100"/>
+            </w:tcMar>
+          </w:tcPr>
+          <w:p>
+            <w:pPr>
+              <w:spacing w:after="20"/>
+            </w:pPr>
+            <w:r>
+              <w:rPr>
+                <w:sz w:val="16"/>
+                <w:szCs w:val="16"/>
+              </w:rPr>
+              <w:t xml:space="preserve">D09</w:t>
+            </w:r>
+          </w:p>
+        </w:tc>
+        <w:tc>
+          <w:tcPr>
+            <w:tcW w:type="dxa" w:w="2500"/>
+            <w:tcBorders>
+              <w:top w:val="single" w:color="7F7F7F" w:sz="4"/>
+              <w:left w:val="single" w:color="7F7F7F" w:sz="4"/>
+              <w:bottom w:val="single" w:color="7F7F7F" w:sz="4"/>
+              <w:right w:val="single" w:color="7F7F7F" w:sz="4"/>
+            </w:tcBorders>
+            <w:tcMar>
+              <w:top w:type="dxa" w:w="60"/>
+              <w:left w:type="dxa" w:w="100"/>
+              <w:bottom w:type="dxa" w:w="60"/>
+              <w:right w:type="dxa" w:w="100"/>
+            </w:tcMar>
+          </w:tcPr>
+          <w:p>
+            <w:pPr>
+              <w:spacing w:after="20"/>
+            </w:pPr>
+            <w:r>
+              <w:rPr>
+                <w:sz w:val="16"/>
+                <w:szCs w:val="16"/>
+              </w:rPr>
+              <w:t xml:space="preserve">In CI the employer's newest notice was sometimes </w:t>
+            </w:r>
+            <w:r>
+              <w:rPr>
+                <w:rFonts w:ascii="Consolas" w:cs="Consolas" w:eastAsia="Consolas" w:hAnsi="Consolas"/>
+                <w:sz w:val="16"/>
+                <w:szCs w:val="16"/>
+              </w:rPr>
+              <w:t xml:space="preserve">posting_review</w:t>
+            </w:r>
+            <w:r>
+              <w:rPr>
+                <w:sz w:val="16"/>
+                <w:szCs w:val="16"/>
+              </w:rPr>
+              <w:t xml:space="preserve"> instead of </w:t>
+            </w:r>
+            <w:r>
+              <w:rPr>
+                <w:rFonts w:ascii="Consolas" w:cs="Consolas" w:eastAsia="Consolas" w:hAnsi="Consolas"/>
+                <w:sz w:val="16"/>
+                <w:szCs w:val="16"/>
+              </w:rPr>
+              <w:t xml:space="preserve">application_received</w:t>
+            </w:r>
+            <w:r>
+              <w:rPr>
+                <w:sz w:val="16"/>
+                <w:szCs w:val="16"/>
+              </w:rPr>
+              <w:t xml:space="preserve"> (11 Oct)</w:t>
+            </w:r>
+          </w:p>
+        </w:tc>
+        <w:tc>
+          <w:tcPr>
+            <w:tcW w:type="dxa" w:w="2300"/>
+            <w:tcBorders>
+              <w:top w:val="single" w:color="7F7F7F" w:sz="4"/>
+              <w:left w:val="single" w:color="7F7F7F" w:sz="4"/>
+              <w:bottom w:val="single" w:color="7F7F7F" w:sz="4"/>
+              <w:right w:val="single" w:color="7F7F7F" w:sz="4"/>
+            </w:tcBorders>
+            <w:tcMar>
+              <w:top w:type="dxa" w:w="60"/>
+              <w:left w:type="dxa" w:w="100"/>
+              <w:bottom w:type="dxa" w:w="60"/>
+              <w:right w:type="dxa" w:w="100"/>
+            </w:tcMar>
+          </w:tcPr>
+          <w:p>
+            <w:pPr>
+              <w:spacing w:after="20"/>
+            </w:pPr>
+            <w:r>
+              <w:rPr>
+                <w:sz w:val="16"/>
+                <w:szCs w:val="16"/>
+              </w:rPr>
+              <w:t xml:space="preserve">Both were created in the same second; </w:t>
+            </w:r>
+            <w:r>
+              <w:rPr>
+                <w:rFonts w:ascii="Consolas" w:cs="Consolas" w:eastAsia="Consolas" w:hAnsi="Consolas"/>
+                <w:sz w:val="16"/>
+                <w:szCs w:val="16"/>
+              </w:rPr>
+              <w:t xml:space="preserve">created_at</w:t>
+            </w:r>
+            <w:r>
+              <w:rPr>
+                <w:sz w:val="16"/>
+                <w:szCs w:val="16"/>
+              </w:rPr>
+              <w:t xml:space="preserve"> has whole seconds and the ids were random UUIDs</w:t>
+            </w:r>
+          </w:p>
+        </w:tc>
+        <w:tc>
+          <w:tcPr>
+            <w:tcW w:type="dxa" w:w="2900"/>
+            <w:tcBorders>
+              <w:top w:val="single" w:color="7F7F7F" w:sz="4"/>
+              <w:left w:val="single" w:color="7F7F7F" w:sz="4"/>
+              <w:bottom w:val="single" w:color="7F7F7F" w:sz="4"/>
+              <w:right w:val="single" w:color="7F7F7F" w:sz="4"/>
+            </w:tcBorders>
+            <w:tcMar>
+              <w:top w:type="dxa" w:w="60"/>
+              <w:left w:type="dxa" w:w="100"/>
+              <w:bottom w:type="dxa" w:w="60"/>
+              <w:right w:type="dxa" w:w="100"/>
+            </w:tcMar>
+          </w:tcPr>
+          <w:p>
+            <w:pPr>
+              <w:spacing w:after="20"/>
+            </w:pPr>
+            <w:r>
+              <w:rPr>
+                <w:sz w:val="16"/>
+                <w:szCs w:val="16"/>
+              </w:rPr>
+              <w:t xml:space="preserve">Time-ordered UUIDv7 ids; the list orders by </w:t>
+            </w:r>
+            <w:r>
+              <w:rPr>
+                <w:rFonts w:ascii="Consolas" w:cs="Consolas" w:eastAsia="Consolas" w:hAnsi="Consolas"/>
+                <w:sz w:val="16"/>
+                <w:szCs w:val="16"/>
+              </w:rPr>
+              <w:t xml:space="preserve">created_at</w:t>
+            </w:r>
+            <w:r>
+              <w:rPr>
+                <w:sz w:val="16"/>
+                <w:szCs w:val="16"/>
+              </w:rPr>
+              <w:t xml:space="preserve">, then id</w:t>
+            </w:r>
+          </w:p>
+        </w:tc>
+        <w:tc>
+          <w:tcPr>
+            <w:tcW w:type="dxa" w:w="1820"/>
+            <w:tcBorders>
+              <w:top w:val="single" w:color="7F7F7F" w:sz="4"/>
+              <w:left w:val="single" w:color="7F7F7F" w:sz="4"/>
+              <w:bottom w:val="single" w:color="7F7F7F" w:sz="4"/>
+              <w:right w:val="single" w:color="7F7F7F" w:sz="4"/>
+            </w:tcBorders>
+            <w:tcMar>
+              <w:top w:type="dxa" w:w="60"/>
+              <w:left w:type="dxa" w:w="100"/>
+              <w:bottom w:type="dxa" w:w="60"/>
+              <w:right w:type="dxa" w:w="100"/>
+            </w:tcMar>
+          </w:tcPr>
+          <w:p>
+            <w:pPr>
+              <w:spacing w:after="20"/>
+            </w:pPr>
+            <w:r>
+              <w:rPr>
+                <w:sz w:val="16"/>
+                <w:szCs w:val="16"/>
+              </w:rPr>
+              <w:t xml:space="preserve">T04 in CI</w:t>
+            </w:r>
+          </w:p>
+        </w:tc>
+      </w:tr>
+      <w:tr>
+        <w:tc>
+          <w:tcPr>
+            <w:tcW w:type="dxa" w:w="560"/>
+            <w:tcBorders>
+              <w:top w:val="single" w:color="7F7F7F" w:sz="4"/>
+              <w:left w:val="single" w:color="7F7F7F" w:sz="4"/>
+              <w:bottom w:val="single" w:color="7F7F7F" w:sz="4"/>
+              <w:right w:val="single" w:color="7F7F7F" w:sz="4"/>
+            </w:tcBorders>
+            <w:tcMar>
+              <w:top w:type="dxa" w:w="60"/>
+              <w:left w:type="dxa" w:w="100"/>
+              <w:bottom w:type="dxa" w:w="60"/>
+              <w:right w:type="dxa" w:w="100"/>
+            </w:tcMar>
+          </w:tcPr>
+          <w:p>
+            <w:pPr>
+              <w:spacing w:after="20"/>
+            </w:pPr>
+            <w:r>
+              <w:rPr>
+                <w:sz w:val="16"/>
+                <w:szCs w:val="16"/>
+              </w:rPr>
+              <w:t xml:space="preserve">D10</w:t>
+            </w:r>
+          </w:p>
+        </w:tc>
+        <w:tc>
+          <w:tcPr>
+            <w:tcW w:type="dxa" w:w="2500"/>
+            <w:tcBorders>
+              <w:top w:val="single" w:color="7F7F7F" w:sz="4"/>
+              <w:left w:val="single" w:color="7F7F7F" w:sz="4"/>
+              <w:bottom w:val="single" w:color="7F7F7F" w:sz="4"/>
+              <w:right w:val="single" w:color="7F7F7F" w:sz="4"/>
+            </w:tcBorders>
+            <w:tcMar>
+              <w:top w:type="dxa" w:w="60"/>
+              <w:left w:type="dxa" w:w="100"/>
+              <w:bottom w:type="dxa" w:w="60"/>
+              <w:right w:type="dxa" w:w="100"/>
+            </w:tcMar>
+          </w:tcPr>
+          <w:p>
+            <w:pPr>
+              <w:spacing w:after="20"/>
+            </w:pPr>
+            <w:r>
+              <w:rPr>
+                <w:sz w:val="16"/>
+                <w:szCs w:val="16"/>
+              </w:rPr>
+              <w:t xml:space="preserve">Forgot password answered in about 509 ms for an existing account and 78 ms for an unknown one, so the timing revealed who has an account (13 Oct)</w:t>
+            </w:r>
+          </w:p>
+        </w:tc>
+        <w:tc>
+          <w:tcPr>
+            <w:tcW w:type="dxa" w:w="2300"/>
+            <w:tcBorders>
+              <w:top w:val="single" w:color="7F7F7F" w:sz="4"/>
+              <w:left w:val="single" w:color="7F7F7F" w:sz="4"/>
+              <w:bottom w:val="single" w:color="7F7F7F" w:sz="4"/>
+              <w:right w:val="single" w:color="7F7F7F" w:sz="4"/>
+            </w:tcBorders>
+            <w:tcMar>
+              <w:top w:type="dxa" w:w="60"/>
+              <w:left w:type="dxa" w:w="100"/>
+              <w:bottom w:type="dxa" w:w="60"/>
+              <w:right w:type="dxa" w:w="100"/>
+            </w:tcMar>
+          </w:tcPr>
+          <w:p>
+            <w:pPr>
+              <w:spacing w:after="20"/>
+            </w:pPr>
+            <w:r>
+              <w:rPr>
+                <w:sz w:val="16"/>
+                <w:szCs w:val="16"/>
+              </w:rPr>
+              <w:t xml:space="preserve">The token and email were prepared in the request only when the account existed</w:t>
+            </w:r>
+          </w:p>
+        </w:tc>
+        <w:tc>
+          <w:tcPr>
+            <w:tcW w:type="dxa" w:w="2900"/>
+            <w:tcBorders>
+              <w:top w:val="single" w:color="7F7F7F" w:sz="4"/>
+              <w:left w:val="single" w:color="7F7F7F" w:sz="4"/>
+              <w:bottom w:val="single" w:color="7F7F7F" w:sz="4"/>
+              <w:right w:val="single" w:color="7F7F7F" w:sz="4"/>
+            </w:tcBorders>
+            <w:tcMar>
+              <w:top w:type="dxa" w:w="60"/>
+              <w:left w:type="dxa" w:w="100"/>
+              <w:bottom w:type="dxa" w:w="60"/>
+              <w:right w:type="dxa" w:w="100"/>
+            </w:tcMar>
+          </w:tcPr>
+          <w:p>
+            <w:pPr>
+              <w:spacing w:after="20"/>
+            </w:pPr>
+            <w:r>
+              <w:rPr>
+                <w:sz w:val="16"/>
+                <w:szCs w:val="16"/>
+              </w:rPr>
+              <w:t xml:space="preserve">Every request only queues the same job; the job checks the account and sends the email (1.8 ms for both, median of 15)</w:t>
+            </w:r>
+          </w:p>
+        </w:tc>
+        <w:tc>
+          <w:tcPr>
+            <w:tcW w:type="dxa" w:w="1820"/>
+            <w:tcBorders>
+              <w:top w:val="single" w:color="7F7F7F" w:sz="4"/>
+              <w:left w:val="single" w:color="7F7F7F" w:sz="4"/>
+              <w:bottom w:val="single" w:color="7F7F7F" w:sz="4"/>
+              <w:right w:val="single" w:color="7F7F7F" w:sz="4"/>
+            </w:tcBorders>
+            <w:tcMar>
+              <w:top w:type="dxa" w:w="60"/>
+              <w:left w:type="dxa" w:w="100"/>
+              <w:bottom w:type="dxa" w:w="60"/>
+              <w:right w:type="dxa" w:w="100"/>
+            </w:tcMar>
+          </w:tcPr>
+          <w:p>
+            <w:pPr>
+              <w:spacing w:after="20"/>
+            </w:pPr>
+            <w:r>
+              <w:rPr>
+                <w:sz w:val="16"/>
+                <w:szCs w:val="16"/>
+              </w:rPr>
+              <w:t xml:space="preserve">Core password-reset tests; timing measurement</w:t>
             </w:r>
           </w:p>
         </w:tc>
@@ -28466,7 +29805,49 @@
           <w:sz w:val="18"/>
           <w:szCs w:val="18"/>
         </w:rPr>
-        <w:t xml:space="preserve">Typical integration defects to check for: CORS preflight blocked between Vercel and the gateway; gateway stripping the Authorization header; Nominatim requests rejected without a User-Agent; SOAP namespace mismatch between WSDL and SoapClient; time-zone differences in the 30-day feedback rule; trust score not recalculated when feedback is hidden.</w:t>
+        <w:t xml:space="preserve">Open: in the CI T13 run the restarted Insights Service still answers from a cached Overpass result (</w:t>
+      </w:r>
+      <w:r>
+        <w:rPr>
+          <w:rFonts w:ascii="Consolas" w:cs="Consolas" w:eastAsia="Consolas" w:hAnsi="Consolas"/>
+          <w:i/>
+          <w:iCs/>
+          <w:color w:val="555555"/>
+          <w:sz w:val="18"/>
+          <w:szCs w:val="18"/>
+        </w:rPr>
+        <w:t xml:space="preserve">cached</w:t>
+      </w:r>
+      <w:r>
+        <w:rPr>
+          <w:i/>
+          <w:iCs/>
+          <w:color w:val="555555"/>
+          <w:sz w:val="18"/>
+          <w:szCs w:val="18"/>
+        </w:rPr>
+        <w:t xml:space="preserve">), so CI does not show the </w:t>
+      </w:r>
+      <w:r>
+        <w:rPr>
+          <w:rFonts w:ascii="Consolas" w:cs="Consolas" w:eastAsia="Consolas" w:hAnsi="Consolas"/>
+          <w:i/>
+          <w:iCs/>
+          <w:color w:val="555555"/>
+          <w:sz w:val="18"/>
+          <w:szCs w:val="18"/>
+        </w:rPr>
+        <w:t xml:space="preserve">unavailable</w:t>
+      </w:r>
+      <w:r>
+        <w:rPr>
+          <w:i/>
+          <w:iCs/>
+          <w:color w:val="555555"/>
+          <w:sz w:val="18"/>
+          <w:szCs w:val="18"/>
+        </w:rPr>
+        <w:t xml:space="preserve"> path; that path is covered by the Insights Jest tests and the local run of 7 October 2026.</w:t>
       </w:r>
     </w:p>
     <w:p>
@@ -33733,7 +35114,7 @@
                 <w:sz w:val="18"/>
                 <w:szCs w:val="18"/>
               </w:rPr>
-              <w:t xml:space="preserve">T08, T09, T16 and the further security cases of folder 09 pass; only </w:t>
+              <w:t xml:space="preserve">Achieved – T08, T09, T16 and the further security cases of folder 09 pass; only </w:t>
             </w:r>
             <w:r>
               <w:rPr>
@@ -33748,15 +35129,7 @@
                 <w:sz w:val="18"/>
                 <w:szCs w:val="18"/>
               </w:rPr>
-              <w:t xml:space="preserve"> files with placeholders are tracked and CI generates throwaway secrets. </w:t>
-            </w:r>
-            <w:r>
-              <w:rPr>
-                <w:sz w:val="18"/>
-                <w:szCs w:val="18"/>
-                <w:highlight w:val="yellow"/>
-              </w:rPr>
-              <w:t xml:space="preserve">[Secret scan result]</w:t>
+              <w:t xml:space="preserve"> files with placeholders are tracked and CI generates throwaway secrets; secret scan with gitleaks 8.30.1 over the full git history (169 commits, 14 Oct 2026): no leaks found.</w:t>
             </w:r>
           </w:p>
         </w:tc>
@@ -34425,13 +35798,167 @@
     </w:p>
     <w:p>
       <w:pPr>
-        <w:spacing w:after="120" w:line="276"/>
+        <w:spacing w:after="120"/>
       </w:pPr>
       <w:r>
         <w:rPr>
+          <w:i/>
+          <w:iCs/>
+          <w:color w:val="555555"/>
+          <w:sz w:val="18"/>
+          <w:szCs w:val="18"/>
           <w:highlight w:val="yellow"/>
         </w:rPr>
-        <w:t xml:space="preserve">[Summarize the team's actual lessons. Suggested prompts: architectural – where service boundaries helped or added overhead; integration – handling external rate limits, SOAP namespaces and XML-to-JSON mapping; testing – value of Postman assertions in CI and what JMeter revealed; teamwork – how API contracts written first let frontend and backend work in parallel; deployment – private networking, environment variables and cold starts.]</w:t>
+        <w:t xml:space="preserve">[Draft written from the project record (commits, PROGRESS.md, test results). The team reviews it, corrects it and adds its own experience – including deployment and the JMeter run – before submission; then remove this note.]</w:t>
+      </w:r>
+    </w:p>
+    <w:p>
+      <w:pPr>
+        <w:pStyle w:val="ListParagraph"/>
+        <w:numPr>
+          <w:ilvl w:val="0"/>
+          <w:numId w:val="2"/>
+        </w:numPr>
+        <w:spacing w:after="60"/>
+      </w:pPr>
+      <w:r>
+        <w:rPr>
+          <w:b/>
+          <w:bCs/>
+        </w:rPr>
+        <w:t xml:space="preserve">Service boundaries paid off when external services failed.</w:t>
+      </w:r>
+      <w:r>
+        <w:t xml:space="preserve"> The public Overpass and Nominatim servers were overloaded or unreachable several times during development (HTTP 504 after 6–16 s, connection failures). Because only the Core Service is required for a job page, hiring kept working and the snapshot degraded to cached, stale or "unavailable" parts. The price was three runtimes (PHP, Node.js, MySQL) to run locally, which strained the 7.3 GB of memory of the main development laptop.</w:t>
+      </w:r>
+    </w:p>
+    <w:p>
+      <w:pPr>
+        <w:pStyle w:val="ListParagraph"/>
+        <w:numPr>
+          <w:ilvl w:val="0"/>
+          <w:numId w:val="2"/>
+        </w:numPr>
+        <w:spacing w:after="60"/>
+      </w:pPr>
+      <w:r>
+        <w:rPr>
+          <w:b/>
+          <w:bCs/>
+        </w:rPr>
+        <w:t xml:space="preserve">Free public APIs need defensive code, not just a client.</w:t>
+      </w:r>
+      <w:r>
+        <w:t xml:space="preserve"> Caching, per-source timeouts, cooldowns, a second Overpass server and a background refresh were all added after real failures; Nominatim's first result was sometimes the wrong place (D08), so results had to be checked against the PSGC location; PSGC's own 9-digit codes differed from the official 10-digit ones the rest of the system uses.</w:t>
+      </w:r>
+    </w:p>
+    <w:p>
+      <w:pPr>
+        <w:pStyle w:val="ListParagraph"/>
+        <w:numPr>
+          <w:ilvl w:val="0"/>
+          <w:numId w:val="2"/>
+        </w:numPr>
+        <w:spacing w:after="60"/>
+      </w:pPr>
+      <w:r>
+        <w:rPr>
+          <w:b/>
+          <w:bCs/>
+        </w:rPr>
+        <w:t xml:space="preserve">Integration through a gateway changes what a URL or header means.</w:t>
+      </w:r>
+      <w:r>
+        <w:t xml:space="preserve"> Three defects (D01–D03) came from the services answering as if the client talked to them directly: a permissive CORS header, the PHP version header and page links with an internal host. Each was found only by testing through the gateway.</w:t>
+      </w:r>
+    </w:p>
+    <w:p>
+      <w:pPr>
+        <w:pStyle w:val="ListParagraph"/>
+        <w:numPr>
+          <w:ilvl w:val="0"/>
+          <w:numId w:val="2"/>
+        </w:numPr>
+        <w:spacing w:after="60"/>
+      </w:pPr>
+      <w:r>
+        <w:rPr>
+          <w:b/>
+          <w:bCs/>
+        </w:rPr>
+        <w:t xml:space="preserve">Test on the database you deploy.</w:t>
+      </w:r>
+      <w:r>
+        <w:t xml:space="preserve"> The fast SQLite test database hid two MySQL differences (D05, D06); running the Core tests on MySQL 8 in CI caught the second one immediately. Likewise the Newman run in CI found a same-second ordering bug (D09) that never appeared on a slower local machine.</w:t>
+      </w:r>
+    </w:p>
+    <w:p>
+      <w:pPr>
+        <w:pStyle w:val="ListParagraph"/>
+        <w:numPr>
+          <w:ilvl w:val="0"/>
+          <w:numId w:val="2"/>
+        </w:numPr>
+        <w:spacing w:after="60"/>
+      </w:pPr>
+      <w:r>
+        <w:rPr>
+          <w:b/>
+          <w:bCs/>
+        </w:rPr>
+        <w:t xml:space="preserve">Writing the API contract first let the work run in parallel.</w:t>
+      </w:r>
+      <w:r>
+        <w:t xml:space="preserve"> All frontend screens were built against </w:t>
+      </w:r>
+      <w:r>
+        <w:rPr>
+          <w:rFonts w:ascii="Consolas" w:cs="Consolas" w:eastAsia="Consolas" w:hAnsi="Consolas"/>
+        </w:rPr>
+        <w:t xml:space="preserve">docs/openapi.yaml</w:t>
+      </w:r>
+      <w:r>
+        <w:t xml:space="preserve"> before most backend modules existed, and the Postman collection, OpenAPI file and SIA document were kept in step with each change.</w:t>
+      </w:r>
+    </w:p>
+    <w:p>
+      <w:pPr>
+        <w:pStyle w:val="ListParagraph"/>
+        <w:numPr>
+          <w:ilvl w:val="0"/>
+          <w:numId w:val="2"/>
+        </w:numPr>
+        <w:spacing w:after="60"/>
+      </w:pPr>
+      <w:r>
+        <w:rPr>
+          <w:b/>
+          <w:bCs/>
+        </w:rPr>
+        <w:t xml:space="preserve">Automated accessibility checks are necessary but not enough.</w:t>
+      </w:r>
+      <w:r>
+        <w:t xml:space="preserve"> axe reported no violations, yet scripted keyboard, focus and reflow checks still found problems (focus lost after an action, cards overflowing at 200% text and 320 px); a screen-reader walkthrough with NVDA remains the final check.</w:t>
+      </w:r>
+    </w:p>
+    <w:p>
+      <w:pPr>
+        <w:pStyle w:val="ListParagraph"/>
+        <w:numPr>
+          <w:ilvl w:val="0"/>
+          <w:numId w:val="2"/>
+        </w:numPr>
+        <w:spacing w:after="60"/>
+      </w:pPr>
+      <w:r>
+        <w:rPr>
+          <w:b/>
+          <w:bCs/>
+        </w:rPr>
+        <w:t xml:space="preserve">Security problems can hide in behaviour, not code.</w:t>
+      </w:r>
+      <w:r>
+        <w:t xml:space="preserve"> The forgot-password endpoint gave the same message for every email but answered faster for unknown ones (D10); only measuring the response time showed that it revealed who has an account.</w:t>
       </w:r>
     </w:p>
     <w:p>

</xml_diff>

<commit_message>
docs(sia): group, section, instructor, members and submission date
Co-Authored-By: Claude Opus 5.5 <noreply@anthropic.com>
</commit_message>
<xml_diff>
--- a/docs/OpenDoor_SIA1_Final_Project_Documentation.docx
+++ b/docs/OpenDoor_SIA1_Final_Project_Documentation.docx
@@ -391,9 +391,8 @@
               <w:rPr>
                 <w:sz w:val="18"/>
                 <w:szCs w:val="18"/>
-                <w:highlight w:val="yellow"/>
-              </w:rPr>
-              <w:t xml:space="preserve">[Enter section]</w:t>
+              </w:rPr>
+              <w:t xml:space="preserve">IT31S1</w:t>
             </w:r>
           </w:p>
         </w:tc>
@@ -455,9 +454,8 @@
               <w:rPr>
                 <w:sz w:val="18"/>
                 <w:szCs w:val="18"/>
-                <w:highlight w:val="yellow"/>
-              </w:rPr>
-              <w:t xml:space="preserve">[Enter instructor name]</w:t>
+              </w:rPr>
+              <w:t xml:space="preserve">Ms. Justine Neypes</w:t>
             </w:r>
           </w:p>
         </w:tc>
@@ -519,9 +517,8 @@
               <w:rPr>
                 <w:sz w:val="18"/>
                 <w:szCs w:val="18"/>
-                <w:highlight w:val="yellow"/>
-              </w:rPr>
-              <w:t xml:space="preserve">[Enter group name or number]</w:t>
+              </w:rPr>
+              <w:t xml:space="preserve">Group 3 – ICARUS</w:t>
             </w:r>
           </w:p>
         </w:tc>
@@ -583,9 +580,8 @@
               <w:rPr>
                 <w:sz w:val="18"/>
                 <w:szCs w:val="18"/>
-                <w:highlight w:val="yellow"/>
-              </w:rPr>
-              <w:t xml:space="preserve">[Month Day, Year]</w:t>
+              </w:rPr>
+              <w:t xml:space="preserve">October 19, 2026</w:t>
             </w:r>
           </w:p>
         </w:tc>
@@ -750,9 +746,8 @@
               <w:rPr>
                 <w:sz w:val="18"/>
                 <w:szCs w:val="18"/>
-                <w:highlight w:val="yellow"/>
-              </w:rPr>
-              <w:t xml:space="preserve">[Name]</w:t>
+              </w:rPr>
+              <w:t xml:space="preserve">Beronilla, Jianina</w:t>
             </w:r>
           </w:p>
         </w:tc>
@@ -810,8 +805,9 @@
               <w:rPr>
                 <w:sz w:val="18"/>
                 <w:szCs w:val="18"/>
-              </w:rPr>
-              <w:t xml:space="preserve">Project lead and integration architect – API gateway, service contracts, CI/CD</w:t>
+                <w:highlight w:val="yellow"/>
+              </w:rPr>
+              <w:t xml:space="preserve">[Role]</w:t>
             </w:r>
           </w:p>
         </w:tc>
@@ -820,6 +816,35 @@
         <w:tc>
           <w:tcPr>
             <w:tcW w:type="dxa" w:w="3000"/>
+            <w:tcBorders>
+              <w:top w:val="single" w:color="7F7F7F" w:sz="4"/>
+              <w:left w:val="single" w:color="7F7F7F" w:sz="4"/>
+              <w:bottom w:val="single" w:color="7F7F7F" w:sz="4"/>
+              <w:right w:val="single" w:color="7F7F7F" w:sz="4"/>
+            </w:tcBorders>
+            <w:tcMar>
+              <w:top w:type="dxa" w:w="60"/>
+              <w:left w:type="dxa" w:w="100"/>
+              <w:bottom w:type="dxa" w:w="60"/>
+              <w:right w:type="dxa" w:w="100"/>
+            </w:tcMar>
+          </w:tcPr>
+          <w:p>
+            <w:pPr>
+              <w:spacing w:after="20"/>
+            </w:pPr>
+            <w:r>
+              <w:rPr>
+                <w:sz w:val="18"/>
+                <w:szCs w:val="18"/>
+              </w:rPr>
+              <w:t xml:space="preserve">Crisologo, Angellana</w:t>
+            </w:r>
+          </w:p>
+        </w:tc>
+        <w:tc>
+          <w:tcPr>
+            <w:tcW w:type="dxa" w:w="2200"/>
             <w:tcBorders>
               <w:top w:val="single" w:color="7F7F7F" w:sz="4"/>
               <w:left w:val="single" w:color="7F7F7F" w:sz="4"/>
@@ -843,13 +868,13 @@
                 <w:szCs w:val="18"/>
                 <w:highlight w:val="yellow"/>
               </w:rPr>
-              <w:t xml:space="preserve">[Name]</w:t>
-            </w:r>
-          </w:p>
-        </w:tc>
-        <w:tc>
-          <w:tcPr>
-            <w:tcW w:type="dxa" w:w="2200"/>
+              <w:t xml:space="preserve">[Student No.]</w:t>
+            </w:r>
+          </w:p>
+        </w:tc>
+        <w:tc>
+          <w:tcPr>
+            <w:tcW w:type="dxa" w:w="4880"/>
             <w:tcBorders>
               <w:top w:val="single" w:color="7F7F7F" w:sz="4"/>
               <w:left w:val="single" w:color="7F7F7F" w:sz="4"/>
@@ -873,13 +898,15 @@
                 <w:szCs w:val="18"/>
                 <w:highlight w:val="yellow"/>
               </w:rPr>
-              <w:t xml:space="preserve">[Student No.]</w:t>
-            </w:r>
-          </w:p>
-        </w:tc>
-        <w:tc>
-          <w:tcPr>
-            <w:tcW w:type="dxa" w:w="4880"/>
+              <w:t xml:space="preserve">[Role]</w:t>
+            </w:r>
+          </w:p>
+        </w:tc>
+      </w:tr>
+      <w:tr>
+        <w:tc>
+          <w:tcPr>
+            <w:tcW w:type="dxa" w:w="3000"/>
             <w:tcBorders>
               <w:top w:val="single" w:color="7F7F7F" w:sz="4"/>
               <w:left w:val="single" w:color="7F7F7F" w:sz="4"/>
@@ -902,15 +929,13 @@
                 <w:sz w:val="18"/>
                 <w:szCs w:val="18"/>
               </w:rPr>
-              <w:t xml:space="preserve">Core Service developer – Laravel API, MySQL schema, matching and trust score</w:t>
-            </w:r>
-          </w:p>
-        </w:tc>
-      </w:tr>
-      <w:tr>
-        <w:tc>
-          <w:tcPr>
-            <w:tcW w:type="dxa" w:w="3000"/>
+              <w:t xml:space="preserve">Ruzgal, Francis Aaron</w:t>
+            </w:r>
+          </w:p>
+        </w:tc>
+        <w:tc>
+          <w:tcPr>
+            <w:tcW w:type="dxa" w:w="2200"/>
             <w:tcBorders>
               <w:top w:val="single" w:color="7F7F7F" w:sz="4"/>
               <w:left w:val="single" w:color="7F7F7F" w:sz="4"/>
@@ -934,13 +959,13 @@
                 <w:szCs w:val="18"/>
                 <w:highlight w:val="yellow"/>
               </w:rPr>
-              <w:t xml:space="preserve">[Name]</w:t>
-            </w:r>
-          </w:p>
-        </w:tc>
-        <w:tc>
-          <w:tcPr>
-            <w:tcW w:type="dxa" w:w="2200"/>
+              <w:t xml:space="preserve">[Student No.]</w:t>
+            </w:r>
+          </w:p>
+        </w:tc>
+        <w:tc>
+          <w:tcPr>
+            <w:tcW w:type="dxa" w:w="4880"/>
             <w:tcBorders>
               <w:top w:val="single" w:color="7F7F7F" w:sz="4"/>
               <w:left w:val="single" w:color="7F7F7F" w:sz="4"/>
@@ -964,13 +989,15 @@
                 <w:szCs w:val="18"/>
                 <w:highlight w:val="yellow"/>
               </w:rPr>
-              <w:t xml:space="preserve">[Student No.]</w:t>
-            </w:r>
-          </w:p>
-        </w:tc>
-        <w:tc>
-          <w:tcPr>
-            <w:tcW w:type="dxa" w:w="4880"/>
+              <w:t xml:space="preserve">[Role]</w:t>
+            </w:r>
+          </w:p>
+        </w:tc>
+      </w:tr>
+      <w:tr>
+        <w:tc>
+          <w:tcPr>
+            <w:tcW w:type="dxa" w:w="3000"/>
             <w:tcBorders>
               <w:top w:val="single" w:color="7F7F7F" w:sz="4"/>
               <w:left w:val="single" w:color="7F7F7F" w:sz="4"/>
@@ -993,15 +1020,13 @@
                 <w:sz w:val="18"/>
                 <w:szCs w:val="18"/>
               </w:rPr>
-              <w:t xml:space="preserve">Integration developer – Accessibility Insights mashup and SOAP Business Registry</w:t>
-            </w:r>
-          </w:p>
-        </w:tc>
-      </w:tr>
-      <w:tr>
-        <w:tc>
-          <w:tcPr>
-            <w:tcW w:type="dxa" w:w="3000"/>
+              <w:t xml:space="preserve">Siochi, Onekhyle</w:t>
+            </w:r>
+          </w:p>
+        </w:tc>
+        <w:tc>
+          <w:tcPr>
+            <w:tcW w:type="dxa" w:w="2200"/>
             <w:tcBorders>
               <w:top w:val="single" w:color="7F7F7F" w:sz="4"/>
               <w:left w:val="single" w:color="7F7F7F" w:sz="4"/>
@@ -1025,13 +1050,13 @@
                 <w:szCs w:val="18"/>
                 <w:highlight w:val="yellow"/>
               </w:rPr>
-              <w:t xml:space="preserve">[Name]</w:t>
-            </w:r>
-          </w:p>
-        </w:tc>
-        <w:tc>
-          <w:tcPr>
-            <w:tcW w:type="dxa" w:w="2200"/>
+              <w:t xml:space="preserve">[Student No.]</w:t>
+            </w:r>
+          </w:p>
+        </w:tc>
+        <w:tc>
+          <w:tcPr>
+            <w:tcW w:type="dxa" w:w="4880"/>
             <w:tcBorders>
               <w:top w:val="single" w:color="7F7F7F" w:sz="4"/>
               <w:left w:val="single" w:color="7F7F7F" w:sz="4"/>
@@ -1055,13 +1080,15 @@
                 <w:szCs w:val="18"/>
                 <w:highlight w:val="yellow"/>
               </w:rPr>
-              <w:t xml:space="preserve">[Student No.]</w:t>
-            </w:r>
-          </w:p>
-        </w:tc>
-        <w:tc>
-          <w:tcPr>
-            <w:tcW w:type="dxa" w:w="4880"/>
+              <w:t xml:space="preserve">[Role]</w:t>
+            </w:r>
+          </w:p>
+        </w:tc>
+      </w:tr>
+      <w:tr>
+        <w:tc>
+          <w:tcPr>
+            <w:tcW w:type="dxa" w:w="3000"/>
             <w:tcBorders>
               <w:top w:val="single" w:color="7F7F7F" w:sz="4"/>
               <w:left w:val="single" w:color="7F7F7F" w:sz="4"/>
@@ -1084,15 +1111,13 @@
                 <w:sz w:val="18"/>
                 <w:szCs w:val="18"/>
               </w:rPr>
-              <w:t xml:space="preserve">Frontend developer – React SPA, accessibility (WCAG 2.1 AA)</w:t>
-            </w:r>
-          </w:p>
-        </w:tc>
-      </w:tr>
-      <w:tr>
-        <w:tc>
-          <w:tcPr>
-            <w:tcW w:type="dxa" w:w="3000"/>
+              <w:t xml:space="preserve">Su, Alfred G.</w:t>
+            </w:r>
+          </w:p>
+        </w:tc>
+        <w:tc>
+          <w:tcPr>
+            <w:tcW w:type="dxa" w:w="2200"/>
             <w:tcBorders>
               <w:top w:val="single" w:color="7F7F7F" w:sz="4"/>
               <w:left w:val="single" w:color="7F7F7F" w:sz="4"/>
@@ -1116,13 +1141,13 @@
                 <w:szCs w:val="18"/>
                 <w:highlight w:val="yellow"/>
               </w:rPr>
-              <w:t xml:space="preserve">[Name]</w:t>
-            </w:r>
-          </w:p>
-        </w:tc>
-        <w:tc>
-          <w:tcPr>
-            <w:tcW w:type="dxa" w:w="2200"/>
+              <w:t xml:space="preserve">[Student No.]</w:t>
+            </w:r>
+          </w:p>
+        </w:tc>
+        <w:tc>
+          <w:tcPr>
+            <w:tcW w:type="dxa" w:w="4880"/>
             <w:tcBorders>
               <w:top w:val="single" w:color="7F7F7F" w:sz="4"/>
               <w:left w:val="single" w:color="7F7F7F" w:sz="4"/>
@@ -1146,36 +1171,7 @@
                 <w:szCs w:val="18"/>
                 <w:highlight w:val="yellow"/>
               </w:rPr>
-              <w:t xml:space="preserve">[Student No.]</w:t>
-            </w:r>
-          </w:p>
-        </w:tc>
-        <w:tc>
-          <w:tcPr>
-            <w:tcW w:type="dxa" w:w="4880"/>
-            <w:tcBorders>
-              <w:top w:val="single" w:color="7F7F7F" w:sz="4"/>
-              <w:left w:val="single" w:color="7F7F7F" w:sz="4"/>
-              <w:bottom w:val="single" w:color="7F7F7F" w:sz="4"/>
-              <w:right w:val="single" w:color="7F7F7F" w:sz="4"/>
-            </w:tcBorders>
-            <w:tcMar>
-              <w:top w:type="dxa" w:w="60"/>
-              <w:left w:type="dxa" w:w="100"/>
-              <w:bottom w:type="dxa" w:w="60"/>
-              <w:right w:type="dxa" w:w="100"/>
-            </w:tcMar>
-          </w:tcPr>
-          <w:p>
-            <w:pPr>
-              <w:spacing w:after="20"/>
-            </w:pPr>
-            <w:r>
-              <w:rPr>
-                <w:sz w:val="18"/>
-                <w:szCs w:val="18"/>
-              </w:rPr>
-              <w:t xml:space="preserve">QA and DevOps – Postman/Newman, JMeter, cloud deployment, documentation</w:t>
+              <w:t xml:space="preserve">[Role]</w:t>
             </w:r>
           </w:p>
         </w:tc>
@@ -1198,7 +1194,7 @@
           <w:sz w:val="18"/>
           <w:szCs w:val="18"/>
         </w:rPr>
-        <w:t xml:space="preserve">Note: the role split above is a suggested division of the five integration workstreams. Adjust it to match the actual group.</w:t>
+        <w:t xml:space="preserve">Suggested division of the five integration workstreams, one per member: project lead and integration architect – API gateway, service contracts, CI/CD; Core Service developer – Laravel API, MySQL schema, matching and trust score; integration developer – Accessibility Insights mashup and SOAP Business Registry; frontend developer – React SPA, accessibility (WCAG 2.1 AA); QA and DevOps – Postman/Newman, JMeter, cloud deployment, documentation.</w:t>
       </w:r>
     </w:p>
     <w:p>
@@ -1628,9 +1624,8 @@
               <w:rPr>
                 <w:sz w:val="18"/>
                 <w:szCs w:val="18"/>
-                <w:highlight w:val="yellow"/>
-              </w:rPr>
-              <w:t xml:space="preserve">[Insert date]</w:t>
+              </w:rPr>
+              <w:t xml:space="preserve">October 19, 2026</w:t>
             </w:r>
           </w:p>
         </w:tc>

</xml_diff>